<commit_message>
Agregado de prototipos y correccion de errores menores (falta indice)
</commit_message>
<xml_diff>
--- a/Entrega 3/Entrega 3 - TPI.docx
+++ b/Entrega 3/Entrega 3 - TPI.docx
@@ -1,6 +1,6 @@
 
 <file path=word/document.xml><?xml version="1.0" encoding="utf-8"?>
-<w:document xmlns:wpc="http://schemas.microsoft.com/office/word/2010/wordprocessingCanvas" xmlns:cx="http://schemas.microsoft.com/office/drawing/2014/chartex" xmlns:cx1="http://schemas.microsoft.com/office/drawing/2015/9/8/chartex" xmlns:cx2="http://schemas.microsoft.com/office/drawing/2015/10/21/chartex" xmlns:cx3="http://schemas.microsoft.com/office/drawing/2016/5/9/chartex" xmlns:cx4="http://schemas.microsoft.com/office/drawing/2016/5/10/chartex" xmlns:cx5="http://schemas.microsoft.com/office/drawing/2016/5/11/chartex" xmlns:cx6="http://schemas.microsoft.com/office/drawing/2016/5/12/chartex" xmlns:cx7="http://schemas.microsoft.com/office/drawing/2016/5/13/chartex" xmlns:cx8="http://schemas.microsoft.com/office/drawing/2016/5/14/chartex" xmlns:mc="http://schemas.openxmlformats.org/markup-compatibility/2006" xmlns:aink="http://schemas.microsoft.com/office/drawing/2016/ink" xmlns:am3d="http://schemas.microsoft.com/office/drawing/2017/model3d" xmlns:o="urn:schemas-microsoft-com:office:office" xmlns:oel="http://schemas.microsoft.com/office/2019/extlst" xmlns:r="http://schemas.openxmlformats.org/officeDocument/2006/relationships" xmlns:m="http://schemas.openxmlformats.org/officeDocument/2006/math" xmlns:v="urn:schemas-microsoft-com:vml" xmlns:wp14="http://schemas.microsoft.com/office/word/2010/wordprocessingDrawing" xmlns:wp="http://schemas.openxmlformats.org/drawingml/2006/wordprocessingDrawing" xmlns:w10="urn:schemas-microsoft-com:office:word" xmlns:w="http://schemas.openxmlformats.org/wordprocessingml/2006/main" xmlns:w14="http://schemas.microsoft.com/office/word/2010/wordml" xmlns:w15="http://schemas.microsoft.com/office/word/2012/wordml" xmlns:w16cex="http://schemas.microsoft.com/office/word/2018/wordml/cex" xmlns:w16cid="http://schemas.microsoft.com/office/word/2016/wordml/cid" xmlns:w16="http://schemas.microsoft.com/office/word/2018/wordml" xmlns:w16du="http://schemas.microsoft.com/office/word/2023/wordml/word16du" xmlns:w16sdtdh="http://schemas.microsoft.com/office/word/2020/wordml/sdtdatahash" xmlns:w16sdtfl="http://schemas.microsoft.com/office/word/2024/wordml/sdtformatlock" xmlns:w16se="http://schemas.microsoft.com/office/word/2015/wordml/symex" xmlns:wpg="http://schemas.microsoft.com/office/word/2010/wordprocessingGroup" xmlns:wpi="http://schemas.microsoft.com/office/word/2010/wordprocessingInk" xmlns:wne="http://schemas.microsoft.com/office/word/2006/wordml" xmlns:wps="http://schemas.microsoft.com/office/word/2010/wordprocessingShape" mc:Ignorable="w14 w15 w16se w16cid w16 w16cex w16sdtdh w16sdtfl w16du wp14">
+<w:document xmlns:wpc="http://schemas.microsoft.com/office/word/2010/wordprocessingCanvas" xmlns:cx="http://schemas.microsoft.com/office/drawing/2014/chartex" xmlns:mc="http://schemas.openxmlformats.org/markup-compatibility/2006" xmlns:o="urn:schemas-microsoft-com:office:office" xmlns:r="http://schemas.openxmlformats.org/officeDocument/2006/relationships" xmlns:m="http://schemas.openxmlformats.org/officeDocument/2006/math" xmlns:v="urn:schemas-microsoft-com:vml" xmlns:wp14="http://schemas.microsoft.com/office/word/2010/wordprocessingDrawing" xmlns:wp="http://schemas.openxmlformats.org/drawingml/2006/wordprocessingDrawing" xmlns:w10="urn:schemas-microsoft-com:office:word" xmlns:w="http://schemas.openxmlformats.org/wordprocessingml/2006/main" xmlns:w14="http://schemas.microsoft.com/office/word/2010/wordml" xmlns:w15="http://schemas.microsoft.com/office/word/2012/wordml" xmlns:w16se="http://schemas.microsoft.com/office/word/2015/wordml/symex" xmlns:wpg="http://schemas.microsoft.com/office/word/2010/wordprocessingGroup" xmlns:wpi="http://schemas.microsoft.com/office/word/2010/wordprocessingInk" xmlns:wne="http://schemas.microsoft.com/office/word/2006/wordml" xmlns:wps="http://schemas.microsoft.com/office/word/2010/wordprocessingShape" mc:Ignorable="w14 w15 w16se wp14">
   <w:body>
     <w:p>
       <w:pPr>
@@ -18,6 +18,7 @@
       <w:r>
         <w:rPr>
           <w:noProof/>
+          <w:lang w:val="en-US" w:eastAsia="en-US"/>
         </w:rPr>
         <w:drawing>
           <wp:inline distT="0" distB="0" distL="0" distR="0" wp14:anchorId="4F7AE386" wp14:editId="38777B53">
@@ -552,6 +553,8 @@
         <w:lastRenderedPageBreak/>
         <w:t>ÍNDICE</w:t>
       </w:r>
+      <w:bookmarkStart w:id="0" w:name="_GoBack"/>
+      <w:bookmarkEnd w:id="0"/>
     </w:p>
     <w:p>
       <w:pPr>
@@ -578,6 +581,7 @@
           <w:docPartUnique/>
         </w:docPartObj>
       </w:sdtPr>
+      <w:sdtEndPr/>
       <w:sdtContent>
         <w:p>
           <w:pPr>
@@ -830,7 +834,7 @@
                 <w:noProof/>
                 <w:webHidden/>
               </w:rPr>
-              <w:t>3</w:t>
+              <w:t>4</w:t>
             </w:r>
             <w:r>
               <w:rPr>
@@ -906,7 +910,7 @@
                 <w:noProof/>
                 <w:webHidden/>
               </w:rPr>
-              <w:t>3</w:t>
+              <w:t>5</w:t>
             </w:r>
             <w:r>
               <w:rPr>
@@ -942,7 +946,7 @@
           <w:lang w:val="es-AR"/>
         </w:rPr>
       </w:pPr>
-      <w:bookmarkStart w:id="0" w:name="_Toc242293372"/>
+      <w:bookmarkStart w:id="1" w:name="_Toc242293372"/>
       <w:r>
         <w:rPr>
           <w:b/>
@@ -977,7 +981,7 @@
         </w:rPr>
         <w:t xml:space="preserve"> de Caso de Uso del TPI</w:t>
       </w:r>
-      <w:bookmarkEnd w:id="0"/>
+      <w:bookmarkEnd w:id="1"/>
     </w:p>
     <w:p>
       <w:pPr>
@@ -987,13 +991,14 @@
       </w:pPr>
       <w:r>
         <w:rPr>
-          <w:lang w:val="es-AR"/>
+          <w:noProof/>
+          <w:lang w:val="en-US" w:eastAsia="en-US"/>
         </w:rPr>
         <w:drawing>
-          <wp:inline distT="0" distB="0" distL="0" distR="0" wp14:anchorId="6A845E67" wp14:editId="56A4CF2F">
-            <wp:extent cx="5731510" cy="6014085"/>
-            <wp:effectExtent l="0" t="0" r="2540" b="5715"/>
-            <wp:docPr id="592645839" name="Imagen 1"/>
+          <wp:inline distT="0" distB="0" distL="0" distR="0" wp14:anchorId="08315925" wp14:editId="171B7E75">
+            <wp:extent cx="5731510" cy="7043420"/>
+            <wp:effectExtent l="0" t="0" r="2540" b="5080"/>
+            <wp:docPr id="19" name="Imagen 19"/>
             <wp:cNvGraphicFramePr>
               <a:graphicFrameLocks xmlns:a="http://schemas.openxmlformats.org/drawingml/2006/main" noChangeAspect="1"/>
             </wp:cNvGraphicFramePr>
@@ -1001,7 +1006,7 @@
               <a:graphicData uri="http://schemas.openxmlformats.org/drawingml/2006/picture">
                 <pic:pic xmlns:pic="http://schemas.openxmlformats.org/drawingml/2006/picture">
                   <pic:nvPicPr>
-                    <pic:cNvPr id="592645839" name=""/>
+                    <pic:cNvPr id="1" name=""/>
                     <pic:cNvPicPr/>
                   </pic:nvPicPr>
                   <pic:blipFill>
@@ -1013,7 +1018,7 @@
                   <pic:spPr>
                     <a:xfrm>
                       <a:off x="0" y="0"/>
-                      <a:ext cx="5731510" cy="6014085"/>
+                      <a:ext cx="5731510" cy="7043420"/>
                     </a:xfrm>
                     <a:prstGeom prst="rect">
                       <a:avLst/>
@@ -1058,7 +1063,7 @@
           <w:lang w:val="es-AR"/>
         </w:rPr>
       </w:pPr>
-      <w:bookmarkStart w:id="1" w:name="_Toc242293373"/>
+      <w:bookmarkStart w:id="2" w:name="_Toc242293373"/>
       <w:r>
         <w:rPr>
           <w:b/>
@@ -1087,7 +1092,7 @@
         </w:rPr>
         <w:t xml:space="preserve"> Objetivos</w:t>
       </w:r>
-      <w:bookmarkEnd w:id="1"/>
+      <w:bookmarkEnd w:id="2"/>
     </w:p>
     <w:tbl>
       <w:tblPr>
@@ -1110,13 +1115,8 @@
             <w:pPr>
               <w:jc w:val="both"/>
             </w:pPr>
-            <w:proofErr w:type="spellStart"/>
-            <w:r>
-              <w:t>N°</w:t>
-            </w:r>
-            <w:proofErr w:type="spellEnd"/>
-            <w:r>
-              <w:t xml:space="preserve"> CU</w:t>
+            <w:r>
+              <w:t>N° CU</w:t>
             </w:r>
           </w:p>
         </w:tc>
@@ -1253,15 +1253,13 @@
               <w:jc w:val="both"/>
             </w:pPr>
             <w:r>
-              <w:t xml:space="preserve">Permitir consultar y visualizar los datos de un </w:t>
-            </w:r>
-            <w:proofErr w:type="spellStart"/>
-            <w:r>
-              <w:t>returo</w:t>
-            </w:r>
-            <w:proofErr w:type="spellEnd"/>
-            <w:r>
-              <w:t xml:space="preserve"> previamente registrado. </w:t>
+              <w:t>Permitir consultar y</w:t>
+            </w:r>
+            <w:r>
+              <w:t xml:space="preserve"> visualizar los datos de un reti</w:t>
+            </w:r>
+            <w:r>
+              <w:t>ro previamente registrado. </w:t>
             </w:r>
           </w:p>
         </w:tc>
@@ -1351,6 +1349,9 @@
         </w:tc>
       </w:tr>
       <w:tr>
+        <w:trPr>
+          <w:trHeight w:val="617"/>
+        </w:trPr>
         <w:tc>
           <w:tcPr>
             <w:tcW w:w="846" w:type="dxa"/>
@@ -1408,6 +1409,9 @@
         </w:tc>
       </w:tr>
       <w:tr>
+        <w:trPr>
+          <w:trHeight w:val="617"/>
+        </w:trPr>
         <w:tc>
           <w:tcPr>
             <w:tcW w:w="846" w:type="dxa"/>
@@ -1416,42 +1420,34 @@
             <w:pPr>
               <w:jc w:val="both"/>
             </w:pPr>
-          </w:p>
+            <w:r>
+              <w:t>CU5</w:t>
+            </w:r>
+          </w:p>
+        </w:tc>
+        <w:tc>
+          <w:tcPr>
+            <w:tcW w:w="2126" w:type="dxa"/>
+          </w:tcPr>
           <w:p>
             <w:pPr>
               <w:jc w:val="both"/>
             </w:pPr>
             <w:r>
-              <w:t>CU</w:t>
-            </w:r>
-            <w:r>
-              <w:t>5</w:t>
-            </w:r>
-          </w:p>
-        </w:tc>
-        <w:tc>
-          <w:tcPr>
-            <w:tcW w:w="2126" w:type="dxa"/>
+              <w:t>Registrar categoría</w:t>
+            </w:r>
+          </w:p>
+        </w:tc>
+        <w:tc>
+          <w:tcPr>
+            <w:tcW w:w="3790" w:type="dxa"/>
           </w:tcPr>
           <w:p>
             <w:pPr>
               <w:jc w:val="both"/>
             </w:pPr>
             <w:r>
-              <w:t>Registrar pago</w:t>
-            </w:r>
-          </w:p>
-        </w:tc>
-        <w:tc>
-          <w:tcPr>
-            <w:tcW w:w="3790" w:type="dxa"/>
-          </w:tcPr>
-          <w:p>
-            <w:pPr>
-              <w:jc w:val="both"/>
-            </w:pPr>
-            <w:r>
-              <w:t>Registrar los pagos realizados y actualizar el estado del retiro según el monto abonado.</w:t>
+              <w:t>Registrar categoría asociada a un retiro en caso de que la misma no exista.</w:t>
             </w:r>
           </w:p>
         </w:tc>
@@ -1500,16 +1496,7 @@
               <w:jc w:val="both"/>
             </w:pPr>
             <w:r>
-              <w:t>Registrar</w:t>
-            </w:r>
-            <w:r>
-              <w:t xml:space="preserve"> </w:t>
-            </w:r>
-            <w:r>
-              <w:t>valoración</w:t>
-            </w:r>
-            <w:r>
-              <w:t> </w:t>
+              <w:t>Registrar pago</w:t>
             </w:r>
           </w:p>
         </w:tc>
@@ -1522,7 +1509,7 @@
               <w:jc w:val="both"/>
             </w:pPr>
             <w:r>
-              <w:t>Registrar la valoración y descripción del usuario según su experiencia en el retiro.</w:t>
+              <w:t>Registrar los pagos realizados y actualizar el estado del retiro según el monto abonado.</w:t>
             </w:r>
           </w:p>
         </w:tc>
@@ -1577,6 +1564,74 @@
               <w:t xml:space="preserve"> </w:t>
             </w:r>
             <w:r>
+              <w:t>valoración </w:t>
+            </w:r>
+          </w:p>
+        </w:tc>
+        <w:tc>
+          <w:tcPr>
+            <w:tcW w:w="3790" w:type="dxa"/>
+          </w:tcPr>
+          <w:p>
+            <w:pPr>
+              <w:jc w:val="both"/>
+            </w:pPr>
+            <w:r>
+              <w:t>Registrar la valoración y descripción del usuario según su experiencia en el retiro.</w:t>
+            </w:r>
+          </w:p>
+        </w:tc>
+        <w:tc>
+          <w:tcPr>
+            <w:tcW w:w="2254" w:type="dxa"/>
+          </w:tcPr>
+          <w:p>
+            <w:pPr>
+              <w:jc w:val="both"/>
+            </w:pPr>
+            <w:r>
+              <w:t>Usuario</w:t>
+            </w:r>
+          </w:p>
+        </w:tc>
+      </w:tr>
+      <w:tr>
+        <w:tc>
+          <w:tcPr>
+            <w:tcW w:w="846" w:type="dxa"/>
+          </w:tcPr>
+          <w:p>
+            <w:pPr>
+              <w:jc w:val="both"/>
+            </w:pPr>
+          </w:p>
+          <w:p>
+            <w:pPr>
+              <w:jc w:val="both"/>
+            </w:pPr>
+            <w:r>
+              <w:t>CU</w:t>
+            </w:r>
+            <w:r>
+              <w:t>8</w:t>
+            </w:r>
+          </w:p>
+        </w:tc>
+        <w:tc>
+          <w:tcPr>
+            <w:tcW w:w="2126" w:type="dxa"/>
+          </w:tcPr>
+          <w:p>
+            <w:pPr>
+              <w:jc w:val="both"/>
+            </w:pPr>
+            <w:r>
+              <w:t>Registrar</w:t>
+            </w:r>
+            <w:r>
+              <w:t xml:space="preserve"> </w:t>
+            </w:r>
+            <w:r>
               <w:t>notificaciones</w:t>
             </w:r>
           </w:p>
@@ -1590,19 +1645,11 @@
               <w:jc w:val="both"/>
             </w:pPr>
             <w:r>
-              <w:t xml:space="preserve">Registrar notificaciones avisando la </w:t>
-            </w:r>
-            <w:r>
-              <w:t>aproximación</w:t>
-            </w:r>
-            <w:r>
-              <w:t xml:space="preserve"> del retiro agendado </w:t>
-            </w:r>
-            <w:proofErr w:type="spellStart"/>
-            <w:r>
-              <w:t>ó</w:t>
-            </w:r>
-            <w:proofErr w:type="spellEnd"/>
+              <w:t>Registrar notificaciones avisando la ap</w:t>
+            </w:r>
+            <w:r>
+              <w:t>roximación del retiro agendado o</w:t>
+            </w:r>
             <w:r>
               <w:t xml:space="preserve"> el vencimiento de un pago pendiente.</w:t>
             </w:r>
@@ -1634,7 +1681,7 @@
           <w:lang w:val="es-AR"/>
         </w:rPr>
       </w:pPr>
-      <w:bookmarkStart w:id="2" w:name="_Toc242293374"/>
+      <w:bookmarkStart w:id="3" w:name="_Toc242293374"/>
       <w:r>
         <w:rPr>
           <w:b/>
@@ -1645,12 +1692,13 @@
         <w:lastRenderedPageBreak/>
         <w:t>Diagrama de transición de estados</w:t>
       </w:r>
-      <w:bookmarkEnd w:id="2"/>
+      <w:bookmarkEnd w:id="3"/>
     </w:p>
     <w:p>
       <w:r>
         <w:rPr>
           <w:noProof/>
+          <w:lang w:val="en-US" w:eastAsia="en-US"/>
         </w:rPr>
         <w:drawing>
           <wp:inline distT="0" distB="0" distL="0" distR="0" wp14:anchorId="2CA1354C" wp14:editId="3F3545DD">
@@ -1713,36 +1761,118 @@
           <w:u w:val="single"/>
         </w:rPr>
       </w:pPr>
-      <w:bookmarkStart w:id="3" w:name="_Toc242293375"/>
-      <w:r>
-        <w:rPr>
-          <w:b/>
-          <w:bCs/>
-          <w:u w:val="single"/>
-        </w:rPr>
-        <w:br w:type="page"/>
-      </w:r>
-    </w:p>
-    <w:p>
-      <w:pPr>
-        <w:spacing w:line="240" w:lineRule="auto"/>
+      <w:bookmarkStart w:id="4" w:name="_Toc242293375"/>
+      <w:r>
         <w:rPr>
           <w:rFonts w:ascii="Tahoma" w:hAnsi="Tahoma" w:cs="Tahoma"/>
           <w:b/>
           <w:bCs/>
           <w:color w:val="333399"/>
         </w:rPr>
-      </w:pPr>
-      <w:r>
+        <w:br w:type="page"/>
+      </w:r>
+    </w:p>
+    <w:p>
+      <w:pPr>
+        <w:pStyle w:val="Ttulo2"/>
+        <w:rPr>
+          <w:b/>
+          <w:bCs/>
+          <w:u w:val="single"/>
+        </w:rPr>
+      </w:pPr>
+      <w:r>
+        <w:rPr>
+          <w:b/>
+          <w:bCs/>
+          <w:u w:val="single"/>
+        </w:rPr>
+        <w:lastRenderedPageBreak/>
+        <w:t xml:space="preserve">Prototipo </w:t>
+      </w:r>
+      <w:r>
+        <w:rPr>
+          <w:b/>
+          <w:bCs/>
+          <w:u w:val="single"/>
+        </w:rPr>
+        <w:t xml:space="preserve">de la </w:t>
+      </w:r>
+      <w:r>
+        <w:rPr>
+          <w:b/>
+          <w:bCs/>
+          <w:u w:val="single"/>
+        </w:rPr>
+        <w:t>pantalla principal</w:t>
+      </w:r>
+    </w:p>
+    <w:p>
+      <w:r>
+        <w:rPr>
+          <w:noProof/>
+          <w:lang w:val="en-US" w:eastAsia="en-US"/>
+        </w:rPr>
+        <w:drawing>
+          <wp:inline distT="0" distB="0" distL="0" distR="0" wp14:anchorId="60AC5EB3" wp14:editId="4FB9E380">
+            <wp:extent cx="1800476" cy="6477904"/>
+            <wp:effectExtent l="0" t="0" r="9525" b="0"/>
+            <wp:docPr id="2" name="Imagen 2"/>
+            <wp:cNvGraphicFramePr>
+              <a:graphicFrameLocks xmlns:a="http://schemas.openxmlformats.org/drawingml/2006/main" noChangeAspect="1"/>
+            </wp:cNvGraphicFramePr>
+            <a:graphic xmlns:a="http://schemas.openxmlformats.org/drawingml/2006/main">
+              <a:graphicData uri="http://schemas.openxmlformats.org/drawingml/2006/picture">
+                <pic:pic xmlns:pic="http://schemas.openxmlformats.org/drawingml/2006/picture">
+                  <pic:nvPicPr>
+                    <pic:cNvPr id="1" name=""/>
+                    <pic:cNvPicPr/>
+                  </pic:nvPicPr>
+                  <pic:blipFill>
+                    <a:blip r:embed="rId16"/>
+                    <a:stretch>
+                      <a:fillRect/>
+                    </a:stretch>
+                  </pic:blipFill>
+                  <pic:spPr>
+                    <a:xfrm>
+                      <a:off x="0" y="0"/>
+                      <a:ext cx="1800476" cy="6477904"/>
+                    </a:xfrm>
+                    <a:prstGeom prst="rect">
+                      <a:avLst/>
+                    </a:prstGeom>
+                  </pic:spPr>
+                </pic:pic>
+              </a:graphicData>
+            </a:graphic>
+          </wp:inline>
+        </w:drawing>
+      </w:r>
+    </w:p>
+    <w:p/>
+    <w:p>
+      <w:r>
+        <w:t>Esta pantalla le permite al usuario consultar de forma rápida sus retiros agendados, visualizar información relevante de los próximos retiros y acceder a las funcionalidades principales de la aplicación.</w:t>
+      </w:r>
+    </w:p>
+    <w:p/>
+    <w:p/>
+    <w:p/>
+    <w:p/>
+    <w:p/>
+    <w:p/>
+    <w:p/>
+    <w:p>
+      <w:pPr>
+        <w:spacing w:line="240" w:lineRule="auto"/>
         <w:rPr>
           <w:rFonts w:ascii="Tahoma" w:hAnsi="Tahoma" w:cs="Tahoma"/>
           <w:b/>
           <w:bCs/>
           <w:color w:val="333399"/>
         </w:rPr>
-        <w:lastRenderedPageBreak/>
-        <w:br w:type="page"/>
-      </w:r>
+      </w:pPr>
     </w:p>
     <w:p>
       <w:pPr>
@@ -1762,8 +1892,27 @@
           <w:bCs/>
           <w:color w:val="333399"/>
         </w:rPr>
-        <w:lastRenderedPageBreak/>
-        <w:t>Plantilla para Descripción de Use Cases  (Trazo Intermedio)</w:t>
+        <w:t xml:space="preserve">Plantilla para Descripción de Use </w:t>
+      </w:r>
+      <w:proofErr w:type="gramStart"/>
+      <w:r>
+        <w:rPr>
+          <w:rFonts w:ascii="Tahoma" w:hAnsi="Tahoma" w:cs="Tahoma"/>
+          <w:b/>
+          <w:bCs/>
+          <w:color w:val="333399"/>
+        </w:rPr>
+        <w:t>Cases  (</w:t>
+      </w:r>
+      <w:proofErr w:type="gramEnd"/>
+      <w:r>
+        <w:rPr>
+          <w:rFonts w:ascii="Tahoma" w:hAnsi="Tahoma" w:cs="Tahoma"/>
+          <w:b/>
+          <w:bCs/>
+          <w:color w:val="333399"/>
+        </w:rPr>
+        <w:t>Trazo Intermedio)</w:t>
       </w:r>
     </w:p>
     <w:p>
@@ -1839,7 +1988,7 @@
                 <w:sz w:val="20"/>
                 <w:szCs w:val="20"/>
               </w:rPr>
-              <w:t>Paquete: El Hotel “Portal del Sol”</w:t>
+              <w:t xml:space="preserve">Paquete: </w:t>
             </w:r>
           </w:p>
         </w:tc>
@@ -2182,6 +2331,7 @@
                 <w:bCs/>
                 <w:noProof/>
                 <w:sz w:val="20"/>
+                <w:lang w:val="en-US" w:eastAsia="en-US"/>
               </w:rPr>
               <mc:AlternateContent>
                 <mc:Choice Requires="wps">
@@ -2240,7 +2390,7 @@
                     </wp:anchor>
                   </w:drawing>
                 </mc:Choice>
-                <mc:Fallback>
+                <mc:Fallback xmlns:cx1="http://schemas.microsoft.com/office/drawing/2015/9/8/chartex" xmlns:cx2="http://schemas.microsoft.com/office/drawing/2015/10/21/chartex" xmlns:cx3="http://schemas.microsoft.com/office/drawing/2016/5/9/chartex" xmlns:cx4="http://schemas.microsoft.com/office/drawing/2016/5/10/chartex" xmlns:cx5="http://schemas.microsoft.com/office/drawing/2016/5/11/chartex" xmlns:cx6="http://schemas.microsoft.com/office/drawing/2016/5/12/chartex" xmlns:cx7="http://schemas.microsoft.com/office/drawing/2016/5/13/chartex" xmlns:cx8="http://schemas.microsoft.com/office/drawing/2016/5/14/chartex" xmlns:aink="http://schemas.microsoft.com/office/drawing/2016/ink" xmlns:am3d="http://schemas.microsoft.com/office/drawing/2017/model3d" xmlns:oel="http://schemas.microsoft.com/office/2019/extlst" xmlns:w16cex="http://schemas.microsoft.com/office/word/2018/wordml/cex" xmlns:w16cid="http://schemas.microsoft.com/office/word/2016/wordml/cid" xmlns:w16="http://schemas.microsoft.com/office/word/2018/wordml" xmlns:w16du="http://schemas.microsoft.com/office/word/2023/wordml/word16du" xmlns:w16sdtdh="http://schemas.microsoft.com/office/word/2020/wordml/sdtdatahash" xmlns:w16sdtfl="http://schemas.microsoft.com/office/word/2024/wordml/sdtformatlock">
                   <w:pict>
                     <v:shape w14:anchorId="64428725" id="Signo de multiplicación 2" o:spid="_x0000_s1026" style="position:absolute;margin-left:141.95pt;margin-top:-23.65pt;width:18pt;height:15pt;z-index:251659264;visibility:visible;mso-wrap-style:square;mso-wrap-distance-left:9pt;mso-wrap-distance-top:0;mso-wrap-distance-right:9pt;mso-wrap-distance-bottom:0;mso-position-horizontal:absolute;mso-position-horizontal-relative:text;mso-position-vertical:absolute;mso-position-vertical-relative:text;v-text-anchor:middle" coordsize="228600,190500" o:gfxdata="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" path="m40562,62964l69246,28543r45054,37545l159354,28543r28684,34421l149294,95250r38744,32286l159354,161957,114300,124412,69246,161957,40562,127536,79306,95250,40562,62964xe" fillcolor="#4f81bd [3204]" stroked="f" strokeweight="2pt">
                       <v:path arrowok="t" o:connecttype="custom" o:connectlocs="40562,62964;69246,28543;114300,66088;159354,28543;188038,62964;149294,95250;188038,127536;159354,161957;114300,124412;69246,161957;40562,127536;79306,95250;40562,62964" o:connectangles="0,0,0,0,0,0,0,0,0,0,0,0,0"/>
@@ -2307,16 +2457,7 @@
                 <w:sz w:val="20"/>
                 <w:szCs w:val="20"/>
               </w:rPr>
-              <w:t>Flujo Básico</w:t>
-            </w:r>
-            <w:r>
-              <w:rPr>
-                <w:rFonts w:ascii="Tahoma" w:hAnsi="Tahoma" w:cs="Tahoma"/>
-                <w:b/>
-                <w:sz w:val="20"/>
-                <w:szCs w:val="20"/>
-              </w:rPr>
-              <w:t>:</w:t>
+              <w:t>Flujo Básico:</w:t>
             </w:r>
           </w:p>
         </w:tc>
@@ -2715,7 +2856,7 @@
                 <w:sz w:val="20"/>
                 <w:szCs w:val="20"/>
               </w:rPr>
-              <w:t>Registrar actividades.</w:t>
+              <w:t>Registrar actividades, Registrar categoría.</w:t>
             </w:r>
           </w:p>
         </w:tc>
@@ -3125,8 +3266,6 @@
         <w:rPr>
           <w:b/>
           <w:bCs/>
-          <w:sz w:val="32"/>
-          <w:szCs w:val="32"/>
           <w:u w:val="single"/>
         </w:rPr>
       </w:pPr>
@@ -3134,9 +3273,109 @@
         <w:rPr>
           <w:b/>
           <w:bCs/>
+          <w:noProof/>
           <w:u w:val="single"/>
-        </w:rPr>
-        <w:br w:type="page"/>
+          <w:lang w:val="en-US" w:eastAsia="en-US"/>
+        </w:rPr>
+        <w:drawing>
+          <wp:anchor distT="0" distB="0" distL="114300" distR="114300" simplePos="0" relativeHeight="251664384" behindDoc="0" locked="0" layoutInCell="1" allowOverlap="1" wp14:anchorId="028B2C32" wp14:editId="0FA413C5">
+            <wp:simplePos x="0" y="0"/>
+            <wp:positionH relativeFrom="column">
+              <wp:posOffset>3028950</wp:posOffset>
+            </wp:positionH>
+            <wp:positionV relativeFrom="paragraph">
+              <wp:posOffset>13334</wp:posOffset>
+            </wp:positionV>
+            <wp:extent cx="2505075" cy="6407403"/>
+            <wp:effectExtent l="0" t="0" r="0" b="0"/>
+            <wp:wrapNone/>
+            <wp:docPr id="12" name="Imagen 12"/>
+            <wp:cNvGraphicFramePr>
+              <a:graphicFrameLocks xmlns:a="http://schemas.openxmlformats.org/drawingml/2006/main" noChangeAspect="1"/>
+            </wp:cNvGraphicFramePr>
+            <a:graphic xmlns:a="http://schemas.openxmlformats.org/drawingml/2006/main">
+              <a:graphicData uri="http://schemas.openxmlformats.org/drawingml/2006/picture">
+                <pic:pic xmlns:pic="http://schemas.openxmlformats.org/drawingml/2006/picture">
+                  <pic:nvPicPr>
+                    <pic:cNvPr id="1" name=""/>
+                    <pic:cNvPicPr/>
+                  </pic:nvPicPr>
+                  <pic:blipFill>
+                    <a:blip r:embed="rId17">
+                      <a:extLst>
+                        <a:ext uri="{28A0092B-C50C-407E-A947-70E740481C1C}">
+                          <a14:useLocalDpi xmlns:a14="http://schemas.microsoft.com/office/drawing/2010/main" val="0"/>
+                        </a:ext>
+                      </a:extLst>
+                    </a:blip>
+                    <a:stretch>
+                      <a:fillRect/>
+                    </a:stretch>
+                  </pic:blipFill>
+                  <pic:spPr>
+                    <a:xfrm>
+                      <a:off x="0" y="0"/>
+                      <a:ext cx="2512806" cy="6427178"/>
+                    </a:xfrm>
+                    <a:prstGeom prst="rect">
+                      <a:avLst/>
+                    </a:prstGeom>
+                  </pic:spPr>
+                </pic:pic>
+              </a:graphicData>
+            </a:graphic>
+            <wp14:sizeRelH relativeFrom="margin">
+              <wp14:pctWidth>0</wp14:pctWidth>
+            </wp14:sizeRelH>
+            <wp14:sizeRelV relativeFrom="margin">
+              <wp14:pctHeight>0</wp14:pctHeight>
+            </wp14:sizeRelV>
+          </wp:anchor>
+        </w:drawing>
+      </w:r>
+      <w:r>
+        <w:rPr>
+          <w:b/>
+          <w:bCs/>
+          <w:noProof/>
+          <w:u w:val="single"/>
+          <w:lang w:val="en-US" w:eastAsia="en-US"/>
+        </w:rPr>
+        <w:drawing>
+          <wp:inline distT="0" distB="0" distL="0" distR="0" wp14:anchorId="509D6A09" wp14:editId="41F9C85E">
+            <wp:extent cx="2905530" cy="6392167"/>
+            <wp:effectExtent l="0" t="0" r="9525" b="8890"/>
+            <wp:docPr id="11" name="Imagen 11"/>
+            <wp:cNvGraphicFramePr>
+              <a:graphicFrameLocks xmlns:a="http://schemas.openxmlformats.org/drawingml/2006/main" noChangeAspect="1"/>
+            </wp:cNvGraphicFramePr>
+            <a:graphic xmlns:a="http://schemas.openxmlformats.org/drawingml/2006/main">
+              <a:graphicData uri="http://schemas.openxmlformats.org/drawingml/2006/picture">
+                <pic:pic xmlns:pic="http://schemas.openxmlformats.org/drawingml/2006/picture">
+                  <pic:nvPicPr>
+                    <pic:cNvPr id="1" name=""/>
+                    <pic:cNvPicPr/>
+                  </pic:nvPicPr>
+                  <pic:blipFill>
+                    <a:blip r:embed="rId18"/>
+                    <a:stretch>
+                      <a:fillRect/>
+                    </a:stretch>
+                  </pic:blipFill>
+                  <pic:spPr>
+                    <a:xfrm>
+                      <a:off x="0" y="0"/>
+                      <a:ext cx="2905530" cy="6392167"/>
+                    </a:xfrm>
+                    <a:prstGeom prst="rect">
+                      <a:avLst/>
+                    </a:prstGeom>
+                  </pic:spPr>
+                </pic:pic>
+              </a:graphicData>
+            </a:graphic>
+          </wp:inline>
+        </w:drawing>
       </w:r>
     </w:p>
     <w:p>
@@ -3152,13 +3391,53 @@
       </w:pPr>
       <w:r>
         <w:rPr>
+          <w:b/>
+          <w:bCs/>
+          <w:u w:val="single"/>
+        </w:rPr>
+        <w:br w:type="page"/>
+      </w:r>
+    </w:p>
+    <w:p>
+      <w:pPr>
+        <w:spacing w:line="240" w:lineRule="auto"/>
+        <w:rPr>
+          <w:b/>
+          <w:bCs/>
+          <w:sz w:val="32"/>
+          <w:szCs w:val="32"/>
+          <w:u w:val="single"/>
+        </w:rPr>
+      </w:pPr>
+      <w:r>
+        <w:rPr>
           <w:rFonts w:ascii="Tahoma" w:hAnsi="Tahoma" w:cs="Tahoma"/>
           <w:b/>
           <w:bCs/>
           <w:color w:val="333399"/>
         </w:rPr>
         <w:lastRenderedPageBreak/>
-        <w:t>Plantilla para Descripción de Use Cases  (Trazo Intermedio)</w:t>
+        <w:t xml:space="preserve">Plantilla para Descripción de Use </w:t>
+      </w:r>
+      <w:proofErr w:type="gramStart"/>
+      <w:r>
+        <w:rPr>
+          <w:rFonts w:ascii="Tahoma" w:hAnsi="Tahoma" w:cs="Tahoma"/>
+          <w:b/>
+          <w:bCs/>
+          <w:color w:val="333399"/>
+        </w:rPr>
+        <w:t>Cases  (</w:t>
+      </w:r>
+      <w:proofErr w:type="gramEnd"/>
+      <w:r>
+        <w:rPr>
+          <w:rFonts w:ascii="Tahoma" w:hAnsi="Tahoma" w:cs="Tahoma"/>
+          <w:b/>
+          <w:bCs/>
+          <w:color w:val="333399"/>
+        </w:rPr>
+        <w:t>Trazo Intermedio)</w:t>
       </w:r>
     </w:p>
     <w:p>
@@ -3195,7 +3474,7 @@
           <w:left w:w="70" w:type="dxa"/>
           <w:right w:w="70" w:type="dxa"/>
         </w:tblCellMar>
-        <w:tblLook w:val="00AF" w:firstRow="1" w:lastRow="0" w:firstColumn="1" w:lastColumn="0" w:noHBand="0" w:noVBand="0"/>
+        <w:tblLook w:val="00A0" w:firstRow="1" w:lastRow="0" w:firstColumn="1" w:lastColumn="0" w:noHBand="0" w:noVBand="0"/>
       </w:tblPr>
       <w:tblGrid>
         <w:gridCol w:w="4389"/>
@@ -3205,12 +3484,6 @@
         <w:gridCol w:w="65"/>
       </w:tblGrid>
       <w:tr>
-        <w:tblPrEx>
-          <w:tblCellMar>
-            <w:top w:w="0" w:type="dxa"/>
-            <w:bottom w:w="0" w:type="dxa"/>
-          </w:tblCellMar>
-        </w:tblPrEx>
         <w:trPr>
           <w:gridAfter w:val="1"/>
           <w:wAfter w:w="5" w:type="dxa"/>
@@ -3244,12 +3517,6 @@
         </w:tc>
       </w:tr>
       <w:tr>
-        <w:tblPrEx>
-          <w:tblCellMar>
-            <w:top w:w="0" w:type="dxa"/>
-            <w:bottom w:w="0" w:type="dxa"/>
-          </w:tblCellMar>
-        </w:tblPrEx>
         <w:trPr>
           <w:gridAfter w:val="1"/>
           <w:wAfter w:w="5" w:type="dxa"/>
@@ -3328,12 +3595,6 @@
         </w:tc>
       </w:tr>
       <w:tr>
-        <w:tblPrEx>
-          <w:tblCellMar>
-            <w:top w:w="0" w:type="dxa"/>
-            <w:bottom w:w="0" w:type="dxa"/>
-          </w:tblCellMar>
-        </w:tblPrEx>
         <w:trPr>
           <w:gridAfter w:val="1"/>
           <w:wAfter w:w="5" w:type="dxa"/>
@@ -3403,12 +3664,6 @@
         </w:tc>
       </w:tr>
       <w:tr>
-        <w:tblPrEx>
-          <w:tblCellMar>
-            <w:top w:w="0" w:type="dxa"/>
-            <w:bottom w:w="0" w:type="dxa"/>
-          </w:tblCellMar>
-        </w:tblPrEx>
         <w:trPr>
           <w:gridAfter w:val="1"/>
           <w:wAfter w:w="5" w:type="dxa"/>
@@ -3505,7 +3760,7 @@
                     </wp:anchor>
                   </w:drawing>
                 </mc:Choice>
-                <mc:Fallback>
+                <mc:Fallback xmlns:cx1="http://schemas.microsoft.com/office/drawing/2015/9/8/chartex" xmlns:cx2="http://schemas.microsoft.com/office/drawing/2015/10/21/chartex" xmlns:cx3="http://schemas.microsoft.com/office/drawing/2016/5/9/chartex" xmlns:cx4="http://schemas.microsoft.com/office/drawing/2016/5/10/chartex" xmlns:cx5="http://schemas.microsoft.com/office/drawing/2016/5/11/chartex" xmlns:cx6="http://schemas.microsoft.com/office/drawing/2016/5/12/chartex" xmlns:cx7="http://schemas.microsoft.com/office/drawing/2016/5/13/chartex" xmlns:cx8="http://schemas.microsoft.com/office/drawing/2016/5/14/chartex" xmlns:aink="http://schemas.microsoft.com/office/drawing/2016/ink" xmlns:am3d="http://schemas.microsoft.com/office/drawing/2017/model3d" xmlns:oel="http://schemas.microsoft.com/office/2019/extlst" xmlns:w16cex="http://schemas.microsoft.com/office/word/2018/wordml/cex" xmlns:w16cid="http://schemas.microsoft.com/office/word/2016/wordml/cid" xmlns:w16="http://schemas.microsoft.com/office/word/2018/wordml" xmlns:w16du="http://schemas.microsoft.com/office/word/2023/wordml/word16du" xmlns:w16sdtdh="http://schemas.microsoft.com/office/word/2020/wordml/sdtdatahash" xmlns:w16sdtfl="http://schemas.microsoft.com/office/word/2024/wordml/sdtformatlock">
                   <w:pict>
                     <v:shapetype w14:anchorId="3CE4F9DD" id="_x0000_t11" coordsize="21600,21600" o:spt="11" adj="5400" path="m@0,l@0@0,0@0,0@2@0@2@0,21600@1,21600@1@2,21600@2,21600@0@1@0@1,xe">
                       <v:stroke joinstyle="miter"/>
@@ -3580,6 +3835,12 @@
               <w:rPr>
                 <w:rFonts w:ascii="Tahoma" w:hAnsi="Tahoma" w:cs="Tahoma"/>
               </w:rPr>
+              <w:fldChar w:fldCharType="separate"/>
+            </w:r>
+            <w:r>
+              <w:rPr>
+                <w:rFonts w:ascii="Tahoma" w:hAnsi="Tahoma" w:cs="Tahoma"/>
+              </w:rPr>
               <w:fldChar w:fldCharType="end"/>
             </w:r>
             <w:r>
@@ -3620,6 +3881,12 @@
               <w:rPr>
                 <w:rFonts w:ascii="Tahoma" w:hAnsi="Tahoma" w:cs="Tahoma"/>
               </w:rPr>
+              <w:fldChar w:fldCharType="separate"/>
+            </w:r>
+            <w:r>
+              <w:rPr>
+                <w:rFonts w:ascii="Tahoma" w:hAnsi="Tahoma" w:cs="Tahoma"/>
+              </w:rPr>
               <w:fldChar w:fldCharType="end"/>
             </w:r>
             <w:r>
@@ -3641,12 +3908,6 @@
         </w:tc>
       </w:tr>
       <w:tr>
-        <w:tblPrEx>
-          <w:tblCellMar>
-            <w:top w:w="0" w:type="dxa"/>
-            <w:bottom w:w="0" w:type="dxa"/>
-          </w:tblCellMar>
-        </w:tblPrEx>
         <w:trPr>
           <w:gridAfter w:val="1"/>
           <w:wAfter w:w="5" w:type="dxa"/>
@@ -3702,12 +3963,6 @@
         </w:tc>
       </w:tr>
       <w:tr>
-        <w:tblPrEx>
-          <w:tblCellMar>
-            <w:top w:w="0" w:type="dxa"/>
-            <w:bottom w:w="0" w:type="dxa"/>
-          </w:tblCellMar>
-        </w:tblPrEx>
         <w:trPr>
           <w:tblCellSpacing w:w="20" w:type="dxa"/>
           <w:jc w:val="center"/>
@@ -3728,6 +3983,7 @@
                 <w:szCs w:val="20"/>
               </w:rPr>
             </w:pPr>
+            <w:proofErr w:type="gramStart"/>
             <w:r>
               <w:rPr>
                 <w:rFonts w:ascii="Tahoma" w:hAnsi="Tahoma" w:cs="Tahoma"/>
@@ -3735,19 +3991,23 @@
                 <w:sz w:val="20"/>
                 <w:szCs w:val="20"/>
               </w:rPr>
-              <w:t>Flujo  Básico:</w:t>
+              <w:t>Flujo  Básico</w:t>
+            </w:r>
+            <w:proofErr w:type="gramEnd"/>
+            <w:r>
+              <w:rPr>
+                <w:rFonts w:ascii="Tahoma" w:hAnsi="Tahoma" w:cs="Tahoma"/>
+                <w:b/>
+                <w:sz w:val="20"/>
+                <w:szCs w:val="20"/>
+              </w:rPr>
+              <w:t>:</w:t>
             </w:r>
           </w:p>
           <w:p/>
         </w:tc>
       </w:tr>
       <w:tr>
-        <w:tblPrEx>
-          <w:tblCellMar>
-            <w:top w:w="0" w:type="dxa"/>
-            <w:bottom w:w="0" w:type="dxa"/>
-          </w:tblCellMar>
-        </w:tblPrEx>
         <w:trPr>
           <w:tblCellSpacing w:w="20" w:type="dxa"/>
           <w:jc w:val="center"/>
@@ -3782,12 +4042,6 @@
         </w:tc>
       </w:tr>
       <w:tr>
-        <w:tblPrEx>
-          <w:tblCellMar>
-            <w:top w:w="0" w:type="dxa"/>
-            <w:bottom w:w="0" w:type="dxa"/>
-          </w:tblCellMar>
-        </w:tblPrEx>
         <w:trPr>
           <w:tblCellSpacing w:w="20" w:type="dxa"/>
           <w:jc w:val="center"/>
@@ -3822,12 +4076,6 @@
         </w:tc>
       </w:tr>
       <w:tr>
-        <w:tblPrEx>
-          <w:tblCellMar>
-            <w:top w:w="0" w:type="dxa"/>
-            <w:bottom w:w="0" w:type="dxa"/>
-          </w:tblCellMar>
-        </w:tblPrEx>
         <w:trPr>
           <w:tblCellSpacing w:w="20" w:type="dxa"/>
           <w:jc w:val="center"/>
@@ -3862,12 +4110,6 @@
         </w:tc>
       </w:tr>
       <w:tr>
-        <w:tblPrEx>
-          <w:tblCellMar>
-            <w:top w:w="0" w:type="dxa"/>
-            <w:bottom w:w="0" w:type="dxa"/>
-          </w:tblCellMar>
-        </w:tblPrEx>
         <w:trPr>
           <w:tblCellSpacing w:w="20" w:type="dxa"/>
           <w:jc w:val="center"/>
@@ -3918,12 +4160,6 @@
         </w:tc>
       </w:tr>
       <w:tr>
-        <w:tblPrEx>
-          <w:tblCellMar>
-            <w:top w:w="0" w:type="dxa"/>
-            <w:bottom w:w="0" w:type="dxa"/>
-          </w:tblCellMar>
-        </w:tblPrEx>
         <w:trPr>
           <w:tblCellSpacing w:w="20" w:type="dxa"/>
           <w:jc w:val="center"/>
@@ -3958,12 +4194,6 @@
         </w:tc>
       </w:tr>
       <w:tr>
-        <w:tblPrEx>
-          <w:tblCellMar>
-            <w:top w:w="0" w:type="dxa"/>
-            <w:bottom w:w="0" w:type="dxa"/>
-          </w:tblCellMar>
-        </w:tblPrEx>
         <w:trPr>
           <w:tblCellSpacing w:w="20" w:type="dxa"/>
           <w:jc w:val="center"/>
@@ -3984,6 +4214,7 @@
                 <w:szCs w:val="20"/>
               </w:rPr>
             </w:pPr>
+            <w:proofErr w:type="gramStart"/>
             <w:r>
               <w:rPr>
                 <w:rFonts w:ascii="Tahoma" w:hAnsi="Tahoma" w:cs="Tahoma"/>
@@ -3991,19 +4222,23 @@
                 <w:sz w:val="20"/>
                 <w:szCs w:val="20"/>
               </w:rPr>
-              <w:t>Flujos  Alternativos:</w:t>
+              <w:t>Flujos  Alternativos</w:t>
+            </w:r>
+            <w:proofErr w:type="gramEnd"/>
+            <w:r>
+              <w:rPr>
+                <w:rFonts w:ascii="Tahoma" w:hAnsi="Tahoma" w:cs="Tahoma"/>
+                <w:b/>
+                <w:sz w:val="20"/>
+                <w:szCs w:val="20"/>
+              </w:rPr>
+              <w:t>:</w:t>
             </w:r>
           </w:p>
           <w:p/>
         </w:tc>
       </w:tr>
       <w:tr>
-        <w:tblPrEx>
-          <w:tblCellMar>
-            <w:top w:w="0" w:type="dxa"/>
-            <w:bottom w:w="0" w:type="dxa"/>
-          </w:tblCellMar>
-        </w:tblPrEx>
         <w:trPr>
           <w:tblCellSpacing w:w="20" w:type="dxa"/>
           <w:jc w:val="center"/>
@@ -4032,12 +4267,6 @@
         </w:tc>
       </w:tr>
       <w:tr>
-        <w:tblPrEx>
-          <w:tblCellMar>
-            <w:top w:w="0" w:type="dxa"/>
-            <w:bottom w:w="0" w:type="dxa"/>
-          </w:tblCellMar>
-        </w:tblPrEx>
         <w:trPr>
           <w:gridAfter w:val="1"/>
           <w:wAfter w:w="5" w:type="dxa"/>
@@ -4121,12 +4350,6 @@
         </w:tc>
       </w:tr>
       <w:tr>
-        <w:tblPrEx>
-          <w:tblCellMar>
-            <w:top w:w="0" w:type="dxa"/>
-            <w:bottom w:w="0" w:type="dxa"/>
-          </w:tblCellMar>
-        </w:tblPrEx>
         <w:trPr>
           <w:gridAfter w:val="1"/>
           <w:wAfter w:w="5" w:type="dxa"/>
@@ -4162,12 +4385,6 @@
         </w:tc>
       </w:tr>
       <w:tr>
-        <w:tblPrEx>
-          <w:tblCellMar>
-            <w:top w:w="0" w:type="dxa"/>
-            <w:bottom w:w="0" w:type="dxa"/>
-          </w:tblCellMar>
-        </w:tblPrEx>
         <w:trPr>
           <w:gridAfter w:val="1"/>
           <w:wAfter w:w="5" w:type="dxa"/>
@@ -4203,12 +4420,6 @@
         </w:tc>
       </w:tr>
       <w:tr>
-        <w:tblPrEx>
-          <w:tblCellMar>
-            <w:top w:w="0" w:type="dxa"/>
-            <w:bottom w:w="0" w:type="dxa"/>
-          </w:tblCellMar>
-        </w:tblPrEx>
         <w:trPr>
           <w:gridAfter w:val="1"/>
           <w:wAfter w:w="5" w:type="dxa"/>
@@ -4244,12 +4455,6 @@
         </w:tc>
       </w:tr>
       <w:tr>
-        <w:tblPrEx>
-          <w:tblCellMar>
-            <w:top w:w="0" w:type="dxa"/>
-            <w:bottom w:w="0" w:type="dxa"/>
-          </w:tblCellMar>
-        </w:tblPrEx>
         <w:trPr>
           <w:gridAfter w:val="1"/>
           <w:wAfter w:w="5" w:type="dxa"/>
@@ -4285,12 +4490,6 @@
         </w:tc>
       </w:tr>
       <w:tr>
-        <w:tblPrEx>
-          <w:tblCellMar>
-            <w:top w:w="0" w:type="dxa"/>
-            <w:bottom w:w="0" w:type="dxa"/>
-          </w:tblCellMar>
-        </w:tblPrEx>
         <w:trPr>
           <w:gridAfter w:val="1"/>
           <w:wAfter w:w="5" w:type="dxa"/>
@@ -4341,12 +4540,6 @@
         </w:tc>
       </w:tr>
       <w:tr>
-        <w:tblPrEx>
-          <w:tblCellMar>
-            <w:top w:w="0" w:type="dxa"/>
-            <w:bottom w:w="0" w:type="dxa"/>
-          </w:tblCellMar>
-        </w:tblPrEx>
         <w:trPr>
           <w:gridAfter w:val="1"/>
           <w:wAfter w:w="5" w:type="dxa"/>
@@ -4427,12 +4620,6 @@
         </w:tc>
       </w:tr>
       <w:tr>
-        <w:tblPrEx>
-          <w:tblCellMar>
-            <w:top w:w="0" w:type="dxa"/>
-            <w:bottom w:w="0" w:type="dxa"/>
-          </w:tblCellMar>
-        </w:tblPrEx>
         <w:trPr>
           <w:gridAfter w:val="1"/>
           <w:wAfter w:w="5" w:type="dxa"/>
@@ -4527,6 +4714,170 @@
     </w:p>
     <w:p>
       <w:pPr>
+        <w:pStyle w:val="Encabezado"/>
+        <w:tabs>
+          <w:tab w:val="clear" w:pos="4252"/>
+          <w:tab w:val="clear" w:pos="8504"/>
+        </w:tabs>
+        <w:jc w:val="center"/>
+        <w:rPr>
+          <w:rFonts w:ascii="Tahoma" w:hAnsi="Tahoma" w:cs="Tahoma"/>
+          <w:b/>
+          <w:bCs/>
+          <w:color w:val="333399"/>
+        </w:rPr>
+      </w:pPr>
+    </w:p>
+    <w:p>
+      <w:pPr>
+        <w:pStyle w:val="Ttulo2"/>
+        <w:rPr>
+          <w:b/>
+          <w:bCs/>
+          <w:u w:val="single"/>
+        </w:rPr>
+      </w:pPr>
+      <w:r>
+        <w:rPr>
+          <w:b/>
+          <w:bCs/>
+          <w:u w:val="single"/>
+        </w:rPr>
+        <w:lastRenderedPageBreak/>
+        <w:t>Prototipo de Consultar retiro agendado</w:t>
+      </w:r>
+    </w:p>
+    <w:p/>
+    <w:p/>
+    <w:p>
+      <w:r>
+        <w:rPr>
+          <w:noProof/>
+          <w:lang w:val="en-US" w:eastAsia="en-US"/>
+        </w:rPr>
+        <w:drawing>
+          <wp:anchor distT="0" distB="0" distL="114300" distR="114300" simplePos="0" relativeHeight="251665408" behindDoc="0" locked="0" layoutInCell="1" allowOverlap="1" wp14:anchorId="4F6A84A7" wp14:editId="2D7460F2">
+            <wp:simplePos x="0" y="0"/>
+            <wp:positionH relativeFrom="column">
+              <wp:posOffset>3067050</wp:posOffset>
+            </wp:positionH>
+            <wp:positionV relativeFrom="paragraph">
+              <wp:posOffset>9525</wp:posOffset>
+            </wp:positionV>
+            <wp:extent cx="2876550" cy="4534223"/>
+            <wp:effectExtent l="0" t="0" r="0" b="0"/>
+            <wp:wrapNone/>
+            <wp:docPr id="14" name="Imagen 14"/>
+            <wp:cNvGraphicFramePr>
+              <a:graphicFrameLocks xmlns:a="http://schemas.openxmlformats.org/drawingml/2006/main" noChangeAspect="1"/>
+            </wp:cNvGraphicFramePr>
+            <a:graphic xmlns:a="http://schemas.openxmlformats.org/drawingml/2006/main">
+              <a:graphicData uri="http://schemas.openxmlformats.org/drawingml/2006/picture">
+                <pic:pic xmlns:pic="http://schemas.openxmlformats.org/drawingml/2006/picture">
+                  <pic:nvPicPr>
+                    <pic:cNvPr id="1" name=""/>
+                    <pic:cNvPicPr/>
+                  </pic:nvPicPr>
+                  <pic:blipFill>
+                    <a:blip r:embed="rId19">
+                      <a:extLst>
+                        <a:ext uri="{28A0092B-C50C-407E-A947-70E740481C1C}">
+                          <a14:useLocalDpi xmlns:a14="http://schemas.microsoft.com/office/drawing/2010/main" val="0"/>
+                        </a:ext>
+                      </a:extLst>
+                    </a:blip>
+                    <a:stretch>
+                      <a:fillRect/>
+                    </a:stretch>
+                  </pic:blipFill>
+                  <pic:spPr>
+                    <a:xfrm>
+                      <a:off x="0" y="0"/>
+                      <a:ext cx="2878368" cy="4537089"/>
+                    </a:xfrm>
+                    <a:prstGeom prst="rect">
+                      <a:avLst/>
+                    </a:prstGeom>
+                  </pic:spPr>
+                </pic:pic>
+              </a:graphicData>
+            </a:graphic>
+            <wp14:sizeRelH relativeFrom="margin">
+              <wp14:pctWidth>0</wp14:pctWidth>
+            </wp14:sizeRelH>
+            <wp14:sizeRelV relativeFrom="margin">
+              <wp14:pctHeight>0</wp14:pctHeight>
+            </wp14:sizeRelV>
+          </wp:anchor>
+        </w:drawing>
+      </w:r>
+      <w:r>
+        <w:rPr>
+          <w:noProof/>
+          <w:lang w:val="en-US" w:eastAsia="en-US"/>
+        </w:rPr>
+        <w:drawing>
+          <wp:inline distT="0" distB="0" distL="0" distR="0" wp14:anchorId="76216942" wp14:editId="7ACFFCE3">
+            <wp:extent cx="2924583" cy="6706536"/>
+            <wp:effectExtent l="0" t="0" r="9525" b="0"/>
+            <wp:docPr id="13" name="Imagen 13"/>
+            <wp:cNvGraphicFramePr>
+              <a:graphicFrameLocks xmlns:a="http://schemas.openxmlformats.org/drawingml/2006/main" noChangeAspect="1"/>
+            </wp:cNvGraphicFramePr>
+            <a:graphic xmlns:a="http://schemas.openxmlformats.org/drawingml/2006/main">
+              <a:graphicData uri="http://schemas.openxmlformats.org/drawingml/2006/picture">
+                <pic:pic xmlns:pic="http://schemas.openxmlformats.org/drawingml/2006/picture">
+                  <pic:nvPicPr>
+                    <pic:cNvPr id="1" name=""/>
+                    <pic:cNvPicPr/>
+                  </pic:nvPicPr>
+                  <pic:blipFill>
+                    <a:blip r:embed="rId20"/>
+                    <a:stretch>
+                      <a:fillRect/>
+                    </a:stretch>
+                  </pic:blipFill>
+                  <pic:spPr>
+                    <a:xfrm>
+                      <a:off x="0" y="0"/>
+                      <a:ext cx="2924583" cy="6706536"/>
+                    </a:xfrm>
+                    <a:prstGeom prst="rect">
+                      <a:avLst/>
+                    </a:prstGeom>
+                  </pic:spPr>
+                </pic:pic>
+              </a:graphicData>
+            </a:graphic>
+          </wp:inline>
+        </w:drawing>
+      </w:r>
+      <w:r>
+        <w:rPr>
+          <w:noProof/>
+          <w:lang w:val="en-US" w:eastAsia="en-US"/>
+        </w:rPr>
+        <w:t xml:space="preserve"> </w:t>
+      </w:r>
+    </w:p>
+    <w:p>
+      <w:pPr>
+        <w:pStyle w:val="Encabezado"/>
+        <w:tabs>
+          <w:tab w:val="clear" w:pos="4252"/>
+          <w:tab w:val="clear" w:pos="8504"/>
+        </w:tabs>
+        <w:jc w:val="center"/>
+        <w:rPr>
+          <w:rFonts w:ascii="Tahoma" w:hAnsi="Tahoma" w:cs="Tahoma"/>
+          <w:b/>
+          <w:bCs/>
+          <w:color w:val="333399"/>
+        </w:rPr>
+      </w:pPr>
+    </w:p>
+    <w:p>
+      <w:pPr>
         <w:spacing w:line="240" w:lineRule="auto"/>
         <w:rPr>
           <w:b/>
@@ -4544,18 +4895,6 @@
         </w:rPr>
         <w:br w:type="page"/>
       </w:r>
-    </w:p>
-    <w:p>
-      <w:pPr>
-        <w:spacing w:line="240" w:lineRule="auto"/>
-        <w:rPr>
-          <w:b/>
-          <w:bCs/>
-          <w:sz w:val="32"/>
-          <w:szCs w:val="32"/>
-          <w:u w:val="single"/>
-        </w:rPr>
-      </w:pPr>
       <w:r>
         <w:rPr>
           <w:rFonts w:ascii="Tahoma" w:hAnsi="Tahoma" w:cs="Tahoma"/>
@@ -4564,7 +4903,27 @@
           <w:color w:val="333399"/>
         </w:rPr>
         <w:lastRenderedPageBreak/>
-        <w:t>Plantilla para Descripción de Use Cases  (Trazo Intermedio)</w:t>
+        <w:t xml:space="preserve">Plantilla para Descripción de Use </w:t>
+      </w:r>
+      <w:proofErr w:type="gramStart"/>
+      <w:r>
+        <w:rPr>
+          <w:rFonts w:ascii="Tahoma" w:hAnsi="Tahoma" w:cs="Tahoma"/>
+          <w:b/>
+          <w:bCs/>
+          <w:color w:val="333399"/>
+        </w:rPr>
+        <w:t>Cases  (</w:t>
+      </w:r>
+      <w:proofErr w:type="gramEnd"/>
+      <w:r>
+        <w:rPr>
+          <w:rFonts w:ascii="Tahoma" w:hAnsi="Tahoma" w:cs="Tahoma"/>
+          <w:b/>
+          <w:bCs/>
+          <w:color w:val="333399"/>
+        </w:rPr>
+        <w:t>Trazo Intermedio)</w:t>
       </w:r>
     </w:p>
     <w:p>
@@ -4601,7 +4960,7 @@
           <w:left w:w="70" w:type="dxa"/>
           <w:right w:w="70" w:type="dxa"/>
         </w:tblCellMar>
-        <w:tblLook w:val="00AF" w:firstRow="1" w:lastRow="0" w:firstColumn="1" w:lastColumn="0" w:noHBand="0" w:noVBand="0"/>
+        <w:tblLook w:val="00A0" w:firstRow="1" w:lastRow="0" w:firstColumn="1" w:lastColumn="0" w:noHBand="0" w:noVBand="0"/>
       </w:tblPr>
       <w:tblGrid>
         <w:gridCol w:w="4389"/>
@@ -4611,12 +4970,6 @@
         <w:gridCol w:w="65"/>
       </w:tblGrid>
       <w:tr>
-        <w:tblPrEx>
-          <w:tblCellMar>
-            <w:top w:w="0" w:type="dxa"/>
-            <w:bottom w:w="0" w:type="dxa"/>
-          </w:tblCellMar>
-        </w:tblPrEx>
         <w:trPr>
           <w:gridAfter w:val="1"/>
           <w:wAfter w:w="5" w:type="dxa"/>
@@ -4650,12 +5003,6 @@
         </w:tc>
       </w:tr>
       <w:tr>
-        <w:tblPrEx>
-          <w:tblCellMar>
-            <w:top w:w="0" w:type="dxa"/>
-            <w:bottom w:w="0" w:type="dxa"/>
-          </w:tblCellMar>
-        </w:tblPrEx>
         <w:trPr>
           <w:gridAfter w:val="1"/>
           <w:wAfter w:w="5" w:type="dxa"/>
@@ -4727,12 +5074,6 @@
         </w:tc>
       </w:tr>
       <w:tr>
-        <w:tblPrEx>
-          <w:tblCellMar>
-            <w:top w:w="0" w:type="dxa"/>
-            <w:bottom w:w="0" w:type="dxa"/>
-          </w:tblCellMar>
-        </w:tblPrEx>
         <w:trPr>
           <w:gridAfter w:val="1"/>
           <w:wAfter w:w="5" w:type="dxa"/>
@@ -4802,12 +5143,6 @@
         </w:tc>
       </w:tr>
       <w:tr>
-        <w:tblPrEx>
-          <w:tblCellMar>
-            <w:top w:w="0" w:type="dxa"/>
-            <w:bottom w:w="0" w:type="dxa"/>
-          </w:tblCellMar>
-        </w:tblPrEx>
         <w:trPr>
           <w:gridAfter w:val="1"/>
           <w:wAfter w:w="5" w:type="dxa"/>
@@ -4904,7 +5239,7 @@
                     </wp:anchor>
                   </w:drawing>
                 </mc:Choice>
-                <mc:Fallback>
+                <mc:Fallback xmlns:cx1="http://schemas.microsoft.com/office/drawing/2015/9/8/chartex" xmlns:cx2="http://schemas.microsoft.com/office/drawing/2015/10/21/chartex" xmlns:cx3="http://schemas.microsoft.com/office/drawing/2016/5/9/chartex" xmlns:cx4="http://schemas.microsoft.com/office/drawing/2016/5/10/chartex" xmlns:cx5="http://schemas.microsoft.com/office/drawing/2016/5/11/chartex" xmlns:cx6="http://schemas.microsoft.com/office/drawing/2016/5/12/chartex" xmlns:cx7="http://schemas.microsoft.com/office/drawing/2016/5/13/chartex" xmlns:cx8="http://schemas.microsoft.com/office/drawing/2016/5/14/chartex" xmlns:aink="http://schemas.microsoft.com/office/drawing/2016/ink" xmlns:am3d="http://schemas.microsoft.com/office/drawing/2017/model3d" xmlns:oel="http://schemas.microsoft.com/office/2019/extlst" xmlns:w16cex="http://schemas.microsoft.com/office/word/2018/wordml/cex" xmlns:w16cid="http://schemas.microsoft.com/office/word/2016/wordml/cid" xmlns:w16="http://schemas.microsoft.com/office/word/2018/wordml" xmlns:w16du="http://schemas.microsoft.com/office/word/2023/wordml/word16du" xmlns:w16sdtdh="http://schemas.microsoft.com/office/word/2020/wordml/sdtdatahash" xmlns:w16sdtfl="http://schemas.microsoft.com/office/word/2024/wordml/sdtformatlock">
                   <w:pict>
                     <v:shape w14:anchorId="263415CC" id="Cruz 6" o:spid="_x0000_s1026" type="#_x0000_t11" style="position:absolute;margin-left:146.35pt;margin-top:.65pt;width:10.5pt;height:11.25pt;z-index:251663360;visibility:visible;mso-wrap-style:square;mso-width-percent:0;mso-height-percent:0;mso-wrap-distance-left:9pt;mso-wrap-distance-top:0;mso-wrap-distance-right:9pt;mso-wrap-distance-bottom:0;mso-position-horizontal:absolute;mso-position-horizontal-relative:text;mso-position-vertical:absolute;mso-position-vertical-relative:text;mso-width-percent:0;mso-height-percent:0;mso-width-relative:page;mso-height-relative:page;v-text-anchor:top" o:gfxdata="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" fillcolor="black" strokecolor="#f2f2f2" strokeweight="3pt">
                       <v:shadow on="t" color="#7f7f7f" opacity=".5" offset="1pt"/>
@@ -4960,6 +5295,12 @@
               <w:rPr>
                 <w:rFonts w:ascii="Tahoma" w:hAnsi="Tahoma" w:cs="Tahoma"/>
               </w:rPr>
+              <w:fldChar w:fldCharType="separate"/>
+            </w:r>
+            <w:r>
+              <w:rPr>
+                <w:rFonts w:ascii="Tahoma" w:hAnsi="Tahoma" w:cs="Tahoma"/>
+              </w:rPr>
               <w:fldChar w:fldCharType="end"/>
             </w:r>
             <w:r>
@@ -5000,6 +5341,12 @@
               <w:rPr>
                 <w:rFonts w:ascii="Tahoma" w:hAnsi="Tahoma" w:cs="Tahoma"/>
               </w:rPr>
+              <w:fldChar w:fldCharType="separate"/>
+            </w:r>
+            <w:r>
+              <w:rPr>
+                <w:rFonts w:ascii="Tahoma" w:hAnsi="Tahoma" w:cs="Tahoma"/>
+              </w:rPr>
               <w:fldChar w:fldCharType="end"/>
             </w:r>
             <w:r>
@@ -5021,12 +5368,6 @@
         </w:tc>
       </w:tr>
       <w:tr>
-        <w:tblPrEx>
-          <w:tblCellMar>
-            <w:top w:w="0" w:type="dxa"/>
-            <w:bottom w:w="0" w:type="dxa"/>
-          </w:tblCellMar>
-        </w:tblPrEx>
         <w:trPr>
           <w:gridAfter w:val="1"/>
           <w:wAfter w:w="5" w:type="dxa"/>
@@ -5083,12 +5424,6 @@
         </w:tc>
       </w:tr>
       <w:tr>
-        <w:tblPrEx>
-          <w:tblCellMar>
-            <w:top w:w="0" w:type="dxa"/>
-            <w:bottom w:w="0" w:type="dxa"/>
-          </w:tblCellMar>
-        </w:tblPrEx>
         <w:trPr>
           <w:tblCellSpacing w:w="20" w:type="dxa"/>
           <w:jc w:val="center"/>
@@ -5109,6 +5444,7 @@
                 <w:szCs w:val="20"/>
               </w:rPr>
             </w:pPr>
+            <w:proofErr w:type="gramStart"/>
             <w:r>
               <w:rPr>
                 <w:rFonts w:ascii="Tahoma" w:hAnsi="Tahoma" w:cs="Tahoma"/>
@@ -5116,19 +5452,23 @@
                 <w:sz w:val="20"/>
                 <w:szCs w:val="20"/>
               </w:rPr>
-              <w:t>Flujo  Básico:</w:t>
+              <w:t>Flujo  Básico</w:t>
+            </w:r>
+            <w:proofErr w:type="gramEnd"/>
+            <w:r>
+              <w:rPr>
+                <w:rFonts w:ascii="Tahoma" w:hAnsi="Tahoma" w:cs="Tahoma"/>
+                <w:b/>
+                <w:sz w:val="20"/>
+                <w:szCs w:val="20"/>
+              </w:rPr>
+              <w:t>:</w:t>
             </w:r>
           </w:p>
           <w:p/>
         </w:tc>
       </w:tr>
       <w:tr>
-        <w:tblPrEx>
-          <w:tblCellMar>
-            <w:top w:w="0" w:type="dxa"/>
-            <w:bottom w:w="0" w:type="dxa"/>
-          </w:tblCellMar>
-        </w:tblPrEx>
         <w:trPr>
           <w:tblCellSpacing w:w="20" w:type="dxa"/>
           <w:jc w:val="center"/>
@@ -5163,12 +5503,6 @@
         </w:tc>
       </w:tr>
       <w:tr>
-        <w:tblPrEx>
-          <w:tblCellMar>
-            <w:top w:w="0" w:type="dxa"/>
-            <w:bottom w:w="0" w:type="dxa"/>
-          </w:tblCellMar>
-        </w:tblPrEx>
         <w:trPr>
           <w:tblCellSpacing w:w="20" w:type="dxa"/>
           <w:jc w:val="center"/>
@@ -5203,12 +5537,6 @@
         </w:tc>
       </w:tr>
       <w:tr>
-        <w:tblPrEx>
-          <w:tblCellMar>
-            <w:top w:w="0" w:type="dxa"/>
-            <w:bottom w:w="0" w:type="dxa"/>
-          </w:tblCellMar>
-        </w:tblPrEx>
         <w:trPr>
           <w:tblCellSpacing w:w="20" w:type="dxa"/>
           <w:jc w:val="center"/>
@@ -5243,12 +5571,6 @@
         </w:tc>
       </w:tr>
       <w:tr>
-        <w:tblPrEx>
-          <w:tblCellMar>
-            <w:top w:w="0" w:type="dxa"/>
-            <w:bottom w:w="0" w:type="dxa"/>
-          </w:tblCellMar>
-        </w:tblPrEx>
         <w:trPr>
           <w:tblCellSpacing w:w="20" w:type="dxa"/>
           <w:jc w:val="center"/>
@@ -5283,12 +5605,6 @@
         </w:tc>
       </w:tr>
       <w:tr>
-        <w:tblPrEx>
-          <w:tblCellMar>
-            <w:top w:w="0" w:type="dxa"/>
-            <w:bottom w:w="0" w:type="dxa"/>
-          </w:tblCellMar>
-        </w:tblPrEx>
         <w:trPr>
           <w:tblCellSpacing w:w="20" w:type="dxa"/>
           <w:jc w:val="center"/>
@@ -5323,12 +5639,6 @@
         </w:tc>
       </w:tr>
       <w:tr>
-        <w:tblPrEx>
-          <w:tblCellMar>
-            <w:top w:w="0" w:type="dxa"/>
-            <w:bottom w:w="0" w:type="dxa"/>
-          </w:tblCellMar>
-        </w:tblPrEx>
         <w:trPr>
           <w:tblCellSpacing w:w="20" w:type="dxa"/>
           <w:jc w:val="center"/>
@@ -5363,12 +5673,6 @@
         </w:tc>
       </w:tr>
       <w:tr>
-        <w:tblPrEx>
-          <w:tblCellMar>
-            <w:top w:w="0" w:type="dxa"/>
-            <w:bottom w:w="0" w:type="dxa"/>
-          </w:tblCellMar>
-        </w:tblPrEx>
         <w:trPr>
           <w:tblCellSpacing w:w="20" w:type="dxa"/>
           <w:jc w:val="center"/>
@@ -5411,12 +5715,6 @@
         </w:tc>
       </w:tr>
       <w:tr>
-        <w:tblPrEx>
-          <w:tblCellMar>
-            <w:top w:w="0" w:type="dxa"/>
-            <w:bottom w:w="0" w:type="dxa"/>
-          </w:tblCellMar>
-        </w:tblPrEx>
         <w:trPr>
           <w:tblCellSpacing w:w="20" w:type="dxa"/>
           <w:jc w:val="center"/>
@@ -5451,12 +5749,6 @@
         </w:tc>
       </w:tr>
       <w:tr>
-        <w:tblPrEx>
-          <w:tblCellMar>
-            <w:top w:w="0" w:type="dxa"/>
-            <w:bottom w:w="0" w:type="dxa"/>
-          </w:tblCellMar>
-        </w:tblPrEx>
         <w:trPr>
           <w:tblCellSpacing w:w="20" w:type="dxa"/>
           <w:jc w:val="center"/>
@@ -5490,12 +5782,6 @@
         </w:tc>
       </w:tr>
       <w:tr>
-        <w:tblPrEx>
-          <w:tblCellMar>
-            <w:top w:w="0" w:type="dxa"/>
-            <w:bottom w:w="0" w:type="dxa"/>
-          </w:tblCellMar>
-        </w:tblPrEx>
         <w:trPr>
           <w:tblCellSpacing w:w="20" w:type="dxa"/>
           <w:jc w:val="center"/>
@@ -5524,12 +5810,6 @@
         </w:tc>
       </w:tr>
       <w:tr>
-        <w:tblPrEx>
-          <w:tblCellMar>
-            <w:top w:w="0" w:type="dxa"/>
-            <w:bottom w:w="0" w:type="dxa"/>
-          </w:tblCellMar>
-        </w:tblPrEx>
         <w:trPr>
           <w:gridAfter w:val="1"/>
           <w:wAfter w:w="5" w:type="dxa"/>
@@ -5613,12 +5893,6 @@
         </w:tc>
       </w:tr>
       <w:tr>
-        <w:tblPrEx>
-          <w:tblCellMar>
-            <w:top w:w="0" w:type="dxa"/>
-            <w:bottom w:w="0" w:type="dxa"/>
-          </w:tblCellMar>
-        </w:tblPrEx>
         <w:trPr>
           <w:gridAfter w:val="1"/>
           <w:wAfter w:w="5" w:type="dxa"/>
@@ -5654,12 +5928,6 @@
         </w:tc>
       </w:tr>
       <w:tr>
-        <w:tblPrEx>
-          <w:tblCellMar>
-            <w:top w:w="0" w:type="dxa"/>
-            <w:bottom w:w="0" w:type="dxa"/>
-          </w:tblCellMar>
-        </w:tblPrEx>
         <w:trPr>
           <w:gridAfter w:val="1"/>
           <w:wAfter w:w="5" w:type="dxa"/>
@@ -5695,12 +5963,6 @@
         </w:tc>
       </w:tr>
       <w:tr>
-        <w:tblPrEx>
-          <w:tblCellMar>
-            <w:top w:w="0" w:type="dxa"/>
-            <w:bottom w:w="0" w:type="dxa"/>
-          </w:tblCellMar>
-        </w:tblPrEx>
         <w:trPr>
           <w:gridAfter w:val="1"/>
           <w:wAfter w:w="5" w:type="dxa"/>
@@ -5736,12 +5998,6 @@
         </w:tc>
       </w:tr>
       <w:tr>
-        <w:tblPrEx>
-          <w:tblCellMar>
-            <w:top w:w="0" w:type="dxa"/>
-            <w:bottom w:w="0" w:type="dxa"/>
-          </w:tblCellMar>
-        </w:tblPrEx>
         <w:trPr>
           <w:gridAfter w:val="1"/>
           <w:wAfter w:w="5" w:type="dxa"/>
@@ -5777,12 +6033,6 @@
         </w:tc>
       </w:tr>
       <w:tr>
-        <w:tblPrEx>
-          <w:tblCellMar>
-            <w:top w:w="0" w:type="dxa"/>
-            <w:bottom w:w="0" w:type="dxa"/>
-          </w:tblCellMar>
-        </w:tblPrEx>
         <w:trPr>
           <w:gridAfter w:val="1"/>
           <w:wAfter w:w="5" w:type="dxa"/>
@@ -5834,12 +6084,6 @@
         </w:tc>
       </w:tr>
       <w:tr>
-        <w:tblPrEx>
-          <w:tblCellMar>
-            <w:top w:w="0" w:type="dxa"/>
-            <w:bottom w:w="0" w:type="dxa"/>
-          </w:tblCellMar>
-        </w:tblPrEx>
         <w:trPr>
           <w:gridAfter w:val="1"/>
           <w:wAfter w:w="5" w:type="dxa"/>
@@ -5919,12 +6163,6 @@
         </w:tc>
       </w:tr>
       <w:tr>
-        <w:tblPrEx>
-          <w:tblCellMar>
-            <w:top w:w="0" w:type="dxa"/>
-            <w:bottom w:w="0" w:type="dxa"/>
-          </w:tblCellMar>
-        </w:tblPrEx>
         <w:trPr>
           <w:gridAfter w:val="1"/>
           <w:wAfter w:w="5" w:type="dxa"/>
@@ -6004,6 +6242,95 @@
     <w:p/>
     <w:p>
       <w:pPr>
+        <w:pStyle w:val="Ttulo2"/>
+        <w:rPr>
+          <w:b/>
+          <w:bCs/>
+          <w:u w:val="single"/>
+        </w:rPr>
+      </w:pPr>
+      <w:r>
+        <w:rPr>
+          <w:b/>
+          <w:bCs/>
+          <w:u w:val="single"/>
+        </w:rPr>
+        <w:lastRenderedPageBreak/>
+        <w:t>Prototipo de Modificar nuevo retiro</w:t>
+      </w:r>
+    </w:p>
+    <w:p>
+      <w:pPr>
+        <w:spacing w:line="240" w:lineRule="auto"/>
+        <w:rPr>
+          <w:b/>
+          <w:bCs/>
+          <w:u w:val="single"/>
+        </w:rPr>
+      </w:pPr>
+      <w:r>
+        <w:rPr>
+          <w:b/>
+          <w:bCs/>
+          <w:noProof/>
+          <w:sz w:val="32"/>
+          <w:szCs w:val="32"/>
+          <w:u w:val="single"/>
+          <w:lang w:val="en-US" w:eastAsia="en-US"/>
+        </w:rPr>
+        <w:drawing>
+          <wp:anchor distT="0" distB="0" distL="114300" distR="114300" simplePos="0" relativeHeight="251666432" behindDoc="0" locked="0" layoutInCell="1" allowOverlap="1" wp14:anchorId="194B9492" wp14:editId="6B8F9C8C">
+            <wp:simplePos x="0" y="0"/>
+            <wp:positionH relativeFrom="column">
+              <wp:posOffset>2867025</wp:posOffset>
+            </wp:positionH>
+            <wp:positionV relativeFrom="paragraph">
+              <wp:posOffset>150495</wp:posOffset>
+            </wp:positionV>
+            <wp:extent cx="2381250" cy="6125210"/>
+            <wp:effectExtent l="0" t="0" r="0" b="8890"/>
+            <wp:wrapNone/>
+            <wp:docPr id="16" name="Imagen 16"/>
+            <wp:cNvGraphicFramePr>
+              <a:graphicFrameLocks xmlns:a="http://schemas.openxmlformats.org/drawingml/2006/main" noChangeAspect="1"/>
+            </wp:cNvGraphicFramePr>
+            <a:graphic xmlns:a="http://schemas.openxmlformats.org/drawingml/2006/main">
+              <a:graphicData uri="http://schemas.openxmlformats.org/drawingml/2006/picture">
+                <pic:pic xmlns:pic="http://schemas.openxmlformats.org/drawingml/2006/picture">
+                  <pic:nvPicPr>
+                    <pic:cNvPr id="1" name=""/>
+                    <pic:cNvPicPr/>
+                  </pic:nvPicPr>
+                  <pic:blipFill>
+                    <a:blip r:embed="rId21">
+                      <a:extLst>
+                        <a:ext uri="{28A0092B-C50C-407E-A947-70E740481C1C}">
+                          <a14:useLocalDpi xmlns:a14="http://schemas.microsoft.com/office/drawing/2010/main" val="0"/>
+                        </a:ext>
+                      </a:extLst>
+                    </a:blip>
+                    <a:stretch>
+                      <a:fillRect/>
+                    </a:stretch>
+                  </pic:blipFill>
+                  <pic:spPr>
+                    <a:xfrm>
+                      <a:off x="0" y="0"/>
+                      <a:ext cx="2381250" cy="6125210"/>
+                    </a:xfrm>
+                    <a:prstGeom prst="rect">
+                      <a:avLst/>
+                    </a:prstGeom>
+                  </pic:spPr>
+                </pic:pic>
+              </a:graphicData>
+            </a:graphic>
+          </wp:anchor>
+        </w:drawing>
+      </w:r>
+    </w:p>
+    <w:p>
+      <w:pPr>
         <w:spacing w:line="240" w:lineRule="auto"/>
         <w:rPr>
           <w:b/>
@@ -6017,10 +6344,54 @@
         <w:rPr>
           <w:b/>
           <w:bCs/>
+          <w:noProof/>
+          <w:sz w:val="32"/>
+          <w:szCs w:val="32"/>
           <w:u w:val="single"/>
-        </w:rPr>
-        <w:lastRenderedPageBreak/>
-        <w:br w:type="page"/>
+          <w:lang w:val="en-US" w:eastAsia="en-US"/>
+        </w:rPr>
+        <w:drawing>
+          <wp:inline distT="0" distB="0" distL="0" distR="0" wp14:anchorId="0F60F6A5" wp14:editId="15E2DBFB">
+            <wp:extent cx="2467319" cy="5382376"/>
+            <wp:effectExtent l="0" t="0" r="9525" b="8890"/>
+            <wp:docPr id="15" name="Imagen 15"/>
+            <wp:cNvGraphicFramePr>
+              <a:graphicFrameLocks xmlns:a="http://schemas.openxmlformats.org/drawingml/2006/main" noChangeAspect="1"/>
+            </wp:cNvGraphicFramePr>
+            <a:graphic xmlns:a="http://schemas.openxmlformats.org/drawingml/2006/main">
+              <a:graphicData uri="http://schemas.openxmlformats.org/drawingml/2006/picture">
+                <pic:pic xmlns:pic="http://schemas.openxmlformats.org/drawingml/2006/picture">
+                  <pic:nvPicPr>
+                    <pic:cNvPr id="1" name=""/>
+                    <pic:cNvPicPr/>
+                  </pic:nvPicPr>
+                  <pic:blipFill>
+                    <a:blip r:embed="rId22"/>
+                    <a:stretch>
+                      <a:fillRect/>
+                    </a:stretch>
+                  </pic:blipFill>
+                  <pic:spPr>
+                    <a:xfrm>
+                      <a:off x="0" y="0"/>
+                      <a:ext cx="2467319" cy="5382376"/>
+                    </a:xfrm>
+                    <a:prstGeom prst="rect">
+                      <a:avLst/>
+                    </a:prstGeom>
+                  </pic:spPr>
+                </pic:pic>
+              </a:graphicData>
+            </a:graphic>
+          </wp:inline>
+        </w:drawing>
+      </w:r>
+      <w:r>
+        <w:rPr>
+          <w:noProof/>
+          <w:lang w:val="en-US" w:eastAsia="en-US"/>
+        </w:rPr>
+        <w:t xml:space="preserve"> </w:t>
       </w:r>
     </w:p>
     <w:p>
@@ -6032,41 +6403,178 @@
           <w:u w:val="single"/>
         </w:rPr>
       </w:pPr>
-      <w:r>
+    </w:p>
+    <w:p>
+      <w:pPr>
+        <w:pStyle w:val="Ttulo2"/>
         <w:rPr>
           <w:b/>
           <w:bCs/>
           <w:u w:val="single"/>
         </w:rPr>
-        <w:lastRenderedPageBreak/>
-        <w:t>Git log de la</w:t>
-      </w:r>
-      <w:r>
+      </w:pPr>
+    </w:p>
+    <w:p>
+      <w:pPr>
+        <w:pStyle w:val="Ttulo2"/>
         <w:rPr>
           <w:b/>
           <w:bCs/>
           <w:u w:val="single"/>
         </w:rPr>
-        <w:t xml:space="preserve"> tercera</w:t>
-      </w:r>
-      <w:r>
+      </w:pPr>
+    </w:p>
+    <w:p>
+      <w:pPr>
+        <w:pStyle w:val="Ttulo2"/>
         <w:rPr>
           <w:b/>
           <w:bCs/>
           <w:u w:val="single"/>
         </w:rPr>
-        <w:t xml:space="preserve"> entrega</w:t>
-      </w:r>
-      <w:bookmarkEnd w:id="3"/>
+      </w:pPr>
     </w:p>
     <w:p/>
+    <w:p>
+      <w:pPr>
+        <w:pStyle w:val="Ttulo2"/>
+        <w:rPr>
+          <w:b/>
+          <w:bCs/>
+          <w:u w:val="single"/>
+        </w:rPr>
+      </w:pPr>
+      <w:proofErr w:type="spellStart"/>
+      <w:r>
+        <w:rPr>
+          <w:b/>
+          <w:bCs/>
+          <w:u w:val="single"/>
+        </w:rPr>
+        <w:lastRenderedPageBreak/>
+        <w:t>Git</w:t>
+      </w:r>
+      <w:proofErr w:type="spellEnd"/>
+      <w:r>
+        <w:rPr>
+          <w:b/>
+          <w:bCs/>
+          <w:u w:val="single"/>
+        </w:rPr>
+        <w:t xml:space="preserve"> log de la</w:t>
+      </w:r>
+      <w:r>
+        <w:rPr>
+          <w:b/>
+          <w:bCs/>
+          <w:u w:val="single"/>
+        </w:rPr>
+        <w:t xml:space="preserve"> tercera</w:t>
+      </w:r>
+      <w:r>
+        <w:rPr>
+          <w:b/>
+          <w:bCs/>
+          <w:u w:val="single"/>
+        </w:rPr>
+        <w:t xml:space="preserve"> entrega</w:t>
+      </w:r>
+      <w:bookmarkEnd w:id="4"/>
+    </w:p>
+    <w:p>
+      <w:r>
+        <w:rPr>
+          <w:noProof/>
+          <w:lang w:val="en-US" w:eastAsia="en-US"/>
+        </w:rPr>
+        <w:drawing>
+          <wp:inline distT="0" distB="0" distL="0" distR="0" wp14:anchorId="42DDB552" wp14:editId="2B5F4B03">
+            <wp:extent cx="5580094" cy="4610100"/>
+            <wp:effectExtent l="0" t="0" r="1905" b="0"/>
+            <wp:docPr id="17" name="Imagen 17"/>
+            <wp:cNvGraphicFramePr>
+              <a:graphicFrameLocks xmlns:a="http://schemas.openxmlformats.org/drawingml/2006/main" noChangeAspect="1"/>
+            </wp:cNvGraphicFramePr>
+            <a:graphic xmlns:a="http://schemas.openxmlformats.org/drawingml/2006/main">
+              <a:graphicData uri="http://schemas.openxmlformats.org/drawingml/2006/picture">
+                <pic:pic xmlns:pic="http://schemas.openxmlformats.org/drawingml/2006/picture">
+                  <pic:nvPicPr>
+                    <pic:cNvPr id="1" name=""/>
+                    <pic:cNvPicPr/>
+                  </pic:nvPicPr>
+                  <pic:blipFill>
+                    <a:blip r:embed="rId23"/>
+                    <a:stretch>
+                      <a:fillRect/>
+                    </a:stretch>
+                  </pic:blipFill>
+                  <pic:spPr>
+                    <a:xfrm>
+                      <a:off x="0" y="0"/>
+                      <a:ext cx="5584862" cy="4614039"/>
+                    </a:xfrm>
+                    <a:prstGeom prst="rect">
+                      <a:avLst/>
+                    </a:prstGeom>
+                  </pic:spPr>
+                </pic:pic>
+              </a:graphicData>
+            </a:graphic>
+          </wp:inline>
+        </w:drawing>
+      </w:r>
+    </w:p>
+    <w:p>
+      <w:r>
+        <w:rPr>
+          <w:noProof/>
+          <w:lang w:val="en-US" w:eastAsia="en-US"/>
+        </w:rPr>
+        <w:lastRenderedPageBreak/>
+        <w:drawing>
+          <wp:inline distT="0" distB="0" distL="0" distR="0" wp14:anchorId="1CCFE1C3" wp14:editId="3CADEE00">
+            <wp:extent cx="5362575" cy="4757755"/>
+            <wp:effectExtent l="0" t="0" r="0" b="5080"/>
+            <wp:docPr id="18" name="Imagen 18"/>
+            <wp:cNvGraphicFramePr>
+              <a:graphicFrameLocks xmlns:a="http://schemas.openxmlformats.org/drawingml/2006/main" noChangeAspect="1"/>
+            </wp:cNvGraphicFramePr>
+            <a:graphic xmlns:a="http://schemas.openxmlformats.org/drawingml/2006/main">
+              <a:graphicData uri="http://schemas.openxmlformats.org/drawingml/2006/picture">
+                <pic:pic xmlns:pic="http://schemas.openxmlformats.org/drawingml/2006/picture">
+                  <pic:nvPicPr>
+                    <pic:cNvPr id="1" name=""/>
+                    <pic:cNvPicPr/>
+                  </pic:nvPicPr>
+                  <pic:blipFill>
+                    <a:blip r:embed="rId24"/>
+                    <a:stretch>
+                      <a:fillRect/>
+                    </a:stretch>
+                  </pic:blipFill>
+                  <pic:spPr>
+                    <a:xfrm>
+                      <a:off x="0" y="0"/>
+                      <a:ext cx="5367230" cy="4761885"/>
+                    </a:xfrm>
+                    <a:prstGeom prst="rect">
+                      <a:avLst/>
+                    </a:prstGeom>
+                  </pic:spPr>
+                </pic:pic>
+              </a:graphicData>
+            </a:graphic>
+          </wp:inline>
+        </w:drawing>
+      </w:r>
+    </w:p>
     <w:sectPr>
-      <w:headerReference w:type="even" r:id="rId16"/>
-      <w:headerReference w:type="default" r:id="rId17"/>
-      <w:footerReference w:type="even" r:id="rId18"/>
-      <w:footerReference w:type="default" r:id="rId19"/>
-      <w:headerReference w:type="first" r:id="rId20"/>
-      <w:footerReference w:type="first" r:id="rId21"/>
+      <w:headerReference w:type="even" r:id="rId25"/>
+      <w:headerReference w:type="default" r:id="rId26"/>
+      <w:footerReference w:type="even" r:id="rId27"/>
+      <w:footerReference w:type="default" r:id="rId28"/>
+      <w:headerReference w:type="first" r:id="rId29"/>
+      <w:footerReference w:type="first" r:id="rId30"/>
       <w:pgSz w:w="11906" w:h="16838"/>
       <w:pgMar w:top="1440" w:right="1440" w:bottom="1440" w:left="1440" w:header="720" w:footer="720" w:gutter="0"/>
       <w:pgNumType w:start="0"/>
@@ -6080,7 +6588,7 @@
 </file>
 
 <file path=word/endnotes.xml><?xml version="1.0" encoding="utf-8"?>
-<w:endnotes xmlns:wpc="http://schemas.microsoft.com/office/word/2010/wordprocessingCanvas" xmlns:cx="http://schemas.microsoft.com/office/drawing/2014/chartex" xmlns:cx1="http://schemas.microsoft.com/office/drawing/2015/9/8/chartex" xmlns:cx2="http://schemas.microsoft.com/office/drawing/2015/10/21/chartex" xmlns:cx3="http://schemas.microsoft.com/office/drawing/2016/5/9/chartex" xmlns:cx4="http://schemas.microsoft.com/office/drawing/2016/5/10/chartex" xmlns:cx5="http://schemas.microsoft.com/office/drawing/2016/5/11/chartex" xmlns:cx6="http://schemas.microsoft.com/office/drawing/2016/5/12/chartex" xmlns:cx7="http://schemas.microsoft.com/office/drawing/2016/5/13/chartex" xmlns:cx8="http://schemas.microsoft.com/office/drawing/2016/5/14/chartex" xmlns:mc="http://schemas.openxmlformats.org/markup-compatibility/2006" xmlns:aink="http://schemas.microsoft.com/office/drawing/2016/ink" xmlns:am3d="http://schemas.microsoft.com/office/drawing/2017/model3d" xmlns:o="urn:schemas-microsoft-com:office:office" xmlns:oel="http://schemas.microsoft.com/office/2019/extlst" xmlns:r="http://schemas.openxmlformats.org/officeDocument/2006/relationships" xmlns:m="http://schemas.openxmlformats.org/officeDocument/2006/math" xmlns:v="urn:schemas-microsoft-com:vml" xmlns:wp14="http://schemas.microsoft.com/office/word/2010/wordprocessingDrawing" xmlns:wp="http://schemas.openxmlformats.org/drawingml/2006/wordprocessingDrawing" xmlns:w10="urn:schemas-microsoft-com:office:word" xmlns:w="http://schemas.openxmlformats.org/wordprocessingml/2006/main" xmlns:w14="http://schemas.microsoft.com/office/word/2010/wordml" xmlns:w15="http://schemas.microsoft.com/office/word/2012/wordml" xmlns:w16cex="http://schemas.microsoft.com/office/word/2018/wordml/cex" xmlns:w16cid="http://schemas.microsoft.com/office/word/2016/wordml/cid" xmlns:w16="http://schemas.microsoft.com/office/word/2018/wordml" xmlns:w16du="http://schemas.microsoft.com/office/word/2023/wordml/word16du" xmlns:w16sdtdh="http://schemas.microsoft.com/office/word/2020/wordml/sdtdatahash" xmlns:w16sdtfl="http://schemas.microsoft.com/office/word/2024/wordml/sdtformatlock" xmlns:w16se="http://schemas.microsoft.com/office/word/2015/wordml/symex" xmlns:wpg="http://schemas.microsoft.com/office/word/2010/wordprocessingGroup" xmlns:wpi="http://schemas.microsoft.com/office/word/2010/wordprocessingInk" xmlns:wne="http://schemas.microsoft.com/office/word/2006/wordml" xmlns:wps="http://schemas.microsoft.com/office/word/2010/wordprocessingShape" mc:Ignorable="w14 w15 w16se w16cid w16 w16cex w16sdtdh w16sdtfl w16du wp14">
+<w:endnotes xmlns:wpc="http://schemas.microsoft.com/office/word/2010/wordprocessingCanvas" xmlns:cx="http://schemas.microsoft.com/office/drawing/2014/chartex" xmlns:mc="http://schemas.openxmlformats.org/markup-compatibility/2006" xmlns:o="urn:schemas-microsoft-com:office:office" xmlns:r="http://schemas.openxmlformats.org/officeDocument/2006/relationships" xmlns:m="http://schemas.openxmlformats.org/officeDocument/2006/math" xmlns:v="urn:schemas-microsoft-com:vml" xmlns:wp14="http://schemas.microsoft.com/office/word/2010/wordprocessingDrawing" xmlns:wp="http://schemas.openxmlformats.org/drawingml/2006/wordprocessingDrawing" xmlns:w10="urn:schemas-microsoft-com:office:word" xmlns:w="http://schemas.openxmlformats.org/wordprocessingml/2006/main" xmlns:w14="http://schemas.microsoft.com/office/word/2010/wordml" xmlns:w15="http://schemas.microsoft.com/office/word/2012/wordml" xmlns:w16se="http://schemas.microsoft.com/office/word/2015/wordml/symex" xmlns:wpg="http://schemas.microsoft.com/office/word/2010/wordprocessingGroup" xmlns:wpi="http://schemas.microsoft.com/office/word/2010/wordprocessingInk" xmlns:wne="http://schemas.microsoft.com/office/word/2006/wordml" xmlns:wps="http://schemas.microsoft.com/office/word/2010/wordprocessingShape" mc:Ignorable="w14 w15 w16se wp14">
   <w:endnote w:type="separator" w:id="-1">
     <w:p>
       <w:pPr>
@@ -6105,7 +6613,7 @@
 </file>
 
 <file path=word/footer1.xml><?xml version="1.0" encoding="utf-8"?>
-<w:ftr xmlns:wpc="http://schemas.microsoft.com/office/word/2010/wordprocessingCanvas" xmlns:cx="http://schemas.microsoft.com/office/drawing/2014/chartex" xmlns:cx1="http://schemas.microsoft.com/office/drawing/2015/9/8/chartex" xmlns:cx2="http://schemas.microsoft.com/office/drawing/2015/10/21/chartex" xmlns:cx3="http://schemas.microsoft.com/office/drawing/2016/5/9/chartex" xmlns:cx4="http://schemas.microsoft.com/office/drawing/2016/5/10/chartex" xmlns:cx5="http://schemas.microsoft.com/office/drawing/2016/5/11/chartex" xmlns:cx6="http://schemas.microsoft.com/office/drawing/2016/5/12/chartex" xmlns:cx7="http://schemas.microsoft.com/office/drawing/2016/5/13/chartex" xmlns:cx8="http://schemas.microsoft.com/office/drawing/2016/5/14/chartex" xmlns:mc="http://schemas.openxmlformats.org/markup-compatibility/2006" xmlns:aink="http://schemas.microsoft.com/office/drawing/2016/ink" xmlns:am3d="http://schemas.microsoft.com/office/drawing/2017/model3d" xmlns:o="urn:schemas-microsoft-com:office:office" xmlns:oel="http://schemas.microsoft.com/office/2019/extlst" xmlns:r="http://schemas.openxmlformats.org/officeDocument/2006/relationships" xmlns:m="http://schemas.openxmlformats.org/officeDocument/2006/math" xmlns:v="urn:schemas-microsoft-com:vml" xmlns:wp14="http://schemas.microsoft.com/office/word/2010/wordprocessingDrawing" xmlns:wp="http://schemas.openxmlformats.org/drawingml/2006/wordprocessingDrawing" xmlns:w10="urn:schemas-microsoft-com:office:word" xmlns:w="http://schemas.openxmlformats.org/wordprocessingml/2006/main" xmlns:w14="http://schemas.microsoft.com/office/word/2010/wordml" xmlns:w15="http://schemas.microsoft.com/office/word/2012/wordml" xmlns:w16cex="http://schemas.microsoft.com/office/word/2018/wordml/cex" xmlns:w16cid="http://schemas.microsoft.com/office/word/2016/wordml/cid" xmlns:w16="http://schemas.microsoft.com/office/word/2018/wordml" xmlns:w16du="http://schemas.microsoft.com/office/word/2023/wordml/word16du" xmlns:w16sdtdh="http://schemas.microsoft.com/office/word/2020/wordml/sdtdatahash" xmlns:w16sdtfl="http://schemas.microsoft.com/office/word/2024/wordml/sdtformatlock" xmlns:w16se="http://schemas.microsoft.com/office/word/2015/wordml/symex" xmlns:wpg="http://schemas.microsoft.com/office/word/2010/wordprocessingGroup" xmlns:wpi="http://schemas.microsoft.com/office/word/2010/wordprocessingInk" xmlns:wne="http://schemas.microsoft.com/office/word/2006/wordml" xmlns:wps="http://schemas.microsoft.com/office/word/2010/wordprocessingShape" mc:Ignorable="w14 w15 w16se w16cid w16 w16cex w16sdtdh w16sdtfl w16du wp14">
+<w:ftr xmlns:wpc="http://schemas.microsoft.com/office/word/2010/wordprocessingCanvas" xmlns:cx="http://schemas.microsoft.com/office/drawing/2014/chartex" xmlns:mc="http://schemas.openxmlformats.org/markup-compatibility/2006" xmlns:o="urn:schemas-microsoft-com:office:office" xmlns:r="http://schemas.openxmlformats.org/officeDocument/2006/relationships" xmlns:m="http://schemas.openxmlformats.org/officeDocument/2006/math" xmlns:v="urn:schemas-microsoft-com:vml" xmlns:wp14="http://schemas.microsoft.com/office/word/2010/wordprocessingDrawing" xmlns:wp="http://schemas.openxmlformats.org/drawingml/2006/wordprocessingDrawing" xmlns:w10="urn:schemas-microsoft-com:office:word" xmlns:w="http://schemas.openxmlformats.org/wordprocessingml/2006/main" xmlns:w14="http://schemas.microsoft.com/office/word/2010/wordml" xmlns:w15="http://schemas.microsoft.com/office/word/2012/wordml" xmlns:w16se="http://schemas.microsoft.com/office/word/2015/wordml/symex" xmlns:wpg="http://schemas.microsoft.com/office/word/2010/wordprocessingGroup" xmlns:wpi="http://schemas.microsoft.com/office/word/2010/wordprocessingInk" xmlns:wne="http://schemas.microsoft.com/office/word/2006/wordml" xmlns:wps="http://schemas.microsoft.com/office/word/2010/wordprocessingShape" mc:Ignorable="w14 w15 w16se wp14">
   <w:p>
     <w:pPr>
       <w:pStyle w:val="Piedepgina"/>
@@ -6115,11 +6623,12 @@
 </file>
 
 <file path=word/footer2.xml><?xml version="1.0" encoding="utf-8"?>
-<w:ftr xmlns:wpc="http://schemas.microsoft.com/office/word/2010/wordprocessingCanvas" xmlns:cx="http://schemas.microsoft.com/office/drawing/2014/chartex" xmlns:cx1="http://schemas.microsoft.com/office/drawing/2015/9/8/chartex" xmlns:cx2="http://schemas.microsoft.com/office/drawing/2015/10/21/chartex" xmlns:cx3="http://schemas.microsoft.com/office/drawing/2016/5/9/chartex" xmlns:cx4="http://schemas.microsoft.com/office/drawing/2016/5/10/chartex" xmlns:cx5="http://schemas.microsoft.com/office/drawing/2016/5/11/chartex" xmlns:cx6="http://schemas.microsoft.com/office/drawing/2016/5/12/chartex" xmlns:cx7="http://schemas.microsoft.com/office/drawing/2016/5/13/chartex" xmlns:cx8="http://schemas.microsoft.com/office/drawing/2016/5/14/chartex" xmlns:mc="http://schemas.openxmlformats.org/markup-compatibility/2006" xmlns:aink="http://schemas.microsoft.com/office/drawing/2016/ink" xmlns:am3d="http://schemas.microsoft.com/office/drawing/2017/model3d" xmlns:o="urn:schemas-microsoft-com:office:office" xmlns:oel="http://schemas.microsoft.com/office/2019/extlst" xmlns:r="http://schemas.openxmlformats.org/officeDocument/2006/relationships" xmlns:m="http://schemas.openxmlformats.org/officeDocument/2006/math" xmlns:v="urn:schemas-microsoft-com:vml" xmlns:wp14="http://schemas.microsoft.com/office/word/2010/wordprocessingDrawing" xmlns:wp="http://schemas.openxmlformats.org/drawingml/2006/wordprocessingDrawing" xmlns:w10="urn:schemas-microsoft-com:office:word" xmlns:w="http://schemas.openxmlformats.org/wordprocessingml/2006/main" xmlns:w14="http://schemas.microsoft.com/office/word/2010/wordml" xmlns:w15="http://schemas.microsoft.com/office/word/2012/wordml" xmlns:w16cex="http://schemas.microsoft.com/office/word/2018/wordml/cex" xmlns:w16cid="http://schemas.microsoft.com/office/word/2016/wordml/cid" xmlns:w16="http://schemas.microsoft.com/office/word/2018/wordml" xmlns:w16du="http://schemas.microsoft.com/office/word/2023/wordml/word16du" xmlns:w16sdtdh="http://schemas.microsoft.com/office/word/2020/wordml/sdtdatahash" xmlns:w16sdtfl="http://schemas.microsoft.com/office/word/2024/wordml/sdtformatlock" xmlns:w16se="http://schemas.microsoft.com/office/word/2015/wordml/symex" xmlns:wpg="http://schemas.microsoft.com/office/word/2010/wordprocessingGroup" xmlns:wpi="http://schemas.microsoft.com/office/word/2010/wordprocessingInk" xmlns:wne="http://schemas.microsoft.com/office/word/2006/wordml" xmlns:wps="http://schemas.microsoft.com/office/word/2010/wordprocessingShape" mc:Ignorable="w14 w15 w16se w16cid w16 w16cex w16sdtdh w16sdtfl w16du wp14">
+<w:ftr xmlns:wpc="http://schemas.microsoft.com/office/word/2010/wordprocessingCanvas" xmlns:cx="http://schemas.microsoft.com/office/drawing/2014/chartex" xmlns:mc="http://schemas.openxmlformats.org/markup-compatibility/2006" xmlns:o="urn:schemas-microsoft-com:office:office" xmlns:r="http://schemas.openxmlformats.org/officeDocument/2006/relationships" xmlns:m="http://schemas.openxmlformats.org/officeDocument/2006/math" xmlns:v="urn:schemas-microsoft-com:vml" xmlns:wp14="http://schemas.microsoft.com/office/word/2010/wordprocessingDrawing" xmlns:wp="http://schemas.openxmlformats.org/drawingml/2006/wordprocessingDrawing" xmlns:w10="urn:schemas-microsoft-com:office:word" xmlns:w="http://schemas.openxmlformats.org/wordprocessingml/2006/main" xmlns:w14="http://schemas.microsoft.com/office/word/2010/wordml" xmlns:w15="http://schemas.microsoft.com/office/word/2012/wordml" xmlns:w16se="http://schemas.microsoft.com/office/word/2015/wordml/symex" xmlns:wpg="http://schemas.microsoft.com/office/word/2010/wordprocessingGroup" xmlns:wpi="http://schemas.microsoft.com/office/word/2010/wordprocessingInk" xmlns:wne="http://schemas.microsoft.com/office/word/2006/wordml" xmlns:wps="http://schemas.microsoft.com/office/word/2010/wordprocessingShape" mc:Ignorable="w14 w15 w16se wp14">
   <w:p>
     <w:r>
       <w:rPr>
         <w:noProof/>
+        <w:lang w:val="en-US" w:eastAsia="en-US"/>
       </w:rPr>
       <mc:AlternateContent>
         <mc:Choice Requires="wps">
@@ -6190,7 +6699,7 @@
             </wp:anchor>
           </w:drawing>
         </mc:Choice>
-        <mc:Fallback>
+        <mc:Fallback xmlns:cx1="http://schemas.microsoft.com/office/drawing/2015/9/8/chartex" xmlns:cx2="http://schemas.microsoft.com/office/drawing/2015/10/21/chartex" xmlns:cx3="http://schemas.microsoft.com/office/drawing/2016/5/9/chartex" xmlns:cx4="http://schemas.microsoft.com/office/drawing/2016/5/10/chartex" xmlns:cx5="http://schemas.microsoft.com/office/drawing/2016/5/11/chartex" xmlns:cx6="http://schemas.microsoft.com/office/drawing/2016/5/12/chartex" xmlns:cx7="http://schemas.microsoft.com/office/drawing/2016/5/13/chartex" xmlns:cx8="http://schemas.microsoft.com/office/drawing/2016/5/14/chartex" xmlns:aink="http://schemas.microsoft.com/office/drawing/2016/ink" xmlns:am3d="http://schemas.microsoft.com/office/drawing/2017/model3d" xmlns:oel="http://schemas.microsoft.com/office/2019/extlst" xmlns:w16cex="http://schemas.microsoft.com/office/word/2018/wordml/cex" xmlns:w16cid="http://schemas.microsoft.com/office/word/2016/wordml/cid" xmlns:w16="http://schemas.microsoft.com/office/word/2018/wordml" xmlns:w16du="http://schemas.microsoft.com/office/word/2023/wordml/word16du" xmlns:w16sdtdh="http://schemas.microsoft.com/office/word/2020/wordml/sdtdatahash" xmlns:w16sdtfl="http://schemas.microsoft.com/office/word/2024/wordml/sdtformatlock">
           <w:pict>
             <v:shapetype w14:anchorId="78A880AB" id="_x0000_t15" coordsize="21600,21600" o:spt="15" adj="16200" path="m@0,l,,,21600@0,21600,21600,10800xe">
               <v:stroke joinstyle="miter"/>
@@ -6223,6 +6732,7 @@
     <w:r>
       <w:rPr>
         <w:noProof/>
+        <w:lang w:val="en-US" w:eastAsia="en-US"/>
       </w:rPr>
       <mc:AlternateContent>
         <mc:Choice Requires="wps">
@@ -6339,7 +6849,7 @@
             </wp:anchor>
           </w:drawing>
         </mc:Choice>
-        <mc:Fallback>
+        <mc:Fallback xmlns:cx1="http://schemas.microsoft.com/office/drawing/2015/9/8/chartex" xmlns:cx2="http://schemas.microsoft.com/office/drawing/2015/10/21/chartex" xmlns:cx3="http://schemas.microsoft.com/office/drawing/2016/5/9/chartex" xmlns:cx4="http://schemas.microsoft.com/office/drawing/2016/5/10/chartex" xmlns:cx5="http://schemas.microsoft.com/office/drawing/2016/5/11/chartex" xmlns:cx6="http://schemas.microsoft.com/office/drawing/2016/5/12/chartex" xmlns:cx7="http://schemas.microsoft.com/office/drawing/2016/5/13/chartex" xmlns:cx8="http://schemas.microsoft.com/office/drawing/2016/5/14/chartex" xmlns:aink="http://schemas.microsoft.com/office/drawing/2016/ink" xmlns:am3d="http://schemas.microsoft.com/office/drawing/2017/model3d" xmlns:oel="http://schemas.microsoft.com/office/2019/extlst" xmlns:w16cex="http://schemas.microsoft.com/office/word/2018/wordml/cex" xmlns:w16cid="http://schemas.microsoft.com/office/word/2016/wordml/cid" xmlns:w16="http://schemas.microsoft.com/office/word/2018/wordml" xmlns:w16du="http://schemas.microsoft.com/office/word/2023/wordml/word16du" xmlns:w16sdtdh="http://schemas.microsoft.com/office/word/2020/wordml/sdtdatahash" xmlns:w16sdtfl="http://schemas.microsoft.com/office/word/2024/wordml/sdtformatlock">
           <w:pict>
             <v:rect w14:anchorId="55970E85" id="Cuadro de texto 1" o:spid="_x0000_s1028" style="position:absolute;margin-left:59.35pt;margin-top:5.05pt;width:305.65pt;height:54.15pt;z-index:-503316445;visibility:visible;mso-wrap-style:square;mso-wrap-distance-left:0;mso-wrap-distance-top:0;mso-wrap-distance-right:0;mso-wrap-distance-bottom:0;mso-position-horizontal:absolute;mso-position-horizontal-relative:margin;mso-position-vertical:absolute;mso-position-vertical-relative:text;v-text-anchor:top" o:gfxdata="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" o:allowincell="f" filled="f" stroked="f" strokeweight="0">
               <v:textbox inset=",7.2pt,,7.2pt">
@@ -6433,7 +6943,10 @@
       <w:fldChar w:fldCharType="separate"/>
     </w:r>
     <w:r>
-      <w:t>5</w:t>
+      <w:rPr>
+        <w:noProof/>
+      </w:rPr>
+      <w:t>13</w:t>
     </w:r>
     <w:r>
       <w:fldChar w:fldCharType="end"/>
@@ -6443,7 +6956,7 @@
 </file>
 
 <file path=word/footer3.xml><?xml version="1.0" encoding="utf-8"?>
-<w:ftr xmlns:wpc="http://schemas.microsoft.com/office/word/2010/wordprocessingCanvas" xmlns:cx="http://schemas.microsoft.com/office/drawing/2014/chartex" xmlns:cx1="http://schemas.microsoft.com/office/drawing/2015/9/8/chartex" xmlns:cx2="http://schemas.microsoft.com/office/drawing/2015/10/21/chartex" xmlns:cx3="http://schemas.microsoft.com/office/drawing/2016/5/9/chartex" xmlns:cx4="http://schemas.microsoft.com/office/drawing/2016/5/10/chartex" xmlns:cx5="http://schemas.microsoft.com/office/drawing/2016/5/11/chartex" xmlns:cx6="http://schemas.microsoft.com/office/drawing/2016/5/12/chartex" xmlns:cx7="http://schemas.microsoft.com/office/drawing/2016/5/13/chartex" xmlns:cx8="http://schemas.microsoft.com/office/drawing/2016/5/14/chartex" xmlns:mc="http://schemas.openxmlformats.org/markup-compatibility/2006" xmlns:aink="http://schemas.microsoft.com/office/drawing/2016/ink" xmlns:am3d="http://schemas.microsoft.com/office/drawing/2017/model3d" xmlns:o="urn:schemas-microsoft-com:office:office" xmlns:oel="http://schemas.microsoft.com/office/2019/extlst" xmlns:r="http://schemas.openxmlformats.org/officeDocument/2006/relationships" xmlns:m="http://schemas.openxmlformats.org/officeDocument/2006/math" xmlns:v="urn:schemas-microsoft-com:vml" xmlns:wp14="http://schemas.microsoft.com/office/word/2010/wordprocessingDrawing" xmlns:wp="http://schemas.openxmlformats.org/drawingml/2006/wordprocessingDrawing" xmlns:w10="urn:schemas-microsoft-com:office:word" xmlns:w="http://schemas.openxmlformats.org/wordprocessingml/2006/main" xmlns:w14="http://schemas.microsoft.com/office/word/2010/wordml" xmlns:w15="http://schemas.microsoft.com/office/word/2012/wordml" xmlns:w16cex="http://schemas.microsoft.com/office/word/2018/wordml/cex" xmlns:w16cid="http://schemas.microsoft.com/office/word/2016/wordml/cid" xmlns:w16="http://schemas.microsoft.com/office/word/2018/wordml" xmlns:w16du="http://schemas.microsoft.com/office/word/2023/wordml/word16du" xmlns:w16sdtdh="http://schemas.microsoft.com/office/word/2020/wordml/sdtdatahash" xmlns:w16sdtfl="http://schemas.microsoft.com/office/word/2024/wordml/sdtformatlock" xmlns:w16se="http://schemas.microsoft.com/office/word/2015/wordml/symex" xmlns:wpg="http://schemas.microsoft.com/office/word/2010/wordprocessingGroup" xmlns:wpi="http://schemas.microsoft.com/office/word/2010/wordprocessingInk" xmlns:wne="http://schemas.microsoft.com/office/word/2006/wordml" xmlns:wps="http://schemas.microsoft.com/office/word/2010/wordprocessingShape" mc:Ignorable="w14 w15 w16se w16cid w16 w16cex w16sdtdh w16sdtfl w16du wp14">
+<w:ftr xmlns:wpc="http://schemas.microsoft.com/office/word/2010/wordprocessingCanvas" xmlns:cx="http://schemas.microsoft.com/office/drawing/2014/chartex" xmlns:mc="http://schemas.openxmlformats.org/markup-compatibility/2006" xmlns:o="urn:schemas-microsoft-com:office:office" xmlns:r="http://schemas.openxmlformats.org/officeDocument/2006/relationships" xmlns:m="http://schemas.openxmlformats.org/officeDocument/2006/math" xmlns:v="urn:schemas-microsoft-com:vml" xmlns:wp14="http://schemas.microsoft.com/office/word/2010/wordprocessingDrawing" xmlns:wp="http://schemas.openxmlformats.org/drawingml/2006/wordprocessingDrawing" xmlns:w10="urn:schemas-microsoft-com:office:word" xmlns:w="http://schemas.openxmlformats.org/wordprocessingml/2006/main" xmlns:w14="http://schemas.microsoft.com/office/word/2010/wordml" xmlns:w15="http://schemas.microsoft.com/office/word/2012/wordml" xmlns:w16se="http://schemas.microsoft.com/office/word/2015/wordml/symex" xmlns:wpg="http://schemas.microsoft.com/office/word/2010/wordprocessingGroup" xmlns:wpi="http://schemas.microsoft.com/office/word/2010/wordprocessingInk" xmlns:wne="http://schemas.microsoft.com/office/word/2006/wordml" xmlns:wps="http://schemas.microsoft.com/office/word/2010/wordprocessingShape" mc:Ignorable="w14 w15 w16se wp14">
   <w:p>
     <w:pPr>
       <w:pStyle w:val="Piedepgina"/>
@@ -6453,7 +6966,7 @@
 </file>
 
 <file path=word/footnotes.xml><?xml version="1.0" encoding="utf-8"?>
-<w:footnotes xmlns:wpc="http://schemas.microsoft.com/office/word/2010/wordprocessingCanvas" xmlns:cx="http://schemas.microsoft.com/office/drawing/2014/chartex" xmlns:cx1="http://schemas.microsoft.com/office/drawing/2015/9/8/chartex" xmlns:cx2="http://schemas.microsoft.com/office/drawing/2015/10/21/chartex" xmlns:cx3="http://schemas.microsoft.com/office/drawing/2016/5/9/chartex" xmlns:cx4="http://schemas.microsoft.com/office/drawing/2016/5/10/chartex" xmlns:cx5="http://schemas.microsoft.com/office/drawing/2016/5/11/chartex" xmlns:cx6="http://schemas.microsoft.com/office/drawing/2016/5/12/chartex" xmlns:cx7="http://schemas.microsoft.com/office/drawing/2016/5/13/chartex" xmlns:cx8="http://schemas.microsoft.com/office/drawing/2016/5/14/chartex" xmlns:mc="http://schemas.openxmlformats.org/markup-compatibility/2006" xmlns:aink="http://schemas.microsoft.com/office/drawing/2016/ink" xmlns:am3d="http://schemas.microsoft.com/office/drawing/2017/model3d" xmlns:o="urn:schemas-microsoft-com:office:office" xmlns:oel="http://schemas.microsoft.com/office/2019/extlst" xmlns:r="http://schemas.openxmlformats.org/officeDocument/2006/relationships" xmlns:m="http://schemas.openxmlformats.org/officeDocument/2006/math" xmlns:v="urn:schemas-microsoft-com:vml" xmlns:wp14="http://schemas.microsoft.com/office/word/2010/wordprocessingDrawing" xmlns:wp="http://schemas.openxmlformats.org/drawingml/2006/wordprocessingDrawing" xmlns:w10="urn:schemas-microsoft-com:office:word" xmlns:w="http://schemas.openxmlformats.org/wordprocessingml/2006/main" xmlns:w14="http://schemas.microsoft.com/office/word/2010/wordml" xmlns:w15="http://schemas.microsoft.com/office/word/2012/wordml" xmlns:w16cex="http://schemas.microsoft.com/office/word/2018/wordml/cex" xmlns:w16cid="http://schemas.microsoft.com/office/word/2016/wordml/cid" xmlns:w16="http://schemas.microsoft.com/office/word/2018/wordml" xmlns:w16du="http://schemas.microsoft.com/office/word/2023/wordml/word16du" xmlns:w16sdtdh="http://schemas.microsoft.com/office/word/2020/wordml/sdtdatahash" xmlns:w16sdtfl="http://schemas.microsoft.com/office/word/2024/wordml/sdtformatlock" xmlns:w16se="http://schemas.microsoft.com/office/word/2015/wordml/symex" xmlns:wpg="http://schemas.microsoft.com/office/word/2010/wordprocessingGroup" xmlns:wpi="http://schemas.microsoft.com/office/word/2010/wordprocessingInk" xmlns:wne="http://schemas.microsoft.com/office/word/2006/wordml" xmlns:wps="http://schemas.microsoft.com/office/word/2010/wordprocessingShape" mc:Ignorable="w14 w15 w16se w16cid w16 w16cex w16sdtdh w16sdtfl w16du wp14">
+<w:footnotes xmlns:wpc="http://schemas.microsoft.com/office/word/2010/wordprocessingCanvas" xmlns:cx="http://schemas.microsoft.com/office/drawing/2014/chartex" xmlns:mc="http://schemas.openxmlformats.org/markup-compatibility/2006" xmlns:o="urn:schemas-microsoft-com:office:office" xmlns:r="http://schemas.openxmlformats.org/officeDocument/2006/relationships" xmlns:m="http://schemas.openxmlformats.org/officeDocument/2006/math" xmlns:v="urn:schemas-microsoft-com:vml" xmlns:wp14="http://schemas.microsoft.com/office/word/2010/wordprocessingDrawing" xmlns:wp="http://schemas.openxmlformats.org/drawingml/2006/wordprocessingDrawing" xmlns:w10="urn:schemas-microsoft-com:office:word" xmlns:w="http://schemas.openxmlformats.org/wordprocessingml/2006/main" xmlns:w14="http://schemas.microsoft.com/office/word/2010/wordml" xmlns:w15="http://schemas.microsoft.com/office/word/2012/wordml" xmlns:w16se="http://schemas.microsoft.com/office/word/2015/wordml/symex" xmlns:wpg="http://schemas.microsoft.com/office/word/2010/wordprocessingGroup" xmlns:wpi="http://schemas.microsoft.com/office/word/2010/wordprocessingInk" xmlns:wne="http://schemas.microsoft.com/office/word/2006/wordml" xmlns:wps="http://schemas.microsoft.com/office/word/2010/wordprocessingShape" mc:Ignorable="w14 w15 w16se wp14">
   <w:footnote w:type="separator" w:id="-1">
     <w:p>
       <w:pPr>
@@ -6478,7 +6991,7 @@
 </file>
 
 <file path=word/header1.xml><?xml version="1.0" encoding="utf-8"?>
-<w:hdr xmlns:wpc="http://schemas.microsoft.com/office/word/2010/wordprocessingCanvas" xmlns:cx="http://schemas.microsoft.com/office/drawing/2014/chartex" xmlns:cx1="http://schemas.microsoft.com/office/drawing/2015/9/8/chartex" xmlns:cx2="http://schemas.microsoft.com/office/drawing/2015/10/21/chartex" xmlns:cx3="http://schemas.microsoft.com/office/drawing/2016/5/9/chartex" xmlns:cx4="http://schemas.microsoft.com/office/drawing/2016/5/10/chartex" xmlns:cx5="http://schemas.microsoft.com/office/drawing/2016/5/11/chartex" xmlns:cx6="http://schemas.microsoft.com/office/drawing/2016/5/12/chartex" xmlns:cx7="http://schemas.microsoft.com/office/drawing/2016/5/13/chartex" xmlns:cx8="http://schemas.microsoft.com/office/drawing/2016/5/14/chartex" xmlns:mc="http://schemas.openxmlformats.org/markup-compatibility/2006" xmlns:aink="http://schemas.microsoft.com/office/drawing/2016/ink" xmlns:am3d="http://schemas.microsoft.com/office/drawing/2017/model3d" xmlns:o="urn:schemas-microsoft-com:office:office" xmlns:oel="http://schemas.microsoft.com/office/2019/extlst" xmlns:r="http://schemas.openxmlformats.org/officeDocument/2006/relationships" xmlns:m="http://schemas.openxmlformats.org/officeDocument/2006/math" xmlns:v="urn:schemas-microsoft-com:vml" xmlns:wp14="http://schemas.microsoft.com/office/word/2010/wordprocessingDrawing" xmlns:wp="http://schemas.openxmlformats.org/drawingml/2006/wordprocessingDrawing" xmlns:w10="urn:schemas-microsoft-com:office:word" xmlns:w="http://schemas.openxmlformats.org/wordprocessingml/2006/main" xmlns:w14="http://schemas.microsoft.com/office/word/2010/wordml" xmlns:w15="http://schemas.microsoft.com/office/word/2012/wordml" xmlns:w16cex="http://schemas.microsoft.com/office/word/2018/wordml/cex" xmlns:w16cid="http://schemas.microsoft.com/office/word/2016/wordml/cid" xmlns:w16="http://schemas.microsoft.com/office/word/2018/wordml" xmlns:w16du="http://schemas.microsoft.com/office/word/2023/wordml/word16du" xmlns:w16sdtdh="http://schemas.microsoft.com/office/word/2020/wordml/sdtdatahash" xmlns:w16sdtfl="http://schemas.microsoft.com/office/word/2024/wordml/sdtformatlock" xmlns:w16se="http://schemas.microsoft.com/office/word/2015/wordml/symex" xmlns:wpg="http://schemas.microsoft.com/office/word/2010/wordprocessingGroup" xmlns:wpi="http://schemas.microsoft.com/office/word/2010/wordprocessingInk" xmlns:wne="http://schemas.microsoft.com/office/word/2006/wordml" xmlns:wps="http://schemas.microsoft.com/office/word/2010/wordprocessingShape" mc:Ignorable="w14 w15 w16se w16cid w16 w16cex w16sdtdh w16sdtfl w16du wp14">
+<w:hdr xmlns:wpc="http://schemas.microsoft.com/office/word/2010/wordprocessingCanvas" xmlns:cx="http://schemas.microsoft.com/office/drawing/2014/chartex" xmlns:mc="http://schemas.openxmlformats.org/markup-compatibility/2006" xmlns:o="urn:schemas-microsoft-com:office:office" xmlns:r="http://schemas.openxmlformats.org/officeDocument/2006/relationships" xmlns:m="http://schemas.openxmlformats.org/officeDocument/2006/math" xmlns:v="urn:schemas-microsoft-com:vml" xmlns:wp14="http://schemas.microsoft.com/office/word/2010/wordprocessingDrawing" xmlns:wp="http://schemas.openxmlformats.org/drawingml/2006/wordprocessingDrawing" xmlns:w10="urn:schemas-microsoft-com:office:word" xmlns:w="http://schemas.openxmlformats.org/wordprocessingml/2006/main" xmlns:w14="http://schemas.microsoft.com/office/word/2010/wordml" xmlns:w15="http://schemas.microsoft.com/office/word/2012/wordml" xmlns:w16se="http://schemas.microsoft.com/office/word/2015/wordml/symex" xmlns:wpg="http://schemas.microsoft.com/office/word/2010/wordprocessingGroup" xmlns:wpi="http://schemas.microsoft.com/office/word/2010/wordprocessingInk" xmlns:wne="http://schemas.microsoft.com/office/word/2006/wordml" xmlns:wps="http://schemas.microsoft.com/office/word/2010/wordprocessingShape" mc:Ignorable="w14 w15 w16se wp14">
   <w:p>
     <w:pPr>
       <w:pStyle w:val="Encabezado"/>
@@ -6488,11 +7001,12 @@
 </file>
 
 <file path=word/header2.xml><?xml version="1.0" encoding="utf-8"?>
-<w:hdr xmlns:wpc="http://schemas.microsoft.com/office/word/2010/wordprocessingCanvas" xmlns:cx="http://schemas.microsoft.com/office/drawing/2014/chartex" xmlns:cx1="http://schemas.microsoft.com/office/drawing/2015/9/8/chartex" xmlns:cx2="http://schemas.microsoft.com/office/drawing/2015/10/21/chartex" xmlns:cx3="http://schemas.microsoft.com/office/drawing/2016/5/9/chartex" xmlns:cx4="http://schemas.microsoft.com/office/drawing/2016/5/10/chartex" xmlns:cx5="http://schemas.microsoft.com/office/drawing/2016/5/11/chartex" xmlns:cx6="http://schemas.microsoft.com/office/drawing/2016/5/12/chartex" xmlns:cx7="http://schemas.microsoft.com/office/drawing/2016/5/13/chartex" xmlns:cx8="http://schemas.microsoft.com/office/drawing/2016/5/14/chartex" xmlns:mc="http://schemas.openxmlformats.org/markup-compatibility/2006" xmlns:aink="http://schemas.microsoft.com/office/drawing/2016/ink" xmlns:am3d="http://schemas.microsoft.com/office/drawing/2017/model3d" xmlns:o="urn:schemas-microsoft-com:office:office" xmlns:oel="http://schemas.microsoft.com/office/2019/extlst" xmlns:r="http://schemas.openxmlformats.org/officeDocument/2006/relationships" xmlns:m="http://schemas.openxmlformats.org/officeDocument/2006/math" xmlns:v="urn:schemas-microsoft-com:vml" xmlns:wp14="http://schemas.microsoft.com/office/word/2010/wordprocessingDrawing" xmlns:wp="http://schemas.openxmlformats.org/drawingml/2006/wordprocessingDrawing" xmlns:w10="urn:schemas-microsoft-com:office:word" xmlns:w="http://schemas.openxmlformats.org/wordprocessingml/2006/main" xmlns:w14="http://schemas.microsoft.com/office/word/2010/wordml" xmlns:w15="http://schemas.microsoft.com/office/word/2012/wordml" xmlns:w16cex="http://schemas.microsoft.com/office/word/2018/wordml/cex" xmlns:w16cid="http://schemas.microsoft.com/office/word/2016/wordml/cid" xmlns:w16="http://schemas.microsoft.com/office/word/2018/wordml" xmlns:w16du="http://schemas.microsoft.com/office/word/2023/wordml/word16du" xmlns:w16sdtdh="http://schemas.microsoft.com/office/word/2020/wordml/sdtdatahash" xmlns:w16sdtfl="http://schemas.microsoft.com/office/word/2024/wordml/sdtformatlock" xmlns:w16se="http://schemas.microsoft.com/office/word/2015/wordml/symex" xmlns:wpg="http://schemas.microsoft.com/office/word/2010/wordprocessingGroup" xmlns:wpi="http://schemas.microsoft.com/office/word/2010/wordprocessingInk" xmlns:wne="http://schemas.microsoft.com/office/word/2006/wordml" xmlns:wps="http://schemas.microsoft.com/office/word/2010/wordprocessingShape" mc:Ignorable="w14 w15 w16se w16cid w16 w16cex w16sdtdh w16sdtfl w16du wp14">
+<w:hdr xmlns:wpc="http://schemas.microsoft.com/office/word/2010/wordprocessingCanvas" xmlns:cx="http://schemas.microsoft.com/office/drawing/2014/chartex" xmlns:mc="http://schemas.openxmlformats.org/markup-compatibility/2006" xmlns:o="urn:schemas-microsoft-com:office:office" xmlns:r="http://schemas.openxmlformats.org/officeDocument/2006/relationships" xmlns:m="http://schemas.openxmlformats.org/officeDocument/2006/math" xmlns:v="urn:schemas-microsoft-com:vml" xmlns:wp14="http://schemas.microsoft.com/office/word/2010/wordprocessingDrawing" xmlns:wp="http://schemas.openxmlformats.org/drawingml/2006/wordprocessingDrawing" xmlns:w10="urn:schemas-microsoft-com:office:word" xmlns:w="http://schemas.openxmlformats.org/wordprocessingml/2006/main" xmlns:w14="http://schemas.microsoft.com/office/word/2010/wordml" xmlns:w15="http://schemas.microsoft.com/office/word/2012/wordml" xmlns:w16se="http://schemas.microsoft.com/office/word/2015/wordml/symex" xmlns:wpg="http://schemas.microsoft.com/office/word/2010/wordprocessingGroup" xmlns:wpi="http://schemas.microsoft.com/office/word/2010/wordprocessingInk" xmlns:wne="http://schemas.microsoft.com/office/word/2006/wordml" xmlns:wps="http://schemas.microsoft.com/office/word/2010/wordprocessingShape" mc:Ignorable="w14 w15 w16se wp14">
   <w:p>
     <w:r>
       <w:rPr>
         <w:noProof/>
+        <w:lang w:val="en-US" w:eastAsia="en-US"/>
       </w:rPr>
       <mc:AlternateContent>
         <mc:Choice Requires="wps">
@@ -6578,7 +7092,7 @@
             </wp:anchor>
           </w:drawing>
         </mc:Choice>
-        <mc:Fallback>
+        <mc:Fallback xmlns:cx1="http://schemas.microsoft.com/office/drawing/2015/9/8/chartex" xmlns:cx2="http://schemas.microsoft.com/office/drawing/2015/10/21/chartex" xmlns:cx3="http://schemas.microsoft.com/office/drawing/2016/5/9/chartex" xmlns:cx4="http://schemas.microsoft.com/office/drawing/2016/5/10/chartex" xmlns:cx5="http://schemas.microsoft.com/office/drawing/2016/5/11/chartex" xmlns:cx6="http://schemas.microsoft.com/office/drawing/2016/5/12/chartex" xmlns:cx7="http://schemas.microsoft.com/office/drawing/2016/5/13/chartex" xmlns:cx8="http://schemas.microsoft.com/office/drawing/2016/5/14/chartex" xmlns:aink="http://schemas.microsoft.com/office/drawing/2016/ink" xmlns:am3d="http://schemas.microsoft.com/office/drawing/2017/model3d" xmlns:oel="http://schemas.microsoft.com/office/2019/extlst" xmlns:w16cex="http://schemas.microsoft.com/office/word/2018/wordml/cex" xmlns:w16cid="http://schemas.microsoft.com/office/word/2016/wordml/cid" xmlns:w16="http://schemas.microsoft.com/office/word/2018/wordml" xmlns:w16du="http://schemas.microsoft.com/office/word/2023/wordml/word16du" xmlns:w16sdtdh="http://schemas.microsoft.com/office/word/2020/wordml/sdtdatahash" xmlns:w16sdtfl="http://schemas.microsoft.com/office/word/2024/wordml/sdtformatlock">
           <w:pict>
             <v:rect w14:anchorId="6704EB9D" id="Cuadro de texto 2" o:spid="_x0000_s1026" style="position:absolute;margin-left:-54pt;margin-top:-23.25pt;width:258pt;height:40.5pt;z-index:-503316470;visibility:visible;mso-wrap-style:square;mso-wrap-distance-left:0;mso-wrap-distance-top:0;mso-wrap-distance-right:0;mso-wrap-distance-bottom:0;mso-position-horizontal:absolute;mso-position-horizontal-relative:text;mso-position-vertical:absolute;mso-position-vertical-relative:text;v-text-anchor:top" o:gfxdata="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" filled="f" stroked="f" strokeweight="0">
               <v:textbox inset=",7.2pt,,7.2pt">
@@ -6619,6 +7133,7 @@
     <w:r>
       <w:rPr>
         <w:noProof/>
+        <w:lang w:val="en-US" w:eastAsia="en-US"/>
       </w:rPr>
       <w:drawing>
         <wp:anchor distT="0" distB="0" distL="0" distR="0" simplePos="0" relativeHeight="26" behindDoc="1" locked="0" layoutInCell="1" allowOverlap="1" wp14:anchorId="7F4A37A0" wp14:editId="5D44ECC9">
@@ -6672,7 +7187,7 @@
 </file>
 
 <file path=word/header3.xml><?xml version="1.0" encoding="utf-8"?>
-<w:hdr xmlns:wpc="http://schemas.microsoft.com/office/word/2010/wordprocessingCanvas" xmlns:cx="http://schemas.microsoft.com/office/drawing/2014/chartex" xmlns:cx1="http://schemas.microsoft.com/office/drawing/2015/9/8/chartex" xmlns:cx2="http://schemas.microsoft.com/office/drawing/2015/10/21/chartex" xmlns:cx3="http://schemas.microsoft.com/office/drawing/2016/5/9/chartex" xmlns:cx4="http://schemas.microsoft.com/office/drawing/2016/5/10/chartex" xmlns:cx5="http://schemas.microsoft.com/office/drawing/2016/5/11/chartex" xmlns:cx6="http://schemas.microsoft.com/office/drawing/2016/5/12/chartex" xmlns:cx7="http://schemas.microsoft.com/office/drawing/2016/5/13/chartex" xmlns:cx8="http://schemas.microsoft.com/office/drawing/2016/5/14/chartex" xmlns:mc="http://schemas.openxmlformats.org/markup-compatibility/2006" xmlns:aink="http://schemas.microsoft.com/office/drawing/2016/ink" xmlns:am3d="http://schemas.microsoft.com/office/drawing/2017/model3d" xmlns:o="urn:schemas-microsoft-com:office:office" xmlns:oel="http://schemas.microsoft.com/office/2019/extlst" xmlns:r="http://schemas.openxmlformats.org/officeDocument/2006/relationships" xmlns:m="http://schemas.openxmlformats.org/officeDocument/2006/math" xmlns:v="urn:schemas-microsoft-com:vml" xmlns:wp14="http://schemas.microsoft.com/office/word/2010/wordprocessingDrawing" xmlns:wp="http://schemas.openxmlformats.org/drawingml/2006/wordprocessingDrawing" xmlns:w10="urn:schemas-microsoft-com:office:word" xmlns:w="http://schemas.openxmlformats.org/wordprocessingml/2006/main" xmlns:w14="http://schemas.microsoft.com/office/word/2010/wordml" xmlns:w15="http://schemas.microsoft.com/office/word/2012/wordml" xmlns:w16cex="http://schemas.microsoft.com/office/word/2018/wordml/cex" xmlns:w16cid="http://schemas.microsoft.com/office/word/2016/wordml/cid" xmlns:w16="http://schemas.microsoft.com/office/word/2018/wordml" xmlns:w16du="http://schemas.microsoft.com/office/word/2023/wordml/word16du" xmlns:w16sdtdh="http://schemas.microsoft.com/office/word/2020/wordml/sdtdatahash" xmlns:w16sdtfl="http://schemas.microsoft.com/office/word/2024/wordml/sdtformatlock" xmlns:w16se="http://schemas.microsoft.com/office/word/2015/wordml/symex" xmlns:wpg="http://schemas.microsoft.com/office/word/2010/wordprocessingGroup" xmlns:wpi="http://schemas.microsoft.com/office/word/2010/wordprocessingInk" xmlns:wne="http://schemas.microsoft.com/office/word/2006/wordml" xmlns:wps="http://schemas.microsoft.com/office/word/2010/wordprocessingShape" mc:Ignorable="w14 w15 w16se w16cid w16 w16cex w16sdtdh w16sdtfl w16du wp14">
+<w:hdr xmlns:wpc="http://schemas.microsoft.com/office/word/2010/wordprocessingCanvas" xmlns:cx="http://schemas.microsoft.com/office/drawing/2014/chartex" xmlns:mc="http://schemas.openxmlformats.org/markup-compatibility/2006" xmlns:o="urn:schemas-microsoft-com:office:office" xmlns:r="http://schemas.openxmlformats.org/officeDocument/2006/relationships" xmlns:m="http://schemas.openxmlformats.org/officeDocument/2006/math" xmlns:v="urn:schemas-microsoft-com:vml" xmlns:wp14="http://schemas.microsoft.com/office/word/2010/wordprocessingDrawing" xmlns:wp="http://schemas.openxmlformats.org/drawingml/2006/wordprocessingDrawing" xmlns:w10="urn:schemas-microsoft-com:office:word" xmlns:w="http://schemas.openxmlformats.org/wordprocessingml/2006/main" xmlns:w14="http://schemas.microsoft.com/office/word/2010/wordml" xmlns:w15="http://schemas.microsoft.com/office/word/2012/wordml" xmlns:w16se="http://schemas.microsoft.com/office/word/2015/wordml/symex" xmlns:wpg="http://schemas.microsoft.com/office/word/2010/wordprocessingGroup" xmlns:wpi="http://schemas.microsoft.com/office/word/2010/wordprocessingInk" xmlns:wne="http://schemas.microsoft.com/office/word/2006/wordml" xmlns:wps="http://schemas.microsoft.com/office/word/2010/wordprocessingShape" mc:Ignorable="w14 w15 w16se wp14">
   <w:p>
     <w:pPr>
       <w:pStyle w:val="Encabezado"/>
@@ -6682,7 +7197,7 @@
 </file>
 
 <file path=word/numbering.xml><?xml version="1.0" encoding="utf-8"?>
-<w:numbering xmlns:wpc="http://schemas.microsoft.com/office/word/2010/wordprocessingCanvas" xmlns:cx="http://schemas.microsoft.com/office/drawing/2014/chartex" xmlns:cx1="http://schemas.microsoft.com/office/drawing/2015/9/8/chartex" xmlns:cx2="http://schemas.microsoft.com/office/drawing/2015/10/21/chartex" xmlns:cx3="http://schemas.microsoft.com/office/drawing/2016/5/9/chartex" xmlns:cx4="http://schemas.microsoft.com/office/drawing/2016/5/10/chartex" xmlns:cx5="http://schemas.microsoft.com/office/drawing/2016/5/11/chartex" xmlns:cx6="http://schemas.microsoft.com/office/drawing/2016/5/12/chartex" xmlns:cx7="http://schemas.microsoft.com/office/drawing/2016/5/13/chartex" xmlns:cx8="http://schemas.microsoft.com/office/drawing/2016/5/14/chartex" xmlns:mc="http://schemas.openxmlformats.org/markup-compatibility/2006" xmlns:aink="http://schemas.microsoft.com/office/drawing/2016/ink" xmlns:am3d="http://schemas.microsoft.com/office/drawing/2017/model3d" xmlns:o="urn:schemas-microsoft-com:office:office" xmlns:oel="http://schemas.microsoft.com/office/2019/extlst" xmlns:r="http://schemas.openxmlformats.org/officeDocument/2006/relationships" xmlns:m="http://schemas.openxmlformats.org/officeDocument/2006/math" xmlns:v="urn:schemas-microsoft-com:vml" xmlns:wp14="http://schemas.microsoft.com/office/word/2010/wordprocessingDrawing" xmlns:wp="http://schemas.openxmlformats.org/drawingml/2006/wordprocessingDrawing" xmlns:w10="urn:schemas-microsoft-com:office:word" xmlns:w="http://schemas.openxmlformats.org/wordprocessingml/2006/main" xmlns:w14="http://schemas.microsoft.com/office/word/2010/wordml" xmlns:w15="http://schemas.microsoft.com/office/word/2012/wordml" xmlns:w16cex="http://schemas.microsoft.com/office/word/2018/wordml/cex" xmlns:w16cid="http://schemas.microsoft.com/office/word/2016/wordml/cid" xmlns:w16="http://schemas.microsoft.com/office/word/2018/wordml" xmlns:w16du="http://schemas.microsoft.com/office/word/2023/wordml/word16du" xmlns:w16sdtdh="http://schemas.microsoft.com/office/word/2020/wordml/sdtdatahash" xmlns:w16sdtfl="http://schemas.microsoft.com/office/word/2024/wordml/sdtformatlock" xmlns:w16se="http://schemas.microsoft.com/office/word/2015/wordml/symex" xmlns:wpg="http://schemas.microsoft.com/office/word/2010/wordprocessingGroup" xmlns:wpi="http://schemas.microsoft.com/office/word/2010/wordprocessingInk" xmlns:wne="http://schemas.microsoft.com/office/word/2006/wordml" xmlns:wps="http://schemas.microsoft.com/office/word/2010/wordprocessingShape" mc:Ignorable="w14 w15 w16se w16cid w16 w16cex w16sdtdh w16sdtfl w16du wp14">
+<w:numbering xmlns:wpc="http://schemas.microsoft.com/office/word/2010/wordprocessingCanvas" xmlns:cx="http://schemas.microsoft.com/office/drawing/2014/chartex" xmlns:mc="http://schemas.openxmlformats.org/markup-compatibility/2006" xmlns:o="urn:schemas-microsoft-com:office:office" xmlns:r="http://schemas.openxmlformats.org/officeDocument/2006/relationships" xmlns:m="http://schemas.openxmlformats.org/officeDocument/2006/math" xmlns:v="urn:schemas-microsoft-com:vml" xmlns:wp14="http://schemas.microsoft.com/office/word/2010/wordprocessingDrawing" xmlns:wp="http://schemas.openxmlformats.org/drawingml/2006/wordprocessingDrawing" xmlns:w10="urn:schemas-microsoft-com:office:word" xmlns:w="http://schemas.openxmlformats.org/wordprocessingml/2006/main" xmlns:w14="http://schemas.microsoft.com/office/word/2010/wordml" xmlns:w15="http://schemas.microsoft.com/office/word/2012/wordml" xmlns:w16se="http://schemas.microsoft.com/office/word/2015/wordml/symex" xmlns:wpg="http://schemas.microsoft.com/office/word/2010/wordprocessingGroup" xmlns:wpi="http://schemas.microsoft.com/office/word/2010/wordprocessingInk" xmlns:wne="http://schemas.microsoft.com/office/word/2006/wordml" xmlns:wps="http://schemas.microsoft.com/office/word/2010/wordprocessingShape" mc:Ignorable="w14 w15 w16se wp14">
   <w:abstractNum w:abstractNumId="0" w15:restartNumberingAfterBreak="0">
     <w:nsid w:val="034D47F8"/>
     <w:multiLevelType w:val="hybridMultilevel"/>
@@ -7465,32 +7980,32 @@
       </w:rPr>
     </w:lvl>
   </w:abstractNum>
-  <w:num w:numId="1" w16cid:durableId="1325401579">
+  <w:num w:numId="1">
     <w:abstractNumId w:val="6"/>
   </w:num>
-  <w:num w:numId="2" w16cid:durableId="1859587705">
+  <w:num w:numId="2">
     <w:abstractNumId w:val="3"/>
   </w:num>
-  <w:num w:numId="3" w16cid:durableId="1193108645">
+  <w:num w:numId="3">
     <w:abstractNumId w:val="2"/>
   </w:num>
-  <w:num w:numId="4" w16cid:durableId="1581865016">
+  <w:num w:numId="4">
     <w:abstractNumId w:val="0"/>
   </w:num>
-  <w:num w:numId="5" w16cid:durableId="1165974685">
+  <w:num w:numId="5">
     <w:abstractNumId w:val="4"/>
   </w:num>
-  <w:num w:numId="6" w16cid:durableId="937754731">
+  <w:num w:numId="6">
     <w:abstractNumId w:val="1"/>
   </w:num>
-  <w:num w:numId="7" w16cid:durableId="1184710301">
+  <w:num w:numId="7">
     <w:abstractNumId w:val="5"/>
   </w:num>
 </w:numbering>
 </file>
 
 <file path=word/styles.xml><?xml version="1.0" encoding="utf-8"?>
-<w:styles xmlns:mc="http://schemas.openxmlformats.org/markup-compatibility/2006" xmlns:r="http://schemas.openxmlformats.org/officeDocument/2006/relationships" xmlns:w="http://schemas.openxmlformats.org/wordprocessingml/2006/main" xmlns:w14="http://schemas.microsoft.com/office/word/2010/wordml" xmlns:w15="http://schemas.microsoft.com/office/word/2012/wordml" xmlns:w16cex="http://schemas.microsoft.com/office/word/2018/wordml/cex" xmlns:w16cid="http://schemas.microsoft.com/office/word/2016/wordml/cid" xmlns:w16="http://schemas.microsoft.com/office/word/2018/wordml" xmlns:w16du="http://schemas.microsoft.com/office/word/2023/wordml/word16du" xmlns:w16sdtdh="http://schemas.microsoft.com/office/word/2020/wordml/sdtdatahash" xmlns:w16sdtfl="http://schemas.microsoft.com/office/word/2024/wordml/sdtformatlock" xmlns:w16se="http://schemas.microsoft.com/office/word/2015/wordml/symex" mc:Ignorable="w14 w15 w16se w16cid w16 w16cex w16sdtdh w16sdtfl w16du">
+<w:styles xmlns:mc="http://schemas.openxmlformats.org/markup-compatibility/2006" xmlns:r="http://schemas.openxmlformats.org/officeDocument/2006/relationships" xmlns:w="http://schemas.openxmlformats.org/wordprocessingml/2006/main" xmlns:w14="http://schemas.microsoft.com/office/word/2010/wordml" xmlns:w15="http://schemas.microsoft.com/office/word/2012/wordml" xmlns:w16se="http://schemas.microsoft.com/office/word/2015/wordml/symex" mc:Ignorable="w14 w15 w16se">
   <w:docDefaults>
     <w:rPrDefault>
       <w:rPr>
@@ -7506,7 +8021,7 @@
       </w:pPr>
     </w:pPrDefault>
   </w:docDefaults>
-  <w:latentStyles w:defLockedState="0" w:defUIPriority="99" w:defSemiHidden="0" w:defUnhideWhenUsed="0" w:defQFormat="0" w:count="376">
+  <w:latentStyles w:defLockedState="0" w:defUIPriority="99" w:defSemiHidden="0" w:defUnhideWhenUsed="0" w:defQFormat="0" w:count="371">
     <w:lsdException w:name="Normal" w:uiPriority="0" w:qFormat="1"/>
     <w:lsdException w:name="heading 1" w:uiPriority="9" w:qFormat="1"/>
     <w:lsdException w:name="heading 2" w:semiHidden="1" w:uiPriority="9" w:unhideWhenUsed="1" w:qFormat="1"/>
@@ -7878,11 +8393,6 @@
     <w:lsdException w:name="List Table 5 Dark Accent 6" w:uiPriority="50"/>
     <w:lsdException w:name="List Table 6 Colorful Accent 6" w:uiPriority="51"/>
     <w:lsdException w:name="List Table 7 Colorful Accent 6" w:uiPriority="52"/>
-    <w:lsdException w:name="Mention" w:semiHidden="1" w:unhideWhenUsed="1"/>
-    <w:lsdException w:name="Smart Hyperlink" w:semiHidden="1" w:unhideWhenUsed="1"/>
-    <w:lsdException w:name="Hashtag" w:semiHidden="1" w:unhideWhenUsed="1"/>
-    <w:lsdException w:name="Unresolved Mention" w:semiHidden="1" w:unhideWhenUsed="1"/>
-    <w:lsdException w:name="Smart Link" w:semiHidden="1" w:unhideWhenUsed="1"/>
   </w:latentStyles>
   <w:style w:type="paragraph" w:default="1" w:styleId="Normal">
     <w:name w:val="Normal"/>
@@ -8005,6 +8515,7 @@
   <w:style w:type="character" w:default="1" w:styleId="Fuentedeprrafopredeter">
     <w:name w:val="Default Paragraph Font"/>
     <w:uiPriority w:val="1"/>
+    <w:semiHidden/>
     <w:unhideWhenUsed/>
   </w:style>
   <w:style w:type="table" w:default="1" w:styleId="Tablanormal">

</xml_diff>

<commit_message>
Correción de indice y titulos
</commit_message>
<xml_diff>
--- a/Entrega 3/Entrega 3 - TPI.docx
+++ b/Entrega 3/Entrega 3 - TPI.docx
@@ -1,6 +1,6 @@
 
 <file path=word/document.xml><?xml version="1.0" encoding="utf-8"?>
-<w:document xmlns:wpc="http://schemas.microsoft.com/office/word/2010/wordprocessingCanvas" xmlns:cx="http://schemas.microsoft.com/office/drawing/2014/chartex" xmlns:cx1="http://schemas.microsoft.com/office/drawing/2015/9/8/chartex" xmlns:cx2="http://schemas.microsoft.com/office/drawing/2015/10/21/chartex" xmlns:cx3="http://schemas.microsoft.com/office/drawing/2016/5/9/chartex" xmlns:cx4="http://schemas.microsoft.com/office/drawing/2016/5/10/chartex" xmlns:cx5="http://schemas.microsoft.com/office/drawing/2016/5/11/chartex" xmlns:cx6="http://schemas.microsoft.com/office/drawing/2016/5/12/chartex" xmlns:cx7="http://schemas.microsoft.com/office/drawing/2016/5/13/chartex" xmlns:cx8="http://schemas.microsoft.com/office/drawing/2016/5/14/chartex" xmlns:mc="http://schemas.openxmlformats.org/markup-compatibility/2006" xmlns:aink="http://schemas.microsoft.com/office/drawing/2016/ink" xmlns:am3d="http://schemas.microsoft.com/office/drawing/2017/model3d" xmlns:o="urn:schemas-microsoft-com:office:office" xmlns:oel="http://schemas.microsoft.com/office/2019/extlst" xmlns:r="http://schemas.openxmlformats.org/officeDocument/2006/relationships" xmlns:m="http://schemas.openxmlformats.org/officeDocument/2006/math" xmlns:v="urn:schemas-microsoft-com:vml" xmlns:wp14="http://schemas.microsoft.com/office/word/2010/wordprocessingDrawing" xmlns:wp="http://schemas.openxmlformats.org/drawingml/2006/wordprocessingDrawing" xmlns:w10="urn:schemas-microsoft-com:office:word" xmlns:w="http://schemas.openxmlformats.org/wordprocessingml/2006/main" xmlns:w14="http://schemas.microsoft.com/office/word/2010/wordml" xmlns:w15="http://schemas.microsoft.com/office/word/2012/wordml" xmlns:w16cex="http://schemas.microsoft.com/office/word/2018/wordml/cex" xmlns:w16cid="http://schemas.microsoft.com/office/word/2016/wordml/cid" xmlns:w16="http://schemas.microsoft.com/office/word/2018/wordml" xmlns:w16sdtdh="http://schemas.microsoft.com/office/word/2020/wordml/sdtdatahash" xmlns:w16se="http://schemas.microsoft.com/office/word/2015/wordml/symex" xmlns:wpg="http://schemas.microsoft.com/office/word/2010/wordprocessingGroup" xmlns:wpi="http://schemas.microsoft.com/office/word/2010/wordprocessingInk" xmlns:wne="http://schemas.microsoft.com/office/word/2006/wordml" xmlns:wps="http://schemas.microsoft.com/office/word/2010/wordprocessingShape" mc:Ignorable="w14 w15 w16se w16cid w16 w16cex w16sdtdh wp14">
+<w:document xmlns:wpc="http://schemas.microsoft.com/office/word/2010/wordprocessingCanvas" xmlns:cx="http://schemas.microsoft.com/office/drawing/2014/chartex" xmlns:cx1="http://schemas.microsoft.com/office/drawing/2015/9/8/chartex" xmlns:cx2="http://schemas.microsoft.com/office/drawing/2015/10/21/chartex" xmlns:cx3="http://schemas.microsoft.com/office/drawing/2016/5/9/chartex" xmlns:cx4="http://schemas.microsoft.com/office/drawing/2016/5/10/chartex" xmlns:cx5="http://schemas.microsoft.com/office/drawing/2016/5/11/chartex" xmlns:cx6="http://schemas.microsoft.com/office/drawing/2016/5/12/chartex" xmlns:cx7="http://schemas.microsoft.com/office/drawing/2016/5/13/chartex" xmlns:cx8="http://schemas.microsoft.com/office/drawing/2016/5/14/chartex" xmlns:mc="http://schemas.openxmlformats.org/markup-compatibility/2006" xmlns:aink="http://schemas.microsoft.com/office/drawing/2016/ink" xmlns:am3d="http://schemas.microsoft.com/office/drawing/2017/model3d" xmlns:o="urn:schemas-microsoft-com:office:office" xmlns:oel="http://schemas.microsoft.com/office/2019/extlst" xmlns:r="http://schemas.openxmlformats.org/officeDocument/2006/relationships" xmlns:m="http://schemas.openxmlformats.org/officeDocument/2006/math" xmlns:v="urn:schemas-microsoft-com:vml" xmlns:wp14="http://schemas.microsoft.com/office/word/2010/wordprocessingDrawing" xmlns:wp="http://schemas.openxmlformats.org/drawingml/2006/wordprocessingDrawing" xmlns:w10="urn:schemas-microsoft-com:office:word" xmlns:w="http://schemas.openxmlformats.org/wordprocessingml/2006/main" xmlns:w14="http://schemas.microsoft.com/office/word/2010/wordml" xmlns:w15="http://schemas.microsoft.com/office/word/2012/wordml" xmlns:w16cex="http://schemas.microsoft.com/office/word/2018/wordml/cex" xmlns:w16cid="http://schemas.microsoft.com/office/word/2016/wordml/cid" xmlns:w16="http://schemas.microsoft.com/office/word/2018/wordml" xmlns:w16sdtdh="http://schemas.microsoft.com/office/word/2020/wordml/sdtdatahash" xmlns:w16se="http://schemas.microsoft.com/office/word/2015/wordml/symex" xmlns:wpg="http://schemas.microsoft.com/office/word/2010/wordprocessingGroup" xmlns:wpi="http://schemas.microsoft.com/office/word/2010/wordprocessingInk" xmlns:wne="http://schemas.microsoft.com/office/word/2006/wordml" xmlns:wps="http://schemas.microsoft.com/office/word/2010/wordprocessingShape" xmlns:a="http://schemas.openxmlformats.org/drawingml/2006/main" xmlns:pic="http://schemas.openxmlformats.org/drawingml/2006/picture" xmlns:a14="http://schemas.microsoft.com/office/drawing/2010/main" mc:Ignorable="w14 w15 w16se w16cid w16 w16cex w16sdtdh wp14">
   <w:body>
     <w:p>
       <w:pPr>
@@ -550,7 +550,6 @@
           <w:i/>
           <w:iCs/>
         </w:rPr>
-        <w:lastRenderedPageBreak/>
         <w:t>ÍNDICE</w:t>
       </w:r>
     </w:p>
@@ -567,7 +566,7 @@
     <w:sdt>
       <w:sdtPr>
         <w:rPr>
-          <w:rFonts w:ascii="Arial" w:eastAsia="Arial" w:hAnsi="Arial" w:cs="Arial"/>
+          <w:rFonts w:ascii="Arial" w:hAnsi="Arial" w:eastAsia="Arial" w:cs="Arial"/>
           <w:color w:val="auto"/>
           <w:sz w:val="22"/>
           <w:szCs w:val="22"/>
@@ -595,335 +594,456 @@
           <w:pPr>
             <w:pStyle w:val="TDC1"/>
             <w:tabs>
-              <w:tab w:val="right" w:leader="dot" w:pos="9016"/>
+              <w:tab w:val="right" w:leader="dot" w:pos="9015"/>
             </w:tabs>
-            <w:rPr>
-              <w:rFonts w:asciiTheme="minorHAnsi" w:eastAsiaTheme="minorEastAsia" w:hAnsiTheme="minorHAnsi" w:cstheme="minorBidi"/>
-              <w:noProof/>
-              <w:kern w:val="2"/>
-              <w:sz w:val="24"/>
-              <w:szCs w:val="24"/>
-              <w:lang w:val="es-AR"/>
-              <w14:ligatures w14:val="standardContextual"/>
-            </w:rPr>
           </w:pPr>
           <w:r>
             <w:fldChar w:fldCharType="begin"/>
           </w:r>
           <w:r>
-            <w:rPr>
-              <w:rStyle w:val="IndexLink"/>
-              <w:b/>
-              <w:bCs/>
-              <w:webHidden/>
-            </w:rPr>
-            <w:instrText xml:space="preserve"> TOC \z \o "1-3" \u \h</w:instrText>
-          </w:r>
-          <w:r>
-            <w:rPr>
-              <w:rStyle w:val="IndexLink"/>
-              <w:b/>
-              <w:bCs/>
-            </w:rPr>
+            <w:instrText xml:space="preserve">TOC \o "1-3" \z \u \h</w:instrText>
+          </w:r>
+          <w:r>
             <w:fldChar w:fldCharType="separate"/>
           </w:r>
-          <w:hyperlink w:anchor="_Toc242293372" w:history="1">
-            <w:r>
-              <w:rPr>
-                <w:rStyle w:val="Hipervnculo"/>
-                <w:b/>
-                <w:bCs/>
-                <w:noProof/>
-                <w:lang w:val="es-AR"/>
-              </w:rPr>
-              <w:t>Modelo de Caso de Uso del TPI</w:t>
-            </w:r>
-            <w:r>
-              <w:rPr>
-                <w:noProof/>
-                <w:webHidden/>
-              </w:rPr>
-              <w:tab/>
-            </w:r>
-            <w:r>
-              <w:rPr>
-                <w:noProof/>
-                <w:webHidden/>
-              </w:rPr>
-              <w:fldChar w:fldCharType="begin"/>
-            </w:r>
-            <w:r>
-              <w:rPr>
-                <w:noProof/>
-                <w:webHidden/>
-              </w:rPr>
-              <w:instrText xml:space="preserve"> PAGEREF _Toc242293372 \h </w:instrText>
-            </w:r>
-            <w:r>
-              <w:rPr>
-                <w:noProof/>
-                <w:webHidden/>
-              </w:rPr>
-            </w:r>
-            <w:r>
-              <w:rPr>
-                <w:noProof/>
-                <w:webHidden/>
-              </w:rPr>
-              <w:fldChar w:fldCharType="separate"/>
-            </w:r>
-            <w:r>
-              <w:rPr>
-                <w:noProof/>
-                <w:webHidden/>
-              </w:rPr>
-              <w:t>2</w:t>
-            </w:r>
-            <w:r>
-              <w:rPr>
-                <w:noProof/>
-                <w:webHidden/>
-              </w:rPr>
-              <w:fldChar w:fldCharType="end"/>
-            </w:r>
-          </w:hyperlink>
+          <w:r>
+            <w:fldChar w:fldCharType="begin"/>
+          </w:r>
+          <w:r>
+            <w:instrText xml:space="preserve">HYPERLINK  \l  "_Toc1208014390" </w:instrText>
+          </w:r>
+          <w:r>
+            <w:fldChar w:fldCharType="separate"/>
+          </w:r>
+          <w:r>
+            <w:rPr/>
+            <w:t>Modelado de Caso de Uso del TPI</w:t>
+          </w:r>
+          <w:r>
+            <w:tab/>
+          </w:r>
+          <w:r>
+            <w:fldChar w:fldCharType="begin"/>
+          </w:r>
+          <w:r>
+            <w:instrText xml:space="preserve">PAGEREF _Toc1208014390 \h</w:instrText>
+          </w:r>
+          <w:r>
+            <w:fldChar w:fldCharType="separate"/>
+          </w:r>
+          <w:r>
+            <w:rPr/>
+            <w:t>2</w:t>
+          </w:r>
+          <w:r>
+            <w:fldChar w:fldCharType="end"/>
+          </w:r>
+          <w:r>
+            <w:fldChar w:fldCharType="end"/>
+          </w:r>
         </w:p>
         <w:p>
           <w:pPr>
             <w:pStyle w:val="TDC2"/>
             <w:tabs>
-              <w:tab w:val="right" w:leader="dot" w:pos="9016"/>
+              <w:tab w:val="right" w:leader="dot" w:pos="9015"/>
             </w:tabs>
-            <w:rPr>
-              <w:rFonts w:asciiTheme="minorHAnsi" w:eastAsiaTheme="minorEastAsia" w:hAnsiTheme="minorHAnsi" w:cstheme="minorBidi"/>
-              <w:noProof/>
-              <w:kern w:val="2"/>
-              <w:sz w:val="24"/>
-              <w:szCs w:val="24"/>
-              <w:lang w:val="es-AR"/>
-              <w14:ligatures w14:val="standardContextual"/>
-            </w:rPr>
           </w:pPr>
-          <w:hyperlink w:anchor="_Toc242293373" w:history="1">
-            <w:r>
-              <w:rPr>
-                <w:rStyle w:val="Hipervnculo"/>
-                <w:b/>
-                <w:bCs/>
-                <w:noProof/>
-                <w:lang w:val="es-AR"/>
-              </w:rPr>
-              <w:t>Lista de CU – Objetivos</w:t>
-            </w:r>
-            <w:r>
-              <w:rPr>
-                <w:noProof/>
-                <w:webHidden/>
-              </w:rPr>
-              <w:tab/>
-            </w:r>
-            <w:r>
-              <w:rPr>
-                <w:noProof/>
-                <w:webHidden/>
-              </w:rPr>
-              <w:fldChar w:fldCharType="begin"/>
-            </w:r>
-            <w:r>
-              <w:rPr>
-                <w:noProof/>
-                <w:webHidden/>
-              </w:rPr>
-              <w:instrText xml:space="preserve"> PAGEREF _Toc242293373 \h </w:instrText>
-            </w:r>
-            <w:r>
-              <w:rPr>
-                <w:noProof/>
-                <w:webHidden/>
-              </w:rPr>
-            </w:r>
-            <w:r>
-              <w:rPr>
-                <w:noProof/>
-                <w:webHidden/>
-              </w:rPr>
-              <w:fldChar w:fldCharType="separate"/>
-            </w:r>
-            <w:r>
-              <w:rPr>
-                <w:noProof/>
-                <w:webHidden/>
-              </w:rPr>
-              <w:t>3</w:t>
-            </w:r>
-            <w:r>
-              <w:rPr>
-                <w:noProof/>
-                <w:webHidden/>
-              </w:rPr>
-              <w:fldChar w:fldCharType="end"/>
-            </w:r>
-          </w:hyperlink>
+          <w:r>
+            <w:fldChar w:fldCharType="begin"/>
+          </w:r>
+          <w:r>
+            <w:instrText xml:space="preserve">HYPERLINK  \l  "_Toc476618457" </w:instrText>
+          </w:r>
+          <w:r>
+            <w:fldChar w:fldCharType="separate"/>
+          </w:r>
+          <w:r>
+            <w:rPr/>
+            <w:t>Diagrama de Casos de Uso</w:t>
+          </w:r>
+          <w:r>
+            <w:tab/>
+          </w:r>
+          <w:r>
+            <w:fldChar w:fldCharType="begin"/>
+          </w:r>
+          <w:r>
+            <w:instrText xml:space="preserve">PAGEREF _Toc476618457 \h</w:instrText>
+          </w:r>
+          <w:r>
+            <w:fldChar w:fldCharType="separate"/>
+          </w:r>
+          <w:r>
+            <w:rPr/>
+            <w:t>3</w:t>
+          </w:r>
+          <w:r>
+            <w:fldChar w:fldCharType="end"/>
+          </w:r>
+          <w:r>
+            <w:fldChar w:fldCharType="end"/>
+          </w:r>
         </w:p>
         <w:p>
           <w:pPr>
             <w:pStyle w:val="TDC2"/>
             <w:tabs>
-              <w:tab w:val="right" w:leader="dot" w:pos="9016"/>
+              <w:tab w:val="right" w:leader="dot" w:pos="9015"/>
             </w:tabs>
-            <w:rPr>
-              <w:rFonts w:asciiTheme="minorHAnsi" w:eastAsiaTheme="minorEastAsia" w:hAnsiTheme="minorHAnsi" w:cstheme="minorBidi"/>
-              <w:noProof/>
-              <w:kern w:val="2"/>
-              <w:sz w:val="24"/>
-              <w:szCs w:val="24"/>
-              <w:lang w:val="es-AR"/>
-              <w14:ligatures w14:val="standardContextual"/>
-            </w:rPr>
           </w:pPr>
-          <w:hyperlink w:anchor="_Toc242293374" w:history="1">
-            <w:r>
-              <w:rPr>
-                <w:rStyle w:val="Hipervnculo"/>
-                <w:b/>
-                <w:bCs/>
-                <w:noProof/>
-                <w:lang w:val="es-AR"/>
-              </w:rPr>
-              <w:t>Diagrama de transición de estados</w:t>
-            </w:r>
-            <w:r>
-              <w:rPr>
-                <w:noProof/>
-                <w:webHidden/>
-              </w:rPr>
-              <w:tab/>
-            </w:r>
-            <w:r>
-              <w:rPr>
-                <w:noProof/>
-                <w:webHidden/>
-              </w:rPr>
-              <w:fldChar w:fldCharType="begin"/>
-            </w:r>
-            <w:r>
-              <w:rPr>
-                <w:noProof/>
-                <w:webHidden/>
-              </w:rPr>
-              <w:instrText xml:space="preserve"> PAGEREF _Toc242293374 \h </w:instrText>
-            </w:r>
-            <w:r>
-              <w:rPr>
-                <w:noProof/>
-                <w:webHidden/>
-              </w:rPr>
-            </w:r>
-            <w:r>
-              <w:rPr>
-                <w:noProof/>
-                <w:webHidden/>
-              </w:rPr>
-              <w:fldChar w:fldCharType="separate"/>
-            </w:r>
-            <w:r>
-              <w:rPr>
-                <w:noProof/>
-                <w:webHidden/>
-              </w:rPr>
-              <w:t>14</w:t>
-            </w:r>
-            <w:r>
-              <w:rPr>
-                <w:noProof/>
-                <w:webHidden/>
-              </w:rPr>
-              <w:fldChar w:fldCharType="end"/>
-            </w:r>
-          </w:hyperlink>
+          <w:r>
+            <w:fldChar w:fldCharType="begin"/>
+          </w:r>
+          <w:r>
+            <w:instrText xml:space="preserve">HYPERLINK  \l  "_Toc1942785650" </w:instrText>
+          </w:r>
+          <w:r>
+            <w:fldChar w:fldCharType="separate"/>
+          </w:r>
+          <w:r>
+            <w:rPr/>
+            <w:t>Lista de CU – Objetivos</w:t>
+          </w:r>
+          <w:r>
+            <w:tab/>
+          </w:r>
+          <w:r>
+            <w:fldChar w:fldCharType="begin"/>
+          </w:r>
+          <w:r>
+            <w:instrText xml:space="preserve">PAGEREF _Toc1942785650 \h</w:instrText>
+          </w:r>
+          <w:r>
+            <w:fldChar w:fldCharType="separate"/>
+          </w:r>
+          <w:r>
+            <w:rPr/>
+            <w:t>3</w:t>
+          </w:r>
+          <w:r>
+            <w:fldChar w:fldCharType="end"/>
+          </w:r>
+          <w:r>
+            <w:fldChar w:fldCharType="end"/>
+          </w:r>
+        </w:p>
+        <w:p>
+          <w:pPr>
+            <w:pStyle w:val="TDC1"/>
+            <w:tabs>
+              <w:tab w:val="right" w:leader="dot" w:pos="9015"/>
+            </w:tabs>
+          </w:pPr>
+          <w:r>
+            <w:fldChar w:fldCharType="begin"/>
+          </w:r>
+          <w:r>
+            <w:instrText xml:space="preserve">HYPERLINK  \l  "_Toc540596233" </w:instrText>
+          </w:r>
+          <w:r>
+            <w:fldChar w:fldCharType="separate"/>
+          </w:r>
+          <w:r>
+            <w:rPr/>
+            <w:t>Presentación de 3 casos de uso esenciales</w:t>
+          </w:r>
+          <w:r>
+            <w:tab/>
+          </w:r>
+          <w:r>
+            <w:fldChar w:fldCharType="begin"/>
+          </w:r>
+          <w:r>
+            <w:instrText xml:space="preserve">PAGEREF _Toc540596233 \h</w:instrText>
+          </w:r>
+          <w:r>
+            <w:fldChar w:fldCharType="separate"/>
+          </w:r>
+          <w:r>
+            <w:rPr/>
+            <w:t>4</w:t>
+          </w:r>
+          <w:r>
+            <w:fldChar w:fldCharType="end"/>
+          </w:r>
+          <w:r>
+            <w:fldChar w:fldCharType="end"/>
+          </w:r>
         </w:p>
         <w:p>
           <w:pPr>
             <w:pStyle w:val="TDC2"/>
             <w:tabs>
-              <w:tab w:val="right" w:leader="dot" w:pos="9016"/>
+              <w:tab w:val="right" w:leader="dot" w:pos="9015"/>
             </w:tabs>
-            <w:rPr>
-              <w:rFonts w:asciiTheme="minorHAnsi" w:eastAsiaTheme="minorEastAsia" w:hAnsiTheme="minorHAnsi" w:cstheme="minorBidi"/>
-              <w:noProof/>
-              <w:kern w:val="2"/>
-              <w:sz w:val="24"/>
-              <w:szCs w:val="24"/>
-              <w:lang w:val="es-AR"/>
-              <w14:ligatures w14:val="standardContextual"/>
-            </w:rPr>
           </w:pPr>
-          <w:hyperlink w:anchor="_Toc242293375" w:history="1">
-            <w:r>
-              <w:rPr>
-                <w:rStyle w:val="Hipervnculo"/>
-                <w:b/>
-                <w:bCs/>
-                <w:noProof/>
-              </w:rPr>
-              <w:t>Git log de la tercera entrega</w:t>
-            </w:r>
-            <w:r>
-              <w:rPr>
-                <w:noProof/>
-                <w:webHidden/>
-              </w:rPr>
-              <w:tab/>
-            </w:r>
-            <w:r>
-              <w:rPr>
-                <w:noProof/>
-                <w:webHidden/>
-              </w:rPr>
-              <w:fldChar w:fldCharType="begin"/>
-            </w:r>
-            <w:r>
-              <w:rPr>
-                <w:noProof/>
-                <w:webHidden/>
-              </w:rPr>
-              <w:instrText xml:space="preserve"> PAGEREF _Toc242293375 \h </w:instrText>
-            </w:r>
-            <w:r>
-              <w:rPr>
-                <w:noProof/>
-                <w:webHidden/>
-              </w:rPr>
-            </w:r>
-            <w:r>
-              <w:rPr>
-                <w:noProof/>
-                <w:webHidden/>
-              </w:rPr>
-              <w:fldChar w:fldCharType="separate"/>
-            </w:r>
-            <w:r>
-              <w:rPr>
-                <w:noProof/>
-                <w:webHidden/>
-              </w:rPr>
-              <w:t>5</w:t>
-            </w:r>
-            <w:r>
-              <w:rPr>
-                <w:noProof/>
-                <w:webHidden/>
-              </w:rPr>
-              <w:fldChar w:fldCharType="end"/>
-            </w:r>
-          </w:hyperlink>
+          <w:r>
+            <w:fldChar w:fldCharType="begin"/>
+          </w:r>
+          <w:r>
+            <w:instrText xml:space="preserve">HYPERLINK  \l  "_Toc637168105" </w:instrText>
+          </w:r>
+          <w:r>
+            <w:fldChar w:fldCharType="separate"/>
+          </w:r>
+          <w:r>
+            <w:rPr/>
+            <w:t>Prototipo de la pantalla principal</w:t>
+          </w:r>
+          <w:r>
+            <w:tab/>
+          </w:r>
+          <w:r>
+            <w:fldChar w:fldCharType="begin"/>
+          </w:r>
+          <w:r>
+            <w:instrText xml:space="preserve">PAGEREF _Toc637168105 \h</w:instrText>
+          </w:r>
+          <w:r>
+            <w:fldChar w:fldCharType="separate"/>
+          </w:r>
+          <w:r>
+            <w:rPr/>
+            <w:t>5</w:t>
+          </w:r>
+          <w:r>
+            <w:fldChar w:fldCharType="end"/>
+          </w:r>
+          <w:r>
+            <w:fldChar w:fldCharType="end"/>
+          </w:r>
         </w:p>
         <w:p>
+          <w:pPr>
+            <w:pStyle w:val="TDC2"/>
+            <w:tabs>
+              <w:tab w:val="right" w:leader="dot" w:pos="9015"/>
+            </w:tabs>
+          </w:pPr>
+          <w:r>
+            <w:fldChar w:fldCharType="begin"/>
+          </w:r>
+          <w:r>
+            <w:instrText xml:space="preserve">HYPERLINK  \l  "_Toc292187718" </w:instrText>
+          </w:r>
+          <w:r>
+            <w:fldChar w:fldCharType="separate"/>
+          </w:r>
+          <w:r>
+            <w:rPr/>
+            <w:t>Prototipo de Registrar nuevo retiro</w:t>
+          </w:r>
+          <w:r>
+            <w:tab/>
+          </w:r>
+          <w:r>
+            <w:fldChar w:fldCharType="begin"/>
+          </w:r>
+          <w:r>
+            <w:instrText xml:space="preserve">PAGEREF _Toc292187718 \h</w:instrText>
+          </w:r>
+          <w:r>
+            <w:fldChar w:fldCharType="separate"/>
+          </w:r>
+          <w:r>
+            <w:rPr/>
+            <w:t>6</w:t>
+          </w:r>
+          <w:r>
+            <w:fldChar w:fldCharType="end"/>
+          </w:r>
+          <w:r>
+            <w:fldChar w:fldCharType="end"/>
+          </w:r>
+        </w:p>
+        <w:p>
+          <w:pPr>
+            <w:pStyle w:val="TDC2"/>
+            <w:tabs>
+              <w:tab w:val="right" w:leader="dot" w:pos="9015"/>
+            </w:tabs>
+          </w:pPr>
+          <w:r>
+            <w:fldChar w:fldCharType="begin"/>
+          </w:r>
+          <w:r>
+            <w:instrText xml:space="preserve">HYPERLINK  \l  "_Toc1758631309" </w:instrText>
+          </w:r>
+          <w:r>
+            <w:fldChar w:fldCharType="separate"/>
+          </w:r>
+          <w:r>
+            <w:rPr/>
+            <w:t>Prototipo de Consultar retiro agendado</w:t>
+          </w:r>
+          <w:r>
+            <w:tab/>
+          </w:r>
+          <w:r>
+            <w:fldChar w:fldCharType="begin"/>
+          </w:r>
+          <w:r>
+            <w:instrText xml:space="preserve">PAGEREF _Toc1758631309 \h</w:instrText>
+          </w:r>
+          <w:r>
+            <w:fldChar w:fldCharType="separate"/>
+          </w:r>
+          <w:r>
+            <w:rPr/>
+            <w:t>9</w:t>
+          </w:r>
+          <w:r>
+            <w:fldChar w:fldCharType="end"/>
+          </w:r>
+          <w:r>
+            <w:fldChar w:fldCharType="end"/>
+          </w:r>
+        </w:p>
+        <w:p>
+          <w:pPr>
+            <w:pStyle w:val="TDC2"/>
+            <w:tabs>
+              <w:tab w:val="right" w:leader="dot" w:pos="9015"/>
+            </w:tabs>
+          </w:pPr>
+          <w:r>
+            <w:fldChar w:fldCharType="begin"/>
+          </w:r>
+          <w:r>
+            <w:instrText xml:space="preserve">HYPERLINK  \l  "_Toc120165810" </w:instrText>
+          </w:r>
+          <w:r>
+            <w:fldChar w:fldCharType="separate"/>
+          </w:r>
+          <w:r>
+            <w:rPr/>
+            <w:t>Prototipo de Modificar retiro agendado</w:t>
+          </w:r>
+          <w:r>
+            <w:tab/>
+          </w:r>
+          <w:r>
+            <w:fldChar w:fldCharType="begin"/>
+          </w:r>
+          <w:r>
+            <w:instrText xml:space="preserve">PAGEREF _Toc120165810 \h</w:instrText>
+          </w:r>
+          <w:r>
+            <w:fldChar w:fldCharType="separate"/>
+          </w:r>
+          <w:r>
+            <w:rPr/>
+            <w:t>12</w:t>
+          </w:r>
+          <w:r>
+            <w:fldChar w:fldCharType="end"/>
+          </w:r>
+          <w:r>
+            <w:fldChar w:fldCharType="end"/>
+          </w:r>
+        </w:p>
+        <w:p>
+          <w:pPr>
+            <w:pStyle w:val="TDC1"/>
+            <w:tabs>
+              <w:tab w:val="right" w:leader="dot" w:pos="9015"/>
+            </w:tabs>
+          </w:pPr>
+          <w:r>
+            <w:fldChar w:fldCharType="begin"/>
+          </w:r>
+          <w:r>
+            <w:instrText xml:space="preserve">HYPERLINK  \l  "_Toc447222063" </w:instrText>
+          </w:r>
+          <w:r>
+            <w:fldChar w:fldCharType="separate"/>
+          </w:r>
+          <w:r>
+            <w:rPr/>
+            <w:t>Diagrama de transición de estados</w:t>
+          </w:r>
+          <w:r>
+            <w:tab/>
+          </w:r>
+          <w:r>
+            <w:fldChar w:fldCharType="begin"/>
+          </w:r>
+          <w:r>
+            <w:instrText xml:space="preserve">PAGEREF _Toc447222063 \h</w:instrText>
+          </w:r>
+          <w:r>
+            <w:fldChar w:fldCharType="separate"/>
+          </w:r>
+          <w:r>
+            <w:rPr/>
+            <w:t>13</w:t>
+          </w:r>
+          <w:r>
+            <w:fldChar w:fldCharType="end"/>
+          </w:r>
+          <w:r>
+            <w:fldChar w:fldCharType="end"/>
+          </w:r>
+        </w:p>
+        <w:p>
+          <w:pPr>
+            <w:pStyle w:val="TDC1"/>
+            <w:tabs>
+              <w:tab w:val="right" w:leader="dot" w:pos="9015"/>
+            </w:tabs>
+          </w:pPr>
+          <w:r>
+            <w:fldChar w:fldCharType="begin"/>
+          </w:r>
+          <w:r>
+            <w:instrText xml:space="preserve">HYPERLINK  \l  "_Toc72469304" </w:instrText>
+          </w:r>
+          <w:r>
+            <w:fldChar w:fldCharType="separate"/>
+          </w:r>
+          <w:r>
+            <w:rPr/>
+            <w:t>Git log de la tercera entrega</w:t>
+          </w:r>
+          <w:r>
+            <w:tab/>
+          </w:r>
+          <w:r>
+            <w:fldChar w:fldCharType="begin"/>
+          </w:r>
+          <w:r>
+            <w:instrText xml:space="preserve">PAGEREF _Toc72469304 \h</w:instrText>
+          </w:r>
+          <w:r>
+            <w:fldChar w:fldCharType="separate"/>
+          </w:r>
+          <w:r>
+            <w:rPr/>
+            <w:t>14</w:t>
+          </w:r>
+          <w:r>
+            <w:fldChar w:fldCharType="end"/>
+          </w:r>
+          <w:r>
+            <w:fldChar w:fldCharType="end"/>
+          </w:r>
+        </w:p>
+        <w:p>
           <w:r>
             <w:fldChar w:fldCharType="end"/>
           </w:r>
         </w:p>
       </w:sdtContent>
+      <w:sdtEndPr>
+        <w:rPr>
+          <w:rFonts w:ascii="Arial" w:hAnsi="Arial" w:eastAsia="Arial" w:cs="Arial"/>
+          <w:color w:val="auto"/>
+          <w:sz w:val="22"/>
+          <w:szCs w:val="22"/>
+          <w:lang w:val="es-ES" w:eastAsia="es-AR"/>
+        </w:rPr>
+      </w:sdtEndPr>
     </w:sdt>
     <w:p>
       <w:r>
@@ -933,52 +1053,64 @@
     <w:p>
       <w:pPr>
         <w:pStyle w:val="Ttulo1"/>
-        <w:spacing w:before="0"/>
-        <w:rPr>
-          <w:b/>
-          <w:bCs/>
-          <w:sz w:val="36"/>
-          <w:szCs w:val="36"/>
+        <w:rPr>
+          <w:b w:val="1"/>
+          <w:bCs w:val="1"/>
           <w:u w:val="single"/>
           <w:lang w:val="es-AR"/>
         </w:rPr>
       </w:pPr>
-      <w:bookmarkStart w:id="0" w:name="_Toc242293372"/>
-      <w:r>
-        <w:rPr>
-          <w:b/>
-          <w:bCs/>
-          <w:sz w:val="36"/>
-          <w:szCs w:val="36"/>
+      <w:bookmarkStart w:name="_Toc1208014390" w:id="14716910"/>
+      <w:r>
+        <w:rPr>
+          <w:b w:val="1"/>
+          <w:bCs w:val="1"/>
           <w:u w:val="single"/>
           <w:lang w:val="es-AR"/>
         </w:rPr>
-        <w:lastRenderedPageBreak/>
         <w:t>Model</w:t>
       </w:r>
       <w:r>
         <w:rPr>
-          <w:b/>
-          <w:bCs/>
-          <w:sz w:val="36"/>
-          <w:szCs w:val="36"/>
+          <w:b w:val="1"/>
+          <w:bCs w:val="1"/>
           <w:u w:val="single"/>
           <w:lang w:val="es-AR"/>
         </w:rPr>
-        <w:t>o</w:t>
-      </w:r>
-      <w:r>
-        <w:rPr>
-          <w:b/>
-          <w:bCs/>
-          <w:sz w:val="36"/>
-          <w:szCs w:val="36"/>
+        <w:t>ado</w:t>
+      </w:r>
+      <w:r>
+        <w:rPr>
+          <w:b w:val="1"/>
+          <w:bCs w:val="1"/>
           <w:u w:val="single"/>
           <w:lang w:val="es-AR"/>
         </w:rPr>
         <w:t xml:space="preserve"> de Caso de Uso del TPI</w:t>
       </w:r>
-      <w:bookmarkEnd w:id="0"/>
+      <w:bookmarkEnd w:id="14716910"/>
+    </w:p>
+    <w:p>
+      <w:pPr>
+        <w:pStyle w:val="Ttulo2"/>
+        <w:rPr>
+          <w:b w:val="1"/>
+          <w:bCs w:val="1"/>
+          <w:u w:val="none"/>
+          <w:lang w:val="es-AR"/>
+        </w:rPr>
+      </w:pPr>
+      <w:bookmarkStart w:name="_Toc476618457" w:id="1956161174"/>
+      <w:r>
+        <w:rPr>
+          <w:b w:val="1"/>
+          <w:bCs w:val="1"/>
+          <w:u w:val="none"/>
+          <w:lang w:val="es-AR"/>
+        </w:rPr>
+        <w:t>Diagrama de Casos de Uso</w:t>
+      </w:r>
+      <w:bookmarkEnd w:id="1956161174"/>
     </w:p>
     <w:p>
       <w:pPr>
@@ -1054,42 +1186,41 @@
       <w:pPr>
         <w:pStyle w:val="Ttulo2"/>
         <w:rPr>
-          <w:b/>
-          <w:bCs/>
-          <w:u w:val="single"/>
+          <w:b w:val="1"/>
+          <w:bCs w:val="1"/>
+          <w:u w:val="none"/>
           <w:lang w:val="es-AR"/>
         </w:rPr>
       </w:pPr>
-      <w:bookmarkStart w:id="1" w:name="_Toc242293373"/>
-      <w:r>
-        <w:rPr>
-          <w:b/>
-          <w:bCs/>
-          <w:u w:val="single"/>
+      <w:bookmarkStart w:name="_Toc1942785650" w:id="1020944321"/>
+      <w:r>
+        <w:rPr>
+          <w:b w:val="1"/>
+          <w:bCs w:val="1"/>
+          <w:u w:val="none"/>
           <w:lang w:val="es-AR"/>
         </w:rPr>
-        <w:lastRenderedPageBreak/>
         <w:t xml:space="preserve">Lista de CU </w:t>
       </w:r>
       <w:r>
         <w:rPr>
-          <w:b/>
-          <w:bCs/>
-          <w:u w:val="single"/>
+          <w:b w:val="1"/>
+          <w:bCs w:val="1"/>
+          <w:u w:val="none"/>
           <w:lang w:val="es-AR"/>
         </w:rPr>
         <w:t>–</w:t>
       </w:r>
       <w:r>
         <w:rPr>
-          <w:b/>
-          <w:bCs/>
-          <w:u w:val="single"/>
+          <w:b w:val="1"/>
+          <w:bCs w:val="1"/>
+          <w:u w:val="none"/>
           <w:lang w:val="es-AR"/>
         </w:rPr>
         <w:t xml:space="preserve"> Objetivos</w:t>
       </w:r>
-      <w:bookmarkEnd w:id="1"/>
+      <w:bookmarkEnd w:id="1020944321"/>
     </w:p>
     <w:tbl>
       <w:tblPr>
@@ -1673,19 +1804,18 @@
       <w:pPr>
         <w:spacing w:line="240" w:lineRule="auto"/>
         <w:rPr>
-          <w:b/>
-          <w:bCs/>
+          <w:b w:val="1"/>
+          <w:bCs w:val="1"/>
           <w:sz w:val="32"/>
           <w:szCs w:val="32"/>
           <w:u w:val="single"/>
         </w:rPr>
       </w:pPr>
-      <w:bookmarkStart w:id="2" w:name="_Toc242293375"/>
       <w:r>
         <w:rPr>
           <w:rFonts w:ascii="Tahoma" w:hAnsi="Tahoma" w:cs="Tahoma"/>
-          <w:b/>
-          <w:bCs/>
+          <w:b w:val="1"/>
+          <w:bCs w:val="1"/>
           <w:color w:val="333399"/>
         </w:rPr>
         <w:br w:type="page"/>
@@ -1693,38 +1823,61 @@
     </w:p>
     <w:p>
       <w:pPr>
+        <w:pStyle w:val="Ttulo1"/>
+        <w:rPr>
+          <w:b w:val="1"/>
+          <w:bCs w:val="1"/>
+          <w:sz w:val="40"/>
+          <w:szCs w:val="40"/>
+          <w:u w:val="single"/>
+        </w:rPr>
+      </w:pPr>
+      <w:bookmarkStart w:name="_Toc540596233" w:id="1111225318"/>
+      <w:r>
+        <w:rPr>
+          <w:b w:val="1"/>
+          <w:bCs w:val="1"/>
+          <w:u w:val="single"/>
+        </w:rPr>
+        <w:t>Presentación de 3 casos de uso esenciales</w:t>
+      </w:r>
+      <w:bookmarkEnd w:id="1111225318"/>
+    </w:p>
+    <w:p>
+      <w:pPr>
         <w:pStyle w:val="Ttulo2"/>
         <w:rPr>
-          <w:b/>
-          <w:bCs/>
-          <w:u w:val="single"/>
-        </w:rPr>
-      </w:pPr>
-      <w:r>
-        <w:rPr>
-          <w:b/>
-          <w:bCs/>
-          <w:u w:val="single"/>
-        </w:rPr>
-        <w:lastRenderedPageBreak/>
+          <w:b w:val="1"/>
+          <w:bCs w:val="1"/>
+          <w:u w:val="none"/>
+        </w:rPr>
+      </w:pPr>
+      <w:bookmarkStart w:name="_Toc637168105" w:id="883809488"/>
+      <w:r>
+        <w:rPr>
+          <w:b w:val="1"/>
+          <w:bCs w:val="1"/>
+          <w:u w:val="none"/>
+        </w:rPr>
         <w:t xml:space="preserve">Prototipo </w:t>
       </w:r>
       <w:r>
         <w:rPr>
-          <w:b/>
-          <w:bCs/>
-          <w:u w:val="single"/>
+          <w:b w:val="1"/>
+          <w:bCs w:val="1"/>
+          <w:u w:val="none"/>
         </w:rPr>
         <w:t xml:space="preserve">de la </w:t>
       </w:r>
       <w:r>
         <w:rPr>
-          <w:b/>
-          <w:bCs/>
-          <w:u w:val="single"/>
+          <w:b w:val="1"/>
+          <w:bCs w:val="1"/>
+          <w:u w:val="none"/>
         </w:rPr>
         <w:t>pantalla principal</w:t>
       </w:r>
+      <w:bookmarkEnd w:id="883809488"/>
     </w:p>
     <w:p/>
     <w:p>
@@ -1871,7 +2024,6 @@
           <w:bCs/>
           <w:color w:val="333399"/>
         </w:rPr>
-        <w:lastRenderedPageBreak/>
         <w:t>Plantilla para Descripción de Use Cases  (Trazo Intermedio)</w:t>
       </w:r>
     </w:p>
@@ -1897,12 +2049,12 @@
         <w:jc w:val="center"/>
         <w:tblCellSpacing w:w="20" w:type="dxa"/>
         <w:tblBorders>
-          <w:top w:val="outset" w:sz="6" w:space="0" w:color="auto"/>
-          <w:left w:val="outset" w:sz="6" w:space="0" w:color="auto"/>
-          <w:bottom w:val="outset" w:sz="6" w:space="0" w:color="auto"/>
-          <w:right w:val="outset" w:sz="6" w:space="0" w:color="auto"/>
-          <w:insideH w:val="outset" w:sz="6" w:space="0" w:color="auto"/>
-          <w:insideV w:val="outset" w:sz="6" w:space="0" w:color="auto"/>
+          <w:top w:val="outset" w:color="auto" w:sz="6" w:space="0"/>
+          <w:left w:val="outset" w:color="auto" w:sz="6" w:space="0"/>
+          <w:bottom w:val="outset" w:color="auto" w:sz="6" w:space="0"/>
+          <w:right w:val="outset" w:color="auto" w:sz="6" w:space="0"/>
+          <w:insideH w:val="outset" w:color="auto" w:sz="6" w:space="0"/>
+          <w:insideV w:val="outset" w:color="auto" w:sz="6" w:space="0"/>
         </w:tblBorders>
         <w:tblLayout w:type="fixed"/>
         <w:tblCellMar>
@@ -1931,6 +2083,7 @@
           <w:tcPr>
             <w:tcW w:w="9071" w:type="dxa"/>
             <w:gridSpan w:val="4"/>
+            <w:tcMar/>
           </w:tcPr>
           <w:p>
             <w:pPr>
@@ -1967,6 +2120,7 @@
             <w:tcW w:w="6292" w:type="dxa"/>
             <w:gridSpan w:val="3"/>
             <w:shd w:val="clear" w:color="auto" w:fill="C0C0C0"/>
+            <w:tcMar/>
           </w:tcPr>
           <w:p>
             <w:pPr>
@@ -2008,6 +2162,7 @@
           <w:tcPr>
             <w:tcW w:w="2739" w:type="dxa"/>
             <w:shd w:val="clear" w:color="auto" w:fill="C0C0C0"/>
+            <w:tcMar/>
           </w:tcPr>
           <w:p>
             <w:pPr>
@@ -2058,6 +2213,7 @@
         <w:tc>
           <w:tcPr>
             <w:tcW w:w="3901" w:type="dxa"/>
+            <w:tcMar/>
           </w:tcPr>
           <w:p>
             <w:pPr>
@@ -2073,8 +2229,8 @@
             <w:r>
               <w:rPr>
                 <w:rFonts w:ascii="Tahoma" w:hAnsi="Tahoma" w:cs="Tahoma"/>
-                <w:b/>
-                <w:bCs/>
+                <w:b w:val="1"/>
+                <w:bCs w:val="1"/>
                 <w:sz w:val="20"/>
                 <w:szCs w:val="20"/>
               </w:rPr>
@@ -2094,7 +2250,6 @@
                 <w:sz w:val="20"/>
                 <w:szCs w:val="20"/>
               </w:rPr>
-              <w:tab/>
               <w:t>Usuario</w:t>
             </w:r>
           </w:p>
@@ -2103,6 +2258,7 @@
           <w:tcPr>
             <w:tcW w:w="5130" w:type="dxa"/>
             <w:gridSpan w:val="3"/>
+            <w:tcMar/>
           </w:tcPr>
           <w:p>
             <w:pPr>
@@ -2143,20 +2299,24 @@
           <w:tcPr>
             <w:tcW w:w="9071" w:type="dxa"/>
             <w:gridSpan w:val="4"/>
-          </w:tcPr>
-          <w:p>
-            <w:pPr>
-              <w:rPr>
-                <w:rFonts w:ascii="Tahoma" w:hAnsi="Tahoma" w:cs="Tahoma"/>
-                <w:sz w:val="20"/>
-              </w:rPr>
-            </w:pPr>
-            <w:r>
-              <w:rPr>
-                <w:rFonts w:ascii="Tahoma" w:hAnsi="Tahoma" w:cs="Tahoma"/>
-                <w:b/>
-                <w:bCs/>
-                <w:sz w:val="20"/>
+            <w:tcMar/>
+          </w:tcPr>
+          <w:p>
+            <w:pPr>
+              <w:pStyle w:val="Normal"/>
+              <w:rPr>
+                <w:rFonts w:ascii="Tahoma" w:hAnsi="Tahoma" w:cs="Tahoma"/>
+                <w:sz w:val="20"/>
+                <w:szCs w:val="20"/>
+              </w:rPr>
+            </w:pPr>
+            <w:r>
+              <w:rPr>
+                <w:rFonts w:ascii="Tahoma" w:hAnsi="Tahoma" w:cs="Tahoma"/>
+                <w:b w:val="1"/>
+                <w:bCs w:val="1"/>
+                <w:sz w:val="20"/>
+                <w:szCs w:val="20"/>
               </w:rPr>
               <w:t>Tipo de Use Case</w:t>
             </w:r>
@@ -2164,24 +2324,76 @@
               <w:rPr>
                 <w:rFonts w:ascii="Tahoma" w:hAnsi="Tahoma" w:cs="Tahoma"/>
                 <w:sz w:val="20"/>
-              </w:rPr>
-              <w:t xml:space="preserve">:                  </w:t>
-            </w:r>
-            <w:r>
-              <w:rPr>
-                <w:rFonts w:ascii="Tahoma" w:hAnsi="Tahoma" w:cs="Tahoma"/>
-              </w:rPr>
-              <w:fldChar w:fldCharType="begin">
-                <w:ffData>
-                  <w:name w:val=""/>
-                  <w:enabled/>
-                  <w:calcOnExit w:val="0"/>
-                  <w:checkBox>
-                    <w:sizeAuto/>
-                    <w:default w:val="0"/>
-                  </w:checkBox>
-                </w:ffData>
-              </w:fldChar>
+                <w:szCs w:val="20"/>
+              </w:rPr>
+              <w:t xml:space="preserve">:              </w:t>
+            </w:r>
+            <w:r>
+              <mc:AlternateContent>
+                <mc:Choice Requires="wps">
+                  <w:drawing>
+                    <wp:inline wp14:editId="1EBC30F4" wp14:anchorId="6508CD78">
+                      <wp:extent cx="228600" cy="190500"/>
+                      <wp:effectExtent l="0" t="0" r="0" b="0"/>
+                      <wp:docPr id="907906472" name="Signo de multiplicación 2"/>
+                      <wp:cNvGraphicFramePr/>
+                      <a:graphic>
+                        <a:graphicData xmlns:a="http://schemas.openxmlformats.org/drawingml/2006/main" uri="http://schemas.microsoft.com/office/word/2010/wordprocessingShape">
+                          <wps:wsp xmlns:wps="http://schemas.microsoft.com/office/word/2010/wordprocessingShape">
+                            <wps:cNvSpPr/>
+                            <wps:spPr>
+                              <a:xfrm xmlns:a="http://schemas.openxmlformats.org/drawingml/2006/main">
+                                <a:off x="0" y="0"/>
+                                <a:ext cx="228600" cy="190500"/>
+                              </a:xfrm>
+                              <a:prstGeom xmlns:a="http://schemas.openxmlformats.org/drawingml/2006/main" prst="mathMultiply">
+                                <a:avLst/>
+                              </a:prstGeom>
+                            </wps:spPr>
+                            <wps:style>
+                              <a:lnRef xmlns:a="http://schemas.openxmlformats.org/drawingml/2006/main" idx="2">
+                                <a:schemeClr val="accent1">
+                                  <a:shade val="15000"/>
+                                </a:schemeClr>
+                              </a:lnRef>
+                              <a:fillRef xmlns:a="http://schemas.openxmlformats.org/drawingml/2006/main" idx="1">
+                                <a:schemeClr val="accent1"/>
+                              </a:fillRef>
+                              <a:effectRef xmlns:a="http://schemas.openxmlformats.org/drawingml/2006/main" idx="0">
+                                <a:schemeClr val="accent1"/>
+                              </a:effectRef>
+                              <a:fontRef xmlns:a="http://schemas.openxmlformats.org/drawingml/2006/main" idx="minor">
+                                <a:schemeClr val="lt1"/>
+                              </a:fontRef>
+                            </wps:style>
+                            <wps:bodyPr rot="0" spcFirstLastPara="0" vertOverflow="overflow" horzOverflow="overflow" vert="horz" wrap="square" lIns="91440" tIns="45720" rIns="91440" bIns="45720" numCol="1" spcCol="0" rtlCol="0" fromWordArt="0" anchor="ctr" anchorCtr="0" forceAA="0" compatLnSpc="1">
+                              <a:prstTxWarp xmlns:a="http://schemas.openxmlformats.org/drawingml/2006/main" prst="textNoShape">
+                                <a:avLst/>
+                              </a:prstTxWarp>
+                              <a:noAutofit xmlns:a="http://schemas.openxmlformats.org/drawingml/2006/main"/>
+                            </wps:bodyPr>
+                          </wps:wsp>
+                        </a:graphicData>
+                      </a:graphic>
+                    </wp:inline>
+                  </w:drawing>
+                </mc:Choice>
+                <mc:Fallback/>
+              </mc:AlternateContent>
+            </w:r>
+            <w:r>
+              <w:rPr>
+                <w:rFonts w:ascii="Tahoma" w:hAnsi="Tahoma" w:cs="Tahoma"/>
+                <w:sz w:val="20"/>
+                <w:szCs w:val="20"/>
+              </w:rPr>
+              <w:t xml:space="preserve">    </w:t>
+            </w:r>
+            <w:r>
+              <w:rPr>
+                <w:rFonts w:ascii="Tahoma" w:hAnsi="Tahoma" w:cs="Tahoma"/>
+              </w:rPr>
+              <w:fldChar w:fldCharType="begin"/>
             </w:r>
             <w:r>
               <w:rPr>
@@ -2193,11 +2405,6 @@
               <w:rPr>
                 <w:rFonts w:ascii="Tahoma" w:hAnsi="Tahoma" w:cs="Tahoma"/>
               </w:rPr>
-            </w:r>
-            <w:r>
-              <w:rPr>
-                <w:rFonts w:ascii="Tahoma" w:hAnsi="Tahoma" w:cs="Tahoma"/>
-              </w:rPr>
               <w:fldChar w:fldCharType="separate"/>
             </w:r>
             <w:r>
@@ -2210,6 +2417,7 @@
               <w:rPr>
                 <w:rFonts w:ascii="Tahoma" w:hAnsi="Tahoma" w:cs="Tahoma"/>
                 <w:sz w:val="20"/>
+                <w:szCs w:val="20"/>
               </w:rPr>
               <w:t xml:space="preserve">  Concreto                                       </w:t>
             </w:r>
@@ -2217,17 +2425,7 @@
               <w:rPr>
                 <w:rFonts w:ascii="Tahoma" w:hAnsi="Tahoma" w:cs="Tahoma"/>
               </w:rPr>
-              <w:fldChar w:fldCharType="begin">
-                <w:ffData>
-                  <w:name w:val="Casilla5"/>
-                  <w:enabled/>
-                  <w:calcOnExit w:val="0"/>
-                  <w:checkBox>
-                    <w:sizeAuto/>
-                    <w:default w:val="0"/>
-                  </w:checkBox>
-                </w:ffData>
-              </w:fldChar>
+              <w:fldChar w:fldCharType="begin"/>
             </w:r>
             <w:r>
               <w:rPr>
@@ -2239,11 +2437,6 @@
               <w:rPr>
                 <w:rFonts w:ascii="Tahoma" w:hAnsi="Tahoma" w:cs="Tahoma"/>
               </w:rPr>
-            </w:r>
-            <w:r>
-              <w:rPr>
-                <w:rFonts w:ascii="Tahoma" w:hAnsi="Tahoma" w:cs="Tahoma"/>
-              </w:rPr>
               <w:fldChar w:fldCharType="separate"/>
             </w:r>
             <w:r>
@@ -2256,8 +2449,19 @@
               <w:rPr>
                 <w:rFonts w:ascii="Tahoma" w:hAnsi="Tahoma" w:cs="Tahoma"/>
                 <w:sz w:val="20"/>
+                <w:szCs w:val="20"/>
               </w:rPr>
               <w:t xml:space="preserve">   Abstracto</w:t>
+            </w:r>
+            <w:r>
+              <w:rPr>
+                <w:rFonts w:ascii="Tahoma" w:hAnsi="Tahoma" w:cs="Tahoma"/>
+              </w:rPr>
+            </w:r>
+            <w:r>
+              <w:rPr>
+                <w:rFonts w:ascii="Tahoma" w:hAnsi="Tahoma" w:cs="Tahoma"/>
+              </w:rPr>
             </w:r>
           </w:p>
         </w:tc>
@@ -2275,95 +2479,21 @@
           <w:tcPr>
             <w:tcW w:w="9071" w:type="dxa"/>
             <w:gridSpan w:val="4"/>
-          </w:tcPr>
-          <w:p>
-            <w:pPr>
-              <w:rPr>
-                <w:rFonts w:ascii="Tahoma" w:hAnsi="Tahoma" w:cs="Tahoma"/>
-                <w:sz w:val="20"/>
-                <w:szCs w:val="20"/>
-              </w:rPr>
-            </w:pPr>
-            <w:r>
-              <w:rPr>
-                <w:rFonts w:ascii="Tahoma" w:hAnsi="Tahoma" w:cs="Tahoma"/>
-                <w:b/>
-                <w:bCs/>
-                <w:noProof/>
-                <w:sz w:val="20"/>
-                <w:lang w:val="en-US" w:eastAsia="en-US"/>
-              </w:rPr>
-              <mc:AlternateContent>
-                <mc:Choice Requires="wps">
-                  <w:drawing>
-                    <wp:anchor distT="0" distB="0" distL="114300" distR="114300" simplePos="0" relativeHeight="251659264" behindDoc="0" locked="0" layoutInCell="1" allowOverlap="1" wp14:anchorId="429952D2" wp14:editId="0F86EAE3">
-                      <wp:simplePos x="0" y="0"/>
-                      <wp:positionH relativeFrom="column">
-                        <wp:posOffset>1802765</wp:posOffset>
-                      </wp:positionH>
-                      <wp:positionV relativeFrom="paragraph">
-                        <wp:posOffset>-300355</wp:posOffset>
-                      </wp:positionV>
-                      <wp:extent cx="228600" cy="190500"/>
-                      <wp:effectExtent l="0" t="0" r="0" b="0"/>
-                      <wp:wrapNone/>
-                      <wp:docPr id="926853849" name="Signo de multiplicación 2"/>
-                      <wp:cNvGraphicFramePr/>
-                      <a:graphic xmlns:a="http://schemas.openxmlformats.org/drawingml/2006/main">
-                        <a:graphicData uri="http://schemas.microsoft.com/office/word/2010/wordprocessingShape">
-                          <wps:wsp>
-                            <wps:cNvSpPr/>
-                            <wps:spPr>
-                              <a:xfrm>
-                                <a:off x="0" y="0"/>
-                                <a:ext cx="228600" cy="190500"/>
-                              </a:xfrm>
-                              <a:prstGeom prst="mathMultiply">
-                                <a:avLst/>
-                              </a:prstGeom>
-                            </wps:spPr>
-                            <wps:style>
-                              <a:lnRef idx="2">
-                                <a:schemeClr val="accent1">
-                                  <a:shade val="15000"/>
-                                </a:schemeClr>
-                              </a:lnRef>
-                              <a:fillRef idx="1">
-                                <a:schemeClr val="accent1"/>
-                              </a:fillRef>
-                              <a:effectRef idx="0">
-                                <a:schemeClr val="accent1"/>
-                              </a:effectRef>
-                              <a:fontRef idx="minor">
-                                <a:schemeClr val="lt1"/>
-                              </a:fontRef>
-                            </wps:style>
-                            <wps:bodyPr rot="0" spcFirstLastPara="0" vertOverflow="overflow" horzOverflow="overflow" vert="horz" wrap="square" lIns="91440" tIns="45720" rIns="91440" bIns="45720" numCol="1" spcCol="0" rtlCol="0" fromWordArt="0" anchor="ctr" anchorCtr="0" forceAA="0" compatLnSpc="1">
-                              <a:prstTxWarp prst="textNoShape">
-                                <a:avLst/>
-                              </a:prstTxWarp>
-                              <a:noAutofit/>
-                            </wps:bodyPr>
-                          </wps:wsp>
-                        </a:graphicData>
-                      </a:graphic>
-                    </wp:anchor>
-                  </w:drawing>
-                </mc:Choice>
-                <mc:Fallback xmlns:w16sdtfl="http://schemas.microsoft.com/office/word/2024/wordml/sdtformatlock" xmlns:w16du="http://schemas.microsoft.com/office/word/2023/wordml/word16du">
-                  <w:pict>
-                    <v:shape w14:anchorId="64428725" id="Signo de multiplicación 2" o:spid="_x0000_s1026" style="position:absolute;margin-left:141.95pt;margin-top:-23.65pt;width:18pt;height:15pt;z-index:251659264;visibility:visible;mso-wrap-style:square;mso-wrap-distance-left:9pt;mso-wrap-distance-top:0;mso-wrap-distance-right:9pt;mso-wrap-distance-bottom:0;mso-position-horizontal:absolute;mso-position-horizontal-relative:text;mso-position-vertical:absolute;mso-position-vertical-relative:text;v-text-anchor:middle" coordsize="228600,190500" o:gfxdata="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" path="m40562,62964l69246,28543r45054,37545l159354,28543r28684,34421l149294,95250r38744,32286l159354,161957,114300,124412,69246,161957,40562,127536,79306,95250,40562,62964xe" fillcolor="#4f81bd [3204]" stroked="f" strokeweight="2pt">
-                      <v:path arrowok="t" o:connecttype="custom" o:connectlocs="40562,62964;69246,28543;114300,66088;159354,28543;188038,62964;149294,95250;188038,127536;159354,161957;114300,124412;69246,161957;40562,127536;79306,95250;40562,62964" o:connectangles="0,0,0,0,0,0,0,0,0,0,0,0,0"/>
-                    </v:shape>
-                  </w:pict>
-                </mc:Fallback>
-              </mc:AlternateContent>
-            </w:r>
-            <w:r>
-              <w:rPr>
-                <w:rFonts w:ascii="Tahoma" w:hAnsi="Tahoma" w:cs="Tahoma"/>
-                <w:b/>
-                <w:bCs/>
+            <w:tcMar/>
+          </w:tcPr>
+          <w:p>
+            <w:pPr>
+              <w:rPr>
+                <w:rFonts w:ascii="Tahoma" w:hAnsi="Tahoma" w:cs="Tahoma"/>
+                <w:sz w:val="20"/>
+                <w:szCs w:val="20"/>
+              </w:rPr>
+            </w:pPr>
+            <w:r>
+              <w:rPr>
+                <w:rFonts w:ascii="Tahoma" w:hAnsi="Tahoma" w:cs="Tahoma"/>
+                <w:b w:val="1"/>
+                <w:bCs w:val="1"/>
                 <w:sz w:val="20"/>
                 <w:szCs w:val="20"/>
               </w:rPr>
@@ -2399,25 +2529,41 @@
             <w:tcW w:w="9120" w:type="dxa"/>
             <w:gridSpan w:val="5"/>
             <w:shd w:val="clear" w:color="auto" w:fill="BFBFBF" w:themeFill="background1" w:themeFillShade="BF"/>
-          </w:tcPr>
-          <w:p>
-            <w:pPr>
-              <w:pStyle w:val="Ttulo3"/>
-              <w:rPr>
-                <w:rFonts w:ascii="Tahoma" w:hAnsi="Tahoma" w:cs="Tahoma"/>
-                <w:b/>
-                <w:sz w:val="20"/>
-                <w:szCs w:val="20"/>
-              </w:rPr>
-            </w:pPr>
-            <w:r>
-              <w:rPr>
-                <w:rFonts w:ascii="Tahoma" w:hAnsi="Tahoma" w:cs="Tahoma"/>
-                <w:b/>
-                <w:sz w:val="20"/>
-                <w:szCs w:val="20"/>
-              </w:rPr>
-              <w:t>Flujo Básico:</w:t>
+            <w:tcMar/>
+          </w:tcPr>
+          <w:p>
+            <w:pPr>
+              <w:pStyle w:val="Normal"/>
+              <w:rPr>
+                <w:rFonts w:ascii="Tahoma" w:hAnsi="Tahoma" w:eastAsia="Tahoma" w:cs="Tahoma"/>
+                <w:b w:val="1"/>
+                <w:bCs w:val="1"/>
+                <w:color w:val="404040" w:themeColor="text1" w:themeTint="BF" w:themeShade="FF"/>
+                <w:sz w:val="20"/>
+                <w:szCs w:val="20"/>
+              </w:rPr>
+            </w:pPr>
+            <w:r>
+              <w:rPr>
+                <w:rFonts w:ascii="Tahoma" w:hAnsi="Tahoma" w:eastAsia="Tahoma" w:cs="Tahoma"/>
+                <w:b w:val="1"/>
+                <w:bCs w:val="1"/>
+                <w:color w:val="404040" w:themeColor="text1" w:themeTint="BF" w:themeShade="FF"/>
+                <w:sz w:val="20"/>
+                <w:szCs w:val="20"/>
+              </w:rPr>
+              <w:t>F</w:t>
+            </w:r>
+            <w:r>
+              <w:rPr>
+                <w:rFonts w:ascii="Tahoma" w:hAnsi="Tahoma" w:eastAsia="Tahoma" w:cs="Tahoma"/>
+                <w:b w:val="1"/>
+                <w:bCs w:val="1"/>
+                <w:color w:val="404040" w:themeColor="text1" w:themeTint="BF" w:themeShade="FF"/>
+                <w:sz w:val="20"/>
+                <w:szCs w:val="20"/>
+              </w:rPr>
+              <w:t>lujo Básico:</w:t>
             </w:r>
           </w:p>
         </w:tc>
@@ -2432,6 +2578,7 @@
           <w:tcPr>
             <w:tcW w:w="9120" w:type="dxa"/>
             <w:gridSpan w:val="5"/>
+            <w:tcMar/>
           </w:tcPr>
           <w:p>
             <w:pPr>
@@ -2470,6 +2617,7 @@
           <w:tcPr>
             <w:tcW w:w="9120" w:type="dxa"/>
             <w:gridSpan w:val="5"/>
+            <w:tcMar/>
           </w:tcPr>
           <w:p>
             <w:pPr>
@@ -2508,6 +2656,7 @@
           <w:tcPr>
             <w:tcW w:w="9120" w:type="dxa"/>
             <w:gridSpan w:val="5"/>
+            <w:tcMar/>
           </w:tcPr>
           <w:p>
             <w:pPr>
@@ -2546,6 +2695,7 @@
           <w:tcPr>
             <w:tcW w:w="9120" w:type="dxa"/>
             <w:gridSpan w:val="5"/>
+            <w:tcMar/>
           </w:tcPr>
           <w:p>
             <w:pPr>
@@ -2616,6 +2766,7 @@
           <w:tcPr>
             <w:tcW w:w="9120" w:type="dxa"/>
             <w:gridSpan w:val="5"/>
+            <w:tcMar/>
           </w:tcPr>
           <w:p>
             <w:pPr>
@@ -2655,25 +2806,41 @@
             <w:tcW w:w="9120" w:type="dxa"/>
             <w:gridSpan w:val="5"/>
             <w:shd w:val="clear" w:color="auto" w:fill="BFBFBF" w:themeFill="background1" w:themeFillShade="BF"/>
-          </w:tcPr>
-          <w:p>
-            <w:pPr>
-              <w:pStyle w:val="Ttulo3"/>
-              <w:rPr>
-                <w:rFonts w:ascii="Tahoma" w:hAnsi="Tahoma" w:cs="Tahoma"/>
-                <w:b/>
-                <w:sz w:val="20"/>
-                <w:szCs w:val="20"/>
-              </w:rPr>
-            </w:pPr>
-            <w:r>
-              <w:rPr>
-                <w:rFonts w:ascii="Tahoma" w:hAnsi="Tahoma" w:cs="Tahoma"/>
-                <w:b/>
-                <w:sz w:val="20"/>
-                <w:szCs w:val="20"/>
-              </w:rPr>
-              <w:t>Flujos  Alternativos:</w:t>
+            <w:tcMar/>
+          </w:tcPr>
+          <w:p>
+            <w:pPr>
+              <w:pStyle w:val="Normal"/>
+              <w:rPr>
+                <w:rFonts w:ascii="Tahoma" w:hAnsi="Tahoma" w:eastAsia="Tahoma" w:cs="Tahoma"/>
+                <w:b w:val="1"/>
+                <w:bCs w:val="1"/>
+                <w:color w:val="404040" w:themeColor="text1" w:themeTint="BF" w:themeShade="FF"/>
+                <w:sz w:val="20"/>
+                <w:szCs w:val="20"/>
+              </w:rPr>
+            </w:pPr>
+            <w:r>
+              <w:rPr>
+                <w:rFonts w:ascii="Tahoma" w:hAnsi="Tahoma" w:eastAsia="Tahoma" w:cs="Tahoma"/>
+                <w:b w:val="1"/>
+                <w:bCs w:val="1"/>
+                <w:color w:val="404040" w:themeColor="text1" w:themeTint="BF" w:themeShade="FF"/>
+                <w:sz w:val="20"/>
+                <w:szCs w:val="20"/>
+              </w:rPr>
+              <w:t>Flujos Alternativos</w:t>
+            </w:r>
+            <w:r>
+              <w:rPr>
+                <w:rFonts w:ascii="Tahoma" w:hAnsi="Tahoma" w:eastAsia="Tahoma" w:cs="Tahoma"/>
+                <w:b w:val="1"/>
+                <w:bCs w:val="1"/>
+                <w:color w:val="404040" w:themeColor="text1" w:themeTint="BF" w:themeShade="FF"/>
+                <w:sz w:val="20"/>
+                <w:szCs w:val="20"/>
+              </w:rPr>
+              <w:t>:</w:t>
             </w:r>
           </w:p>
         </w:tc>
@@ -2688,6 +2855,7 @@
           <w:tcPr>
             <w:tcW w:w="9120" w:type="dxa"/>
             <w:gridSpan w:val="5"/>
+            <w:tcMar/>
           </w:tcPr>
           <w:p>
             <w:pPr>
@@ -2722,6 +2890,7 @@
           <w:tcPr>
             <w:tcW w:w="9071" w:type="dxa"/>
             <w:gridSpan w:val="4"/>
+            <w:tcMar/>
           </w:tcPr>
           <w:p>
             <w:pPr>
@@ -2780,6 +2949,7 @@
           <w:tcPr>
             <w:tcW w:w="9071" w:type="dxa"/>
             <w:gridSpan w:val="4"/>
+            <w:tcMar/>
           </w:tcPr>
           <w:p>
             <w:pPr>
@@ -2834,6 +3004,7 @@
           <w:tcPr>
             <w:tcW w:w="9071" w:type="dxa"/>
             <w:gridSpan w:val="4"/>
+            <w:tcMar/>
           </w:tcPr>
           <w:p>
             <w:pPr>
@@ -2880,6 +3051,7 @@
           <w:tcPr>
             <w:tcW w:w="9071" w:type="dxa"/>
             <w:gridSpan w:val="4"/>
+            <w:tcMar/>
           </w:tcPr>
           <w:p>
             <w:pPr>
@@ -2924,6 +3096,7 @@
           <w:tcPr>
             <w:tcW w:w="9071" w:type="dxa"/>
             <w:gridSpan w:val="4"/>
+            <w:tcMar/>
           </w:tcPr>
           <w:p>
             <w:pPr>
@@ -2968,23 +3141,24 @@
           <w:tcPr>
             <w:tcW w:w="9071" w:type="dxa"/>
             <w:gridSpan w:val="4"/>
-          </w:tcPr>
-          <w:p>
-            <w:pPr>
-              <w:pStyle w:val="Ttulo1"/>
+            <w:tcMar/>
+          </w:tcPr>
+          <w:p>
+            <w:pPr>
+              <w:pStyle w:val="Normal"/>
               <w:rPr>
                 <w:rFonts w:cs="Tahoma"/>
-                <w:b/>
-                <w:bCs/>
-                <w:sz w:val="20"/>
-                <w:szCs w:val="20"/>
-              </w:rPr>
-            </w:pPr>
-            <w:r>
-              <w:rPr>
-                <w:rFonts w:ascii="Tahoma" w:hAnsi="Tahoma" w:cs="Tahoma"/>
-                <w:b/>
-                <w:bCs/>
+                <w:b w:val="1"/>
+                <w:bCs w:val="1"/>
+                <w:sz w:val="20"/>
+                <w:szCs w:val="20"/>
+              </w:rPr>
+            </w:pPr>
+            <w:r>
+              <w:rPr>
+                <w:rFonts w:ascii="Tahoma" w:hAnsi="Tahoma" w:eastAsia="Tahoma" w:cs="Tahoma"/>
+                <w:b w:val="1"/>
+                <w:bCs w:val="1"/>
                 <w:sz w:val="20"/>
                 <w:szCs w:val="20"/>
               </w:rPr>
@@ -2992,9 +3166,9 @@
             </w:r>
             <w:r>
               <w:rPr>
-                <w:rFonts w:cs="Tahoma"/>
-                <w:b/>
-                <w:bCs/>
+                <w:rFonts w:ascii="Tahoma" w:hAnsi="Tahoma" w:eastAsia="Tahoma" w:cs="Tahoma"/>
+                <w:b w:val="1"/>
+                <w:bCs w:val="1"/>
                 <w:sz w:val="20"/>
                 <w:szCs w:val="20"/>
               </w:rPr>
@@ -3002,7 +3176,6 @@
             </w:r>
             <w:r>
               <w:rPr>
-                <w:rFonts w:cs="Tahoma"/>
                 <w:sz w:val="20"/>
                 <w:szCs w:val="20"/>
               </w:rPr>
@@ -3024,46 +3197,51 @@
           <w:tcPr>
             <w:tcW w:w="5755" w:type="dxa"/>
             <w:gridSpan w:val="2"/>
-          </w:tcPr>
-          <w:p>
-            <w:pPr>
-              <w:pStyle w:val="Ttulo1"/>
+            <w:tcMar/>
+          </w:tcPr>
+          <w:p>
+            <w:pPr>
+              <w:pStyle w:val="Normal"/>
               <w:tabs>
-                <w:tab w:val="right" w:pos="1988"/>
+                <w:tab w:val="right" w:leader="none" w:pos="1988"/>
               </w:tabs>
               <w:rPr>
                 <w:rFonts w:cs="Tahoma"/>
-                <w:bCs/>
-                <w:sz w:val="20"/>
-              </w:rPr>
-            </w:pPr>
-            <w:r>
-              <w:rPr>
-                <w:rFonts w:ascii="Tahoma" w:hAnsi="Tahoma" w:cs="Tahoma"/>
-                <w:b/>
-                <w:bCs/>
-                <w:sz w:val="20"/>
+                <w:sz w:val="20"/>
+                <w:szCs w:val="20"/>
+              </w:rPr>
+            </w:pPr>
+            <w:r>
+              <w:rPr>
+                <w:rFonts w:ascii="Tahoma" w:hAnsi="Tahoma" w:eastAsia="Tahoma" w:cs="Tahoma"/>
+                <w:b w:val="1"/>
+                <w:bCs w:val="1"/>
+                <w:sz w:val="20"/>
+                <w:szCs w:val="20"/>
               </w:rPr>
               <w:t>Autor:</w:t>
             </w:r>
             <w:r>
               <w:rPr>
-                <w:rFonts w:cs="Tahoma"/>
-                <w:sz w:val="20"/>
+                <w:rFonts w:ascii="Tahoma" w:hAnsi="Tahoma" w:eastAsia="Tahoma" w:cs="Tahoma"/>
+                <w:b w:val="1"/>
+                <w:bCs w:val="1"/>
+                <w:sz w:val="20"/>
+                <w:szCs w:val="20"/>
               </w:rPr>
               <w:t xml:space="preserve"> </w:t>
             </w:r>
             <w:r>
               <w:rPr>
-                <w:rFonts w:cs="Tahoma"/>
-                <w:sz w:val="20"/>
+                <w:sz w:val="20"/>
+                <w:szCs w:val="20"/>
               </w:rPr>
               <w:t>Agüero/Borgo/Medin</w:t>
             </w:r>
             <w:r>
               <w:rPr>
-                <w:rFonts w:cs="Tahoma"/>
-                <w:sz w:val="20"/>
+                <w:sz w:val="20"/>
+                <w:szCs w:val="20"/>
               </w:rPr>
               <w:t>a</w:t>
             </w:r>
@@ -3073,33 +3251,27 @@
           <w:tcPr>
             <w:tcW w:w="3276" w:type="dxa"/>
             <w:gridSpan w:val="2"/>
-          </w:tcPr>
-          <w:p>
-            <w:pPr>
-              <w:pStyle w:val="Ttulo1"/>
+            <w:tcMar/>
+          </w:tcPr>
+          <w:p>
+            <w:pPr>
+              <w:pStyle w:val="Normal"/>
               <w:rPr>
                 <w:rFonts w:cs="Tahoma"/>
-                <w:bCs/>
-                <w:sz w:val="20"/>
-                <w:szCs w:val="20"/>
-              </w:rPr>
-            </w:pPr>
-            <w:r>
-              <w:rPr>
-                <w:rFonts w:ascii="Tahoma" w:hAnsi="Tahoma" w:cs="Tahoma"/>
-                <w:b/>
-                <w:bCs/>
+                <w:sz w:val="20"/>
+                <w:szCs w:val="20"/>
+              </w:rPr>
+            </w:pPr>
+            <w:r>
+              <w:rPr>
+                <w:rFonts w:ascii="Tahoma" w:hAnsi="Tahoma" w:eastAsia="Tahoma" w:cs="Tahoma"/>
                 <w:sz w:val="20"/>
                 <w:szCs w:val="20"/>
               </w:rPr>
               <w:t>Fecha Creación:</w:t>
             </w:r>
             <w:r>
-              <w:rPr>
-                <w:rFonts w:cs="Tahoma"/>
-                <w:sz w:val="20"/>
-                <w:szCs w:val="20"/>
-              </w:rPr>
+              <w:rPr/>
               <w:t xml:space="preserve"> 05/10/2026</w:t>
             </w:r>
           </w:p>
@@ -3110,7 +3282,7 @@
           <w:gridAfter w:val="1"/>
           <w:wAfter w:w="9" w:type="dxa"/>
           <w:cantSplit/>
-          <w:trHeight w:val="759"/>
+          <w:trHeight w:val="450"/>
           <w:tblCellSpacing w:w="20" w:type="dxa"/>
           <w:jc w:val="center"/>
         </w:trPr>
@@ -3118,25 +3290,38 @@
           <w:tcPr>
             <w:tcW w:w="5755" w:type="dxa"/>
             <w:gridSpan w:val="2"/>
-          </w:tcPr>
-          <w:p>
-            <w:pPr>
-              <w:pStyle w:val="Ttulo1"/>
-              <w:rPr>
-                <w:rFonts w:ascii="Tahoma" w:hAnsi="Tahoma" w:cs="Tahoma"/>
-                <w:b/>
-                <w:bCs/>
-                <w:sz w:val="20"/>
-              </w:rPr>
-            </w:pPr>
-            <w:r>
-              <w:rPr>
-                <w:rFonts w:ascii="Tahoma" w:hAnsi="Tahoma" w:cs="Tahoma"/>
-                <w:b/>
-                <w:bCs/>
-                <w:sz w:val="20"/>
-              </w:rPr>
-              <w:t xml:space="preserve">Autor Última Modificación: </w:t>
+            <w:tcMar/>
+          </w:tcPr>
+          <w:p>
+            <w:pPr>
+              <w:pStyle w:val="Normal"/>
+              <w:rPr>
+                <w:rFonts w:ascii="Tahoma" w:hAnsi="Tahoma" w:eastAsia="Tahoma" w:cs="Tahoma"/>
+                <w:b w:val="1"/>
+                <w:bCs w:val="1"/>
+                <w:sz w:val="20"/>
+                <w:szCs w:val="20"/>
+              </w:rPr>
+            </w:pPr>
+            <w:r>
+              <w:rPr>
+                <w:rFonts w:ascii="Tahoma" w:hAnsi="Tahoma" w:eastAsia="Tahoma" w:cs="Tahoma"/>
+                <w:b w:val="1"/>
+                <w:bCs w:val="1"/>
+                <w:sz w:val="20"/>
+                <w:szCs w:val="20"/>
+              </w:rPr>
+              <w:t>Autor Última Modificación:</w:t>
+            </w:r>
+            <w:r>
+              <w:rPr>
+                <w:rFonts w:ascii="Tahoma" w:hAnsi="Tahoma" w:eastAsia="Tahoma" w:cs="Tahoma"/>
+                <w:b w:val="1"/>
+                <w:bCs w:val="1"/>
+                <w:sz w:val="20"/>
+                <w:szCs w:val="20"/>
+              </w:rPr>
+              <w:t xml:space="preserve"> </w:t>
             </w:r>
           </w:p>
         </w:tc>
@@ -3144,23 +3329,24 @@
           <w:tcPr>
             <w:tcW w:w="3276" w:type="dxa"/>
             <w:gridSpan w:val="2"/>
-          </w:tcPr>
-          <w:p>
-            <w:pPr>
-              <w:pStyle w:val="Ttulo1"/>
-              <w:rPr>
-                <w:rFonts w:ascii="Tahoma" w:hAnsi="Tahoma" w:cs="Tahoma"/>
-                <w:b/>
-                <w:bCs/>
-                <w:sz w:val="20"/>
-                <w:szCs w:val="20"/>
-              </w:rPr>
-            </w:pPr>
-            <w:r>
-              <w:rPr>
-                <w:rFonts w:ascii="Tahoma" w:hAnsi="Tahoma" w:cs="Tahoma"/>
-                <w:b/>
-                <w:bCs/>
+            <w:tcMar/>
+          </w:tcPr>
+          <w:p>
+            <w:pPr>
+              <w:pStyle w:val="Normal"/>
+              <w:rPr>
+                <w:rFonts w:ascii="Tahoma" w:hAnsi="Tahoma" w:eastAsia="Tahoma" w:cs="Tahoma"/>
+                <w:b w:val="1"/>
+                <w:bCs w:val="1"/>
+                <w:sz w:val="20"/>
+                <w:szCs w:val="20"/>
+              </w:rPr>
+            </w:pPr>
+            <w:r>
+              <w:rPr>
+                <w:rFonts w:ascii="Tahoma" w:hAnsi="Tahoma" w:eastAsia="Tahoma" w:cs="Tahoma"/>
+                <w:b w:val="1"/>
+                <w:bCs w:val="1"/>
                 <w:sz w:val="20"/>
                 <w:szCs w:val="20"/>
               </w:rPr>
@@ -3204,20 +3390,21 @@
       <w:pPr>
         <w:pStyle w:val="Ttulo2"/>
         <w:rPr>
-          <w:b/>
-          <w:bCs/>
-          <w:u w:val="single"/>
-        </w:rPr>
-      </w:pPr>
-      <w:r>
-        <w:rPr>
-          <w:b/>
-          <w:bCs/>
-          <w:u w:val="single"/>
-        </w:rPr>
-        <w:lastRenderedPageBreak/>
+          <w:b w:val="1"/>
+          <w:bCs w:val="1"/>
+          <w:u w:val="none"/>
+        </w:rPr>
+      </w:pPr>
+      <w:bookmarkStart w:name="_Toc292187718" w:id="1436358513"/>
+      <w:r>
+        <w:rPr>
+          <w:b w:val="1"/>
+          <w:bCs w:val="1"/>
+          <w:u w:val="none"/>
+        </w:rPr>
         <w:t>Prototipo de Registrar nuevo retiro</w:t>
       </w:r>
+      <w:bookmarkEnd w:id="1436358513"/>
     </w:p>
     <w:p>
       <w:r>
@@ -3450,7 +3637,6 @@
           <w:bCs/>
           <w:u w:val="single"/>
         </w:rPr>
-        <w:lastRenderedPageBreak/>
         <w:drawing>
           <wp:inline distT="0" distB="0" distL="0" distR="0" wp14:anchorId="640351ED" wp14:editId="218B41C9">
             <wp:extent cx="2590800" cy="7895187"/>
@@ -3526,7 +3712,6 @@
           <w:bCs/>
           <w:color w:val="333399"/>
         </w:rPr>
-        <w:lastRenderedPageBreak/>
         <w:t>Plantilla para Descripción de Use Cases  (Trazo Intermedio)</w:t>
       </w:r>
     </w:p>
@@ -3552,12 +3737,12 @@
         <w:jc w:val="center"/>
         <w:tblCellSpacing w:w="20" w:type="dxa"/>
         <w:tblBorders>
-          <w:top w:val="outset" w:sz="6" w:space="0" w:color="auto"/>
-          <w:left w:val="outset" w:sz="6" w:space="0" w:color="auto"/>
-          <w:bottom w:val="outset" w:sz="6" w:space="0" w:color="auto"/>
-          <w:right w:val="outset" w:sz="6" w:space="0" w:color="auto"/>
-          <w:insideH w:val="outset" w:sz="6" w:space="0" w:color="auto"/>
-          <w:insideV w:val="outset" w:sz="6" w:space="0" w:color="auto"/>
+          <w:top w:val="outset" w:color="auto" w:sz="6" w:space="0"/>
+          <w:left w:val="outset" w:color="auto" w:sz="6" w:space="0"/>
+          <w:bottom w:val="outset" w:color="auto" w:sz="6" w:space="0"/>
+          <w:right w:val="outset" w:color="auto" w:sz="6" w:space="0"/>
+          <w:insideH w:val="outset" w:color="auto" w:sz="6" w:space="0"/>
+          <w:insideV w:val="outset" w:color="auto" w:sz="6" w:space="0"/>
         </w:tblBorders>
         <w:tblLayout w:type="fixed"/>
         <w:tblCellMar>
@@ -3586,6 +3771,7 @@
           <w:tcPr>
             <w:tcW w:w="10056" w:type="dxa"/>
             <w:gridSpan w:val="4"/>
+            <w:tcMar/>
           </w:tcPr>
           <w:p>
             <w:pPr>
@@ -3620,6 +3806,7 @@
             <w:tcW w:w="6977" w:type="dxa"/>
             <w:gridSpan w:val="3"/>
             <w:shd w:val="clear" w:color="auto" w:fill="C0C0C0"/>
+            <w:tcMar/>
           </w:tcPr>
           <w:p>
             <w:pPr>
@@ -3657,6 +3844,7 @@
           <w:tcPr>
             <w:tcW w:w="3039" w:type="dxa"/>
             <w:shd w:val="clear" w:color="auto" w:fill="C0C0C0"/>
+            <w:tcMar/>
           </w:tcPr>
           <w:p>
             <w:pPr>
@@ -3696,6 +3884,7 @@
         <w:tc>
           <w:tcPr>
             <w:tcW w:w="4329" w:type="dxa"/>
+            <w:tcMar/>
           </w:tcPr>
           <w:p>
             <w:pPr>
@@ -3726,6 +3915,7 @@
           <w:tcPr>
             <w:tcW w:w="5687" w:type="dxa"/>
             <w:gridSpan w:val="3"/>
+            <w:tcMar/>
           </w:tcPr>
           <w:p>
             <w:pPr>
@@ -3765,6 +3955,7 @@
           <w:tcPr>
             <w:tcW w:w="10056" w:type="dxa"/>
             <w:gridSpan w:val="4"/>
+            <w:tcMar/>
           </w:tcPr>
           <w:p>
             <w:pPr>
@@ -3851,8 +4042,8 @@
                   </w:drawing>
                 </mc:Choice>
                 <mc:Fallback xmlns:w16sdtfl="http://schemas.microsoft.com/office/word/2024/wordml/sdtformatlock" xmlns:w16du="http://schemas.microsoft.com/office/word/2023/wordml/word16du">
-                  <w:pict>
-                    <v:shapetype w14:anchorId="3CE4F9DD" id="_x0000_t11" coordsize="21600,21600" o:spt="11" adj="5400" path="m@0,l@0@0,0@0,0@2@0@2@0,21600@1,21600@1@2,21600@2,21600@0@1@0@1,xe">
+                  <w:pict w14:anchorId="6873BC2E">
+                    <v:shapetype id="_x0000_t11" coordsize="21600,21600" o:spt="11" adj="5400" path="m@0,l@0@0,0@0,0@2@0@2@0,21600@1,21600@1@2,21600@2,21600@0@1@0@1,xe" w14:anchorId="3CE4F9DD">
                       <v:stroke joinstyle="miter"/>
                       <v:formulas>
                         <v:f eqn="val #0"/>
@@ -3866,12 +4057,12 @@
                         <v:f eqn="prod width 1 2"/>
                         <v:f eqn="prod height 1 2"/>
                       </v:formulas>
-                      <v:path gradientshapeok="t" limo="10800,10800" o:connecttype="custom" o:connectlocs="@8,0;0,@9;@8,@7;@6,@9" textboxrect="0,0,21600,21600;5400,5400,16200,16200;10800,10800,10800,10800"/>
+                      <v:path limo="10800,10800" textboxrect="0,0,21600,21600;5400,5400,16200,16200;10800,10800,10800,10800" gradientshapeok="t" o:connecttype="custom" o:connectlocs="@8,0;0,@9;@8,@7;@6,@9"/>
                       <v:handles>
                         <v:h position="#0,topLeft" switch="" xrange="0,10800"/>
                       </v:handles>
                     </v:shapetype>
-                    <v:shape id="Cruz 5" o:spid="_x0000_s1026" type="#_x0000_t11" style="position:absolute;margin-left:147.1pt;margin-top:-.1pt;width:9pt;height:11.25pt;z-index:251661312;visibility:visible;mso-wrap-style:square;mso-width-percent:0;mso-height-percent:0;mso-wrap-distance-left:9pt;mso-wrap-distance-top:0;mso-wrap-distance-right:9pt;mso-wrap-distance-bottom:0;mso-position-horizontal:absolute;mso-position-horizontal-relative:text;mso-position-vertical:absolute;mso-position-vertical-relative:text;mso-width-percent:0;mso-height-percent:0;mso-width-relative:page;mso-height-relative:page;v-text-anchor:top" o:gfxdata="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" fillcolor="black" strokecolor="#f2f2f2" strokeweight="3pt">
+                    <v:shape id="Cruz 5" style="position:absolute;margin-left:147.1pt;margin-top:-.1pt;width:9pt;height:11.25pt;z-index:251661312;visibility:visible;mso-wrap-style:square;mso-width-percent:0;mso-height-percent:0;mso-wrap-distance-left:9pt;mso-wrap-distance-top:0;mso-wrap-distance-right:9pt;mso-wrap-distance-bottom:0;mso-position-horizontal:absolute;mso-position-horizontal-relative:text;mso-position-vertical:absolute;mso-position-vertical-relative:text;mso-width-percent:0;mso-height-percent:0;mso-width-relative:page;mso-height-relative:page;v-text-anchor:top" o:spid="_x0000_s1026" fillcolor="black" strokecolor="#f2f2f2" strokeweight="3pt" type="#_x0000_t11" o:gfxdata="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">
                       <v:shadow on="t" color="#7f7f7f" opacity=".5" offset="1pt"/>
                     </v:shape>
                   </w:pict>
@@ -4009,6 +4200,7 @@
           <w:tcPr>
             <w:tcW w:w="10056" w:type="dxa"/>
             <w:gridSpan w:val="4"/>
+            <w:tcMar/>
           </w:tcPr>
           <w:p>
             <w:pPr>
@@ -4061,26 +4253,40 @@
           <w:tcPr>
             <w:tcW w:w="10101" w:type="dxa"/>
             <w:gridSpan w:val="5"/>
-            <w:shd w:val="clear" w:color="auto" w:fill="BFBFBF"/>
-          </w:tcPr>
-          <w:p>
-            <w:pPr>
-              <w:pStyle w:val="Ttulo3"/>
-              <w:rPr>
-                <w:rFonts w:ascii="Tahoma" w:hAnsi="Tahoma" w:cs="Tahoma"/>
-                <w:b/>
-                <w:sz w:val="20"/>
-                <w:szCs w:val="20"/>
-              </w:rPr>
-            </w:pPr>
-            <w:r>
-              <w:rPr>
-                <w:rFonts w:ascii="Tahoma" w:hAnsi="Tahoma" w:cs="Tahoma"/>
-                <w:b/>
-                <w:sz w:val="20"/>
-                <w:szCs w:val="20"/>
-              </w:rPr>
-              <w:t>Flujo  Básico:</w:t>
+            <w:shd w:val="clear" w:color="auto" w:fill="BFBFBF" w:themeFill="background1" w:themeFillShade="BF"/>
+            <w:tcMar/>
+          </w:tcPr>
+          <w:p>
+            <w:pPr>
+              <w:pStyle w:val="Normal"/>
+              <w:rPr>
+                <w:rFonts w:ascii="Tahoma" w:hAnsi="Tahoma" w:eastAsia="Tahoma" w:cs="Tahoma"/>
+                <w:b w:val="1"/>
+                <w:bCs w:val="1"/>
+                <w:color w:val="808080" w:themeColor="background1" w:themeTint="FF" w:themeShade="80"/>
+                <w:sz w:val="20"/>
+                <w:szCs w:val="20"/>
+              </w:rPr>
+            </w:pPr>
+            <w:r>
+              <w:rPr>
+                <w:rFonts w:ascii="Tahoma" w:hAnsi="Tahoma" w:eastAsia="Tahoma" w:cs="Tahoma"/>
+                <w:b w:val="1"/>
+                <w:bCs w:val="1"/>
+                <w:sz w:val="20"/>
+                <w:szCs w:val="20"/>
+              </w:rPr>
+              <w:t>Flujo Básico</w:t>
+            </w:r>
+            <w:r>
+              <w:rPr>
+                <w:rFonts w:ascii="Tahoma" w:hAnsi="Tahoma" w:eastAsia="Tahoma" w:cs="Tahoma"/>
+                <w:b w:val="1"/>
+                <w:bCs w:val="1"/>
+                <w:sz w:val="20"/>
+                <w:szCs w:val="20"/>
+              </w:rPr>
+              <w:t>:</w:t>
             </w:r>
           </w:p>
           <w:p/>
@@ -4095,6 +4301,7 @@
           <w:tcPr>
             <w:tcW w:w="10101" w:type="dxa"/>
             <w:gridSpan w:val="5"/>
+            <w:tcMar/>
           </w:tcPr>
           <w:p>
             <w:pPr>
@@ -4129,6 +4336,7 @@
           <w:tcPr>
             <w:tcW w:w="10101" w:type="dxa"/>
             <w:gridSpan w:val="5"/>
+            <w:tcMar/>
           </w:tcPr>
           <w:p>
             <w:pPr>
@@ -4163,6 +4371,7 @@
           <w:tcPr>
             <w:tcW w:w="10101" w:type="dxa"/>
             <w:gridSpan w:val="5"/>
+            <w:tcMar/>
           </w:tcPr>
           <w:p>
             <w:pPr>
@@ -4197,6 +4406,7 @@
           <w:tcPr>
             <w:tcW w:w="10101" w:type="dxa"/>
             <w:gridSpan w:val="5"/>
+            <w:tcMar/>
           </w:tcPr>
           <w:p>
             <w:pPr>
@@ -4247,6 +4457,7 @@
           <w:tcPr>
             <w:tcW w:w="10101" w:type="dxa"/>
             <w:gridSpan w:val="5"/>
+            <w:tcMar/>
           </w:tcPr>
           <w:p>
             <w:pPr>
@@ -4281,26 +4492,39 @@
           <w:tcPr>
             <w:tcW w:w="10101" w:type="dxa"/>
             <w:gridSpan w:val="5"/>
-            <w:shd w:val="clear" w:color="auto" w:fill="BFBFBF"/>
-          </w:tcPr>
-          <w:p>
-            <w:pPr>
-              <w:pStyle w:val="Ttulo3"/>
-              <w:rPr>
-                <w:rFonts w:ascii="Tahoma" w:hAnsi="Tahoma" w:cs="Tahoma"/>
-                <w:b/>
-                <w:sz w:val="20"/>
-                <w:szCs w:val="20"/>
-              </w:rPr>
-            </w:pPr>
-            <w:r>
-              <w:rPr>
-                <w:rFonts w:ascii="Tahoma" w:hAnsi="Tahoma" w:cs="Tahoma"/>
-                <w:b/>
-                <w:sz w:val="20"/>
-                <w:szCs w:val="20"/>
-              </w:rPr>
-              <w:t>Flujos  Alternativos:</w:t>
+            <w:shd w:val="clear" w:color="auto" w:fill="BFBFBF" w:themeFill="background1" w:themeFillShade="BF"/>
+            <w:tcMar/>
+          </w:tcPr>
+          <w:p>
+            <w:pPr>
+              <w:pStyle w:val="Normal"/>
+              <w:rPr>
+                <w:rFonts w:ascii="Tahoma" w:hAnsi="Tahoma" w:eastAsia="Tahoma" w:cs="Tahoma"/>
+                <w:b w:val="1"/>
+                <w:bCs w:val="1"/>
+                <w:sz w:val="20"/>
+                <w:szCs w:val="20"/>
+              </w:rPr>
+            </w:pPr>
+            <w:r>
+              <w:rPr>
+                <w:rFonts w:ascii="Tahoma" w:hAnsi="Tahoma" w:eastAsia="Tahoma" w:cs="Tahoma"/>
+                <w:b w:val="1"/>
+                <w:bCs w:val="1"/>
+                <w:sz w:val="20"/>
+                <w:szCs w:val="20"/>
+              </w:rPr>
+              <w:t>Flujos Alternativos</w:t>
+            </w:r>
+            <w:r>
+              <w:rPr>
+                <w:rFonts w:ascii="Tahoma" w:hAnsi="Tahoma" w:eastAsia="Tahoma" w:cs="Tahoma"/>
+                <w:b w:val="1"/>
+                <w:bCs w:val="1"/>
+                <w:sz w:val="20"/>
+                <w:szCs w:val="20"/>
+              </w:rPr>
+              <w:t>:</w:t>
             </w:r>
           </w:p>
           <w:p/>
@@ -4315,6 +4539,7 @@
           <w:tcPr>
             <w:tcW w:w="10101" w:type="dxa"/>
             <w:gridSpan w:val="5"/>
+            <w:tcMar/>
           </w:tcPr>
           <w:p>
             <w:pPr>
@@ -4346,6 +4571,7 @@
           <w:tcPr>
             <w:tcW w:w="10056" w:type="dxa"/>
             <w:gridSpan w:val="4"/>
+            <w:tcMar/>
           </w:tcPr>
           <w:p>
             <w:pPr>
@@ -4429,6 +4655,7 @@
           <w:tcPr>
             <w:tcW w:w="10056" w:type="dxa"/>
             <w:gridSpan w:val="4"/>
+            <w:tcMar/>
           </w:tcPr>
           <w:p>
             <w:pPr>
@@ -4464,6 +4691,7 @@
           <w:tcPr>
             <w:tcW w:w="10056" w:type="dxa"/>
             <w:gridSpan w:val="4"/>
+            <w:tcMar/>
           </w:tcPr>
           <w:p>
             <w:pPr>
@@ -4499,6 +4727,7 @@
           <w:tcPr>
             <w:tcW w:w="10056" w:type="dxa"/>
             <w:gridSpan w:val="4"/>
+            <w:tcMar/>
           </w:tcPr>
           <w:p>
             <w:pPr>
@@ -4534,6 +4763,7 @@
           <w:tcPr>
             <w:tcW w:w="10056" w:type="dxa"/>
             <w:gridSpan w:val="4"/>
+            <w:tcMar/>
           </w:tcPr>
           <w:p>
             <w:pPr>
@@ -4569,38 +4799,35 @@
           <w:tcPr>
             <w:tcW w:w="10056" w:type="dxa"/>
             <w:gridSpan w:val="4"/>
-          </w:tcPr>
-          <w:p>
-            <w:pPr>
-              <w:pStyle w:val="Ttulo1"/>
+            <w:tcMar/>
+          </w:tcPr>
+          <w:p>
+            <w:pPr>
+              <w:pStyle w:val="Normal"/>
               <w:rPr>
                 <w:rFonts w:cs="Tahoma"/>
-                <w:bCs/>
-                <w:sz w:val="20"/>
-              </w:rPr>
-            </w:pPr>
-            <w:r>
-              <w:rPr>
-                <w:rFonts w:ascii="Tahoma" w:hAnsi="Tahoma" w:cs="Tahoma"/>
-                <w:b/>
-                <w:sz w:val="20"/>
+                <w:sz w:val="20"/>
+                <w:szCs w:val="20"/>
+              </w:rPr>
+            </w:pPr>
+            <w:r>
+              <w:rPr>
+                <w:rFonts w:ascii="Tahoma" w:hAnsi="Tahoma" w:eastAsia="Tahoma" w:cs="Tahoma"/>
+                <w:b w:val="1"/>
+                <w:bCs w:val="1"/>
+                <w:sz w:val="20"/>
+                <w:szCs w:val="20"/>
               </w:rPr>
               <w:t>Use Case de Generalización:</w:t>
             </w:r>
             <w:r>
-              <w:rPr>
-                <w:rFonts w:cs="Tahoma"/>
-                <w:bCs/>
-                <w:sz w:val="20"/>
-              </w:rPr>
+              <w:rPr/>
               <w:t xml:space="preserve"> </w:t>
             </w:r>
             <w:r>
               <w:rPr>
-                <w:rFonts w:cs="Tahoma"/>
-                <w:b/>
-                <w:bCs/>
-                <w:sz w:val="20"/>
+                <w:sz w:val="20"/>
+                <w:szCs w:val="20"/>
               </w:rPr>
               <w:t>No aplica</w:t>
             </w:r>
@@ -4619,34 +4846,42 @@
           <w:tcPr>
             <w:tcW w:w="6383" w:type="dxa"/>
             <w:gridSpan w:val="2"/>
-          </w:tcPr>
-          <w:p>
-            <w:pPr>
-              <w:pStyle w:val="Ttulo1"/>
+            <w:tcMar/>
+          </w:tcPr>
+          <w:p>
+            <w:pPr>
+              <w:pStyle w:val="Normal"/>
               <w:tabs>
-                <w:tab w:val="right" w:pos="1988"/>
+                <w:tab w:val="right" w:leader="none" w:pos="1988"/>
               </w:tabs>
               <w:rPr>
                 <w:rFonts w:cs="Tahoma"/>
-                <w:bCs/>
-                <w:sz w:val="20"/>
-              </w:rPr>
-            </w:pPr>
-            <w:r>
-              <w:rPr>
-                <w:rFonts w:ascii="Tahoma" w:hAnsi="Tahoma" w:cs="Tahoma"/>
-                <w:b/>
-                <w:sz w:val="20"/>
-              </w:rPr>
-              <w:t xml:space="preserve">Autor: </w:t>
-            </w:r>
-            <w:r>
-              <w:rPr>
-                <w:rFonts w:cs="Tahoma"/>
-                <w:bCs/>
-                <w:sz w:val="20"/>
-              </w:rPr>
+                <w:sz w:val="20"/>
+                <w:szCs w:val="20"/>
+              </w:rPr>
+            </w:pPr>
+            <w:r>
+              <w:rPr>
+                <w:rFonts w:ascii="Tahoma" w:hAnsi="Tahoma" w:eastAsia="Tahoma" w:cs="Tahoma"/>
+                <w:b w:val="1"/>
+                <w:bCs w:val="1"/>
+                <w:sz w:val="20"/>
+                <w:szCs w:val="20"/>
+              </w:rPr>
+              <w:t>Autor:</w:t>
+            </w:r>
+            <w:r>
+              <w:rPr/>
+              <w:t xml:space="preserve"> </w:t>
+            </w:r>
+            <w:r>
               <w:tab/>
+            </w:r>
+            <w:r>
+              <w:rPr>
+                <w:sz w:val="20"/>
+                <w:szCs w:val="20"/>
+              </w:rPr>
               <w:t>Agustín Borgo</w:t>
             </w:r>
           </w:p>
@@ -4655,21 +4890,22 @@
           <w:tcPr>
             <w:tcW w:w="3633" w:type="dxa"/>
             <w:gridSpan w:val="2"/>
-          </w:tcPr>
-          <w:p>
-            <w:pPr>
-              <w:pStyle w:val="Ttulo1"/>
+            <w:tcMar/>
+          </w:tcPr>
+          <w:p>
+            <w:pPr>
+              <w:pStyle w:val="Normal"/>
               <w:rPr>
                 <w:rFonts w:cs="Tahoma"/>
-                <w:bCs/>
-                <w:sz w:val="20"/>
-                <w:szCs w:val="20"/>
-              </w:rPr>
-            </w:pPr>
-            <w:r>
-              <w:rPr>
-                <w:rFonts w:ascii="Tahoma" w:hAnsi="Tahoma" w:cs="Tahoma"/>
-                <w:b/>
+                <w:sz w:val="20"/>
+                <w:szCs w:val="20"/>
+              </w:rPr>
+            </w:pPr>
+            <w:r>
+              <w:rPr>
+                <w:rFonts w:ascii="Tahoma" w:hAnsi="Tahoma" w:eastAsia="Tahoma" w:cs="Tahoma"/>
+                <w:b w:val="1"/>
+                <w:bCs w:val="1"/>
                 <w:sz w:val="20"/>
                 <w:szCs w:val="20"/>
               </w:rPr>
@@ -4677,8 +4913,6 @@
             </w:r>
             <w:r>
               <w:rPr>
-                <w:rFonts w:cs="Tahoma"/>
-                <w:b/>
                 <w:sz w:val="20"/>
                 <w:szCs w:val="20"/>
               </w:rPr>
@@ -4699,31 +4933,37 @@
           <w:tcPr>
             <w:tcW w:w="6383" w:type="dxa"/>
             <w:gridSpan w:val="2"/>
-          </w:tcPr>
-          <w:p>
-            <w:pPr>
-              <w:pStyle w:val="Ttulo1"/>
+            <w:tcMar/>
+          </w:tcPr>
+          <w:p>
+            <w:pPr>
+              <w:pStyle w:val="Normal"/>
               <w:rPr>
                 <w:rFonts w:cs="Tahoma"/>
-                <w:bCs/>
-                <w:sz w:val="20"/>
-              </w:rPr>
-            </w:pPr>
-            <w:r>
-              <w:rPr>
-                <w:rFonts w:ascii="Tahoma" w:hAnsi="Tahoma" w:cs="Tahoma"/>
-                <w:b/>
-                <w:sz w:val="20"/>
+                <w:sz w:val="20"/>
+                <w:szCs w:val="20"/>
+              </w:rPr>
+            </w:pPr>
+            <w:r>
+              <w:rPr>
+                <w:rFonts w:ascii="Tahoma" w:hAnsi="Tahoma" w:eastAsia="Tahoma" w:cs="Tahoma"/>
+                <w:b w:val="1"/>
+                <w:bCs w:val="1"/>
+                <w:sz w:val="20"/>
+                <w:szCs w:val="20"/>
               </w:rPr>
               <w:t>Autor Última Modificación:</w:t>
             </w:r>
             <w:r>
-              <w:rPr>
-                <w:rFonts w:cs="Tahoma"/>
-                <w:bCs/>
-                <w:sz w:val="20"/>
-              </w:rPr>
-              <w:t xml:space="preserve"> Agustín Borgo</w:t>
+              <w:rPr/>
+              <w:t xml:space="preserve"> </w:t>
+            </w:r>
+            <w:r>
+              <w:rPr>
+                <w:sz w:val="20"/>
+                <w:szCs w:val="20"/>
+              </w:rPr>
+              <w:t>Agustín Borgo</w:t>
             </w:r>
           </w:p>
         </w:tc>
@@ -4731,21 +4971,22 @@
           <w:tcPr>
             <w:tcW w:w="3633" w:type="dxa"/>
             <w:gridSpan w:val="2"/>
-          </w:tcPr>
-          <w:p>
-            <w:pPr>
-              <w:pStyle w:val="Ttulo1"/>
+            <w:tcMar/>
+          </w:tcPr>
+          <w:p>
+            <w:pPr>
+              <w:pStyle w:val="Normal"/>
               <w:rPr>
                 <w:rFonts w:cs="Tahoma"/>
-                <w:bCs/>
-                <w:sz w:val="20"/>
-                <w:szCs w:val="20"/>
-              </w:rPr>
-            </w:pPr>
-            <w:r>
-              <w:rPr>
-                <w:rFonts w:ascii="Tahoma" w:hAnsi="Tahoma" w:cs="Tahoma"/>
-                <w:b/>
+                <w:sz w:val="20"/>
+                <w:szCs w:val="20"/>
+              </w:rPr>
+            </w:pPr>
+            <w:r>
+              <w:rPr>
+                <w:rFonts w:ascii="Tahoma" w:hAnsi="Tahoma" w:eastAsia="Tahoma" w:cs="Tahoma"/>
+                <w:b w:val="1"/>
+                <w:bCs w:val="1"/>
                 <w:sz w:val="20"/>
                 <w:szCs w:val="20"/>
               </w:rPr>
@@ -4753,12 +4994,20 @@
             </w:r>
             <w:r>
               <w:rPr>
-                <w:rFonts w:cs="Tahoma"/>
-                <w:b/>
-                <w:sz w:val="20"/>
-                <w:szCs w:val="20"/>
-              </w:rPr>
-              <w:t xml:space="preserve">  6/10/2026</w:t>
+                <w:rFonts w:ascii="Tahoma" w:hAnsi="Tahoma" w:eastAsia="Tahoma" w:cs="Tahoma"/>
+                <w:b w:val="1"/>
+                <w:bCs w:val="1"/>
+                <w:sz w:val="20"/>
+                <w:szCs w:val="20"/>
+              </w:rPr>
+              <w:t xml:space="preserve"> </w:t>
+            </w:r>
+            <w:r>
+              <w:rPr>
+                <w:sz w:val="20"/>
+                <w:szCs w:val="20"/>
+              </w:rPr>
+              <w:t>6/10/2026</w:t>
             </w:r>
           </w:p>
         </w:tc>
@@ -4766,56 +5015,54 @@
     </w:tbl>
     <w:p>
       <w:pPr>
-        <w:pStyle w:val="Encabezado"/>
+        <w:pStyle w:val="Normal"/>
         <w:tabs>
-          <w:tab w:val="clear" w:pos="4252"/>
-          <w:tab w:val="clear" w:pos="8504"/>
+          <w:tab w:val="clear" w:leader="none" w:pos="4252"/>
+          <w:tab w:val="clear" w:leader="none" w:pos="8504"/>
         </w:tabs>
         <w:jc w:val="center"/>
         <w:rPr>
-          <w:rFonts w:ascii="Tahoma" w:hAnsi="Tahoma" w:cs="Tahoma"/>
-          <w:b/>
-          <w:bCs/>
-          <w:color w:val="333399"/>
+          <w:b w:val="1"/>
+          <w:bCs w:val="1"/>
+          <w:u w:val="single"/>
         </w:rPr>
       </w:pPr>
     </w:p>
     <w:p>
       <w:pPr>
-        <w:pStyle w:val="Encabezado"/>
-        <w:tabs>
-          <w:tab w:val="clear" w:pos="4252"/>
-          <w:tab w:val="clear" w:pos="8504"/>
-        </w:tabs>
-        <w:jc w:val="center"/>
-        <w:rPr>
-          <w:rFonts w:ascii="Tahoma" w:hAnsi="Tahoma" w:cs="Tahoma"/>
-          <w:b/>
-          <w:bCs/>
-          <w:color w:val="333399"/>
+        <w:pStyle w:val="Ttulo2"/>
+        <w:rPr>
+          <w:b w:val="1"/>
+          <w:bCs w:val="1"/>
+          <w:u w:val="single"/>
         </w:rPr>
       </w:pPr>
     </w:p>
     <w:p>
+      <w:r>
+        <w:br w:type="page"/>
+      </w:r>
+    </w:p>
+    <w:p>
       <w:pPr>
         <w:pStyle w:val="Ttulo2"/>
         <w:rPr>
-          <w:b/>
-          <w:bCs/>
-          <w:u w:val="single"/>
-        </w:rPr>
-      </w:pPr>
-      <w:r>
-        <w:rPr>
-          <w:b/>
-          <w:bCs/>
-          <w:u w:val="single"/>
-        </w:rPr>
-        <w:lastRenderedPageBreak/>
+          <w:b w:val="1"/>
+          <w:bCs w:val="1"/>
+          <w:u w:val="none"/>
+        </w:rPr>
+      </w:pPr>
+      <w:bookmarkStart w:name="_Toc1758631309" w:id="668379657"/>
+      <w:r>
+        <w:rPr>
+          <w:b w:val="1"/>
+          <w:bCs w:val="1"/>
+          <w:u w:val="none"/>
+        </w:rPr>
         <w:t>Prototipo de Consultar retiro agendado</w:t>
       </w:r>
+      <w:bookmarkEnd w:id="668379657"/>
     </w:p>
-    <w:p/>
     <w:p/>
     <w:p>
       <w:r>
@@ -4949,7 +5196,6 @@
           <w:bCs/>
           <w:color w:val="333399"/>
         </w:rPr>
-        <w:lastRenderedPageBreak/>
         <w:drawing>
           <wp:inline distT="0" distB="0" distL="0" distR="0" wp14:anchorId="7FB9EEAF" wp14:editId="7F01B121">
             <wp:extent cx="2423117" cy="5325533"/>
@@ -5013,7 +5259,6 @@
           <w:bCs/>
           <w:color w:val="333399"/>
         </w:rPr>
-        <w:lastRenderedPageBreak/>
         <w:t>Plantilla para Descripción de Use Cases  (Trazo Intermedio)</w:t>
       </w:r>
     </w:p>
@@ -5039,12 +5284,12 @@
         <w:jc w:val="center"/>
         <w:tblCellSpacing w:w="20" w:type="dxa"/>
         <w:tblBorders>
-          <w:top w:val="outset" w:sz="6" w:space="0" w:color="auto"/>
-          <w:left w:val="outset" w:sz="6" w:space="0" w:color="auto"/>
-          <w:bottom w:val="outset" w:sz="6" w:space="0" w:color="auto"/>
-          <w:right w:val="outset" w:sz="6" w:space="0" w:color="auto"/>
-          <w:insideH w:val="outset" w:sz="6" w:space="0" w:color="auto"/>
-          <w:insideV w:val="outset" w:sz="6" w:space="0" w:color="auto"/>
+          <w:top w:val="outset" w:color="auto" w:sz="6" w:space="0"/>
+          <w:left w:val="outset" w:color="auto" w:sz="6" w:space="0"/>
+          <w:bottom w:val="outset" w:color="auto" w:sz="6" w:space="0"/>
+          <w:right w:val="outset" w:color="auto" w:sz="6" w:space="0"/>
+          <w:insideH w:val="outset" w:color="auto" w:sz="6" w:space="0"/>
+          <w:insideV w:val="outset" w:color="auto" w:sz="6" w:space="0"/>
         </w:tblBorders>
         <w:tblLayout w:type="fixed"/>
         <w:tblCellMar>
@@ -5073,6 +5318,7 @@
           <w:tcPr>
             <w:tcW w:w="10056" w:type="dxa"/>
             <w:gridSpan w:val="4"/>
+            <w:tcMar/>
           </w:tcPr>
           <w:p>
             <w:pPr>
@@ -5107,6 +5353,7 @@
             <w:tcW w:w="6977" w:type="dxa"/>
             <w:gridSpan w:val="3"/>
             <w:shd w:val="clear" w:color="auto" w:fill="C0C0C0"/>
+            <w:tcMar/>
           </w:tcPr>
           <w:p>
             <w:pPr>
@@ -5137,6 +5384,7 @@
           <w:tcPr>
             <w:tcW w:w="3039" w:type="dxa"/>
             <w:shd w:val="clear" w:color="auto" w:fill="C0C0C0"/>
+            <w:tcMar/>
           </w:tcPr>
           <w:p>
             <w:pPr>
@@ -5176,6 +5424,7 @@
         <w:tc>
           <w:tcPr>
             <w:tcW w:w="4329" w:type="dxa"/>
+            <w:tcMar/>
           </w:tcPr>
           <w:p>
             <w:pPr>
@@ -5206,6 +5455,7 @@
           <w:tcPr>
             <w:tcW w:w="5687" w:type="dxa"/>
             <w:gridSpan w:val="3"/>
+            <w:tcMar/>
           </w:tcPr>
           <w:p>
             <w:pPr>
@@ -5245,6 +5495,7 @@
           <w:tcPr>
             <w:tcW w:w="10056" w:type="dxa"/>
             <w:gridSpan w:val="4"/>
+            <w:tcMar/>
           </w:tcPr>
           <w:p>
             <w:pPr>
@@ -5331,8 +5582,8 @@
                   </w:drawing>
                 </mc:Choice>
                 <mc:Fallback xmlns:w16sdtfl="http://schemas.microsoft.com/office/word/2024/wordml/sdtformatlock" xmlns:w16du="http://schemas.microsoft.com/office/word/2023/wordml/word16du">
-                  <w:pict>
-                    <v:shape w14:anchorId="263415CC" id="Cruz 6" o:spid="_x0000_s1026" type="#_x0000_t11" style="position:absolute;margin-left:146.35pt;margin-top:.65pt;width:10.5pt;height:11.25pt;z-index:251663360;visibility:visible;mso-wrap-style:square;mso-width-percent:0;mso-height-percent:0;mso-wrap-distance-left:9pt;mso-wrap-distance-top:0;mso-wrap-distance-right:9pt;mso-wrap-distance-bottom:0;mso-position-horizontal:absolute;mso-position-horizontal-relative:text;mso-position-vertical:absolute;mso-position-vertical-relative:text;mso-width-percent:0;mso-height-percent:0;mso-width-relative:page;mso-height-relative:page;v-text-anchor:top" o:gfxdata="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" fillcolor="black" strokecolor="#f2f2f2" strokeweight="3pt">
+                  <w:pict w14:anchorId="73905CDF">
+                    <v:shape id="Cruz 6" style="position:absolute;margin-left:146.35pt;margin-top:.65pt;width:10.5pt;height:11.25pt;z-index:251663360;visibility:visible;mso-wrap-style:square;mso-width-percent:0;mso-height-percent:0;mso-wrap-distance-left:9pt;mso-wrap-distance-top:0;mso-wrap-distance-right:9pt;mso-wrap-distance-bottom:0;mso-position-horizontal:absolute;mso-position-horizontal-relative:text;mso-position-vertical:absolute;mso-position-vertical-relative:text;mso-width-percent:0;mso-height-percent:0;mso-width-relative:page;mso-height-relative:page;v-text-anchor:top" o:spid="_x0000_s1026" fillcolor="black" strokecolor="#f2f2f2" strokeweight="3pt" type="#_x0000_t11" o:gfxdata="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" w14:anchorId="263415CC">
                       <v:shadow on="t" color="#7f7f7f" opacity=".5" offset="1pt"/>
                     </v:shape>
                   </w:pict>
@@ -5470,6 +5721,7 @@
           <w:tcPr>
             <w:tcW w:w="10056" w:type="dxa"/>
             <w:gridSpan w:val="4"/>
+            <w:tcMar/>
           </w:tcPr>
           <w:p>
             <w:pPr>
@@ -5523,26 +5775,39 @@
           <w:tcPr>
             <w:tcW w:w="10101" w:type="dxa"/>
             <w:gridSpan w:val="5"/>
-            <w:shd w:val="clear" w:color="auto" w:fill="BFBFBF"/>
-          </w:tcPr>
-          <w:p>
-            <w:pPr>
-              <w:pStyle w:val="Ttulo3"/>
-              <w:rPr>
-                <w:rFonts w:ascii="Tahoma" w:hAnsi="Tahoma" w:cs="Tahoma"/>
-                <w:b/>
-                <w:sz w:val="20"/>
-                <w:szCs w:val="20"/>
-              </w:rPr>
-            </w:pPr>
-            <w:r>
-              <w:rPr>
-                <w:rFonts w:ascii="Tahoma" w:hAnsi="Tahoma" w:cs="Tahoma"/>
-                <w:b/>
-                <w:sz w:val="20"/>
-                <w:szCs w:val="20"/>
-              </w:rPr>
-              <w:t>Flujo  Básico:</w:t>
+            <w:shd w:val="clear" w:color="auto" w:fill="BFBFBF" w:themeFill="background1" w:themeFillShade="BF"/>
+            <w:tcMar/>
+          </w:tcPr>
+          <w:p>
+            <w:pPr>
+              <w:pStyle w:val="Normal"/>
+              <w:rPr>
+                <w:rFonts w:ascii="Tahoma" w:hAnsi="Tahoma" w:eastAsia="Tahoma" w:cs="Tahoma"/>
+                <w:b w:val="1"/>
+                <w:bCs w:val="1"/>
+                <w:sz w:val="22"/>
+                <w:szCs w:val="22"/>
+              </w:rPr>
+            </w:pPr>
+            <w:r>
+              <w:rPr>
+                <w:rFonts w:ascii="Tahoma" w:hAnsi="Tahoma" w:eastAsia="Tahoma" w:cs="Tahoma"/>
+                <w:b w:val="1"/>
+                <w:bCs w:val="1"/>
+                <w:sz w:val="22"/>
+                <w:szCs w:val="22"/>
+              </w:rPr>
+              <w:t>Flujo Básico</w:t>
+            </w:r>
+            <w:r>
+              <w:rPr>
+                <w:rFonts w:ascii="Tahoma" w:hAnsi="Tahoma" w:eastAsia="Tahoma" w:cs="Tahoma"/>
+                <w:b w:val="1"/>
+                <w:bCs w:val="1"/>
+                <w:sz w:val="22"/>
+                <w:szCs w:val="22"/>
+              </w:rPr>
+              <w:t>:</w:t>
             </w:r>
           </w:p>
           <w:p/>
@@ -5557,6 +5822,7 @@
           <w:tcPr>
             <w:tcW w:w="10101" w:type="dxa"/>
             <w:gridSpan w:val="5"/>
+            <w:tcMar/>
           </w:tcPr>
           <w:p>
             <w:pPr>
@@ -5591,6 +5857,7 @@
           <w:tcPr>
             <w:tcW w:w="10101" w:type="dxa"/>
             <w:gridSpan w:val="5"/>
+            <w:tcMar/>
           </w:tcPr>
           <w:p>
             <w:pPr>
@@ -5625,6 +5892,7 @@
           <w:tcPr>
             <w:tcW w:w="10101" w:type="dxa"/>
             <w:gridSpan w:val="5"/>
+            <w:tcMar/>
           </w:tcPr>
           <w:p>
             <w:pPr>
@@ -5659,6 +5927,7 @@
           <w:tcPr>
             <w:tcW w:w="10101" w:type="dxa"/>
             <w:gridSpan w:val="5"/>
+            <w:tcMar/>
           </w:tcPr>
           <w:p>
             <w:pPr>
@@ -5693,6 +5962,7 @@
           <w:tcPr>
             <w:tcW w:w="10101" w:type="dxa"/>
             <w:gridSpan w:val="5"/>
+            <w:tcMar/>
           </w:tcPr>
           <w:p>
             <w:pPr>
@@ -5727,6 +5997,7 @@
           <w:tcPr>
             <w:tcW w:w="10101" w:type="dxa"/>
             <w:gridSpan w:val="5"/>
+            <w:tcMar/>
           </w:tcPr>
           <w:p>
             <w:pPr>
@@ -5761,6 +6032,7 @@
           <w:tcPr>
             <w:tcW w:w="10101" w:type="dxa"/>
             <w:gridSpan w:val="5"/>
+            <w:tcMar/>
           </w:tcPr>
           <w:p>
             <w:pPr>
@@ -5803,6 +6075,7 @@
           <w:tcPr>
             <w:tcW w:w="10101" w:type="dxa"/>
             <w:gridSpan w:val="5"/>
+            <w:tcMar/>
           </w:tcPr>
           <w:p>
             <w:pPr>
@@ -5837,24 +6110,27 @@
           <w:tcPr>
             <w:tcW w:w="10101" w:type="dxa"/>
             <w:gridSpan w:val="5"/>
-            <w:shd w:val="clear" w:color="auto" w:fill="BFBFBF"/>
-          </w:tcPr>
-          <w:p>
-            <w:pPr>
-              <w:pStyle w:val="Ttulo3"/>
-              <w:rPr>
-                <w:rFonts w:ascii="Tahoma" w:hAnsi="Tahoma" w:cs="Tahoma"/>
-                <w:b/>
-                <w:sz w:val="20"/>
-                <w:szCs w:val="20"/>
-              </w:rPr>
-            </w:pPr>
-            <w:r>
-              <w:rPr>
-                <w:rFonts w:ascii="Tahoma" w:hAnsi="Tahoma" w:cs="Tahoma"/>
-                <w:b/>
-                <w:sz w:val="20"/>
-                <w:szCs w:val="20"/>
+            <w:shd w:val="clear" w:color="auto" w:fill="BFBFBF" w:themeFill="background1" w:themeFillShade="BF"/>
+            <w:tcMar/>
+          </w:tcPr>
+          <w:p>
+            <w:pPr>
+              <w:pStyle w:val="Normal"/>
+              <w:rPr>
+                <w:rFonts w:ascii="Tahoma" w:hAnsi="Tahoma" w:eastAsia="Tahoma" w:cs="Tahoma"/>
+                <w:b w:val="1"/>
+                <w:bCs w:val="1"/>
+                <w:sz w:val="22"/>
+                <w:szCs w:val="22"/>
+              </w:rPr>
+            </w:pPr>
+            <w:r>
+              <w:rPr>
+                <w:rFonts w:ascii="Tahoma" w:hAnsi="Tahoma" w:eastAsia="Tahoma" w:cs="Tahoma"/>
+                <w:b w:val="1"/>
+                <w:bCs w:val="1"/>
+                <w:sz w:val="22"/>
+                <w:szCs w:val="22"/>
               </w:rPr>
               <w:t>Flujos  Alternativos:</w:t>
             </w:r>
@@ -5870,6 +6146,7 @@
           <w:tcPr>
             <w:tcW w:w="10101" w:type="dxa"/>
             <w:gridSpan w:val="5"/>
+            <w:tcMar/>
           </w:tcPr>
           <w:p>
             <w:pPr>
@@ -5901,6 +6178,7 @@
           <w:tcPr>
             <w:tcW w:w="10056" w:type="dxa"/>
             <w:gridSpan w:val="4"/>
+            <w:tcMar/>
           </w:tcPr>
           <w:p>
             <w:pPr>
@@ -5984,6 +6262,7 @@
           <w:tcPr>
             <w:tcW w:w="10056" w:type="dxa"/>
             <w:gridSpan w:val="4"/>
+            <w:tcMar/>
           </w:tcPr>
           <w:p>
             <w:pPr>
@@ -6019,6 +6298,7 @@
           <w:tcPr>
             <w:tcW w:w="10056" w:type="dxa"/>
             <w:gridSpan w:val="4"/>
+            <w:tcMar/>
           </w:tcPr>
           <w:p>
             <w:pPr>
@@ -6054,6 +6334,7 @@
           <w:tcPr>
             <w:tcW w:w="10056" w:type="dxa"/>
             <w:gridSpan w:val="4"/>
+            <w:tcMar/>
           </w:tcPr>
           <w:p>
             <w:pPr>
@@ -6089,6 +6370,7 @@
           <w:tcPr>
             <w:tcW w:w="10056" w:type="dxa"/>
             <w:gridSpan w:val="4"/>
+            <w:tcMar/>
           </w:tcPr>
           <w:p>
             <w:pPr>
@@ -6124,39 +6406,43 @@
           <w:tcPr>
             <w:tcW w:w="10056" w:type="dxa"/>
             <w:gridSpan w:val="4"/>
-          </w:tcPr>
-          <w:p>
-            <w:pPr>
-              <w:pStyle w:val="Ttulo1"/>
+            <w:tcMar/>
+          </w:tcPr>
+          <w:p>
+            <w:pPr>
+              <w:pStyle w:val="Normal"/>
               <w:rPr>
                 <w:rFonts w:cs="Tahoma"/>
-                <w:bCs/>
-                <w:sz w:val="20"/>
-              </w:rPr>
-            </w:pPr>
-            <w:r>
-              <w:rPr>
-                <w:rFonts w:ascii="Tahoma" w:hAnsi="Tahoma" w:cs="Tahoma"/>
-                <w:b/>
-                <w:sz w:val="20"/>
+                <w:sz w:val="20"/>
+                <w:szCs w:val="20"/>
+              </w:rPr>
+            </w:pPr>
+            <w:r>
+              <w:rPr>
+                <w:rFonts w:ascii="Tahoma" w:hAnsi="Tahoma" w:eastAsia="Tahoma" w:cs="Tahoma"/>
+                <w:b w:val="1"/>
+                <w:bCs w:val="1"/>
+                <w:sz w:val="20"/>
+                <w:szCs w:val="20"/>
               </w:rPr>
               <w:t>Use Case de Generalización:</w:t>
             </w:r>
             <w:r>
               <w:rPr>
-                <w:rFonts w:cs="Tahoma"/>
-                <w:b/>
-                <w:bCs/>
-                <w:sz w:val="20"/>
+                <w:rFonts w:ascii="Tahoma" w:hAnsi="Tahoma" w:eastAsia="Tahoma" w:cs="Tahoma"/>
+                <w:b w:val="1"/>
+                <w:bCs w:val="1"/>
+                <w:sz w:val="20"/>
+                <w:szCs w:val="20"/>
               </w:rPr>
               <w:t xml:space="preserve"> </w:t>
             </w:r>
             <w:r>
               <w:rPr>
-                <w:rFonts w:cs="Tahoma"/>
-                <w:b/>
-                <w:bCs/>
-                <w:sz w:val="20"/>
+                <w:b w:val="1"/>
+                <w:bCs w:val="1"/>
+                <w:sz w:val="20"/>
+                <w:szCs w:val="20"/>
               </w:rPr>
               <w:t>No aplica</w:t>
             </w:r>
@@ -6175,34 +6461,40 @@
           <w:tcPr>
             <w:tcW w:w="6383" w:type="dxa"/>
             <w:gridSpan w:val="2"/>
-          </w:tcPr>
-          <w:p>
-            <w:pPr>
-              <w:pStyle w:val="Ttulo1"/>
+            <w:tcMar/>
+          </w:tcPr>
+          <w:p>
+            <w:pPr>
+              <w:pStyle w:val="Normal"/>
               <w:tabs>
-                <w:tab w:val="right" w:pos="1988"/>
+                <w:tab w:val="right" w:leader="none" w:pos="1988"/>
               </w:tabs>
               <w:rPr>
                 <w:rFonts w:cs="Tahoma"/>
-                <w:bCs/>
-                <w:sz w:val="20"/>
-              </w:rPr>
-            </w:pPr>
-            <w:r>
-              <w:rPr>
-                <w:rFonts w:ascii="Tahoma" w:hAnsi="Tahoma" w:cs="Tahoma"/>
-                <w:b/>
-                <w:sz w:val="20"/>
+                <w:sz w:val="20"/>
+                <w:szCs w:val="20"/>
+              </w:rPr>
+            </w:pPr>
+            <w:r>
+              <w:rPr>
+                <w:rFonts w:ascii="Tahoma" w:hAnsi="Tahoma" w:eastAsia="Tahoma" w:cs="Tahoma"/>
+                <w:b w:val="1"/>
+                <w:bCs w:val="1"/>
+                <w:sz w:val="20"/>
+                <w:szCs w:val="20"/>
               </w:rPr>
               <w:t>Autor:</w:t>
             </w:r>
             <w:r>
               <w:rPr>
-                <w:rFonts w:cs="Tahoma"/>
-                <w:bCs/>
-                <w:sz w:val="20"/>
-              </w:rPr>
-              <w:t xml:space="preserve"> Agustín Borgo</w:t>
+                <w:sz w:val="20"/>
+                <w:szCs w:val="20"/>
+              </w:rPr>
+              <w:t xml:space="preserve"> </w:t>
+            </w:r>
+            <w:r>
+              <w:rPr/>
+              <w:t>Agustín Borgo</w:t>
             </w:r>
           </w:p>
         </w:tc>
@@ -6210,21 +6502,22 @@
           <w:tcPr>
             <w:tcW w:w="3633" w:type="dxa"/>
             <w:gridSpan w:val="2"/>
-          </w:tcPr>
-          <w:p>
-            <w:pPr>
-              <w:pStyle w:val="Ttulo1"/>
+            <w:tcMar/>
+          </w:tcPr>
+          <w:p>
+            <w:pPr>
+              <w:pStyle w:val="Normal"/>
               <w:rPr>
                 <w:rFonts w:cs="Tahoma"/>
-                <w:bCs/>
-                <w:sz w:val="20"/>
-                <w:szCs w:val="20"/>
-              </w:rPr>
-            </w:pPr>
-            <w:r>
-              <w:rPr>
-                <w:rFonts w:cs="Tahoma"/>
-                <w:bCs/>
+                <w:sz w:val="20"/>
+                <w:szCs w:val="20"/>
+              </w:rPr>
+            </w:pPr>
+            <w:r>
+              <w:rPr>
+                <w:rFonts w:ascii="Tahoma" w:hAnsi="Tahoma" w:eastAsia="Tahoma" w:cs="Tahoma"/>
+                <w:b w:val="1"/>
+                <w:bCs w:val="1"/>
                 <w:sz w:val="20"/>
                 <w:szCs w:val="20"/>
               </w:rPr>
@@ -6232,12 +6525,17 @@
             </w:r>
             <w:r>
               <w:rPr>
-                <w:rFonts w:cs="Tahoma"/>
-                <w:b/>
-                <w:sz w:val="20"/>
-                <w:szCs w:val="20"/>
-              </w:rPr>
-              <w:t>: 6/10/2026</w:t>
+                <w:rFonts w:ascii="Tahoma" w:hAnsi="Tahoma" w:eastAsia="Tahoma" w:cs="Tahoma"/>
+                <w:b w:val="1"/>
+                <w:bCs w:val="1"/>
+                <w:sz w:val="20"/>
+                <w:szCs w:val="20"/>
+              </w:rPr>
+              <w:t>:</w:t>
+            </w:r>
+            <w:r>
+              <w:rPr/>
+              <w:t xml:space="preserve"> 6/10/2026</w:t>
             </w:r>
           </w:p>
         </w:tc>
@@ -6254,31 +6552,40 @@
           <w:tcPr>
             <w:tcW w:w="6383" w:type="dxa"/>
             <w:gridSpan w:val="2"/>
-          </w:tcPr>
-          <w:p>
-            <w:pPr>
-              <w:pStyle w:val="Ttulo1"/>
+            <w:tcMar/>
+          </w:tcPr>
+          <w:p>
+            <w:pPr>
+              <w:pStyle w:val="Normal"/>
               <w:rPr>
                 <w:rFonts w:cs="Tahoma"/>
-                <w:bCs/>
-                <w:sz w:val="20"/>
-              </w:rPr>
-            </w:pPr>
-            <w:r>
-              <w:rPr>
-                <w:rFonts w:ascii="Tahoma" w:hAnsi="Tahoma" w:cs="Tahoma"/>
-                <w:b/>
-                <w:sz w:val="20"/>
+                <w:sz w:val="20"/>
+                <w:szCs w:val="20"/>
+              </w:rPr>
+            </w:pPr>
+            <w:r>
+              <w:rPr>
+                <w:rFonts w:ascii="Tahoma" w:hAnsi="Tahoma" w:eastAsia="Tahoma" w:cs="Tahoma"/>
+                <w:b w:val="1"/>
+                <w:bCs w:val="1"/>
+                <w:sz w:val="20"/>
+                <w:szCs w:val="20"/>
               </w:rPr>
               <w:t>Autor Última Modificación:</w:t>
             </w:r>
             <w:r>
               <w:rPr>
-                <w:rFonts w:cs="Tahoma"/>
-                <w:bCs/>
-                <w:sz w:val="20"/>
-              </w:rPr>
-              <w:t xml:space="preserve"> Agustín Borgo</w:t>
+                <w:rFonts w:ascii="Tahoma" w:hAnsi="Tahoma" w:eastAsia="Tahoma" w:cs="Tahoma"/>
+                <w:b w:val="1"/>
+                <w:bCs w:val="1"/>
+                <w:sz w:val="20"/>
+                <w:szCs w:val="20"/>
+              </w:rPr>
+              <w:t xml:space="preserve"> </w:t>
+            </w:r>
+            <w:r>
+              <w:rPr/>
+              <w:t>Agustín Borgo</w:t>
             </w:r>
           </w:p>
         </w:tc>
@@ -6286,21 +6593,22 @@
           <w:tcPr>
             <w:tcW w:w="3633" w:type="dxa"/>
             <w:gridSpan w:val="2"/>
-          </w:tcPr>
-          <w:p>
-            <w:pPr>
-              <w:pStyle w:val="Ttulo1"/>
+            <w:tcMar/>
+          </w:tcPr>
+          <w:p>
+            <w:pPr>
+              <w:pStyle w:val="Normal"/>
               <w:rPr>
                 <w:rFonts w:cs="Tahoma"/>
-                <w:bCs/>
-                <w:sz w:val="20"/>
-                <w:szCs w:val="20"/>
-              </w:rPr>
-            </w:pPr>
-            <w:r>
-              <w:rPr>
-                <w:rFonts w:cs="Tahoma"/>
-                <w:bCs/>
+                <w:sz w:val="20"/>
+                <w:szCs w:val="20"/>
+              </w:rPr>
+            </w:pPr>
+            <w:r>
+              <w:rPr>
+                <w:rFonts w:ascii="Tahoma" w:hAnsi="Tahoma" w:eastAsia="Tahoma" w:cs="Tahoma"/>
+                <w:b w:val="1"/>
+                <w:bCs w:val="1"/>
                 <w:sz w:val="20"/>
                 <w:szCs w:val="20"/>
               </w:rPr>
@@ -6308,60 +6616,76 @@
             </w:r>
             <w:r>
               <w:rPr>
-                <w:rFonts w:cs="Tahoma"/>
-                <w:b/>
-                <w:sz w:val="20"/>
-                <w:szCs w:val="20"/>
-              </w:rPr>
-              <w:t>: 6/10/2026</w:t>
+                <w:rFonts w:ascii="Tahoma" w:hAnsi="Tahoma" w:eastAsia="Tahoma" w:cs="Tahoma"/>
+                <w:b w:val="1"/>
+                <w:bCs w:val="1"/>
+                <w:sz w:val="20"/>
+                <w:szCs w:val="20"/>
+              </w:rPr>
+              <w:t xml:space="preserve">: </w:t>
+            </w:r>
+            <w:r>
+              <w:rPr/>
+              <w:t>6/10/2026</w:t>
             </w:r>
           </w:p>
         </w:tc>
       </w:tr>
     </w:tbl>
-    <w:p/>
     <w:p>
       <w:pPr>
         <w:pStyle w:val="Ttulo2"/>
-        <w:rPr>
-          <w:b/>
-          <w:bCs/>
-          <w:u w:val="single"/>
-        </w:rPr>
-      </w:pPr>
-      <w:r>
-        <w:rPr>
-          <w:b/>
-          <w:bCs/>
-          <w:u w:val="single"/>
-        </w:rPr>
-        <w:lastRenderedPageBreak/>
+      </w:pPr>
+    </w:p>
+    <w:p>
+      <w:pPr/>
+      <w:r>
+        <w:br w:type="page"/>
+      </w:r>
+    </w:p>
+    <w:p>
+      <w:pPr>
+        <w:pStyle w:val="Ttulo2"/>
+        <w:rPr>
+          <w:b w:val="1"/>
+          <w:bCs w:val="1"/>
+          <w:u w:val="none"/>
+        </w:rPr>
+      </w:pPr>
+      <w:bookmarkStart w:name="_Toc120165810" w:id="1768569584"/>
+      <w:r>
+        <w:rPr>
+          <w:b w:val="1"/>
+          <w:bCs w:val="1"/>
+          <w:u w:val="none"/>
+        </w:rPr>
         <w:t>Prototipo de Modific</w:t>
       </w:r>
       <w:r>
         <w:rPr>
-          <w:b/>
-          <w:bCs/>
-          <w:u w:val="single"/>
+          <w:b w:val="1"/>
+          <w:bCs w:val="1"/>
+          <w:u w:val="none"/>
         </w:rPr>
         <w:t xml:space="preserve">ar </w:t>
       </w:r>
       <w:r>
         <w:rPr>
-          <w:b/>
-          <w:bCs/>
-          <w:u w:val="single"/>
+          <w:b w:val="1"/>
+          <w:bCs w:val="1"/>
+          <w:u w:val="none"/>
         </w:rPr>
         <w:t>retiro</w:t>
       </w:r>
       <w:r>
         <w:rPr>
-          <w:b/>
-          <w:bCs/>
-          <w:u w:val="single"/>
+          <w:b w:val="1"/>
+          <w:bCs w:val="1"/>
+          <w:u w:val="none"/>
         </w:rPr>
         <w:t xml:space="preserve"> agendado</w:t>
       </w:r>
+      <w:bookmarkEnd w:id="1768569584"/>
     </w:p>
     <w:p>
       <w:pPr>
@@ -6496,26 +6820,27 @@
     </w:p>
     <w:p>
       <w:pPr>
-        <w:pStyle w:val="Ttulo2"/>
-        <w:rPr>
-          <w:b/>
-          <w:bCs/>
+        <w:pStyle w:val="Ttulo1"/>
+        <w:rPr>
+          <w:b w:val="1"/>
+          <w:bCs w:val="1"/>
+          <w:sz w:val="40"/>
+          <w:szCs w:val="40"/>
           <w:u w:val="single"/>
           <w:lang w:val="es-AR"/>
         </w:rPr>
       </w:pPr>
-      <w:bookmarkStart w:id="3" w:name="_Toc242293374"/>
-      <w:r>
-        <w:rPr>
-          <w:b/>
-          <w:bCs/>
+      <w:bookmarkStart w:name="_Toc447222063" w:id="703218160"/>
+      <w:r>
+        <w:rPr>
+          <w:b w:val="1"/>
+          <w:bCs w:val="1"/>
           <w:u w:val="single"/>
           <w:lang w:val="es-AR"/>
         </w:rPr>
-        <w:lastRenderedPageBreak/>
         <w:t>Diagrama de transición de estados</w:t>
       </w:r>
-      <w:bookmarkEnd w:id="3"/>
+      <w:bookmarkEnd w:id="703218160"/>
     </w:p>
     <w:p>
       <w:pPr>
@@ -6594,39 +6919,39 @@
     <w:p/>
     <w:p>
       <w:pPr>
-        <w:pStyle w:val="Ttulo2"/>
-        <w:rPr>
-          <w:b/>
-          <w:bCs/>
+        <w:pStyle w:val="Ttulo1"/>
+        <w:rPr>
+          <w:b w:val="1"/>
+          <w:bCs w:val="1"/>
           <w:u w:val="single"/>
         </w:rPr>
       </w:pPr>
-      <w:r>
-        <w:rPr>
-          <w:b/>
-          <w:bCs/>
+      <w:bookmarkStart w:name="_Toc72469304" w:id="1893364355"/>
+      <w:r>
+        <w:rPr>
+          <w:b w:val="1"/>
+          <w:bCs w:val="1"/>
           <w:u w:val="single"/>
         </w:rPr>
-        <w:lastRenderedPageBreak/>
         <w:t>Git log de la</w:t>
       </w:r>
       <w:r>
         <w:rPr>
-          <w:b/>
-          <w:bCs/>
+          <w:b w:val="1"/>
+          <w:bCs w:val="1"/>
           <w:u w:val="single"/>
         </w:rPr>
         <w:t xml:space="preserve"> tercera</w:t>
       </w:r>
       <w:r>
         <w:rPr>
-          <w:b/>
-          <w:bCs/>
+          <w:b w:val="1"/>
+          <w:bCs w:val="1"/>
           <w:u w:val="single"/>
         </w:rPr>
         <w:t xml:space="preserve"> entrega</w:t>
       </w:r>
-      <w:bookmarkEnd w:id="2"/>
+      <w:bookmarkEnd w:id="1893364355"/>
     </w:p>
     <w:p>
       <w:r>
@@ -6677,7 +7002,6 @@
           <w:noProof/>
           <w:lang w:val="en-US" w:eastAsia="en-US"/>
         </w:rPr>
-        <w:lastRenderedPageBreak/>
         <w:drawing>
           <wp:inline distT="0" distB="0" distL="0" distR="0" wp14:anchorId="1CCFE1C3" wp14:editId="3CADEE00">
             <wp:extent cx="5362575" cy="4757755"/>
@@ -6722,7 +7046,7 @@
       <w:footerReference w:type="default" r:id="rId31"/>
       <w:headerReference w:type="first" r:id="rId32"/>
       <w:footerReference w:type="first" r:id="rId33"/>
-      <w:pgSz w:w="11906" w:h="16838"/>
+      <w:pgSz w:w="11906" w:h="16838" w:orient="portrait"/>
       <w:pgMar w:top="1440" w:right="1440" w:bottom="1440" w:left="1440" w:header="720" w:footer="720" w:gutter="0"/>
       <w:pgNumType w:start="0"/>
       <w:cols w:space="720"/>
@@ -6770,7 +7094,7 @@
 </file>
 
 <file path=word/footer2.xml><?xml version="1.0" encoding="utf-8"?>
-<w:ftr xmlns:wpc="http://schemas.microsoft.com/office/word/2010/wordprocessingCanvas" xmlns:cx="http://schemas.microsoft.com/office/drawing/2014/chartex" xmlns:cx1="http://schemas.microsoft.com/office/drawing/2015/9/8/chartex" xmlns:cx2="http://schemas.microsoft.com/office/drawing/2015/10/21/chartex" xmlns:cx3="http://schemas.microsoft.com/office/drawing/2016/5/9/chartex" xmlns:cx4="http://schemas.microsoft.com/office/drawing/2016/5/10/chartex" xmlns:cx5="http://schemas.microsoft.com/office/drawing/2016/5/11/chartex" xmlns:cx6="http://schemas.microsoft.com/office/drawing/2016/5/12/chartex" xmlns:cx7="http://schemas.microsoft.com/office/drawing/2016/5/13/chartex" xmlns:cx8="http://schemas.microsoft.com/office/drawing/2016/5/14/chartex" xmlns:mc="http://schemas.openxmlformats.org/markup-compatibility/2006" xmlns:aink="http://schemas.microsoft.com/office/drawing/2016/ink" xmlns:am3d="http://schemas.microsoft.com/office/drawing/2017/model3d" xmlns:o="urn:schemas-microsoft-com:office:office" xmlns:oel="http://schemas.microsoft.com/office/2019/extlst" xmlns:r="http://schemas.openxmlformats.org/officeDocument/2006/relationships" xmlns:m="http://schemas.openxmlformats.org/officeDocument/2006/math" xmlns:v="urn:schemas-microsoft-com:vml" xmlns:wp14="http://schemas.microsoft.com/office/word/2010/wordprocessingDrawing" xmlns:wp="http://schemas.openxmlformats.org/drawingml/2006/wordprocessingDrawing" xmlns:w10="urn:schemas-microsoft-com:office:word" xmlns:w="http://schemas.openxmlformats.org/wordprocessingml/2006/main" xmlns:w14="http://schemas.microsoft.com/office/word/2010/wordml" xmlns:w15="http://schemas.microsoft.com/office/word/2012/wordml" xmlns:w16cex="http://schemas.microsoft.com/office/word/2018/wordml/cex" xmlns:w16cid="http://schemas.microsoft.com/office/word/2016/wordml/cid" xmlns:w16="http://schemas.microsoft.com/office/word/2018/wordml" xmlns:w16sdtdh="http://schemas.microsoft.com/office/word/2020/wordml/sdtdatahash" xmlns:w16se="http://schemas.microsoft.com/office/word/2015/wordml/symex" xmlns:wpg="http://schemas.microsoft.com/office/word/2010/wordprocessingGroup" xmlns:wpi="http://schemas.microsoft.com/office/word/2010/wordprocessingInk" xmlns:wne="http://schemas.microsoft.com/office/word/2006/wordml" xmlns:wps="http://schemas.microsoft.com/office/word/2010/wordprocessingShape" mc:Ignorable="w14 w15 w16se w16cid w16 w16cex w16sdtdh wp14">
+<w:ftr xmlns:wpc="http://schemas.microsoft.com/office/word/2010/wordprocessingCanvas" xmlns:cx="http://schemas.microsoft.com/office/drawing/2014/chartex" xmlns:cx1="http://schemas.microsoft.com/office/drawing/2015/9/8/chartex" xmlns:cx2="http://schemas.microsoft.com/office/drawing/2015/10/21/chartex" xmlns:cx3="http://schemas.microsoft.com/office/drawing/2016/5/9/chartex" xmlns:cx4="http://schemas.microsoft.com/office/drawing/2016/5/10/chartex" xmlns:cx5="http://schemas.microsoft.com/office/drawing/2016/5/11/chartex" xmlns:cx6="http://schemas.microsoft.com/office/drawing/2016/5/12/chartex" xmlns:cx7="http://schemas.microsoft.com/office/drawing/2016/5/13/chartex" xmlns:cx8="http://schemas.microsoft.com/office/drawing/2016/5/14/chartex" xmlns:mc="http://schemas.openxmlformats.org/markup-compatibility/2006" xmlns:aink="http://schemas.microsoft.com/office/drawing/2016/ink" xmlns:am3d="http://schemas.microsoft.com/office/drawing/2017/model3d" xmlns:o="urn:schemas-microsoft-com:office:office" xmlns:oel="http://schemas.microsoft.com/office/2019/extlst" xmlns:r="http://schemas.openxmlformats.org/officeDocument/2006/relationships" xmlns:m="http://schemas.openxmlformats.org/officeDocument/2006/math" xmlns:v="urn:schemas-microsoft-com:vml" xmlns:wp14="http://schemas.microsoft.com/office/word/2010/wordprocessingDrawing" xmlns:wp="http://schemas.openxmlformats.org/drawingml/2006/wordprocessingDrawing" xmlns:w10="urn:schemas-microsoft-com:office:word" xmlns:w="http://schemas.openxmlformats.org/wordprocessingml/2006/main" xmlns:w14="http://schemas.microsoft.com/office/word/2010/wordml" xmlns:w15="http://schemas.microsoft.com/office/word/2012/wordml" xmlns:w16cex="http://schemas.microsoft.com/office/word/2018/wordml/cex" xmlns:w16cid="http://schemas.microsoft.com/office/word/2016/wordml/cid" xmlns:w16="http://schemas.microsoft.com/office/word/2018/wordml" xmlns:w16sdtdh="http://schemas.microsoft.com/office/word/2020/wordml/sdtdatahash" xmlns:w16se="http://schemas.microsoft.com/office/word/2015/wordml/symex" xmlns:wpg="http://schemas.microsoft.com/office/word/2010/wordprocessingGroup" xmlns:wpi="http://schemas.microsoft.com/office/word/2010/wordprocessingInk" xmlns:wne="http://schemas.microsoft.com/office/word/2006/wordml" xmlns:wps="http://schemas.microsoft.com/office/word/2010/wordprocessingShape" xmlns:a="http://schemas.openxmlformats.org/drawingml/2006/main" mc:Ignorable="w14 w15 w16se w16cid w16 w16cex w16sdtdh wp14">
   <w:p>
     <w:r>
       <w:rPr>
@@ -6847,19 +7171,19 @@
           </w:drawing>
         </mc:Choice>
         <mc:Fallback>
-          <w:pict>
-            <v:shapetype w14:anchorId="78A880AB" id="_x0000_t15" coordsize="21600,21600" o:spt="15" adj="16200" path="m@0,l,,,21600@0,21600,21600,10800xe">
+          <w:pict w14:anchorId="20D4A900">
+            <v:shapetype id="_x0000_t15" coordsize="21600,21600" o:spt="15" adj="16200" path="m@0,l,,,21600@0,21600,21600,10800xe" w14:anchorId="78A880AB">
               <v:stroke joinstyle="miter"/>
               <v:formulas>
                 <v:f eqn="val #0"/>
                 <v:f eqn="prod #0 1 2"/>
               </v:formulas>
-              <v:path gradientshapeok="t" o:connecttype="custom" o:connectlocs="@1,0;0,10800;@1,21600;21600,10800" o:connectangles="270,180,90,0" textboxrect="0,0,10800,21600;0,0,16200,21600;0,0,21600,21600"/>
+              <v:path textboxrect="0,0,10800,21600;0,0,16200,21600;0,0,21600,21600" gradientshapeok="t" o:connecttype="custom" o:connectlocs="@1,0;0,10800;@1,21600;21600,10800" o:connectangles="270,180,90,0"/>
               <v:handles>
                 <v:h position="#0,topLeft" xrange="0,21600"/>
               </v:handles>
             </v:shapetype>
-            <v:shape id="Flecha: pentágono 3" o:spid="_x0000_s1027" type="#_x0000_t15" style="position:absolute;margin-left:410.9pt;margin-top:7.5pt;width:110.65pt;height:26.25pt;rotation:180;z-index:-503316460;visibility:visible;mso-wrap-style:square;mso-wrap-distance-left:0;mso-wrap-distance-top:0;mso-wrap-distance-right:0;mso-wrap-distance-bottom:0;mso-position-horizontal:absolute;mso-position-horizontal-relative:text;mso-position-vertical:absolute;mso-position-vertical-relative:text;v-text-anchor:middle" o:gfxdata="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" adj="19038" fillcolor="#45818e" stroked="f" strokeweight="0">
+            <v:shape id="Flecha: pentágono 3" style="position:absolute;margin-left:410.9pt;margin-top:7.5pt;width:110.65pt;height:26.25pt;rotation:180;z-index:-503316460;visibility:visible;mso-wrap-style:square;mso-wrap-distance-left:0;mso-wrap-distance-top:0;mso-wrap-distance-right:0;mso-wrap-distance-bottom:0;mso-position-horizontal:absolute;mso-position-horizontal-relative:text;mso-position-vertical:absolute;mso-position-vertical-relative:text;v-text-anchor:middle" o:spid="_x0000_s1027" fillcolor="#45818e" stroked="f" strokeweight="0" type="#_x0000_t15" adj="19038" o:gfxdata="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">
               <v:textbox inset=",7.2pt,,7.2pt">
                 <w:txbxContent>
                   <w:p>
@@ -6997,8 +7321,8 @@
           </w:drawing>
         </mc:Choice>
         <mc:Fallback>
-          <w:pict>
-            <v:rect w14:anchorId="55970E85" id="Cuadro de texto 1" o:spid="_x0000_s1028" style="position:absolute;margin-left:59.35pt;margin-top:5.05pt;width:305.65pt;height:54.15pt;z-index:-503316445;visibility:visible;mso-wrap-style:square;mso-wrap-distance-left:0;mso-wrap-distance-top:0;mso-wrap-distance-right:0;mso-wrap-distance-bottom:0;mso-position-horizontal:absolute;mso-position-horizontal-relative:margin;mso-position-vertical:absolute;mso-position-vertical-relative:text;v-text-anchor:top" o:gfxdata="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" o:allowincell="f" filled="f" stroked="f" strokeweight="0">
+          <w:pict w14:anchorId="080FB80A">
+            <v:rect id="Cuadro de texto 1" style="position:absolute;margin-left:59.35pt;margin-top:5.05pt;width:305.65pt;height:54.15pt;z-index:-503316445;visibility:visible;mso-wrap-style:square;mso-wrap-distance-left:0;mso-wrap-distance-top:0;mso-wrap-distance-right:0;mso-wrap-distance-bottom:0;mso-position-horizontal:absolute;mso-position-horizontal-relative:margin;mso-position-vertical:absolute;mso-position-vertical-relative:text;v-text-anchor:top" o:spid="_x0000_s1028" o:allowincell="f" filled="f" stroked="f" strokeweight="0" w14:anchorId="55970E85" o:gfxdata="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">
               <v:textbox inset=",7.2pt,,7.2pt">
                 <w:txbxContent>
                   <w:p>
@@ -7148,7 +7472,7 @@
 </file>
 
 <file path=word/header2.xml><?xml version="1.0" encoding="utf-8"?>
-<w:hdr xmlns:wpc="http://schemas.microsoft.com/office/word/2010/wordprocessingCanvas" xmlns:cx="http://schemas.microsoft.com/office/drawing/2014/chartex" xmlns:cx1="http://schemas.microsoft.com/office/drawing/2015/9/8/chartex" xmlns:cx2="http://schemas.microsoft.com/office/drawing/2015/10/21/chartex" xmlns:cx3="http://schemas.microsoft.com/office/drawing/2016/5/9/chartex" xmlns:cx4="http://schemas.microsoft.com/office/drawing/2016/5/10/chartex" xmlns:cx5="http://schemas.microsoft.com/office/drawing/2016/5/11/chartex" xmlns:cx6="http://schemas.microsoft.com/office/drawing/2016/5/12/chartex" xmlns:cx7="http://schemas.microsoft.com/office/drawing/2016/5/13/chartex" xmlns:cx8="http://schemas.microsoft.com/office/drawing/2016/5/14/chartex" xmlns:mc="http://schemas.openxmlformats.org/markup-compatibility/2006" xmlns:aink="http://schemas.microsoft.com/office/drawing/2016/ink" xmlns:am3d="http://schemas.microsoft.com/office/drawing/2017/model3d" xmlns:o="urn:schemas-microsoft-com:office:office" xmlns:oel="http://schemas.microsoft.com/office/2019/extlst" xmlns:r="http://schemas.openxmlformats.org/officeDocument/2006/relationships" xmlns:m="http://schemas.openxmlformats.org/officeDocument/2006/math" xmlns:v="urn:schemas-microsoft-com:vml" xmlns:wp14="http://schemas.microsoft.com/office/word/2010/wordprocessingDrawing" xmlns:wp="http://schemas.openxmlformats.org/drawingml/2006/wordprocessingDrawing" xmlns:w10="urn:schemas-microsoft-com:office:word" xmlns:w="http://schemas.openxmlformats.org/wordprocessingml/2006/main" xmlns:w14="http://schemas.microsoft.com/office/word/2010/wordml" xmlns:w15="http://schemas.microsoft.com/office/word/2012/wordml" xmlns:w16cex="http://schemas.microsoft.com/office/word/2018/wordml/cex" xmlns:w16cid="http://schemas.microsoft.com/office/word/2016/wordml/cid" xmlns:w16="http://schemas.microsoft.com/office/word/2018/wordml" xmlns:w16sdtdh="http://schemas.microsoft.com/office/word/2020/wordml/sdtdatahash" xmlns:w16se="http://schemas.microsoft.com/office/word/2015/wordml/symex" xmlns:wpg="http://schemas.microsoft.com/office/word/2010/wordprocessingGroup" xmlns:wpi="http://schemas.microsoft.com/office/word/2010/wordprocessingInk" xmlns:wne="http://schemas.microsoft.com/office/word/2006/wordml" xmlns:wps="http://schemas.microsoft.com/office/word/2010/wordprocessingShape" mc:Ignorable="w14 w15 w16se w16cid w16 w16cex w16sdtdh wp14">
+<w:hdr xmlns:wpc="http://schemas.microsoft.com/office/word/2010/wordprocessingCanvas" xmlns:cx="http://schemas.microsoft.com/office/drawing/2014/chartex" xmlns:cx1="http://schemas.microsoft.com/office/drawing/2015/9/8/chartex" xmlns:cx2="http://schemas.microsoft.com/office/drawing/2015/10/21/chartex" xmlns:cx3="http://schemas.microsoft.com/office/drawing/2016/5/9/chartex" xmlns:cx4="http://schemas.microsoft.com/office/drawing/2016/5/10/chartex" xmlns:cx5="http://schemas.microsoft.com/office/drawing/2016/5/11/chartex" xmlns:cx6="http://schemas.microsoft.com/office/drawing/2016/5/12/chartex" xmlns:cx7="http://schemas.microsoft.com/office/drawing/2016/5/13/chartex" xmlns:cx8="http://schemas.microsoft.com/office/drawing/2016/5/14/chartex" xmlns:mc="http://schemas.openxmlformats.org/markup-compatibility/2006" xmlns:aink="http://schemas.microsoft.com/office/drawing/2016/ink" xmlns:am3d="http://schemas.microsoft.com/office/drawing/2017/model3d" xmlns:o="urn:schemas-microsoft-com:office:office" xmlns:oel="http://schemas.microsoft.com/office/2019/extlst" xmlns:r="http://schemas.openxmlformats.org/officeDocument/2006/relationships" xmlns:m="http://schemas.openxmlformats.org/officeDocument/2006/math" xmlns:v="urn:schemas-microsoft-com:vml" xmlns:wp14="http://schemas.microsoft.com/office/word/2010/wordprocessingDrawing" xmlns:wp="http://schemas.openxmlformats.org/drawingml/2006/wordprocessingDrawing" xmlns:w10="urn:schemas-microsoft-com:office:word" xmlns:w="http://schemas.openxmlformats.org/wordprocessingml/2006/main" xmlns:w14="http://schemas.microsoft.com/office/word/2010/wordml" xmlns:w15="http://schemas.microsoft.com/office/word/2012/wordml" xmlns:w16cex="http://schemas.microsoft.com/office/word/2018/wordml/cex" xmlns:w16cid="http://schemas.microsoft.com/office/word/2016/wordml/cid" xmlns:w16="http://schemas.microsoft.com/office/word/2018/wordml" xmlns:w16sdtdh="http://schemas.microsoft.com/office/word/2020/wordml/sdtdatahash" xmlns:w16se="http://schemas.microsoft.com/office/word/2015/wordml/symex" xmlns:wpg="http://schemas.microsoft.com/office/word/2010/wordprocessingGroup" xmlns:wpi="http://schemas.microsoft.com/office/word/2010/wordprocessingInk" xmlns:wne="http://schemas.microsoft.com/office/word/2006/wordml" xmlns:wps="http://schemas.microsoft.com/office/word/2010/wordprocessingShape" xmlns:a="http://schemas.openxmlformats.org/drawingml/2006/main" xmlns:pic="http://schemas.openxmlformats.org/drawingml/2006/picture" mc:Ignorable="w14 w15 w16se w16cid w16 w16cex w16sdtdh wp14">
   <w:p>
     <w:r>
       <w:rPr>
@@ -7208,7 +7532,7 @@
                           </w:pPr>
                           <w:r>
                             <w:rPr>
-                              <w:rFonts w:ascii="Roboto" w:eastAsia="Roboto" w:hAnsi="Roboto" w:cs="Roboto"/>
+                              <w:rFonts w:ascii="Roboto" w:hAnsi="Roboto" w:eastAsia="Roboto" w:cs="Roboto"/>
                               <w:b/>
                               <w:color w:val="666666"/>
                             </w:rPr>
@@ -7222,7 +7546,7 @@
                           </w:pPr>
                           <w:r>
                             <w:rPr>
-                              <w:rFonts w:ascii="Roboto" w:eastAsia="Roboto" w:hAnsi="Roboto" w:cs="Roboto"/>
+                              <w:rFonts w:ascii="Roboto" w:hAnsi="Roboto" w:eastAsia="Roboto" w:cs="Roboto"/>
                               <w:color w:val="666666"/>
                             </w:rPr>
                             <w:t>Análisis de Sistemas de Información</w:t>
@@ -7240,8 +7564,8 @@
           </w:drawing>
         </mc:Choice>
         <mc:Fallback>
-          <w:pict>
-            <v:rect w14:anchorId="6704EB9D" id="Cuadro de texto 2" o:spid="_x0000_s1026" style="position:absolute;margin-left:-54pt;margin-top:-23.25pt;width:258pt;height:40.5pt;z-index:-503316470;visibility:visible;mso-wrap-style:square;mso-wrap-distance-left:0;mso-wrap-distance-top:0;mso-wrap-distance-right:0;mso-wrap-distance-bottom:0;mso-position-horizontal:absolute;mso-position-horizontal-relative:text;mso-position-vertical:absolute;mso-position-vertical-relative:text;v-text-anchor:top" o:gfxdata="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" filled="f" stroked="f" strokeweight="0">
+          <w:pict w14:anchorId="08A8B822">
+            <v:rect id="Cuadro de texto 2" style="position:absolute;margin-left:-54pt;margin-top:-23.25pt;width:258pt;height:40.5pt;z-index:-503316470;visibility:visible;mso-wrap-style:square;mso-wrap-distance-left:0;mso-wrap-distance-top:0;mso-wrap-distance-right:0;mso-wrap-distance-bottom:0;mso-position-horizontal:absolute;mso-position-horizontal-relative:text;mso-position-vertical:absolute;mso-position-vertical-relative:text;v-text-anchor:top" o:spid="_x0000_s1026" filled="f" stroked="f" strokeweight="0" w14:anchorId="6704EB9D" o:gfxdata="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">
               <v:textbox inset=",7.2pt,,7.2pt">
                 <w:txbxContent>
                   <w:p>
@@ -7250,7 +7574,7 @@
                     </w:pPr>
                     <w:r>
                       <w:rPr>
-                        <w:rFonts w:ascii="Roboto" w:eastAsia="Roboto" w:hAnsi="Roboto" w:cs="Roboto"/>
+                        <w:rFonts w:ascii="Roboto" w:hAnsi="Roboto" w:eastAsia="Roboto" w:cs="Roboto"/>
                         <w:b/>
                         <w:color w:val="666666"/>
                       </w:rPr>
@@ -7264,7 +7588,7 @@
                     </w:pPr>
                     <w:r>
                       <w:rPr>
-                        <w:rFonts w:ascii="Roboto" w:eastAsia="Roboto" w:hAnsi="Roboto" w:cs="Roboto"/>
+                        <w:rFonts w:ascii="Roboto" w:hAnsi="Roboto" w:eastAsia="Roboto" w:cs="Roboto"/>
                         <w:color w:val="666666"/>
                       </w:rPr>
                       <w:t>Análisis de Sistemas de Información</w:t>
@@ -7447,7 +7771,7 @@
         <w:ind w:left="720" w:hanging="360"/>
       </w:pPr>
       <w:rPr>
-        <w:rFonts w:ascii="Symbol" w:hAnsi="Symbol" w:hint="default"/>
+        <w:rFonts w:hint="default" w:ascii="Symbol" w:hAnsi="Symbol"/>
       </w:rPr>
     </w:lvl>
     <w:lvl w:ilvl="1" w:tplc="04090003" w:tentative="1">
@@ -7459,7 +7783,7 @@
         <w:ind w:left="1440" w:hanging="360"/>
       </w:pPr>
       <w:rPr>
-        <w:rFonts w:ascii="Courier New" w:hAnsi="Courier New" w:cs="Courier New" w:hint="default"/>
+        <w:rFonts w:hint="default" w:ascii="Courier New" w:hAnsi="Courier New" w:cs="Courier New"/>
       </w:rPr>
     </w:lvl>
     <w:lvl w:ilvl="2" w:tplc="04090005" w:tentative="1">
@@ -7471,7 +7795,7 @@
         <w:ind w:left="2160" w:hanging="360"/>
       </w:pPr>
       <w:rPr>
-        <w:rFonts w:ascii="Wingdings" w:hAnsi="Wingdings" w:hint="default"/>
+        <w:rFonts w:hint="default" w:ascii="Wingdings" w:hAnsi="Wingdings"/>
       </w:rPr>
     </w:lvl>
     <w:lvl w:ilvl="3" w:tplc="04090001" w:tentative="1">
@@ -7483,7 +7807,7 @@
         <w:ind w:left="2880" w:hanging="360"/>
       </w:pPr>
       <w:rPr>
-        <w:rFonts w:ascii="Symbol" w:hAnsi="Symbol" w:hint="default"/>
+        <w:rFonts w:hint="default" w:ascii="Symbol" w:hAnsi="Symbol"/>
       </w:rPr>
     </w:lvl>
     <w:lvl w:ilvl="4" w:tplc="04090003" w:tentative="1">
@@ -7495,7 +7819,7 @@
         <w:ind w:left="3600" w:hanging="360"/>
       </w:pPr>
       <w:rPr>
-        <w:rFonts w:ascii="Courier New" w:hAnsi="Courier New" w:cs="Courier New" w:hint="default"/>
+        <w:rFonts w:hint="default" w:ascii="Courier New" w:hAnsi="Courier New" w:cs="Courier New"/>
       </w:rPr>
     </w:lvl>
     <w:lvl w:ilvl="5" w:tplc="04090005" w:tentative="1">
@@ -7507,7 +7831,7 @@
         <w:ind w:left="4320" w:hanging="360"/>
       </w:pPr>
       <w:rPr>
-        <w:rFonts w:ascii="Wingdings" w:hAnsi="Wingdings" w:hint="default"/>
+        <w:rFonts w:hint="default" w:ascii="Wingdings" w:hAnsi="Wingdings"/>
       </w:rPr>
     </w:lvl>
     <w:lvl w:ilvl="6" w:tplc="04090001" w:tentative="1">
@@ -7519,7 +7843,7 @@
         <w:ind w:left="5040" w:hanging="360"/>
       </w:pPr>
       <w:rPr>
-        <w:rFonts w:ascii="Symbol" w:hAnsi="Symbol" w:hint="default"/>
+        <w:rFonts w:hint="default" w:ascii="Symbol" w:hAnsi="Symbol"/>
       </w:rPr>
     </w:lvl>
     <w:lvl w:ilvl="7" w:tplc="04090003" w:tentative="1">
@@ -7531,7 +7855,7 @@
         <w:ind w:left="5760" w:hanging="360"/>
       </w:pPr>
       <w:rPr>
-        <w:rFonts w:ascii="Courier New" w:hAnsi="Courier New" w:cs="Courier New" w:hint="default"/>
+        <w:rFonts w:hint="default" w:ascii="Courier New" w:hAnsi="Courier New" w:cs="Courier New"/>
       </w:rPr>
     </w:lvl>
     <w:lvl w:ilvl="8" w:tplc="04090005" w:tentative="1">
@@ -7543,7 +7867,7 @@
         <w:ind w:left="6480" w:hanging="360"/>
       </w:pPr>
       <w:rPr>
-        <w:rFonts w:ascii="Wingdings" w:hAnsi="Wingdings" w:hint="default"/>
+        <w:rFonts w:hint="default" w:ascii="Wingdings" w:hAnsi="Wingdings"/>
       </w:rPr>
     </w:lvl>
   </w:abstractNum>
@@ -7685,7 +8009,7 @@
         <w:ind w:left="720" w:hanging="360"/>
       </w:pPr>
       <w:rPr>
-        <w:rFonts w:ascii="Symbol" w:hAnsi="Symbol" w:cs="Symbol" w:hint="default"/>
+        <w:rFonts w:hint="default" w:ascii="Symbol" w:hAnsi="Symbol" w:cs="Symbol"/>
       </w:rPr>
     </w:lvl>
     <w:lvl w:ilvl="1">
@@ -7700,7 +8024,7 @@
         <w:ind w:left="1440" w:hanging="360"/>
       </w:pPr>
       <w:rPr>
-        <w:rFonts w:ascii="Courier New" w:hAnsi="Courier New" w:cs="Courier New" w:hint="default"/>
+        <w:rFonts w:hint="default" w:ascii="Courier New" w:hAnsi="Courier New" w:cs="Courier New"/>
       </w:rPr>
     </w:lvl>
     <w:lvl w:ilvl="2">
@@ -7715,7 +8039,7 @@
         <w:ind w:left="2160" w:hanging="360"/>
       </w:pPr>
       <w:rPr>
-        <w:rFonts w:ascii="Wingdings" w:hAnsi="Wingdings" w:cs="Wingdings" w:hint="default"/>
+        <w:rFonts w:hint="default" w:ascii="Wingdings" w:hAnsi="Wingdings" w:cs="Wingdings"/>
       </w:rPr>
     </w:lvl>
     <w:lvl w:ilvl="3">
@@ -7730,7 +8054,7 @@
         <w:ind w:left="2880" w:hanging="360"/>
       </w:pPr>
       <w:rPr>
-        <w:rFonts w:ascii="Symbol" w:hAnsi="Symbol" w:cs="Symbol" w:hint="default"/>
+        <w:rFonts w:hint="default" w:ascii="Symbol" w:hAnsi="Symbol" w:cs="Symbol"/>
       </w:rPr>
     </w:lvl>
     <w:lvl w:ilvl="4">
@@ -7745,7 +8069,7 @@
         <w:ind w:left="3600" w:hanging="360"/>
       </w:pPr>
       <w:rPr>
-        <w:rFonts w:ascii="Courier New" w:hAnsi="Courier New" w:cs="Courier New" w:hint="default"/>
+        <w:rFonts w:hint="default" w:ascii="Courier New" w:hAnsi="Courier New" w:cs="Courier New"/>
       </w:rPr>
     </w:lvl>
     <w:lvl w:ilvl="5">
@@ -7760,7 +8084,7 @@
         <w:ind w:left="4320" w:hanging="360"/>
       </w:pPr>
       <w:rPr>
-        <w:rFonts w:ascii="Wingdings" w:hAnsi="Wingdings" w:cs="Wingdings" w:hint="default"/>
+        <w:rFonts w:hint="default" w:ascii="Wingdings" w:hAnsi="Wingdings" w:cs="Wingdings"/>
       </w:rPr>
     </w:lvl>
     <w:lvl w:ilvl="6">
@@ -7775,7 +8099,7 @@
         <w:ind w:left="5040" w:hanging="360"/>
       </w:pPr>
       <w:rPr>
-        <w:rFonts w:ascii="Symbol" w:hAnsi="Symbol" w:cs="Symbol" w:hint="default"/>
+        <w:rFonts w:hint="default" w:ascii="Symbol" w:hAnsi="Symbol" w:cs="Symbol"/>
       </w:rPr>
     </w:lvl>
     <w:lvl w:ilvl="7">
@@ -7790,7 +8114,7 @@
         <w:ind w:left="5760" w:hanging="360"/>
       </w:pPr>
       <w:rPr>
-        <w:rFonts w:ascii="Courier New" w:hAnsi="Courier New" w:cs="Courier New" w:hint="default"/>
+        <w:rFonts w:hint="default" w:ascii="Courier New" w:hAnsi="Courier New" w:cs="Courier New"/>
       </w:rPr>
     </w:lvl>
     <w:lvl w:ilvl="8">
@@ -7805,7 +8129,7 @@
         <w:ind w:left="6480" w:hanging="360"/>
       </w:pPr>
       <w:rPr>
-        <w:rFonts w:ascii="Wingdings" w:hAnsi="Wingdings" w:cs="Wingdings" w:hint="default"/>
+        <w:rFonts w:hint="default" w:ascii="Wingdings" w:hAnsi="Wingdings" w:cs="Wingdings"/>
       </w:rPr>
     </w:lvl>
   </w:abstractNum>
@@ -8003,7 +8327,7 @@
         <w:ind w:left="720" w:hanging="360"/>
       </w:pPr>
       <w:rPr>
-        <w:rFonts w:ascii="Symbol" w:hAnsi="Symbol" w:cs="Symbol" w:hint="default"/>
+        <w:rFonts w:hint="default" w:ascii="Symbol" w:hAnsi="Symbol" w:cs="Symbol"/>
       </w:rPr>
     </w:lvl>
     <w:lvl w:ilvl="1">
@@ -8018,7 +8342,7 @@
         <w:ind w:left="1440" w:hanging="360"/>
       </w:pPr>
       <w:rPr>
-        <w:rFonts w:ascii="Courier New" w:hAnsi="Courier New" w:cs="Courier New" w:hint="default"/>
+        <w:rFonts w:hint="default" w:ascii="Courier New" w:hAnsi="Courier New" w:cs="Courier New"/>
       </w:rPr>
     </w:lvl>
     <w:lvl w:ilvl="2">
@@ -8033,7 +8357,7 @@
         <w:ind w:left="2160" w:hanging="360"/>
       </w:pPr>
       <w:rPr>
-        <w:rFonts w:ascii="Wingdings" w:hAnsi="Wingdings" w:cs="Wingdings" w:hint="default"/>
+        <w:rFonts w:hint="default" w:ascii="Wingdings" w:hAnsi="Wingdings" w:cs="Wingdings"/>
       </w:rPr>
     </w:lvl>
     <w:lvl w:ilvl="3">
@@ -8048,7 +8372,7 @@
         <w:ind w:left="2880" w:hanging="360"/>
       </w:pPr>
       <w:rPr>
-        <w:rFonts w:ascii="Symbol" w:hAnsi="Symbol" w:cs="Symbol" w:hint="default"/>
+        <w:rFonts w:hint="default" w:ascii="Symbol" w:hAnsi="Symbol" w:cs="Symbol"/>
       </w:rPr>
     </w:lvl>
     <w:lvl w:ilvl="4">
@@ -8063,7 +8387,7 @@
         <w:ind w:left="3600" w:hanging="360"/>
       </w:pPr>
       <w:rPr>
-        <w:rFonts w:ascii="Courier New" w:hAnsi="Courier New" w:cs="Courier New" w:hint="default"/>
+        <w:rFonts w:hint="default" w:ascii="Courier New" w:hAnsi="Courier New" w:cs="Courier New"/>
       </w:rPr>
     </w:lvl>
     <w:lvl w:ilvl="5">
@@ -8078,7 +8402,7 @@
         <w:ind w:left="4320" w:hanging="360"/>
       </w:pPr>
       <w:rPr>
-        <w:rFonts w:ascii="Wingdings" w:hAnsi="Wingdings" w:cs="Wingdings" w:hint="default"/>
+        <w:rFonts w:hint="default" w:ascii="Wingdings" w:hAnsi="Wingdings" w:cs="Wingdings"/>
       </w:rPr>
     </w:lvl>
     <w:lvl w:ilvl="6">
@@ -8093,7 +8417,7 @@
         <w:ind w:left="5040" w:hanging="360"/>
       </w:pPr>
       <w:rPr>
-        <w:rFonts w:ascii="Symbol" w:hAnsi="Symbol" w:cs="Symbol" w:hint="default"/>
+        <w:rFonts w:hint="default" w:ascii="Symbol" w:hAnsi="Symbol" w:cs="Symbol"/>
       </w:rPr>
     </w:lvl>
     <w:lvl w:ilvl="7">
@@ -8108,7 +8432,7 @@
         <w:ind w:left="5760" w:hanging="360"/>
       </w:pPr>
       <w:rPr>
-        <w:rFonts w:ascii="Courier New" w:hAnsi="Courier New" w:cs="Courier New" w:hint="default"/>
+        <w:rFonts w:hint="default" w:ascii="Courier New" w:hAnsi="Courier New" w:cs="Courier New"/>
       </w:rPr>
     </w:lvl>
     <w:lvl w:ilvl="8">
@@ -8123,7 +8447,7 @@
         <w:ind w:left="6480" w:hanging="360"/>
       </w:pPr>
       <w:rPr>
-        <w:rFonts w:ascii="Wingdings" w:hAnsi="Wingdings" w:cs="Wingdings" w:hint="default"/>
+        <w:rFonts w:hint="default" w:ascii="Wingdings" w:hAnsi="Wingdings" w:cs="Wingdings"/>
       </w:rPr>
     </w:lvl>
   </w:abstractNum>
@@ -8152,11 +8476,11 @@
 </file>
 
 <file path=word/styles.xml><?xml version="1.0" encoding="utf-8"?>
-<w:styles xmlns:mc="http://schemas.openxmlformats.org/markup-compatibility/2006" xmlns:r="http://schemas.openxmlformats.org/officeDocument/2006/relationships" xmlns:w="http://schemas.openxmlformats.org/wordprocessingml/2006/main" xmlns:w14="http://schemas.microsoft.com/office/word/2010/wordml" xmlns:w15="http://schemas.microsoft.com/office/word/2012/wordml" xmlns:w16cex="http://schemas.microsoft.com/office/word/2018/wordml/cex" xmlns:w16cid="http://schemas.microsoft.com/office/word/2016/wordml/cid" xmlns:w16="http://schemas.microsoft.com/office/word/2018/wordml" xmlns:w16sdtdh="http://schemas.microsoft.com/office/word/2020/wordml/sdtdatahash" xmlns:w16se="http://schemas.microsoft.com/office/word/2015/wordml/symex" mc:Ignorable="w14 w15 w16se w16cid w16 w16cex w16sdtdh">
+<w:styles xmlns:wp14="http://schemas.microsoft.com/office/word/2010/wordprocessingDrawing" xmlns:mc="http://schemas.openxmlformats.org/markup-compatibility/2006" xmlns:r="http://schemas.openxmlformats.org/officeDocument/2006/relationships" xmlns:w="http://schemas.openxmlformats.org/wordprocessingml/2006/main" xmlns:w14="http://schemas.microsoft.com/office/word/2010/wordml" xmlns:w15="http://schemas.microsoft.com/office/word/2012/wordml" xmlns:w16cex="http://schemas.microsoft.com/office/word/2018/wordml/cex" xmlns:w16cid="http://schemas.microsoft.com/office/word/2016/wordml/cid" xmlns:w16="http://schemas.microsoft.com/office/word/2018/wordml" xmlns:w16sdtdh="http://schemas.microsoft.com/office/word/2020/wordml/sdtdatahash" xmlns:w16se="http://schemas.microsoft.com/office/word/2015/wordml/symex" mc:Ignorable="w14 w15 w16se w16cid w16 w16cex w16sdtdh wp14">
   <w:docDefaults>
     <w:rPrDefault>
       <w:rPr>
-        <w:rFonts w:ascii="Arial" w:eastAsia="Arial" w:hAnsi="Arial" w:cs="Arial"/>
+        <w:rFonts w:ascii="Arial" w:hAnsi="Arial" w:eastAsia="Arial" w:cs="Arial"/>
         <w:sz w:val="22"/>
         <w:szCs w:val="22"/>
         <w:lang w:val="es-ES" w:eastAsia="es-AR" w:bidi="ar-SA"/>
@@ -8171,14 +8495,14 @@
   <w:latentStyles w:defLockedState="0" w:defUIPriority="99" w:defSemiHidden="0" w:defUnhideWhenUsed="0" w:defQFormat="0" w:count="376">
     <w:lsdException w:name="Normal" w:uiPriority="0" w:qFormat="1"/>
     <w:lsdException w:name="heading 1" w:uiPriority="9" w:qFormat="1"/>
-    <w:lsdException w:name="heading 2" w:semiHidden="1" w:uiPriority="9" w:unhideWhenUsed="1" w:qFormat="1"/>
-    <w:lsdException w:name="heading 3" w:semiHidden="1" w:uiPriority="9" w:unhideWhenUsed="1" w:qFormat="1"/>
-    <w:lsdException w:name="heading 4" w:semiHidden="1" w:uiPriority="9" w:unhideWhenUsed="1" w:qFormat="1"/>
-    <w:lsdException w:name="heading 5" w:semiHidden="1" w:uiPriority="9" w:unhideWhenUsed="1" w:qFormat="1"/>
-    <w:lsdException w:name="heading 6" w:semiHidden="1" w:uiPriority="9" w:unhideWhenUsed="1" w:qFormat="1"/>
-    <w:lsdException w:name="heading 7" w:semiHidden="1" w:uiPriority="9" w:unhideWhenUsed="1" w:qFormat="1"/>
-    <w:lsdException w:name="heading 8" w:semiHidden="1" w:uiPriority="9" w:unhideWhenUsed="1" w:qFormat="1"/>
-    <w:lsdException w:name="heading 9" w:semiHidden="1" w:uiPriority="9" w:unhideWhenUsed="1" w:qFormat="1"/>
+    <w:lsdException w:name="heading 2" w:uiPriority="9" w:semiHidden="1" w:unhideWhenUsed="1" w:qFormat="1"/>
+    <w:lsdException w:name="heading 3" w:uiPriority="9" w:semiHidden="1" w:unhideWhenUsed="1" w:qFormat="1"/>
+    <w:lsdException w:name="heading 4" w:uiPriority="9" w:semiHidden="1" w:unhideWhenUsed="1" w:qFormat="1"/>
+    <w:lsdException w:name="heading 5" w:uiPriority="9" w:semiHidden="1" w:unhideWhenUsed="1" w:qFormat="1"/>
+    <w:lsdException w:name="heading 6" w:uiPriority="9" w:semiHidden="1" w:unhideWhenUsed="1" w:qFormat="1"/>
+    <w:lsdException w:name="heading 7" w:uiPriority="9" w:semiHidden="1" w:unhideWhenUsed="1" w:qFormat="1"/>
+    <w:lsdException w:name="heading 8" w:uiPriority="9" w:semiHidden="1" w:unhideWhenUsed="1" w:qFormat="1"/>
+    <w:lsdException w:name="heading 9" w:uiPriority="9" w:semiHidden="1" w:unhideWhenUsed="1" w:qFormat="1"/>
     <w:lsdException w:name="index 1" w:semiHidden="1" w:unhideWhenUsed="1"/>
     <w:lsdException w:name="index 2" w:semiHidden="1" w:unhideWhenUsed="1"/>
     <w:lsdException w:name="index 3" w:semiHidden="1" w:unhideWhenUsed="1"/>
@@ -8188,22 +8512,22 @@
     <w:lsdException w:name="index 7" w:semiHidden="1" w:unhideWhenUsed="1"/>
     <w:lsdException w:name="index 8" w:semiHidden="1" w:unhideWhenUsed="1"/>
     <w:lsdException w:name="index 9" w:semiHidden="1" w:unhideWhenUsed="1"/>
-    <w:lsdException w:name="toc 1" w:semiHidden="1" w:uiPriority="39" w:unhideWhenUsed="1"/>
-    <w:lsdException w:name="toc 2" w:semiHidden="1" w:uiPriority="39" w:unhideWhenUsed="1"/>
-    <w:lsdException w:name="toc 3" w:semiHidden="1" w:uiPriority="39" w:unhideWhenUsed="1"/>
-    <w:lsdException w:name="toc 4" w:semiHidden="1" w:uiPriority="39" w:unhideWhenUsed="1"/>
-    <w:lsdException w:name="toc 5" w:semiHidden="1" w:uiPriority="39" w:unhideWhenUsed="1"/>
-    <w:lsdException w:name="toc 6" w:semiHidden="1" w:uiPriority="39" w:unhideWhenUsed="1"/>
-    <w:lsdException w:name="toc 7" w:semiHidden="1" w:uiPriority="39" w:unhideWhenUsed="1"/>
-    <w:lsdException w:name="toc 8" w:semiHidden="1" w:uiPriority="39" w:unhideWhenUsed="1"/>
-    <w:lsdException w:name="toc 9" w:semiHidden="1" w:uiPriority="39" w:unhideWhenUsed="1"/>
+    <w:lsdException w:name="toc 1" w:uiPriority="39" w:semiHidden="1" w:unhideWhenUsed="1"/>
+    <w:lsdException w:name="toc 2" w:uiPriority="39" w:semiHidden="1" w:unhideWhenUsed="1"/>
+    <w:lsdException w:name="toc 3" w:uiPriority="39" w:semiHidden="1" w:unhideWhenUsed="1"/>
+    <w:lsdException w:name="toc 4" w:uiPriority="39" w:semiHidden="1" w:unhideWhenUsed="1"/>
+    <w:lsdException w:name="toc 5" w:uiPriority="39" w:semiHidden="1" w:unhideWhenUsed="1"/>
+    <w:lsdException w:name="toc 6" w:uiPriority="39" w:semiHidden="1" w:unhideWhenUsed="1"/>
+    <w:lsdException w:name="toc 7" w:uiPriority="39" w:semiHidden="1" w:unhideWhenUsed="1"/>
+    <w:lsdException w:name="toc 8" w:uiPriority="39" w:semiHidden="1" w:unhideWhenUsed="1"/>
+    <w:lsdException w:name="toc 9" w:uiPriority="39" w:semiHidden="1" w:unhideWhenUsed="1"/>
     <w:lsdException w:name="Normal Indent" w:semiHidden="1" w:unhideWhenUsed="1"/>
     <w:lsdException w:name="footnote text" w:semiHidden="1" w:unhideWhenUsed="1"/>
     <w:lsdException w:name="annotation text" w:semiHidden="1" w:unhideWhenUsed="1"/>
-    <w:lsdException w:name="header" w:semiHidden="1" w:uiPriority="0" w:unhideWhenUsed="1"/>
+    <w:lsdException w:name="header" w:uiPriority="0" w:semiHidden="1" w:unhideWhenUsed="1"/>
     <w:lsdException w:name="footer" w:semiHidden="1" w:unhideWhenUsed="1"/>
     <w:lsdException w:name="index heading" w:semiHidden="1" w:unhideWhenUsed="1"/>
-    <w:lsdException w:name="caption" w:semiHidden="1" w:uiPriority="35" w:unhideWhenUsed="1" w:qFormat="1"/>
+    <w:lsdException w:name="caption" w:uiPriority="35" w:semiHidden="1" w:unhideWhenUsed="1" w:qFormat="1"/>
     <w:lsdException w:name="table of figures" w:semiHidden="1" w:unhideWhenUsed="1"/>
     <w:lsdException w:name="envelope address" w:semiHidden="1" w:unhideWhenUsed="1"/>
     <w:lsdException w:name="envelope return" w:semiHidden="1" w:unhideWhenUsed="1"/>
@@ -8234,7 +8558,7 @@
     <w:lsdException w:name="Title" w:uiPriority="10" w:qFormat="1"/>
     <w:lsdException w:name="Closing" w:semiHidden="1" w:unhideWhenUsed="1"/>
     <w:lsdException w:name="Signature" w:semiHidden="1" w:unhideWhenUsed="1"/>
-    <w:lsdException w:name="Default Paragraph Font" w:semiHidden="1" w:uiPriority="1" w:unhideWhenUsed="1"/>
+    <w:lsdException w:name="Default Paragraph Font" w:uiPriority="1" w:semiHidden="1" w:unhideWhenUsed="1"/>
     <w:lsdException w:name="Body Text" w:semiHidden="1" w:unhideWhenUsed="1"/>
     <w:lsdException w:name="Body Text Indent" w:semiHidden="1" w:unhideWhenUsed="1"/>
     <w:lsdException w:name="List Continue" w:semiHidden="1" w:unhideWhenUsed="1"/>
@@ -8434,8 +8758,8 @@
     <w:lsdException w:name="Subtle Reference" w:uiPriority="31" w:qFormat="1"/>
     <w:lsdException w:name="Intense Reference" w:uiPriority="32" w:qFormat="1"/>
     <w:lsdException w:name="Book Title" w:uiPriority="33" w:qFormat="1"/>
-    <w:lsdException w:name="Bibliography" w:semiHidden="1" w:uiPriority="37" w:unhideWhenUsed="1"/>
-    <w:lsdException w:name="TOC Heading" w:semiHidden="1" w:uiPriority="39" w:unhideWhenUsed="1" w:qFormat="1"/>
+    <w:lsdException w:name="Bibliography" w:uiPriority="37" w:semiHidden="1" w:unhideWhenUsed="1"/>
+    <w:lsdException w:name="TOC Heading" w:uiPriority="39" w:semiHidden="1" w:unhideWhenUsed="1" w:qFormat="1"/>
     <w:lsdException w:name="Plain Table 1" w:uiPriority="41"/>
     <w:lsdException w:name="Plain Table 2" w:uiPriority="42"/>
     <w:lsdException w:name="Plain Table 3" w:uiPriority="43"/>
@@ -8546,7 +8870,7 @@
     <w:lsdException w:name="Unresolved Mention" w:semiHidden="1" w:unhideWhenUsed="1"/>
     <w:lsdException w:name="Smart Link" w:semiHidden="1" w:unhideWhenUsed="1"/>
   </w:latentStyles>
-  <w:style w:type="paragraph" w:default="1" w:styleId="Normal">
+  <w:style w:type="paragraph" w:styleId="Normal" w:default="1">
     <w:name w:val="Normal"/>
     <w:qFormat/>
     <w:pPr>
@@ -8664,13 +8988,13 @@
       <w:color w:val="666666"/>
     </w:rPr>
   </w:style>
-  <w:style w:type="character" w:default="1" w:styleId="Fuentedeprrafopredeter">
+  <w:style w:type="character" w:styleId="Fuentedeprrafopredeter" w:default="1">
     <w:name w:val="Default Paragraph Font"/>
     <w:uiPriority w:val="1"/>
     <w:semiHidden/>
     <w:unhideWhenUsed/>
   </w:style>
-  <w:style w:type="table" w:default="1" w:styleId="Tablanormal">
+  <w:style w:type="table" w:styleId="Tablanormal" w:default="1">
     <w:name w:val="Normal Table"/>
     <w:uiPriority w:val="99"/>
     <w:semiHidden/>
@@ -8685,7 +9009,7 @@
       </w:tblCellMar>
     </w:tblPr>
   </w:style>
-  <w:style w:type="numbering" w:default="1" w:styleId="Sinlista">
+  <w:style w:type="numbering" w:styleId="Sinlista" w:default="1">
     <w:name w:val="No List"/>
     <w:uiPriority w:val="99"/>
     <w:semiHidden/>
@@ -8702,7 +9026,7 @@
       <w:u w:val="single"/>
     </w:rPr>
   </w:style>
-  <w:style w:type="character" w:customStyle="1" w:styleId="Mencinsinresolver1">
+  <w:style w:type="character" w:styleId="Mencinsinresolver1" w:customStyle="1">
     <w:name w:val="Mención sin resolver1"/>
     <w:basedOn w:val="Fuentedeprrafopredeter"/>
     <w:uiPriority w:val="99"/>
@@ -8726,24 +9050,24 @@
       <w:u w:val="single"/>
     </w:rPr>
   </w:style>
-  <w:style w:type="character" w:customStyle="1" w:styleId="EncabezadoCar">
+  <w:style w:type="character" w:styleId="EncabezadoCar" w:customStyle="1">
     <w:name w:val="Encabezado Car"/>
     <w:basedOn w:val="Fuentedeprrafopredeter"/>
     <w:link w:val="Encabezado"/>
     <w:uiPriority w:val="99"/>
     <w:rsid w:val="004B52D1"/>
   </w:style>
-  <w:style w:type="character" w:customStyle="1" w:styleId="PiedepginaCar">
+  <w:style w:type="character" w:styleId="PiedepginaCar" w:customStyle="1">
     <w:name w:val="Pie de página Car"/>
     <w:basedOn w:val="Fuentedeprrafopredeter"/>
     <w:link w:val="Piedepgina"/>
     <w:uiPriority w:val="99"/>
     <w:rsid w:val="004B52D1"/>
   </w:style>
-  <w:style w:type="character" w:customStyle="1" w:styleId="IndexLink">
+  <w:style w:type="character" w:styleId="IndexLink" w:customStyle="1">
     <w:name w:val="Index Link"/>
   </w:style>
-  <w:style w:type="paragraph" w:customStyle="1" w:styleId="Heading">
+  <w:style w:type="paragraph" w:styleId="Heading" w:customStyle="1">
     <w:name w:val="Heading"/>
     <w:basedOn w:val="Normal"/>
     <w:next w:val="Textoindependiente"/>
@@ -8752,7 +9076,7 @@
       <w:spacing w:before="240" w:after="120"/>
     </w:pPr>
     <w:rPr>
-      <w:rFonts w:ascii="Liberation Sans" w:eastAsia="Noto Sans" w:hAnsi="Liberation Sans" w:cs="Noto Sans Devanagari"/>
+      <w:rFonts w:ascii="Liberation Sans" w:hAnsi="Liberation Sans" w:eastAsia="Noto Sans" w:cs="Noto Sans Devanagari"/>
       <w:sz w:val="28"/>
       <w:szCs w:val="28"/>
     </w:rPr>
@@ -8786,7 +9110,7 @@
       <w:szCs w:val="24"/>
     </w:rPr>
   </w:style>
-  <w:style w:type="paragraph" w:customStyle="1" w:styleId="Index">
+  <w:style w:type="paragraph" w:styleId="Index" w:customStyle="1">
     <w:name w:val="Index"/>
     <w:basedOn w:val="Normal"/>
     <w:pPr>
@@ -8829,7 +9153,7 @@
       <w:szCs w:val="30"/>
     </w:rPr>
   </w:style>
-  <w:style w:type="paragraph" w:customStyle="1" w:styleId="HeaderandFooter">
+  <w:style w:type="paragraph" w:styleId="HeaderandFooter" w:customStyle="1">
     <w:name w:val="Header and Footer"/>
     <w:basedOn w:val="Normal"/>
   </w:style>
@@ -8879,7 +9203,7 @@
       <w:outlineLvl w:val="9"/>
     </w:pPr>
     <w:rPr>
-      <w:rFonts w:asciiTheme="majorHAnsi" w:eastAsiaTheme="majorEastAsia" w:hAnsiTheme="majorHAnsi" w:cstheme="majorBidi"/>
+      <w:rFonts w:asciiTheme="majorHAnsi" w:hAnsiTheme="majorHAnsi" w:eastAsiaTheme="majorEastAsia" w:cstheme="majorBidi"/>
       <w:color w:val="365F91" w:themeColor="accent1" w:themeShade="BF"/>
       <w:sz w:val="32"/>
       <w:szCs w:val="32"/>
@@ -8935,11 +9259,11 @@
       <w:ind w:left="440"/>
     </w:pPr>
   </w:style>
-  <w:style w:type="paragraph" w:customStyle="1" w:styleId="FrameContents">
+  <w:style w:type="paragraph" w:styleId="FrameContents" w:customStyle="1">
     <w:name w:val="Frame Contents"/>
     <w:basedOn w:val="Normal"/>
   </w:style>
-  <w:style w:type="table" w:customStyle="1" w:styleId="TableNormal">
+  <w:style w:type="table" w:styleId="TableNormal" w:customStyle="1">
     <w:name w:val="TableNormal"/>
     <w:tblPr>
       <w:tblCellMar>
@@ -8957,12 +9281,12 @@
     <w:rsid w:val="00C55A72"/>
     <w:tblPr>
       <w:tblBorders>
-        <w:top w:val="single" w:sz="4" w:space="0" w:color="auto"/>
-        <w:left w:val="single" w:sz="4" w:space="0" w:color="auto"/>
-        <w:bottom w:val="single" w:sz="4" w:space="0" w:color="auto"/>
-        <w:right w:val="single" w:sz="4" w:space="0" w:color="auto"/>
-        <w:insideH w:val="single" w:sz="4" w:space="0" w:color="auto"/>
-        <w:insideV w:val="single" w:sz="4" w:space="0" w:color="auto"/>
+        <w:top w:val="single" w:color="auto" w:sz="4" w:space="0"/>
+        <w:left w:val="single" w:color="auto" w:sz="4" w:space="0"/>
+        <w:bottom w:val="single" w:color="auto" w:sz="4" w:space="0"/>
+        <w:right w:val="single" w:color="auto" w:sz="4" w:space="0"/>
+        <w:insideH w:val="single" w:color="auto" w:sz="4" w:space="0"/>
+        <w:insideV w:val="single" w:color="auto" w:sz="4" w:space="0"/>
       </w:tblBorders>
     </w:tblPr>
   </w:style>

</xml_diff>

<commit_message>
Se agrego fulo alternativo al CU registrar nuevo retiro
</commit_message>
<xml_diff>
--- a/Entrega 3/Entrega 3 - TPI.docx
+++ b/Entrega 3/Entrega 3 - TPI.docx
@@ -1,6 +1,6 @@
 
 <file path=word/document.xml><?xml version="1.0" encoding="utf-8"?>
-<w:document xmlns:wpc="http://schemas.microsoft.com/office/word/2010/wordprocessingCanvas" xmlns:cx="http://schemas.microsoft.com/office/drawing/2014/chartex" xmlns:cx1="http://schemas.microsoft.com/office/drawing/2015/9/8/chartex" xmlns:cx2="http://schemas.microsoft.com/office/drawing/2015/10/21/chartex" xmlns:cx3="http://schemas.microsoft.com/office/drawing/2016/5/9/chartex" xmlns:cx4="http://schemas.microsoft.com/office/drawing/2016/5/10/chartex" xmlns:cx5="http://schemas.microsoft.com/office/drawing/2016/5/11/chartex" xmlns:cx6="http://schemas.microsoft.com/office/drawing/2016/5/12/chartex" xmlns:cx7="http://schemas.microsoft.com/office/drawing/2016/5/13/chartex" xmlns:cx8="http://schemas.microsoft.com/office/drawing/2016/5/14/chartex" xmlns:mc="http://schemas.openxmlformats.org/markup-compatibility/2006" xmlns:aink="http://schemas.microsoft.com/office/drawing/2016/ink" xmlns:am3d="http://schemas.microsoft.com/office/drawing/2017/model3d" xmlns:o="urn:schemas-microsoft-com:office:office" xmlns:oel="http://schemas.microsoft.com/office/2019/extlst" xmlns:r="http://schemas.openxmlformats.org/officeDocument/2006/relationships" xmlns:m="http://schemas.openxmlformats.org/officeDocument/2006/math" xmlns:v="urn:schemas-microsoft-com:vml" xmlns:wp14="http://schemas.microsoft.com/office/word/2010/wordprocessingDrawing" xmlns:wp="http://schemas.openxmlformats.org/drawingml/2006/wordprocessingDrawing" xmlns:w10="urn:schemas-microsoft-com:office:word" xmlns:w="http://schemas.openxmlformats.org/wordprocessingml/2006/main" xmlns:w14="http://schemas.microsoft.com/office/word/2010/wordml" xmlns:w15="http://schemas.microsoft.com/office/word/2012/wordml" xmlns:w16cex="http://schemas.microsoft.com/office/word/2018/wordml/cex" xmlns:w16cid="http://schemas.microsoft.com/office/word/2016/wordml/cid" xmlns:w16="http://schemas.microsoft.com/office/word/2018/wordml" xmlns:w16sdtdh="http://schemas.microsoft.com/office/word/2020/wordml/sdtdatahash" xmlns:w16se="http://schemas.microsoft.com/office/word/2015/wordml/symex" xmlns:wpg="http://schemas.microsoft.com/office/word/2010/wordprocessingGroup" xmlns:wpi="http://schemas.microsoft.com/office/word/2010/wordprocessingInk" xmlns:wne="http://schemas.microsoft.com/office/word/2006/wordml" xmlns:wps="http://schemas.microsoft.com/office/word/2010/wordprocessingShape" xmlns:a="http://schemas.openxmlformats.org/drawingml/2006/main" xmlns:pic="http://schemas.openxmlformats.org/drawingml/2006/picture" xmlns:a14="http://schemas.microsoft.com/office/drawing/2010/main" mc:Ignorable="w14 w15 w16se w16cid w16 w16cex w16sdtdh wp14">
+<w:document xmlns:wpc="http://schemas.microsoft.com/office/word/2010/wordprocessingCanvas" xmlns:cx="http://schemas.microsoft.com/office/drawing/2014/chartex" xmlns:cx1="http://schemas.microsoft.com/office/drawing/2015/9/8/chartex" xmlns:cx2="http://schemas.microsoft.com/office/drawing/2015/10/21/chartex" xmlns:cx3="http://schemas.microsoft.com/office/drawing/2016/5/9/chartex" xmlns:cx4="http://schemas.microsoft.com/office/drawing/2016/5/10/chartex" xmlns:cx5="http://schemas.microsoft.com/office/drawing/2016/5/11/chartex" xmlns:cx6="http://schemas.microsoft.com/office/drawing/2016/5/12/chartex" xmlns:cx7="http://schemas.microsoft.com/office/drawing/2016/5/13/chartex" xmlns:cx8="http://schemas.microsoft.com/office/drawing/2016/5/14/chartex" xmlns:mc="http://schemas.openxmlformats.org/markup-compatibility/2006" xmlns:aink="http://schemas.microsoft.com/office/drawing/2016/ink" xmlns:am3d="http://schemas.microsoft.com/office/drawing/2017/model3d" xmlns:o="urn:schemas-microsoft-com:office:office" xmlns:oel="http://schemas.microsoft.com/office/2019/extlst" xmlns:r="http://schemas.openxmlformats.org/officeDocument/2006/relationships" xmlns:m="http://schemas.openxmlformats.org/officeDocument/2006/math" xmlns:v="urn:schemas-microsoft-com:vml" xmlns:wp14="http://schemas.microsoft.com/office/word/2010/wordprocessingDrawing" xmlns:wp="http://schemas.openxmlformats.org/drawingml/2006/wordprocessingDrawing" xmlns:w10="urn:schemas-microsoft-com:office:word" xmlns:w="http://schemas.openxmlformats.org/wordprocessingml/2006/main" xmlns:w14="http://schemas.microsoft.com/office/word/2010/wordml" xmlns:w15="http://schemas.microsoft.com/office/word/2012/wordml" xmlns:w16cex="http://schemas.microsoft.com/office/word/2018/wordml/cex" xmlns:w16cid="http://schemas.microsoft.com/office/word/2016/wordml/cid" xmlns:w16="http://schemas.microsoft.com/office/word/2018/wordml" xmlns:w16sdtdh="http://schemas.microsoft.com/office/word/2020/wordml/sdtdatahash" xmlns:w16se="http://schemas.microsoft.com/office/word/2015/wordml/symex" xmlns:wpg="http://schemas.microsoft.com/office/word/2010/wordprocessingGroup" xmlns:wpi="http://schemas.microsoft.com/office/word/2010/wordprocessingInk" xmlns:wne="http://schemas.microsoft.com/office/word/2006/wordml" xmlns:wps="http://schemas.microsoft.com/office/word/2010/wordprocessingShape" mc:Ignorable="w14 w15 w16se w16cid w16 w16cex w16sdtdh wp14">
   <w:body>
     <w:p>
       <w:pPr>
@@ -426,13 +426,8 @@
       </w:hyperlink>
     </w:p>
     <w:p>
-      <w:proofErr w:type="spellStart"/>
-      <w:r>
-        <w:t>Nuñez</w:t>
-      </w:r>
-      <w:proofErr w:type="spellEnd"/>
-      <w:r>
-        <w:t xml:space="preserve"> Loza, Juan Manuel</w:t>
+      <w:r>
+        <w:t>Nuñez Loza, Juan Manuel</w:t>
       </w:r>
       <w:r>
         <w:tab/>
@@ -550,6 +545,7 @@
           <w:i/>
           <w:iCs/>
         </w:rPr>
+        <w:lastRenderedPageBreak/>
         <w:t>ÍNDICE</w:t>
       </w:r>
     </w:p>
@@ -566,7 +562,7 @@
     <w:sdt>
       <w:sdtPr>
         <w:rPr>
-          <w:rFonts w:ascii="Arial" w:hAnsi="Arial" w:eastAsia="Arial" w:cs="Arial"/>
+          <w:rFonts w:ascii="Arial" w:eastAsia="Arial" w:hAnsi="Arial" w:cs="Arial"/>
           <w:color w:val="auto"/>
           <w:sz w:val="22"/>
           <w:szCs w:val="22"/>
@@ -601,46 +597,34 @@
             <w:fldChar w:fldCharType="begin"/>
           </w:r>
           <w:r>
-            <w:instrText xml:space="preserve">TOC \o "1-3" \z \u \h</w:instrText>
+            <w:instrText>TOC \o "1-3" \z \u \h</w:instrText>
           </w:r>
           <w:r>
             <w:fldChar w:fldCharType="separate"/>
           </w:r>
-          <w:r>
-            <w:fldChar w:fldCharType="begin"/>
-          </w:r>
-          <w:r>
-            <w:instrText xml:space="preserve">HYPERLINK  \l  "_Toc1208014390" </w:instrText>
-          </w:r>
-          <w:r>
-            <w:fldChar w:fldCharType="separate"/>
-          </w:r>
-          <w:r>
-            <w:rPr/>
-            <w:t>Modelado de Caso de Uso del TPI</w:t>
-          </w:r>
-          <w:r>
-            <w:tab/>
-          </w:r>
-          <w:r>
-            <w:fldChar w:fldCharType="begin"/>
-          </w:r>
-          <w:r>
-            <w:instrText xml:space="preserve">PAGEREF _Toc1208014390 \h</w:instrText>
-          </w:r>
-          <w:r>
-            <w:fldChar w:fldCharType="separate"/>
-          </w:r>
-          <w:r>
-            <w:rPr/>
-            <w:t>2</w:t>
-          </w:r>
-          <w:r>
-            <w:fldChar w:fldCharType="end"/>
-          </w:r>
-          <w:r>
-            <w:fldChar w:fldCharType="end"/>
-          </w:r>
+          <w:hyperlink w:anchor="_Toc1208014390" w:history="1">
+            <w:r>
+              <w:t>Modelado de Caso de Uso del TPI</w:t>
+            </w:r>
+            <w:r>
+              <w:tab/>
+            </w:r>
+            <w:r>
+              <w:fldChar w:fldCharType="begin"/>
+            </w:r>
+            <w:r>
+              <w:instrText>PAGEREF _Toc1208014390 \h</w:instrText>
+            </w:r>
+            <w:r>
+              <w:fldChar w:fldCharType="separate"/>
+            </w:r>
+            <w:r>
+              <w:t>2</w:t>
+            </w:r>
+            <w:r>
+              <w:fldChar w:fldCharType="end"/>
+            </w:r>
+          </w:hyperlink>
         </w:p>
         <w:p>
           <w:pPr>
@@ -649,41 +633,29 @@
               <w:tab w:val="right" w:leader="dot" w:pos="9015"/>
             </w:tabs>
           </w:pPr>
-          <w:r>
-            <w:fldChar w:fldCharType="begin"/>
-          </w:r>
-          <w:r>
-            <w:instrText xml:space="preserve">HYPERLINK  \l  "_Toc476618457" </w:instrText>
-          </w:r>
-          <w:r>
-            <w:fldChar w:fldCharType="separate"/>
-          </w:r>
-          <w:r>
-            <w:rPr/>
-            <w:t>Diagrama de Casos de Uso</w:t>
-          </w:r>
-          <w:r>
-            <w:tab/>
-          </w:r>
-          <w:r>
-            <w:fldChar w:fldCharType="begin"/>
-          </w:r>
-          <w:r>
-            <w:instrText xml:space="preserve">PAGEREF _Toc476618457 \h</w:instrText>
-          </w:r>
-          <w:r>
-            <w:fldChar w:fldCharType="separate"/>
-          </w:r>
-          <w:r>
-            <w:rPr/>
-            <w:t>3</w:t>
-          </w:r>
-          <w:r>
-            <w:fldChar w:fldCharType="end"/>
-          </w:r>
-          <w:r>
-            <w:fldChar w:fldCharType="end"/>
-          </w:r>
+          <w:hyperlink w:anchor="_Toc476618457" w:history="1">
+            <w:r>
+              <w:t>Diagrama de Casos de Uso</w:t>
+            </w:r>
+            <w:r>
+              <w:tab/>
+            </w:r>
+            <w:r>
+              <w:fldChar w:fldCharType="begin"/>
+            </w:r>
+            <w:r>
+              <w:instrText>PAGEREF _Toc476618457 \h</w:instrText>
+            </w:r>
+            <w:r>
+              <w:fldChar w:fldCharType="separate"/>
+            </w:r>
+            <w:r>
+              <w:t>3</w:t>
+            </w:r>
+            <w:r>
+              <w:fldChar w:fldCharType="end"/>
+            </w:r>
+          </w:hyperlink>
         </w:p>
         <w:p>
           <w:pPr>
@@ -692,41 +664,29 @@
               <w:tab w:val="right" w:leader="dot" w:pos="9015"/>
             </w:tabs>
           </w:pPr>
-          <w:r>
-            <w:fldChar w:fldCharType="begin"/>
-          </w:r>
-          <w:r>
-            <w:instrText xml:space="preserve">HYPERLINK  \l  "_Toc1942785650" </w:instrText>
-          </w:r>
-          <w:r>
-            <w:fldChar w:fldCharType="separate"/>
-          </w:r>
-          <w:r>
-            <w:rPr/>
-            <w:t>Lista de CU – Objetivos</w:t>
-          </w:r>
-          <w:r>
-            <w:tab/>
-          </w:r>
-          <w:r>
-            <w:fldChar w:fldCharType="begin"/>
-          </w:r>
-          <w:r>
-            <w:instrText xml:space="preserve">PAGEREF _Toc1942785650 \h</w:instrText>
-          </w:r>
-          <w:r>
-            <w:fldChar w:fldCharType="separate"/>
-          </w:r>
-          <w:r>
-            <w:rPr/>
-            <w:t>3</w:t>
-          </w:r>
-          <w:r>
-            <w:fldChar w:fldCharType="end"/>
-          </w:r>
-          <w:r>
-            <w:fldChar w:fldCharType="end"/>
-          </w:r>
+          <w:hyperlink w:anchor="_Toc1942785650" w:history="1">
+            <w:r>
+              <w:t>Lista de CU – Objetivos</w:t>
+            </w:r>
+            <w:r>
+              <w:tab/>
+            </w:r>
+            <w:r>
+              <w:fldChar w:fldCharType="begin"/>
+            </w:r>
+            <w:r>
+              <w:instrText>PAGEREF _Toc1942785650 \h</w:instrText>
+            </w:r>
+            <w:r>
+              <w:fldChar w:fldCharType="separate"/>
+            </w:r>
+            <w:r>
+              <w:t>3</w:t>
+            </w:r>
+            <w:r>
+              <w:fldChar w:fldCharType="end"/>
+            </w:r>
+          </w:hyperlink>
         </w:p>
         <w:p>
           <w:pPr>
@@ -735,41 +695,29 @@
               <w:tab w:val="right" w:leader="dot" w:pos="9015"/>
             </w:tabs>
           </w:pPr>
-          <w:r>
-            <w:fldChar w:fldCharType="begin"/>
-          </w:r>
-          <w:r>
-            <w:instrText xml:space="preserve">HYPERLINK  \l  "_Toc540596233" </w:instrText>
-          </w:r>
-          <w:r>
-            <w:fldChar w:fldCharType="separate"/>
-          </w:r>
-          <w:r>
-            <w:rPr/>
-            <w:t>Presentación de 3 casos de uso esenciales</w:t>
-          </w:r>
-          <w:r>
-            <w:tab/>
-          </w:r>
-          <w:r>
-            <w:fldChar w:fldCharType="begin"/>
-          </w:r>
-          <w:r>
-            <w:instrText xml:space="preserve">PAGEREF _Toc540596233 \h</w:instrText>
-          </w:r>
-          <w:r>
-            <w:fldChar w:fldCharType="separate"/>
-          </w:r>
-          <w:r>
-            <w:rPr/>
-            <w:t>4</w:t>
-          </w:r>
-          <w:r>
-            <w:fldChar w:fldCharType="end"/>
-          </w:r>
-          <w:r>
-            <w:fldChar w:fldCharType="end"/>
-          </w:r>
+          <w:hyperlink w:anchor="_Toc540596233" w:history="1">
+            <w:r>
+              <w:t>Presentación de 3 casos de uso esenciales</w:t>
+            </w:r>
+            <w:r>
+              <w:tab/>
+            </w:r>
+            <w:r>
+              <w:fldChar w:fldCharType="begin"/>
+            </w:r>
+            <w:r>
+              <w:instrText>PAGEREF _Toc540596233 \h</w:instrText>
+            </w:r>
+            <w:r>
+              <w:fldChar w:fldCharType="separate"/>
+            </w:r>
+            <w:r>
+              <w:t>4</w:t>
+            </w:r>
+            <w:r>
+              <w:fldChar w:fldCharType="end"/>
+            </w:r>
+          </w:hyperlink>
         </w:p>
         <w:p>
           <w:pPr>
@@ -778,41 +726,29 @@
               <w:tab w:val="right" w:leader="dot" w:pos="9015"/>
             </w:tabs>
           </w:pPr>
-          <w:r>
-            <w:fldChar w:fldCharType="begin"/>
-          </w:r>
-          <w:r>
-            <w:instrText xml:space="preserve">HYPERLINK  \l  "_Toc637168105" </w:instrText>
-          </w:r>
-          <w:r>
-            <w:fldChar w:fldCharType="separate"/>
-          </w:r>
-          <w:r>
-            <w:rPr/>
-            <w:t>Prototipo de la pantalla principal</w:t>
-          </w:r>
-          <w:r>
-            <w:tab/>
-          </w:r>
-          <w:r>
-            <w:fldChar w:fldCharType="begin"/>
-          </w:r>
-          <w:r>
-            <w:instrText xml:space="preserve">PAGEREF _Toc637168105 \h</w:instrText>
-          </w:r>
-          <w:r>
-            <w:fldChar w:fldCharType="separate"/>
-          </w:r>
-          <w:r>
-            <w:rPr/>
-            <w:t>5</w:t>
-          </w:r>
-          <w:r>
-            <w:fldChar w:fldCharType="end"/>
-          </w:r>
-          <w:r>
-            <w:fldChar w:fldCharType="end"/>
-          </w:r>
+          <w:hyperlink w:anchor="_Toc637168105" w:history="1">
+            <w:r>
+              <w:t>Prototipo de la pantalla principal</w:t>
+            </w:r>
+            <w:r>
+              <w:tab/>
+            </w:r>
+            <w:r>
+              <w:fldChar w:fldCharType="begin"/>
+            </w:r>
+            <w:r>
+              <w:instrText>PAGEREF _Toc637168105 \h</w:instrText>
+            </w:r>
+            <w:r>
+              <w:fldChar w:fldCharType="separate"/>
+            </w:r>
+            <w:r>
+              <w:t>5</w:t>
+            </w:r>
+            <w:r>
+              <w:fldChar w:fldCharType="end"/>
+            </w:r>
+          </w:hyperlink>
         </w:p>
         <w:p>
           <w:pPr>
@@ -821,41 +757,29 @@
               <w:tab w:val="right" w:leader="dot" w:pos="9015"/>
             </w:tabs>
           </w:pPr>
-          <w:r>
-            <w:fldChar w:fldCharType="begin"/>
-          </w:r>
-          <w:r>
-            <w:instrText xml:space="preserve">HYPERLINK  \l  "_Toc292187718" </w:instrText>
-          </w:r>
-          <w:r>
-            <w:fldChar w:fldCharType="separate"/>
-          </w:r>
-          <w:r>
-            <w:rPr/>
-            <w:t>Prototipo de Registrar nuevo retiro</w:t>
-          </w:r>
-          <w:r>
-            <w:tab/>
-          </w:r>
-          <w:r>
-            <w:fldChar w:fldCharType="begin"/>
-          </w:r>
-          <w:r>
-            <w:instrText xml:space="preserve">PAGEREF _Toc292187718 \h</w:instrText>
-          </w:r>
-          <w:r>
-            <w:fldChar w:fldCharType="separate"/>
-          </w:r>
-          <w:r>
-            <w:rPr/>
-            <w:t>6</w:t>
-          </w:r>
-          <w:r>
-            <w:fldChar w:fldCharType="end"/>
-          </w:r>
-          <w:r>
-            <w:fldChar w:fldCharType="end"/>
-          </w:r>
+          <w:hyperlink w:anchor="_Toc292187718" w:history="1">
+            <w:r>
+              <w:t>Prototipo de Registrar nuevo retiro</w:t>
+            </w:r>
+            <w:r>
+              <w:tab/>
+            </w:r>
+            <w:r>
+              <w:fldChar w:fldCharType="begin"/>
+            </w:r>
+            <w:r>
+              <w:instrText>PAGEREF _Toc292187718 \h</w:instrText>
+            </w:r>
+            <w:r>
+              <w:fldChar w:fldCharType="separate"/>
+            </w:r>
+            <w:r>
+              <w:t>6</w:t>
+            </w:r>
+            <w:r>
+              <w:fldChar w:fldCharType="end"/>
+            </w:r>
+          </w:hyperlink>
         </w:p>
         <w:p>
           <w:pPr>
@@ -864,41 +788,29 @@
               <w:tab w:val="right" w:leader="dot" w:pos="9015"/>
             </w:tabs>
           </w:pPr>
-          <w:r>
-            <w:fldChar w:fldCharType="begin"/>
-          </w:r>
-          <w:r>
-            <w:instrText xml:space="preserve">HYPERLINK  \l  "_Toc1758631309" </w:instrText>
-          </w:r>
-          <w:r>
-            <w:fldChar w:fldCharType="separate"/>
-          </w:r>
-          <w:r>
-            <w:rPr/>
-            <w:t>Prototipo de Consultar retiro agendado</w:t>
-          </w:r>
-          <w:r>
-            <w:tab/>
-          </w:r>
-          <w:r>
-            <w:fldChar w:fldCharType="begin"/>
-          </w:r>
-          <w:r>
-            <w:instrText xml:space="preserve">PAGEREF _Toc1758631309 \h</w:instrText>
-          </w:r>
-          <w:r>
-            <w:fldChar w:fldCharType="separate"/>
-          </w:r>
-          <w:r>
-            <w:rPr/>
-            <w:t>9</w:t>
-          </w:r>
-          <w:r>
-            <w:fldChar w:fldCharType="end"/>
-          </w:r>
-          <w:r>
-            <w:fldChar w:fldCharType="end"/>
-          </w:r>
+          <w:hyperlink w:anchor="_Toc1758631309" w:history="1">
+            <w:r>
+              <w:t>Prototipo de Consultar retiro agendado</w:t>
+            </w:r>
+            <w:r>
+              <w:tab/>
+            </w:r>
+            <w:r>
+              <w:fldChar w:fldCharType="begin"/>
+            </w:r>
+            <w:r>
+              <w:instrText>PAGEREF _Toc1758631309 \h</w:instrText>
+            </w:r>
+            <w:r>
+              <w:fldChar w:fldCharType="separate"/>
+            </w:r>
+            <w:r>
+              <w:t>9</w:t>
+            </w:r>
+            <w:r>
+              <w:fldChar w:fldCharType="end"/>
+            </w:r>
+          </w:hyperlink>
         </w:p>
         <w:p>
           <w:pPr>
@@ -907,41 +819,29 @@
               <w:tab w:val="right" w:leader="dot" w:pos="9015"/>
             </w:tabs>
           </w:pPr>
-          <w:r>
-            <w:fldChar w:fldCharType="begin"/>
-          </w:r>
-          <w:r>
-            <w:instrText xml:space="preserve">HYPERLINK  \l  "_Toc120165810" </w:instrText>
-          </w:r>
-          <w:r>
-            <w:fldChar w:fldCharType="separate"/>
-          </w:r>
-          <w:r>
-            <w:rPr/>
-            <w:t>Prototipo de Modificar retiro agendado</w:t>
-          </w:r>
-          <w:r>
-            <w:tab/>
-          </w:r>
-          <w:r>
-            <w:fldChar w:fldCharType="begin"/>
-          </w:r>
-          <w:r>
-            <w:instrText xml:space="preserve">PAGEREF _Toc120165810 \h</w:instrText>
-          </w:r>
-          <w:r>
-            <w:fldChar w:fldCharType="separate"/>
-          </w:r>
-          <w:r>
-            <w:rPr/>
-            <w:t>12</w:t>
-          </w:r>
-          <w:r>
-            <w:fldChar w:fldCharType="end"/>
-          </w:r>
-          <w:r>
-            <w:fldChar w:fldCharType="end"/>
-          </w:r>
+          <w:hyperlink w:anchor="_Toc120165810" w:history="1">
+            <w:r>
+              <w:t>Prototipo de Modificar retiro agendado</w:t>
+            </w:r>
+            <w:r>
+              <w:tab/>
+            </w:r>
+            <w:r>
+              <w:fldChar w:fldCharType="begin"/>
+            </w:r>
+            <w:r>
+              <w:instrText>PAGEREF _Toc120165810 \h</w:instrText>
+            </w:r>
+            <w:r>
+              <w:fldChar w:fldCharType="separate"/>
+            </w:r>
+            <w:r>
+              <w:t>12</w:t>
+            </w:r>
+            <w:r>
+              <w:fldChar w:fldCharType="end"/>
+            </w:r>
+          </w:hyperlink>
         </w:p>
         <w:p>
           <w:pPr>
@@ -950,41 +850,29 @@
               <w:tab w:val="right" w:leader="dot" w:pos="9015"/>
             </w:tabs>
           </w:pPr>
-          <w:r>
-            <w:fldChar w:fldCharType="begin"/>
-          </w:r>
-          <w:r>
-            <w:instrText xml:space="preserve">HYPERLINK  \l  "_Toc447222063" </w:instrText>
-          </w:r>
-          <w:r>
-            <w:fldChar w:fldCharType="separate"/>
-          </w:r>
-          <w:r>
-            <w:rPr/>
-            <w:t>Diagrama de transición de estados</w:t>
-          </w:r>
-          <w:r>
-            <w:tab/>
-          </w:r>
-          <w:r>
-            <w:fldChar w:fldCharType="begin"/>
-          </w:r>
-          <w:r>
-            <w:instrText xml:space="preserve">PAGEREF _Toc447222063 \h</w:instrText>
-          </w:r>
-          <w:r>
-            <w:fldChar w:fldCharType="separate"/>
-          </w:r>
-          <w:r>
-            <w:rPr/>
-            <w:t>13</w:t>
-          </w:r>
-          <w:r>
-            <w:fldChar w:fldCharType="end"/>
-          </w:r>
-          <w:r>
-            <w:fldChar w:fldCharType="end"/>
-          </w:r>
+          <w:hyperlink w:anchor="_Toc447222063" w:history="1">
+            <w:r>
+              <w:t>Diagrama de transición de estados</w:t>
+            </w:r>
+            <w:r>
+              <w:tab/>
+            </w:r>
+            <w:r>
+              <w:fldChar w:fldCharType="begin"/>
+            </w:r>
+            <w:r>
+              <w:instrText>PAGEREF _Toc447222063 \h</w:instrText>
+            </w:r>
+            <w:r>
+              <w:fldChar w:fldCharType="separate"/>
+            </w:r>
+            <w:r>
+              <w:t>13</w:t>
+            </w:r>
+            <w:r>
+              <w:fldChar w:fldCharType="end"/>
+            </w:r>
+          </w:hyperlink>
         </w:p>
         <w:p>
           <w:pPr>
@@ -993,41 +881,29 @@
               <w:tab w:val="right" w:leader="dot" w:pos="9015"/>
             </w:tabs>
           </w:pPr>
-          <w:r>
-            <w:fldChar w:fldCharType="begin"/>
-          </w:r>
-          <w:r>
-            <w:instrText xml:space="preserve">HYPERLINK  \l  "_Toc72469304" </w:instrText>
-          </w:r>
-          <w:r>
-            <w:fldChar w:fldCharType="separate"/>
-          </w:r>
-          <w:r>
-            <w:rPr/>
-            <w:t>Git log de la tercera entrega</w:t>
-          </w:r>
-          <w:r>
-            <w:tab/>
-          </w:r>
-          <w:r>
-            <w:fldChar w:fldCharType="begin"/>
-          </w:r>
-          <w:r>
-            <w:instrText xml:space="preserve">PAGEREF _Toc72469304 \h</w:instrText>
-          </w:r>
-          <w:r>
-            <w:fldChar w:fldCharType="separate"/>
-          </w:r>
-          <w:r>
-            <w:rPr/>
-            <w:t>14</w:t>
-          </w:r>
-          <w:r>
-            <w:fldChar w:fldCharType="end"/>
-          </w:r>
-          <w:r>
-            <w:fldChar w:fldCharType="end"/>
-          </w:r>
+          <w:hyperlink w:anchor="_Toc72469304" w:history="1">
+            <w:r>
+              <w:t>Git log de la tercera entrega</w:t>
+            </w:r>
+            <w:r>
+              <w:tab/>
+            </w:r>
+            <w:r>
+              <w:fldChar w:fldCharType="begin"/>
+            </w:r>
+            <w:r>
+              <w:instrText>PAGEREF _Toc72469304 \h</w:instrText>
+            </w:r>
+            <w:r>
+              <w:fldChar w:fldCharType="separate"/>
+            </w:r>
+            <w:r>
+              <w:t>14</w:t>
+            </w:r>
+            <w:r>
+              <w:fldChar w:fldCharType="end"/>
+            </w:r>
+          </w:hyperlink>
         </w:p>
         <w:p>
           <w:r>
@@ -1035,15 +911,6 @@
           </w:r>
         </w:p>
       </w:sdtContent>
-      <w:sdtEndPr>
-        <w:rPr>
-          <w:rFonts w:ascii="Arial" w:hAnsi="Arial" w:eastAsia="Arial" w:cs="Arial"/>
-          <w:color w:val="auto"/>
-          <w:sz w:val="22"/>
-          <w:szCs w:val="22"/>
-          <w:lang w:val="es-ES" w:eastAsia="es-AR"/>
-        </w:rPr>
-      </w:sdtEndPr>
     </w:sdt>
     <w:p>
       <w:r>
@@ -1054,26 +921,27 @@
       <w:pPr>
         <w:pStyle w:val="Ttulo1"/>
         <w:rPr>
-          <w:b w:val="1"/>
-          <w:bCs w:val="1"/>
+          <w:b/>
+          <w:bCs/>
           <w:u w:val="single"/>
           <w:lang w:val="es-AR"/>
         </w:rPr>
       </w:pPr>
-      <w:bookmarkStart w:name="_Toc1208014390" w:id="14716910"/>
-      <w:r>
-        <w:rPr>
-          <w:b w:val="1"/>
-          <w:bCs w:val="1"/>
+      <w:bookmarkStart w:id="0" w:name="_Toc1208014390"/>
+      <w:r>
+        <w:rPr>
+          <w:b/>
+          <w:bCs/>
           <w:u w:val="single"/>
           <w:lang w:val="es-AR"/>
         </w:rPr>
+        <w:lastRenderedPageBreak/>
         <w:t>Model</w:t>
       </w:r>
       <w:r>
         <w:rPr>
-          <w:b w:val="1"/>
-          <w:bCs w:val="1"/>
+          <w:b/>
+          <w:bCs/>
           <w:u w:val="single"/>
           <w:lang w:val="es-AR"/>
         </w:rPr>
@@ -1081,36 +949,34 @@
       </w:r>
       <w:r>
         <w:rPr>
-          <w:b w:val="1"/>
-          <w:bCs w:val="1"/>
+          <w:b/>
+          <w:bCs/>
           <w:u w:val="single"/>
           <w:lang w:val="es-AR"/>
         </w:rPr>
         <w:t xml:space="preserve"> de Caso de Uso del TPI</w:t>
       </w:r>
-      <w:bookmarkEnd w:id="14716910"/>
+      <w:bookmarkEnd w:id="0"/>
     </w:p>
     <w:p>
       <w:pPr>
         <w:pStyle w:val="Ttulo2"/>
         <w:rPr>
-          <w:b w:val="1"/>
-          <w:bCs w:val="1"/>
-          <w:u w:val="none"/>
+          <w:b/>
+          <w:bCs/>
           <w:lang w:val="es-AR"/>
         </w:rPr>
       </w:pPr>
-      <w:bookmarkStart w:name="_Toc476618457" w:id="1956161174"/>
-      <w:r>
-        <w:rPr>
-          <w:b w:val="1"/>
-          <w:bCs w:val="1"/>
-          <w:u w:val="none"/>
+      <w:bookmarkStart w:id="1" w:name="_Toc476618457"/>
+      <w:r>
+        <w:rPr>
+          <w:b/>
+          <w:bCs/>
           <w:lang w:val="es-AR"/>
         </w:rPr>
         <w:t>Diagrama de Casos de Uso</w:t>
       </w:r>
-      <w:bookmarkEnd w:id="1956161174"/>
+      <w:bookmarkEnd w:id="1"/>
     </w:p>
     <w:p>
       <w:pPr>
@@ -1186,41 +1052,22 @@
       <w:pPr>
         <w:pStyle w:val="Ttulo2"/>
         <w:rPr>
-          <w:b w:val="1"/>
-          <w:bCs w:val="1"/>
-          <w:u w:val="none"/>
+          <w:b/>
+          <w:bCs/>
           <w:lang w:val="es-AR"/>
         </w:rPr>
       </w:pPr>
-      <w:bookmarkStart w:name="_Toc1942785650" w:id="1020944321"/>
-      <w:r>
-        <w:rPr>
-          <w:b w:val="1"/>
-          <w:bCs w:val="1"/>
-          <w:u w:val="none"/>
+      <w:bookmarkStart w:id="2" w:name="_Toc1942785650"/>
+      <w:r>
+        <w:rPr>
+          <w:b/>
+          <w:bCs/>
           <w:lang w:val="es-AR"/>
         </w:rPr>
-        <w:t xml:space="preserve">Lista de CU </w:t>
-      </w:r>
-      <w:r>
-        <w:rPr>
-          <w:b w:val="1"/>
-          <w:bCs w:val="1"/>
-          <w:u w:val="none"/>
-          <w:lang w:val="es-AR"/>
-        </w:rPr>
-        <w:t>–</w:t>
-      </w:r>
-      <w:r>
-        <w:rPr>
-          <w:b w:val="1"/>
-          <w:bCs w:val="1"/>
-          <w:u w:val="none"/>
-          <w:lang w:val="es-AR"/>
-        </w:rPr>
-        <w:t xml:space="preserve"> Objetivos</w:t>
-      </w:r>
-      <w:bookmarkEnd w:id="1020944321"/>
+        <w:lastRenderedPageBreak/>
+        <w:t>Lista de CU – Objetivos</w:t>
+      </w:r>
+      <w:bookmarkEnd w:id="2"/>
     </w:p>
     <w:tbl>
       <w:tblPr>
@@ -1804,8 +1651,8 @@
       <w:pPr>
         <w:spacing w:line="240" w:lineRule="auto"/>
         <w:rPr>
-          <w:b w:val="1"/>
-          <w:bCs w:val="1"/>
+          <w:b/>
+          <w:bCs/>
           <w:sz w:val="32"/>
           <w:szCs w:val="32"/>
           <w:u w:val="single"/>
@@ -1814,8 +1661,8 @@
       <w:r>
         <w:rPr>
           <w:rFonts w:ascii="Tahoma" w:hAnsi="Tahoma" w:cs="Tahoma"/>
-          <w:b w:val="1"/>
-          <w:bCs w:val="1"/>
+          <w:b/>
+          <w:bCs/>
           <w:color w:val="333399"/>
         </w:rPr>
         <w:br w:type="page"/>
@@ -1825,63 +1672,61 @@
       <w:pPr>
         <w:pStyle w:val="Ttulo1"/>
         <w:rPr>
-          <w:b w:val="1"/>
-          <w:bCs w:val="1"/>
-          <w:sz w:val="40"/>
-          <w:szCs w:val="40"/>
+          <w:b/>
+          <w:bCs/>
           <w:u w:val="single"/>
         </w:rPr>
       </w:pPr>
-      <w:bookmarkStart w:name="_Toc540596233" w:id="1111225318"/>
-      <w:r>
-        <w:rPr>
-          <w:b w:val="1"/>
-          <w:bCs w:val="1"/>
+      <w:bookmarkStart w:id="3" w:name="_Toc540596233"/>
+      <w:r>
+        <w:rPr>
+          <w:b/>
+          <w:bCs/>
           <w:u w:val="single"/>
         </w:rPr>
+        <w:lastRenderedPageBreak/>
         <w:t>Presentación de 3 casos de uso esenciales</w:t>
       </w:r>
-      <w:bookmarkEnd w:id="1111225318"/>
+      <w:bookmarkEnd w:id="3"/>
     </w:p>
     <w:p>
       <w:pPr>
         <w:pStyle w:val="Ttulo2"/>
         <w:rPr>
-          <w:b w:val="1"/>
-          <w:bCs w:val="1"/>
-          <w:u w:val="none"/>
-        </w:rPr>
-      </w:pPr>
-      <w:bookmarkStart w:name="_Toc637168105" w:id="883809488"/>
-      <w:r>
-        <w:rPr>
-          <w:b w:val="1"/>
-          <w:bCs w:val="1"/>
-          <w:u w:val="none"/>
+          <w:b/>
+          <w:bCs/>
+        </w:rPr>
+      </w:pPr>
+      <w:bookmarkStart w:id="4" w:name="_Toc637168105"/>
+      <w:r>
+        <w:rPr>
+          <w:b/>
+          <w:bCs/>
         </w:rPr>
         <w:t xml:space="preserve">Prototipo </w:t>
       </w:r>
       <w:r>
         <w:rPr>
-          <w:b w:val="1"/>
-          <w:bCs w:val="1"/>
-          <w:u w:val="none"/>
+          <w:b/>
+          <w:bCs/>
         </w:rPr>
         <w:t xml:space="preserve">de la </w:t>
       </w:r>
       <w:r>
         <w:rPr>
-          <w:b w:val="1"/>
-          <w:bCs w:val="1"/>
-          <w:u w:val="none"/>
+          <w:b/>
+          <w:bCs/>
         </w:rPr>
         <w:t>pantalla principal</w:t>
       </w:r>
-      <w:bookmarkEnd w:id="883809488"/>
+      <w:bookmarkEnd w:id="4"/>
     </w:p>
     <w:p/>
     <w:p>
       <w:r>
+        <w:rPr>
+          <w:noProof/>
+        </w:rPr>
         <w:drawing>
           <wp:anchor distT="0" distB="0" distL="114300" distR="114300" simplePos="0" relativeHeight="251667456" behindDoc="0" locked="0" layoutInCell="1" allowOverlap="1" wp14:anchorId="24F380F4" wp14:editId="23DB7BE2">
             <wp:simplePos x="0" y="0"/>
@@ -1939,6 +1784,9 @@
         </w:drawing>
       </w:r>
       <w:r>
+        <w:rPr>
+          <w:noProof/>
+        </w:rPr>
         <w:drawing>
           <wp:inline distT="0" distB="0" distL="0" distR="0" wp14:anchorId="1954E342" wp14:editId="3D5E0169">
             <wp:extent cx="2606266" cy="4846740"/>
@@ -2049,12 +1897,12 @@
         <w:jc w:val="center"/>
         <w:tblCellSpacing w:w="20" w:type="dxa"/>
         <w:tblBorders>
-          <w:top w:val="outset" w:color="auto" w:sz="6" w:space="0"/>
-          <w:left w:val="outset" w:color="auto" w:sz="6" w:space="0"/>
-          <w:bottom w:val="outset" w:color="auto" w:sz="6" w:space="0"/>
-          <w:right w:val="outset" w:color="auto" w:sz="6" w:space="0"/>
-          <w:insideH w:val="outset" w:color="auto" w:sz="6" w:space="0"/>
-          <w:insideV w:val="outset" w:color="auto" w:sz="6" w:space="0"/>
+          <w:top w:val="outset" w:sz="6" w:space="0" w:color="auto"/>
+          <w:left w:val="outset" w:sz="6" w:space="0" w:color="auto"/>
+          <w:bottom w:val="outset" w:sz="6" w:space="0" w:color="auto"/>
+          <w:right w:val="outset" w:sz="6" w:space="0" w:color="auto"/>
+          <w:insideH w:val="outset" w:sz="6" w:space="0" w:color="auto"/>
+          <w:insideV w:val="outset" w:sz="6" w:space="0" w:color="auto"/>
         </w:tblBorders>
         <w:tblLayout w:type="fixed"/>
         <w:tblCellMar>
@@ -2083,7 +1931,6 @@
           <w:tcPr>
             <w:tcW w:w="9071" w:type="dxa"/>
             <w:gridSpan w:val="4"/>
-            <w:tcMar/>
           </w:tcPr>
           <w:p>
             <w:pPr>
@@ -2120,7 +1967,6 @@
             <w:tcW w:w="6292" w:type="dxa"/>
             <w:gridSpan w:val="3"/>
             <w:shd w:val="clear" w:color="auto" w:fill="C0C0C0"/>
-            <w:tcMar/>
           </w:tcPr>
           <w:p>
             <w:pPr>
@@ -2162,7 +2008,6 @@
           <w:tcPr>
             <w:tcW w:w="2739" w:type="dxa"/>
             <w:shd w:val="clear" w:color="auto" w:fill="C0C0C0"/>
-            <w:tcMar/>
           </w:tcPr>
           <w:p>
             <w:pPr>
@@ -2213,7 +2058,6 @@
         <w:tc>
           <w:tcPr>
             <w:tcW w:w="3901" w:type="dxa"/>
-            <w:tcMar/>
           </w:tcPr>
           <w:p>
             <w:pPr>
@@ -2229,8 +2073,8 @@
             <w:r>
               <w:rPr>
                 <w:rFonts w:ascii="Tahoma" w:hAnsi="Tahoma" w:cs="Tahoma"/>
-                <w:b w:val="1"/>
-                <w:bCs w:val="1"/>
+                <w:b/>
+                <w:bCs/>
                 <w:sz w:val="20"/>
                 <w:szCs w:val="20"/>
               </w:rPr>
@@ -2242,15 +2086,7 @@
                 <w:sz w:val="20"/>
                 <w:szCs w:val="20"/>
               </w:rPr>
-              <w:t xml:space="preserve">: </w:t>
-            </w:r>
-            <w:r>
-              <w:rPr>
-                <w:rFonts w:ascii="Tahoma" w:hAnsi="Tahoma" w:cs="Tahoma"/>
-                <w:sz w:val="20"/>
-                <w:szCs w:val="20"/>
-              </w:rPr>
-              <w:t>Usuario</w:t>
+              <w:t>: Usuario</w:t>
             </w:r>
           </w:p>
         </w:tc>
@@ -2258,7 +2094,6 @@
           <w:tcPr>
             <w:tcW w:w="5130" w:type="dxa"/>
             <w:gridSpan w:val="3"/>
-            <w:tcMar/>
           </w:tcPr>
           <w:p>
             <w:pPr>
@@ -2299,22 +2134,20 @@
           <w:tcPr>
             <w:tcW w:w="9071" w:type="dxa"/>
             <w:gridSpan w:val="4"/>
-            <w:tcMar/>
-          </w:tcPr>
-          <w:p>
-            <w:pPr>
-              <w:pStyle w:val="Normal"/>
-              <w:rPr>
-                <w:rFonts w:ascii="Tahoma" w:hAnsi="Tahoma" w:cs="Tahoma"/>
-                <w:sz w:val="20"/>
-                <w:szCs w:val="20"/>
-              </w:rPr>
-            </w:pPr>
-            <w:r>
-              <w:rPr>
-                <w:rFonts w:ascii="Tahoma" w:hAnsi="Tahoma" w:cs="Tahoma"/>
-                <w:b w:val="1"/>
-                <w:bCs w:val="1"/>
+          </w:tcPr>
+          <w:p>
+            <w:pPr>
+              <w:rPr>
+                <w:rFonts w:ascii="Tahoma" w:hAnsi="Tahoma" w:cs="Tahoma"/>
+                <w:sz w:val="20"/>
+                <w:szCs w:val="20"/>
+              </w:rPr>
+            </w:pPr>
+            <w:r>
+              <w:rPr>
+                <w:rFonts w:ascii="Tahoma" w:hAnsi="Tahoma" w:cs="Tahoma"/>
+                <w:b/>
+                <w:bCs/>
                 <w:sz w:val="20"/>
                 <w:szCs w:val="20"/>
               </w:rPr>
@@ -2329,48 +2162,51 @@
               <w:t xml:space="preserve">:              </w:t>
             </w:r>
             <w:r>
+              <w:rPr>
+                <w:noProof/>
+              </w:rPr>
               <mc:AlternateContent>
                 <mc:Choice Requires="wps">
                   <w:drawing>
-                    <wp:inline wp14:editId="1EBC30F4" wp14:anchorId="6508CD78">
+                    <wp:inline distT="0" distB="0" distL="0" distR="0" wp14:anchorId="6508CD78" wp14:editId="1EBC30F4">
                       <wp:extent cx="228600" cy="190500"/>
                       <wp:effectExtent l="0" t="0" r="0" b="0"/>
                       <wp:docPr id="907906472" name="Signo de multiplicación 2"/>
                       <wp:cNvGraphicFramePr/>
-                      <a:graphic>
-                        <a:graphicData xmlns:a="http://schemas.openxmlformats.org/drawingml/2006/main" uri="http://schemas.microsoft.com/office/word/2010/wordprocessingShape">
-                          <wps:wsp xmlns:wps="http://schemas.microsoft.com/office/word/2010/wordprocessingShape">
+                      <a:graphic xmlns:a="http://schemas.openxmlformats.org/drawingml/2006/main">
+                        <a:graphicData uri="http://schemas.microsoft.com/office/word/2010/wordprocessingShape">
+                          <wps:wsp>
                             <wps:cNvSpPr/>
                             <wps:spPr>
-                              <a:xfrm xmlns:a="http://schemas.openxmlformats.org/drawingml/2006/main">
+                              <a:xfrm>
                                 <a:off x="0" y="0"/>
                                 <a:ext cx="228600" cy="190500"/>
                               </a:xfrm>
-                              <a:prstGeom xmlns:a="http://schemas.openxmlformats.org/drawingml/2006/main" prst="mathMultiply">
+                              <a:prstGeom prst="mathMultiply">
                                 <a:avLst/>
                               </a:prstGeom>
                             </wps:spPr>
                             <wps:style>
-                              <a:lnRef xmlns:a="http://schemas.openxmlformats.org/drawingml/2006/main" idx="2">
+                              <a:lnRef idx="2">
                                 <a:schemeClr val="accent1">
                                   <a:shade val="15000"/>
                                 </a:schemeClr>
                               </a:lnRef>
-                              <a:fillRef xmlns:a="http://schemas.openxmlformats.org/drawingml/2006/main" idx="1">
+                              <a:fillRef idx="1">
                                 <a:schemeClr val="accent1"/>
                               </a:fillRef>
-                              <a:effectRef xmlns:a="http://schemas.openxmlformats.org/drawingml/2006/main" idx="0">
+                              <a:effectRef idx="0">
                                 <a:schemeClr val="accent1"/>
                               </a:effectRef>
-                              <a:fontRef xmlns:a="http://schemas.openxmlformats.org/drawingml/2006/main" idx="minor">
+                              <a:fontRef idx="minor">
                                 <a:schemeClr val="lt1"/>
                               </a:fontRef>
                             </wps:style>
                             <wps:bodyPr rot="0" spcFirstLastPara="0" vertOverflow="overflow" horzOverflow="overflow" vert="horz" wrap="square" lIns="91440" tIns="45720" rIns="91440" bIns="45720" numCol="1" spcCol="0" rtlCol="0" fromWordArt="0" anchor="ctr" anchorCtr="0" forceAA="0" compatLnSpc="1">
-                              <a:prstTxWarp xmlns:a="http://schemas.openxmlformats.org/drawingml/2006/main" prst="textNoShape">
+                              <a:prstTxWarp prst="textNoShape">
                                 <a:avLst/>
                               </a:prstTxWarp>
-                              <a:noAutofit xmlns:a="http://schemas.openxmlformats.org/drawingml/2006/main"/>
+                              <a:noAutofit/>
                             </wps:bodyPr>
                           </wps:wsp>
                         </a:graphicData>
@@ -2378,7 +2214,7 @@
                     </wp:inline>
                   </w:drawing>
                 </mc:Choice>
-                <mc:Fallback/>
+                <mc:Fallback xmlns:a14="http://schemas.microsoft.com/office/drawing/2010/main" xmlns:pic="http://schemas.openxmlformats.org/drawingml/2006/picture" xmlns:a="http://schemas.openxmlformats.org/drawingml/2006/main"/>
               </mc:AlternateContent>
             </w:r>
             <w:r>
@@ -2452,16 +2288,6 @@
                 <w:szCs w:val="20"/>
               </w:rPr>
               <w:t xml:space="preserve">   Abstracto</w:t>
-            </w:r>
-            <w:r>
-              <w:rPr>
-                <w:rFonts w:ascii="Tahoma" w:hAnsi="Tahoma" w:cs="Tahoma"/>
-              </w:rPr>
-            </w:r>
-            <w:r>
-              <w:rPr>
-                <w:rFonts w:ascii="Tahoma" w:hAnsi="Tahoma" w:cs="Tahoma"/>
-              </w:rPr>
             </w:r>
           </w:p>
         </w:tc>
@@ -2479,21 +2305,20 @@
           <w:tcPr>
             <w:tcW w:w="9071" w:type="dxa"/>
             <w:gridSpan w:val="4"/>
-            <w:tcMar/>
-          </w:tcPr>
-          <w:p>
-            <w:pPr>
-              <w:rPr>
-                <w:rFonts w:ascii="Tahoma" w:hAnsi="Tahoma" w:cs="Tahoma"/>
-                <w:sz w:val="20"/>
-                <w:szCs w:val="20"/>
-              </w:rPr>
-            </w:pPr>
-            <w:r>
-              <w:rPr>
-                <w:rFonts w:ascii="Tahoma" w:hAnsi="Tahoma" w:cs="Tahoma"/>
-                <w:b w:val="1"/>
-                <w:bCs w:val="1"/>
+          </w:tcPr>
+          <w:p>
+            <w:pPr>
+              <w:rPr>
+                <w:rFonts w:ascii="Tahoma" w:hAnsi="Tahoma" w:cs="Tahoma"/>
+                <w:sz w:val="20"/>
+                <w:szCs w:val="20"/>
+              </w:rPr>
+            </w:pPr>
+            <w:r>
+              <w:rPr>
+                <w:rFonts w:ascii="Tahoma" w:hAnsi="Tahoma" w:cs="Tahoma"/>
+                <w:b/>
+                <w:bCs/>
                 <w:sz w:val="20"/>
                 <w:szCs w:val="20"/>
               </w:rPr>
@@ -2529,41 +2354,28 @@
             <w:tcW w:w="9120" w:type="dxa"/>
             <w:gridSpan w:val="5"/>
             <w:shd w:val="clear" w:color="auto" w:fill="BFBFBF" w:themeFill="background1" w:themeFillShade="BF"/>
-            <w:tcMar/>
-          </w:tcPr>
-          <w:p>
-            <w:pPr>
-              <w:pStyle w:val="Normal"/>
-              <w:rPr>
-                <w:rFonts w:ascii="Tahoma" w:hAnsi="Tahoma" w:eastAsia="Tahoma" w:cs="Tahoma"/>
-                <w:b w:val="1"/>
-                <w:bCs w:val="1"/>
-                <w:color w:val="404040" w:themeColor="text1" w:themeTint="BF" w:themeShade="FF"/>
-                <w:sz w:val="20"/>
-                <w:szCs w:val="20"/>
-              </w:rPr>
-            </w:pPr>
-            <w:r>
-              <w:rPr>
-                <w:rFonts w:ascii="Tahoma" w:hAnsi="Tahoma" w:eastAsia="Tahoma" w:cs="Tahoma"/>
-                <w:b w:val="1"/>
-                <w:bCs w:val="1"/>
-                <w:color w:val="404040" w:themeColor="text1" w:themeTint="BF" w:themeShade="FF"/>
-                <w:sz w:val="20"/>
-                <w:szCs w:val="20"/>
-              </w:rPr>
-              <w:t>F</w:t>
-            </w:r>
-            <w:r>
-              <w:rPr>
-                <w:rFonts w:ascii="Tahoma" w:hAnsi="Tahoma" w:eastAsia="Tahoma" w:cs="Tahoma"/>
-                <w:b w:val="1"/>
-                <w:bCs w:val="1"/>
-                <w:color w:val="404040" w:themeColor="text1" w:themeTint="BF" w:themeShade="FF"/>
-                <w:sz w:val="20"/>
-                <w:szCs w:val="20"/>
-              </w:rPr>
-              <w:t>lujo Básico:</w:t>
+          </w:tcPr>
+          <w:p>
+            <w:pPr>
+              <w:rPr>
+                <w:rFonts w:ascii="Tahoma" w:eastAsia="Tahoma" w:hAnsi="Tahoma" w:cs="Tahoma"/>
+                <w:b/>
+                <w:bCs/>
+                <w:color w:val="404040" w:themeColor="text1" w:themeTint="BF"/>
+                <w:sz w:val="20"/>
+                <w:szCs w:val="20"/>
+              </w:rPr>
+            </w:pPr>
+            <w:r>
+              <w:rPr>
+                <w:rFonts w:ascii="Tahoma" w:eastAsia="Tahoma" w:hAnsi="Tahoma" w:cs="Tahoma"/>
+                <w:b/>
+                <w:bCs/>
+                <w:color w:val="404040" w:themeColor="text1" w:themeTint="BF"/>
+                <w:sz w:val="20"/>
+                <w:szCs w:val="20"/>
+              </w:rPr>
+              <w:t>Flujo Básico:</w:t>
             </w:r>
           </w:p>
         </w:tc>
@@ -2578,7 +2390,6 @@
           <w:tcPr>
             <w:tcW w:w="9120" w:type="dxa"/>
             <w:gridSpan w:val="5"/>
-            <w:tcMar/>
           </w:tcPr>
           <w:p>
             <w:pPr>
@@ -2617,7 +2428,6 @@
           <w:tcPr>
             <w:tcW w:w="9120" w:type="dxa"/>
             <w:gridSpan w:val="5"/>
-            <w:tcMar/>
           </w:tcPr>
           <w:p>
             <w:pPr>
@@ -2656,7 +2466,6 @@
           <w:tcPr>
             <w:tcW w:w="9120" w:type="dxa"/>
             <w:gridSpan w:val="5"/>
-            <w:tcMar/>
           </w:tcPr>
           <w:p>
             <w:pPr>
@@ -2695,7 +2504,6 @@
           <w:tcPr>
             <w:tcW w:w="9120" w:type="dxa"/>
             <w:gridSpan w:val="5"/>
-            <w:tcMar/>
           </w:tcPr>
           <w:p>
             <w:pPr>
@@ -2766,7 +2574,6 @@
           <w:tcPr>
             <w:tcW w:w="9120" w:type="dxa"/>
             <w:gridSpan w:val="5"/>
-            <w:tcMar/>
           </w:tcPr>
           <w:p>
             <w:pPr>
@@ -2806,26 +2613,24 @@
             <w:tcW w:w="9120" w:type="dxa"/>
             <w:gridSpan w:val="5"/>
             <w:shd w:val="clear" w:color="auto" w:fill="BFBFBF" w:themeFill="background1" w:themeFillShade="BF"/>
-            <w:tcMar/>
-          </w:tcPr>
-          <w:p>
-            <w:pPr>
-              <w:pStyle w:val="Normal"/>
-              <w:rPr>
-                <w:rFonts w:ascii="Tahoma" w:hAnsi="Tahoma" w:eastAsia="Tahoma" w:cs="Tahoma"/>
-                <w:b w:val="1"/>
-                <w:bCs w:val="1"/>
-                <w:color w:val="404040" w:themeColor="text1" w:themeTint="BF" w:themeShade="FF"/>
-                <w:sz w:val="20"/>
-                <w:szCs w:val="20"/>
-              </w:rPr>
-            </w:pPr>
-            <w:r>
-              <w:rPr>
-                <w:rFonts w:ascii="Tahoma" w:hAnsi="Tahoma" w:eastAsia="Tahoma" w:cs="Tahoma"/>
-                <w:b w:val="1"/>
-                <w:bCs w:val="1"/>
-                <w:color w:val="404040" w:themeColor="text1" w:themeTint="BF" w:themeShade="FF"/>
+          </w:tcPr>
+          <w:p>
+            <w:pPr>
+              <w:rPr>
+                <w:rFonts w:ascii="Tahoma" w:eastAsia="Tahoma" w:hAnsi="Tahoma" w:cs="Tahoma"/>
+                <w:b/>
+                <w:bCs/>
+                <w:color w:val="404040" w:themeColor="text1" w:themeTint="BF"/>
+                <w:sz w:val="20"/>
+                <w:szCs w:val="20"/>
+              </w:rPr>
+            </w:pPr>
+            <w:r>
+              <w:rPr>
+                <w:rFonts w:ascii="Tahoma" w:eastAsia="Tahoma" w:hAnsi="Tahoma" w:cs="Tahoma"/>
+                <w:b/>
+                <w:bCs/>
+                <w:color w:val="404040" w:themeColor="text1" w:themeTint="BF"/>
                 <w:sz w:val="20"/>
                 <w:szCs w:val="20"/>
               </w:rPr>
@@ -2833,10 +2638,10 @@
             </w:r>
             <w:r>
               <w:rPr>
-                <w:rFonts w:ascii="Tahoma" w:hAnsi="Tahoma" w:eastAsia="Tahoma" w:cs="Tahoma"/>
-                <w:b w:val="1"/>
-                <w:bCs w:val="1"/>
-                <w:color w:val="404040" w:themeColor="text1" w:themeTint="BF" w:themeShade="FF"/>
+                <w:rFonts w:ascii="Tahoma" w:eastAsia="Tahoma" w:hAnsi="Tahoma" w:cs="Tahoma"/>
+                <w:b/>
+                <w:bCs/>
+                <w:color w:val="404040" w:themeColor="text1" w:themeTint="BF"/>
                 <w:sz w:val="20"/>
                 <w:szCs w:val="20"/>
               </w:rPr>
@@ -2855,7 +2660,6 @@
           <w:tcPr>
             <w:tcW w:w="9120" w:type="dxa"/>
             <w:gridSpan w:val="5"/>
-            <w:tcMar/>
           </w:tcPr>
           <w:p>
             <w:pPr>
@@ -2873,6 +2677,37 @@
                 <w:szCs w:val="20"/>
               </w:rPr>
               <w:t>A2. En caso de que el usuario al presionar no encuentre una actividad en la lista predeterminada de actividades, se llama al caso de uso registrar actividades.</w:t>
+            </w:r>
+          </w:p>
+        </w:tc>
+      </w:tr>
+      <w:tr>
+        <w:trPr>
+          <w:trHeight w:val="285"/>
+          <w:tblCellSpacing w:w="20" w:type="dxa"/>
+          <w:jc w:val="center"/>
+        </w:trPr>
+        <w:tc>
+          <w:tcPr>
+            <w:tcW w:w="9120" w:type="dxa"/>
+            <w:gridSpan w:val="5"/>
+          </w:tcPr>
+          <w:p>
+            <w:pPr>
+              <w:jc w:val="both"/>
+              <w:rPr>
+                <w:rFonts w:ascii="Tahoma" w:hAnsi="Tahoma" w:cs="Tahoma"/>
+                <w:sz w:val="20"/>
+                <w:szCs w:val="20"/>
+              </w:rPr>
+            </w:pPr>
+            <w:r>
+              <w:rPr>
+                <w:rFonts w:ascii="Tahoma" w:hAnsi="Tahoma" w:cs="Tahoma"/>
+                <w:sz w:val="20"/>
+                <w:szCs w:val="20"/>
+              </w:rPr>
+              <w:t>A3. En caso de que el usuario al presionar no encuentre una actividad en la lista predeterminada de categorías, se llama al caso de uso de registrar categoría.</w:t>
             </w:r>
           </w:p>
         </w:tc>
@@ -2890,7 +2725,6 @@
           <w:tcPr>
             <w:tcW w:w="9071" w:type="dxa"/>
             <w:gridSpan w:val="4"/>
-            <w:tcMar/>
           </w:tcPr>
           <w:p>
             <w:pPr>
@@ -2949,7 +2783,6 @@
           <w:tcPr>
             <w:tcW w:w="9071" w:type="dxa"/>
             <w:gridSpan w:val="4"/>
-            <w:tcMar/>
           </w:tcPr>
           <w:p>
             <w:pPr>
@@ -3004,7 +2837,6 @@
           <w:tcPr>
             <w:tcW w:w="9071" w:type="dxa"/>
             <w:gridSpan w:val="4"/>
-            <w:tcMar/>
           </w:tcPr>
           <w:p>
             <w:pPr>
@@ -3051,7 +2883,6 @@
           <w:tcPr>
             <w:tcW w:w="9071" w:type="dxa"/>
             <w:gridSpan w:val="4"/>
-            <w:tcMar/>
           </w:tcPr>
           <w:p>
             <w:pPr>
@@ -3096,7 +2927,6 @@
           <w:tcPr>
             <w:tcW w:w="9071" w:type="dxa"/>
             <w:gridSpan w:val="4"/>
-            <w:tcMar/>
           </w:tcPr>
           <w:p>
             <w:pPr>
@@ -3141,38 +2971,26 @@
           <w:tcPr>
             <w:tcW w:w="9071" w:type="dxa"/>
             <w:gridSpan w:val="4"/>
-            <w:tcMar/>
-          </w:tcPr>
-          <w:p>
-            <w:pPr>
-              <w:pStyle w:val="Normal"/>
+          </w:tcPr>
+          <w:p>
+            <w:pPr>
               <w:rPr>
                 <w:rFonts w:cs="Tahoma"/>
-                <w:b w:val="1"/>
-                <w:bCs w:val="1"/>
-                <w:sz w:val="20"/>
-                <w:szCs w:val="20"/>
-              </w:rPr>
-            </w:pPr>
-            <w:r>
-              <w:rPr>
-                <w:rFonts w:ascii="Tahoma" w:hAnsi="Tahoma" w:eastAsia="Tahoma" w:cs="Tahoma"/>
-                <w:b w:val="1"/>
-                <w:bCs w:val="1"/>
-                <w:sz w:val="20"/>
-                <w:szCs w:val="20"/>
-              </w:rPr>
-              <w:t>Use Case de Generalización:</w:t>
-            </w:r>
-            <w:r>
-              <w:rPr>
-                <w:rFonts w:ascii="Tahoma" w:hAnsi="Tahoma" w:eastAsia="Tahoma" w:cs="Tahoma"/>
-                <w:b w:val="1"/>
-                <w:bCs w:val="1"/>
-                <w:sz w:val="20"/>
-                <w:szCs w:val="20"/>
-              </w:rPr>
-              <w:t xml:space="preserve"> </w:t>
+                <w:b/>
+                <w:bCs/>
+                <w:sz w:val="20"/>
+                <w:szCs w:val="20"/>
+              </w:rPr>
+            </w:pPr>
+            <w:r>
+              <w:rPr>
+                <w:rFonts w:ascii="Tahoma" w:eastAsia="Tahoma" w:hAnsi="Tahoma" w:cs="Tahoma"/>
+                <w:b/>
+                <w:bCs/>
+                <w:sz w:val="20"/>
+                <w:szCs w:val="20"/>
+              </w:rPr>
+              <w:t xml:space="preserve">Use Case de Generalización: </w:t>
             </w:r>
             <w:r>
               <w:rPr>
@@ -3197,13 +3015,11 @@
           <w:tcPr>
             <w:tcW w:w="5755" w:type="dxa"/>
             <w:gridSpan w:val="2"/>
-            <w:tcMar/>
-          </w:tcPr>
-          <w:p>
-            <w:pPr>
-              <w:pStyle w:val="Normal"/>
+          </w:tcPr>
+          <w:p>
+            <w:pPr>
               <w:tabs>
-                <w:tab w:val="right" w:leader="none" w:pos="1988"/>
+                <w:tab w:val="right" w:pos="1988"/>
               </w:tabs>
               <w:rPr>
                 <w:rFonts w:cs="Tahoma"/>
@@ -3213,37 +3029,20 @@
             </w:pPr>
             <w:r>
               <w:rPr>
-                <w:rFonts w:ascii="Tahoma" w:hAnsi="Tahoma" w:eastAsia="Tahoma" w:cs="Tahoma"/>
-                <w:b w:val="1"/>
-                <w:bCs w:val="1"/>
-                <w:sz w:val="20"/>
-                <w:szCs w:val="20"/>
-              </w:rPr>
-              <w:t>Autor:</w:t>
-            </w:r>
-            <w:r>
-              <w:rPr>
-                <w:rFonts w:ascii="Tahoma" w:hAnsi="Tahoma" w:eastAsia="Tahoma" w:cs="Tahoma"/>
-                <w:b w:val="1"/>
-                <w:bCs w:val="1"/>
-                <w:sz w:val="20"/>
-                <w:szCs w:val="20"/>
-              </w:rPr>
-              <w:t xml:space="preserve"> </w:t>
-            </w:r>
-            <w:r>
-              <w:rPr>
-                <w:sz w:val="20"/>
-                <w:szCs w:val="20"/>
-              </w:rPr>
-              <w:t>Agüero/Borgo/Medin</w:t>
-            </w:r>
-            <w:r>
-              <w:rPr>
-                <w:sz w:val="20"/>
-                <w:szCs w:val="20"/>
-              </w:rPr>
-              <w:t>a</w:t>
+                <w:rFonts w:ascii="Tahoma" w:eastAsia="Tahoma" w:hAnsi="Tahoma" w:cs="Tahoma"/>
+                <w:b/>
+                <w:bCs/>
+                <w:sz w:val="20"/>
+                <w:szCs w:val="20"/>
+              </w:rPr>
+              <w:t xml:space="preserve">Autor: </w:t>
+            </w:r>
+            <w:r>
+              <w:rPr>
+                <w:sz w:val="20"/>
+                <w:szCs w:val="20"/>
+              </w:rPr>
+              <w:t>Agüero/Borgo/Medina</w:t>
             </w:r>
           </w:p>
         </w:tc>
@@ -3251,11 +3050,9 @@
           <w:tcPr>
             <w:tcW w:w="3276" w:type="dxa"/>
             <w:gridSpan w:val="2"/>
-            <w:tcMar/>
-          </w:tcPr>
-          <w:p>
-            <w:pPr>
-              <w:pStyle w:val="Normal"/>
+          </w:tcPr>
+          <w:p>
+            <w:pPr>
               <w:rPr>
                 <w:rFonts w:cs="Tahoma"/>
                 <w:sz w:val="20"/>
@@ -3264,14 +3061,13 @@
             </w:pPr>
             <w:r>
               <w:rPr>
-                <w:rFonts w:ascii="Tahoma" w:hAnsi="Tahoma" w:eastAsia="Tahoma" w:cs="Tahoma"/>
+                <w:rFonts w:ascii="Tahoma" w:eastAsia="Tahoma" w:hAnsi="Tahoma" w:cs="Tahoma"/>
                 <w:sz w:val="20"/>
                 <w:szCs w:val="20"/>
               </w:rPr>
               <w:t>Fecha Creación:</w:t>
             </w:r>
             <w:r>
-              <w:rPr/>
               <w:t xml:space="preserve"> 05/10/2026</w:t>
             </w:r>
           </w:p>
@@ -3290,38 +3086,26 @@
           <w:tcPr>
             <w:tcW w:w="5755" w:type="dxa"/>
             <w:gridSpan w:val="2"/>
-            <w:tcMar/>
-          </w:tcPr>
-          <w:p>
-            <w:pPr>
-              <w:pStyle w:val="Normal"/>
-              <w:rPr>
-                <w:rFonts w:ascii="Tahoma" w:hAnsi="Tahoma" w:eastAsia="Tahoma" w:cs="Tahoma"/>
-                <w:b w:val="1"/>
-                <w:bCs w:val="1"/>
-                <w:sz w:val="20"/>
-                <w:szCs w:val="20"/>
-              </w:rPr>
-            </w:pPr>
-            <w:r>
-              <w:rPr>
-                <w:rFonts w:ascii="Tahoma" w:hAnsi="Tahoma" w:eastAsia="Tahoma" w:cs="Tahoma"/>
-                <w:b w:val="1"/>
-                <w:bCs w:val="1"/>
-                <w:sz w:val="20"/>
-                <w:szCs w:val="20"/>
-              </w:rPr>
-              <w:t>Autor Última Modificación:</w:t>
-            </w:r>
-            <w:r>
-              <w:rPr>
-                <w:rFonts w:ascii="Tahoma" w:hAnsi="Tahoma" w:eastAsia="Tahoma" w:cs="Tahoma"/>
-                <w:b w:val="1"/>
-                <w:bCs w:val="1"/>
-                <w:sz w:val="20"/>
-                <w:szCs w:val="20"/>
-              </w:rPr>
-              <w:t xml:space="preserve"> </w:t>
+          </w:tcPr>
+          <w:p>
+            <w:pPr>
+              <w:rPr>
+                <w:rFonts w:ascii="Tahoma" w:eastAsia="Tahoma" w:hAnsi="Tahoma" w:cs="Tahoma"/>
+                <w:b/>
+                <w:bCs/>
+                <w:sz w:val="20"/>
+                <w:szCs w:val="20"/>
+              </w:rPr>
+            </w:pPr>
+            <w:r>
+              <w:rPr>
+                <w:rFonts w:ascii="Tahoma" w:eastAsia="Tahoma" w:hAnsi="Tahoma" w:cs="Tahoma"/>
+                <w:b/>
+                <w:bCs/>
+                <w:sz w:val="20"/>
+                <w:szCs w:val="20"/>
+              </w:rPr>
+              <w:t xml:space="preserve">Autor Última Modificación: </w:t>
             </w:r>
           </w:p>
         </w:tc>
@@ -3329,24 +3113,22 @@
           <w:tcPr>
             <w:tcW w:w="3276" w:type="dxa"/>
             <w:gridSpan w:val="2"/>
-            <w:tcMar/>
-          </w:tcPr>
-          <w:p>
-            <w:pPr>
-              <w:pStyle w:val="Normal"/>
-              <w:rPr>
-                <w:rFonts w:ascii="Tahoma" w:hAnsi="Tahoma" w:eastAsia="Tahoma" w:cs="Tahoma"/>
-                <w:b w:val="1"/>
-                <w:bCs w:val="1"/>
-                <w:sz w:val="20"/>
-                <w:szCs w:val="20"/>
-              </w:rPr>
-            </w:pPr>
-            <w:r>
-              <w:rPr>
-                <w:rFonts w:ascii="Tahoma" w:hAnsi="Tahoma" w:eastAsia="Tahoma" w:cs="Tahoma"/>
-                <w:b w:val="1"/>
-                <w:bCs w:val="1"/>
+          </w:tcPr>
+          <w:p>
+            <w:pPr>
+              <w:rPr>
+                <w:rFonts w:ascii="Tahoma" w:eastAsia="Tahoma" w:hAnsi="Tahoma" w:cs="Tahoma"/>
+                <w:b/>
+                <w:bCs/>
+                <w:sz w:val="20"/>
+                <w:szCs w:val="20"/>
+              </w:rPr>
+            </w:pPr>
+            <w:r>
+              <w:rPr>
+                <w:rFonts w:ascii="Tahoma" w:eastAsia="Tahoma" w:hAnsi="Tahoma" w:cs="Tahoma"/>
+                <w:b/>
+                <w:bCs/>
                 <w:sz w:val="20"/>
                 <w:szCs w:val="20"/>
               </w:rPr>
@@ -3390,27 +3172,27 @@
       <w:pPr>
         <w:pStyle w:val="Ttulo2"/>
         <w:rPr>
-          <w:b w:val="1"/>
-          <w:bCs w:val="1"/>
-          <w:u w:val="none"/>
-        </w:rPr>
-      </w:pPr>
-      <w:bookmarkStart w:name="_Toc292187718" w:id="1436358513"/>
-      <w:r>
-        <w:rPr>
-          <w:b w:val="1"/>
-          <w:bCs w:val="1"/>
-          <w:u w:val="none"/>
-        </w:rPr>
+          <w:b/>
+          <w:bCs/>
+        </w:rPr>
+      </w:pPr>
+      <w:bookmarkStart w:id="5" w:name="_Toc292187718"/>
+      <w:r>
+        <w:rPr>
+          <w:b/>
+          <w:bCs/>
+        </w:rPr>
+        <w:lastRenderedPageBreak/>
         <w:t>Prototipo de Registrar nuevo retiro</w:t>
       </w:r>
-      <w:bookmarkEnd w:id="1436358513"/>
+      <w:bookmarkEnd w:id="5"/>
     </w:p>
     <w:p>
       <w:r>
         <w:rPr>
           <w:b/>
           <w:bCs/>
+          <w:noProof/>
           <w:u w:val="single"/>
         </w:rPr>
         <w:drawing>
@@ -3483,6 +3265,7 @@
         <w:rPr>
           <w:b/>
           <w:bCs/>
+          <w:noProof/>
           <w:u w:val="single"/>
         </w:rPr>
         <w:drawing>
@@ -3635,8 +3418,10 @@
         <w:rPr>
           <w:b/>
           <w:bCs/>
+          <w:noProof/>
           <w:u w:val="single"/>
         </w:rPr>
+        <w:lastRenderedPageBreak/>
         <w:drawing>
           <wp:inline distT="0" distB="0" distL="0" distR="0" wp14:anchorId="640351ED" wp14:editId="218B41C9">
             <wp:extent cx="2590800" cy="7895187"/>
@@ -3712,6 +3497,7 @@
           <w:bCs/>
           <w:color w:val="333399"/>
         </w:rPr>
+        <w:lastRenderedPageBreak/>
         <w:t>Plantilla para Descripción de Use Cases  (Trazo Intermedio)</w:t>
       </w:r>
     </w:p>
@@ -3737,12 +3523,12 @@
         <w:jc w:val="center"/>
         <w:tblCellSpacing w:w="20" w:type="dxa"/>
         <w:tblBorders>
-          <w:top w:val="outset" w:color="auto" w:sz="6" w:space="0"/>
-          <w:left w:val="outset" w:color="auto" w:sz="6" w:space="0"/>
-          <w:bottom w:val="outset" w:color="auto" w:sz="6" w:space="0"/>
-          <w:right w:val="outset" w:color="auto" w:sz="6" w:space="0"/>
-          <w:insideH w:val="outset" w:color="auto" w:sz="6" w:space="0"/>
-          <w:insideV w:val="outset" w:color="auto" w:sz="6" w:space="0"/>
+          <w:top w:val="outset" w:sz="6" w:space="0" w:color="auto"/>
+          <w:left w:val="outset" w:sz="6" w:space="0" w:color="auto"/>
+          <w:bottom w:val="outset" w:sz="6" w:space="0" w:color="auto"/>
+          <w:right w:val="outset" w:sz="6" w:space="0" w:color="auto"/>
+          <w:insideH w:val="outset" w:sz="6" w:space="0" w:color="auto"/>
+          <w:insideV w:val="outset" w:sz="6" w:space="0" w:color="auto"/>
         </w:tblBorders>
         <w:tblLayout w:type="fixed"/>
         <w:tblCellMar>
@@ -3771,7 +3557,6 @@
           <w:tcPr>
             <w:tcW w:w="10056" w:type="dxa"/>
             <w:gridSpan w:val="4"/>
-            <w:tcMar/>
           </w:tcPr>
           <w:p>
             <w:pPr>
@@ -3806,7 +3591,6 @@
             <w:tcW w:w="6977" w:type="dxa"/>
             <w:gridSpan w:val="3"/>
             <w:shd w:val="clear" w:color="auto" w:fill="C0C0C0"/>
-            <w:tcMar/>
           </w:tcPr>
           <w:p>
             <w:pPr>
@@ -3844,7 +3628,6 @@
           <w:tcPr>
             <w:tcW w:w="3039" w:type="dxa"/>
             <w:shd w:val="clear" w:color="auto" w:fill="C0C0C0"/>
-            <w:tcMar/>
           </w:tcPr>
           <w:p>
             <w:pPr>
@@ -3884,7 +3667,6 @@
         <w:tc>
           <w:tcPr>
             <w:tcW w:w="4329" w:type="dxa"/>
-            <w:tcMar/>
           </w:tcPr>
           <w:p>
             <w:pPr>
@@ -3915,7 +3697,6 @@
           <w:tcPr>
             <w:tcW w:w="5687" w:type="dxa"/>
             <w:gridSpan w:val="3"/>
-            <w:tcMar/>
           </w:tcPr>
           <w:p>
             <w:pPr>
@@ -3955,7 +3736,6 @@
           <w:tcPr>
             <w:tcW w:w="10056" w:type="dxa"/>
             <w:gridSpan w:val="4"/>
-            <w:tcMar/>
           </w:tcPr>
           <w:p>
             <w:pPr>
@@ -4041,7 +3821,7 @@
                     </wp:anchor>
                   </w:drawing>
                 </mc:Choice>
-                <mc:Fallback xmlns:w16sdtfl="http://schemas.microsoft.com/office/word/2024/wordml/sdtformatlock" xmlns:w16du="http://schemas.microsoft.com/office/word/2023/wordml/word16du">
+                <mc:Fallback xmlns:w16du="http://schemas.microsoft.com/office/word/2023/wordml/word16du" xmlns:w16sdtfl="http://schemas.microsoft.com/office/word/2024/wordml/sdtformatlock" xmlns:a14="http://schemas.microsoft.com/office/drawing/2010/main" xmlns:pic="http://schemas.openxmlformats.org/drawingml/2006/picture" xmlns:a="http://schemas.openxmlformats.org/drawingml/2006/main">
                   <w:pict w14:anchorId="6873BC2E">
                     <v:shapetype id="_x0000_t11" coordsize="21600,21600" o:spt="11" adj="5400" path="m@0,l@0@0,0@0,0@2@0@2@0,21600@1,21600@1@2,21600@2,21600@0@1@0@1,xe" w14:anchorId="3CE4F9DD">
                       <v:stroke joinstyle="miter"/>
@@ -4200,7 +3980,6 @@
           <w:tcPr>
             <w:tcW w:w="10056" w:type="dxa"/>
             <w:gridSpan w:val="4"/>
-            <w:tcMar/>
           </w:tcPr>
           <w:p>
             <w:pPr>
@@ -4254,25 +4033,23 @@
             <w:tcW w:w="10101" w:type="dxa"/>
             <w:gridSpan w:val="5"/>
             <w:shd w:val="clear" w:color="auto" w:fill="BFBFBF" w:themeFill="background1" w:themeFillShade="BF"/>
-            <w:tcMar/>
-          </w:tcPr>
-          <w:p>
-            <w:pPr>
-              <w:pStyle w:val="Normal"/>
-              <w:rPr>
-                <w:rFonts w:ascii="Tahoma" w:hAnsi="Tahoma" w:eastAsia="Tahoma" w:cs="Tahoma"/>
-                <w:b w:val="1"/>
-                <w:bCs w:val="1"/>
-                <w:color w:val="808080" w:themeColor="background1" w:themeTint="FF" w:themeShade="80"/>
-                <w:sz w:val="20"/>
-                <w:szCs w:val="20"/>
-              </w:rPr>
-            </w:pPr>
-            <w:r>
-              <w:rPr>
-                <w:rFonts w:ascii="Tahoma" w:hAnsi="Tahoma" w:eastAsia="Tahoma" w:cs="Tahoma"/>
-                <w:b w:val="1"/>
-                <w:bCs w:val="1"/>
+          </w:tcPr>
+          <w:p>
+            <w:pPr>
+              <w:rPr>
+                <w:rFonts w:ascii="Tahoma" w:eastAsia="Tahoma" w:hAnsi="Tahoma" w:cs="Tahoma"/>
+                <w:b/>
+                <w:bCs/>
+                <w:color w:val="808080" w:themeColor="background1" w:themeShade="80"/>
+                <w:sz w:val="20"/>
+                <w:szCs w:val="20"/>
+              </w:rPr>
+            </w:pPr>
+            <w:r>
+              <w:rPr>
+                <w:rFonts w:ascii="Tahoma" w:eastAsia="Tahoma" w:hAnsi="Tahoma" w:cs="Tahoma"/>
+                <w:b/>
+                <w:bCs/>
                 <w:sz w:val="20"/>
                 <w:szCs w:val="20"/>
               </w:rPr>
@@ -4280,9 +4057,9 @@
             </w:r>
             <w:r>
               <w:rPr>
-                <w:rFonts w:ascii="Tahoma" w:hAnsi="Tahoma" w:eastAsia="Tahoma" w:cs="Tahoma"/>
-                <w:b w:val="1"/>
-                <w:bCs w:val="1"/>
+                <w:rFonts w:ascii="Tahoma" w:eastAsia="Tahoma" w:hAnsi="Tahoma" w:cs="Tahoma"/>
+                <w:b/>
+                <w:bCs/>
                 <w:sz w:val="20"/>
                 <w:szCs w:val="20"/>
               </w:rPr>
@@ -4301,7 +4078,6 @@
           <w:tcPr>
             <w:tcW w:w="10101" w:type="dxa"/>
             <w:gridSpan w:val="5"/>
-            <w:tcMar/>
           </w:tcPr>
           <w:p>
             <w:pPr>
@@ -4336,7 +4112,6 @@
           <w:tcPr>
             <w:tcW w:w="10101" w:type="dxa"/>
             <w:gridSpan w:val="5"/>
-            <w:tcMar/>
           </w:tcPr>
           <w:p>
             <w:pPr>
@@ -4371,7 +4146,6 @@
           <w:tcPr>
             <w:tcW w:w="10101" w:type="dxa"/>
             <w:gridSpan w:val="5"/>
-            <w:tcMar/>
           </w:tcPr>
           <w:p>
             <w:pPr>
@@ -4406,7 +4180,6 @@
           <w:tcPr>
             <w:tcW w:w="10101" w:type="dxa"/>
             <w:gridSpan w:val="5"/>
-            <w:tcMar/>
           </w:tcPr>
           <w:p>
             <w:pPr>
@@ -4457,7 +4230,6 @@
           <w:tcPr>
             <w:tcW w:w="10101" w:type="dxa"/>
             <w:gridSpan w:val="5"/>
-            <w:tcMar/>
           </w:tcPr>
           <w:p>
             <w:pPr>
@@ -4493,24 +4265,22 @@
             <w:tcW w:w="10101" w:type="dxa"/>
             <w:gridSpan w:val="5"/>
             <w:shd w:val="clear" w:color="auto" w:fill="BFBFBF" w:themeFill="background1" w:themeFillShade="BF"/>
-            <w:tcMar/>
-          </w:tcPr>
-          <w:p>
-            <w:pPr>
-              <w:pStyle w:val="Normal"/>
-              <w:rPr>
-                <w:rFonts w:ascii="Tahoma" w:hAnsi="Tahoma" w:eastAsia="Tahoma" w:cs="Tahoma"/>
-                <w:b w:val="1"/>
-                <w:bCs w:val="1"/>
-                <w:sz w:val="20"/>
-                <w:szCs w:val="20"/>
-              </w:rPr>
-            </w:pPr>
-            <w:r>
-              <w:rPr>
-                <w:rFonts w:ascii="Tahoma" w:hAnsi="Tahoma" w:eastAsia="Tahoma" w:cs="Tahoma"/>
-                <w:b w:val="1"/>
-                <w:bCs w:val="1"/>
+          </w:tcPr>
+          <w:p>
+            <w:pPr>
+              <w:rPr>
+                <w:rFonts w:ascii="Tahoma" w:eastAsia="Tahoma" w:hAnsi="Tahoma" w:cs="Tahoma"/>
+                <w:b/>
+                <w:bCs/>
+                <w:sz w:val="20"/>
+                <w:szCs w:val="20"/>
+              </w:rPr>
+            </w:pPr>
+            <w:r>
+              <w:rPr>
+                <w:rFonts w:ascii="Tahoma" w:eastAsia="Tahoma" w:hAnsi="Tahoma" w:cs="Tahoma"/>
+                <w:b/>
+                <w:bCs/>
                 <w:sz w:val="20"/>
                 <w:szCs w:val="20"/>
               </w:rPr>
@@ -4518,9 +4288,9 @@
             </w:r>
             <w:r>
               <w:rPr>
-                <w:rFonts w:ascii="Tahoma" w:hAnsi="Tahoma" w:eastAsia="Tahoma" w:cs="Tahoma"/>
-                <w:b w:val="1"/>
-                <w:bCs w:val="1"/>
+                <w:rFonts w:ascii="Tahoma" w:eastAsia="Tahoma" w:hAnsi="Tahoma" w:cs="Tahoma"/>
+                <w:b/>
+                <w:bCs/>
                 <w:sz w:val="20"/>
                 <w:szCs w:val="20"/>
               </w:rPr>
@@ -4539,7 +4309,6 @@
           <w:tcPr>
             <w:tcW w:w="10101" w:type="dxa"/>
             <w:gridSpan w:val="5"/>
-            <w:tcMar/>
           </w:tcPr>
           <w:p>
             <w:pPr>
@@ -4571,7 +4340,6 @@
           <w:tcPr>
             <w:tcW w:w="10056" w:type="dxa"/>
             <w:gridSpan w:val="4"/>
-            <w:tcMar/>
           </w:tcPr>
           <w:p>
             <w:pPr>
@@ -4655,7 +4423,6 @@
           <w:tcPr>
             <w:tcW w:w="10056" w:type="dxa"/>
             <w:gridSpan w:val="4"/>
-            <w:tcMar/>
           </w:tcPr>
           <w:p>
             <w:pPr>
@@ -4691,7 +4458,6 @@
           <w:tcPr>
             <w:tcW w:w="10056" w:type="dxa"/>
             <w:gridSpan w:val="4"/>
-            <w:tcMar/>
           </w:tcPr>
           <w:p>
             <w:pPr>
@@ -4727,7 +4493,6 @@
           <w:tcPr>
             <w:tcW w:w="10056" w:type="dxa"/>
             <w:gridSpan w:val="4"/>
-            <w:tcMar/>
           </w:tcPr>
           <w:p>
             <w:pPr>
@@ -4763,7 +4528,6 @@
           <w:tcPr>
             <w:tcW w:w="10056" w:type="dxa"/>
             <w:gridSpan w:val="4"/>
-            <w:tcMar/>
           </w:tcPr>
           <w:p>
             <w:pPr>
@@ -4799,11 +4563,9 @@
           <w:tcPr>
             <w:tcW w:w="10056" w:type="dxa"/>
             <w:gridSpan w:val="4"/>
-            <w:tcMar/>
-          </w:tcPr>
-          <w:p>
-            <w:pPr>
-              <w:pStyle w:val="Normal"/>
+          </w:tcPr>
+          <w:p>
+            <w:pPr>
               <w:rPr>
                 <w:rFonts w:cs="Tahoma"/>
                 <w:sz w:val="20"/>
@@ -4812,16 +4574,15 @@
             </w:pPr>
             <w:r>
               <w:rPr>
-                <w:rFonts w:ascii="Tahoma" w:hAnsi="Tahoma" w:eastAsia="Tahoma" w:cs="Tahoma"/>
-                <w:b w:val="1"/>
-                <w:bCs w:val="1"/>
+                <w:rFonts w:ascii="Tahoma" w:eastAsia="Tahoma" w:hAnsi="Tahoma" w:cs="Tahoma"/>
+                <w:b/>
+                <w:bCs/>
                 <w:sz w:val="20"/>
                 <w:szCs w:val="20"/>
               </w:rPr>
               <w:t>Use Case de Generalización:</w:t>
             </w:r>
             <w:r>
-              <w:rPr/>
               <w:t xml:space="preserve"> </w:t>
             </w:r>
             <w:r>
@@ -4846,13 +4607,11 @@
           <w:tcPr>
             <w:tcW w:w="6383" w:type="dxa"/>
             <w:gridSpan w:val="2"/>
-            <w:tcMar/>
-          </w:tcPr>
-          <w:p>
-            <w:pPr>
-              <w:pStyle w:val="Normal"/>
+          </w:tcPr>
+          <w:p>
+            <w:pPr>
               <w:tabs>
-                <w:tab w:val="right" w:leader="none" w:pos="1988"/>
+                <w:tab w:val="right" w:pos="1988"/>
               </w:tabs>
               <w:rPr>
                 <w:rFonts w:cs="Tahoma"/>
@@ -4862,16 +4621,15 @@
             </w:pPr>
             <w:r>
               <w:rPr>
-                <w:rFonts w:ascii="Tahoma" w:hAnsi="Tahoma" w:eastAsia="Tahoma" w:cs="Tahoma"/>
-                <w:b w:val="1"/>
-                <w:bCs w:val="1"/>
+                <w:rFonts w:ascii="Tahoma" w:eastAsia="Tahoma" w:hAnsi="Tahoma" w:cs="Tahoma"/>
+                <w:b/>
+                <w:bCs/>
                 <w:sz w:val="20"/>
                 <w:szCs w:val="20"/>
               </w:rPr>
               <w:t>Autor:</w:t>
             </w:r>
             <w:r>
-              <w:rPr/>
               <w:t xml:space="preserve"> </w:t>
             </w:r>
             <w:r>
@@ -4890,11 +4648,9 @@
           <w:tcPr>
             <w:tcW w:w="3633" w:type="dxa"/>
             <w:gridSpan w:val="2"/>
-            <w:tcMar/>
-          </w:tcPr>
-          <w:p>
-            <w:pPr>
-              <w:pStyle w:val="Normal"/>
+          </w:tcPr>
+          <w:p>
+            <w:pPr>
               <w:rPr>
                 <w:rFonts w:cs="Tahoma"/>
                 <w:sz w:val="20"/>
@@ -4903,9 +4659,9 @@
             </w:pPr>
             <w:r>
               <w:rPr>
-                <w:rFonts w:ascii="Tahoma" w:hAnsi="Tahoma" w:eastAsia="Tahoma" w:cs="Tahoma"/>
-                <w:b w:val="1"/>
-                <w:bCs w:val="1"/>
+                <w:rFonts w:ascii="Tahoma" w:eastAsia="Tahoma" w:hAnsi="Tahoma" w:cs="Tahoma"/>
+                <w:b/>
+                <w:bCs/>
                 <w:sz w:val="20"/>
                 <w:szCs w:val="20"/>
               </w:rPr>
@@ -4933,11 +4689,9 @@
           <w:tcPr>
             <w:tcW w:w="6383" w:type="dxa"/>
             <w:gridSpan w:val="2"/>
-            <w:tcMar/>
-          </w:tcPr>
-          <w:p>
-            <w:pPr>
-              <w:pStyle w:val="Normal"/>
+          </w:tcPr>
+          <w:p>
+            <w:pPr>
               <w:rPr>
                 <w:rFonts w:cs="Tahoma"/>
                 <w:sz w:val="20"/>
@@ -4946,16 +4700,15 @@
             </w:pPr>
             <w:r>
               <w:rPr>
-                <w:rFonts w:ascii="Tahoma" w:hAnsi="Tahoma" w:eastAsia="Tahoma" w:cs="Tahoma"/>
-                <w:b w:val="1"/>
-                <w:bCs w:val="1"/>
+                <w:rFonts w:ascii="Tahoma" w:eastAsia="Tahoma" w:hAnsi="Tahoma" w:cs="Tahoma"/>
+                <w:b/>
+                <w:bCs/>
                 <w:sz w:val="20"/>
                 <w:szCs w:val="20"/>
               </w:rPr>
               <w:t>Autor Última Modificación:</w:t>
             </w:r>
             <w:r>
-              <w:rPr/>
               <w:t xml:space="preserve"> </w:t>
             </w:r>
             <w:r>
@@ -4971,11 +4724,9 @@
           <w:tcPr>
             <w:tcW w:w="3633" w:type="dxa"/>
             <w:gridSpan w:val="2"/>
-            <w:tcMar/>
-          </w:tcPr>
-          <w:p>
-            <w:pPr>
-              <w:pStyle w:val="Normal"/>
+          </w:tcPr>
+          <w:p>
+            <w:pPr>
               <w:rPr>
                 <w:rFonts w:cs="Tahoma"/>
                 <w:sz w:val="20"/>
@@ -4984,9 +4735,9 @@
             </w:pPr>
             <w:r>
               <w:rPr>
-                <w:rFonts w:ascii="Tahoma" w:hAnsi="Tahoma" w:eastAsia="Tahoma" w:cs="Tahoma"/>
-                <w:b w:val="1"/>
-                <w:bCs w:val="1"/>
+                <w:rFonts w:ascii="Tahoma" w:eastAsia="Tahoma" w:hAnsi="Tahoma" w:cs="Tahoma"/>
+                <w:b/>
+                <w:bCs/>
                 <w:sz w:val="20"/>
                 <w:szCs w:val="20"/>
               </w:rPr>
@@ -4994,9 +4745,9 @@
             </w:r>
             <w:r>
               <w:rPr>
-                <w:rFonts w:ascii="Tahoma" w:hAnsi="Tahoma" w:eastAsia="Tahoma" w:cs="Tahoma"/>
-                <w:b w:val="1"/>
-                <w:bCs w:val="1"/>
+                <w:rFonts w:ascii="Tahoma" w:eastAsia="Tahoma" w:hAnsi="Tahoma" w:cs="Tahoma"/>
+                <w:b/>
+                <w:bCs/>
                 <w:sz w:val="20"/>
                 <w:szCs w:val="20"/>
               </w:rPr>
@@ -5015,15 +4766,10 @@
     </w:tbl>
     <w:p>
       <w:pPr>
-        <w:pStyle w:val="Normal"/>
-        <w:tabs>
-          <w:tab w:val="clear" w:leader="none" w:pos="4252"/>
-          <w:tab w:val="clear" w:leader="none" w:pos="8504"/>
-        </w:tabs>
         <w:jc w:val="center"/>
         <w:rPr>
-          <w:b w:val="1"/>
-          <w:bCs w:val="1"/>
+          <w:b/>
+          <w:bCs/>
           <w:u w:val="single"/>
         </w:rPr>
       </w:pPr>
@@ -5032,8 +4778,8 @@
       <w:pPr>
         <w:pStyle w:val="Ttulo2"/>
         <w:rPr>
-          <w:b w:val="1"/>
-          <w:bCs w:val="1"/>
+          <w:b/>
+          <w:bCs/>
           <w:u w:val="single"/>
         </w:rPr>
       </w:pPr>
@@ -5047,21 +4793,20 @@
       <w:pPr>
         <w:pStyle w:val="Ttulo2"/>
         <w:rPr>
-          <w:b w:val="1"/>
-          <w:bCs w:val="1"/>
-          <w:u w:val="none"/>
-        </w:rPr>
-      </w:pPr>
-      <w:bookmarkStart w:name="_Toc1758631309" w:id="668379657"/>
-      <w:r>
-        <w:rPr>
-          <w:b w:val="1"/>
-          <w:bCs w:val="1"/>
-          <w:u w:val="none"/>
-        </w:rPr>
+          <w:b/>
+          <w:bCs/>
+        </w:rPr>
+      </w:pPr>
+      <w:bookmarkStart w:id="6" w:name="_Toc1758631309"/>
+      <w:r>
+        <w:rPr>
+          <w:b/>
+          <w:bCs/>
+        </w:rPr>
+        <w:lastRenderedPageBreak/>
         <w:t>Prototipo de Consultar retiro agendado</w:t>
       </w:r>
-      <w:bookmarkEnd w:id="668379657"/>
+      <w:bookmarkEnd w:id="6"/>
     </w:p>
     <w:p/>
     <w:p>
@@ -5194,8 +4939,10 @@
           <w:rFonts w:ascii="Tahoma" w:hAnsi="Tahoma" w:cs="Tahoma"/>
           <w:b/>
           <w:bCs/>
+          <w:noProof/>
           <w:color w:val="333399"/>
         </w:rPr>
+        <w:lastRenderedPageBreak/>
         <w:drawing>
           <wp:inline distT="0" distB="0" distL="0" distR="0" wp14:anchorId="7FB9EEAF" wp14:editId="7F01B121">
             <wp:extent cx="2423117" cy="5325533"/>
@@ -5259,6 +5006,7 @@
           <w:bCs/>
           <w:color w:val="333399"/>
         </w:rPr>
+        <w:lastRenderedPageBreak/>
         <w:t>Plantilla para Descripción de Use Cases  (Trazo Intermedio)</w:t>
       </w:r>
     </w:p>
@@ -5284,12 +5032,12 @@
         <w:jc w:val="center"/>
         <w:tblCellSpacing w:w="20" w:type="dxa"/>
         <w:tblBorders>
-          <w:top w:val="outset" w:color="auto" w:sz="6" w:space="0"/>
-          <w:left w:val="outset" w:color="auto" w:sz="6" w:space="0"/>
-          <w:bottom w:val="outset" w:color="auto" w:sz="6" w:space="0"/>
-          <w:right w:val="outset" w:color="auto" w:sz="6" w:space="0"/>
-          <w:insideH w:val="outset" w:color="auto" w:sz="6" w:space="0"/>
-          <w:insideV w:val="outset" w:color="auto" w:sz="6" w:space="0"/>
+          <w:top w:val="outset" w:sz="6" w:space="0" w:color="auto"/>
+          <w:left w:val="outset" w:sz="6" w:space="0" w:color="auto"/>
+          <w:bottom w:val="outset" w:sz="6" w:space="0" w:color="auto"/>
+          <w:right w:val="outset" w:sz="6" w:space="0" w:color="auto"/>
+          <w:insideH w:val="outset" w:sz="6" w:space="0" w:color="auto"/>
+          <w:insideV w:val="outset" w:sz="6" w:space="0" w:color="auto"/>
         </w:tblBorders>
         <w:tblLayout w:type="fixed"/>
         <w:tblCellMar>
@@ -5318,7 +5066,6 @@
           <w:tcPr>
             <w:tcW w:w="10056" w:type="dxa"/>
             <w:gridSpan w:val="4"/>
-            <w:tcMar/>
           </w:tcPr>
           <w:p>
             <w:pPr>
@@ -5353,7 +5100,6 @@
             <w:tcW w:w="6977" w:type="dxa"/>
             <w:gridSpan w:val="3"/>
             <w:shd w:val="clear" w:color="auto" w:fill="C0C0C0"/>
-            <w:tcMar/>
           </w:tcPr>
           <w:p>
             <w:pPr>
@@ -5384,7 +5130,6 @@
           <w:tcPr>
             <w:tcW w:w="3039" w:type="dxa"/>
             <w:shd w:val="clear" w:color="auto" w:fill="C0C0C0"/>
-            <w:tcMar/>
           </w:tcPr>
           <w:p>
             <w:pPr>
@@ -5424,7 +5169,6 @@
         <w:tc>
           <w:tcPr>
             <w:tcW w:w="4329" w:type="dxa"/>
-            <w:tcMar/>
           </w:tcPr>
           <w:p>
             <w:pPr>
@@ -5455,7 +5199,6 @@
           <w:tcPr>
             <w:tcW w:w="5687" w:type="dxa"/>
             <w:gridSpan w:val="3"/>
-            <w:tcMar/>
           </w:tcPr>
           <w:p>
             <w:pPr>
@@ -5495,7 +5238,6 @@
           <w:tcPr>
             <w:tcW w:w="10056" w:type="dxa"/>
             <w:gridSpan w:val="4"/>
-            <w:tcMar/>
           </w:tcPr>
           <w:p>
             <w:pPr>
@@ -5581,7 +5323,7 @@
                     </wp:anchor>
                   </w:drawing>
                 </mc:Choice>
-                <mc:Fallback xmlns:w16sdtfl="http://schemas.microsoft.com/office/word/2024/wordml/sdtformatlock" xmlns:w16du="http://schemas.microsoft.com/office/word/2023/wordml/word16du">
+                <mc:Fallback xmlns:w16du="http://schemas.microsoft.com/office/word/2023/wordml/word16du" xmlns:w16sdtfl="http://schemas.microsoft.com/office/word/2024/wordml/sdtformatlock" xmlns:a14="http://schemas.microsoft.com/office/drawing/2010/main" xmlns:pic="http://schemas.openxmlformats.org/drawingml/2006/picture" xmlns:a="http://schemas.openxmlformats.org/drawingml/2006/main">
                   <w:pict w14:anchorId="73905CDF">
                     <v:shape id="Cruz 6" style="position:absolute;margin-left:146.35pt;margin-top:.65pt;width:10.5pt;height:11.25pt;z-index:251663360;visibility:visible;mso-wrap-style:square;mso-width-percent:0;mso-height-percent:0;mso-wrap-distance-left:9pt;mso-wrap-distance-top:0;mso-wrap-distance-right:9pt;mso-wrap-distance-bottom:0;mso-position-horizontal:absolute;mso-position-horizontal-relative:text;mso-position-vertical:absolute;mso-position-vertical-relative:text;mso-width-percent:0;mso-height-percent:0;mso-width-relative:page;mso-height-relative:page;v-text-anchor:top" o:spid="_x0000_s1026" fillcolor="black" strokecolor="#f2f2f2" strokeweight="3pt" type="#_x0000_t11" o:gfxdata="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" w14:anchorId="263415CC">
                       <v:shadow on="t" color="#7f7f7f" opacity=".5" offset="1pt"/>
@@ -5721,7 +5463,6 @@
           <w:tcPr>
             <w:tcW w:w="10056" w:type="dxa"/>
             <w:gridSpan w:val="4"/>
-            <w:tcMar/>
           </w:tcPr>
           <w:p>
             <w:pPr>
@@ -5776,36 +5517,28 @@
             <w:tcW w:w="10101" w:type="dxa"/>
             <w:gridSpan w:val="5"/>
             <w:shd w:val="clear" w:color="auto" w:fill="BFBFBF" w:themeFill="background1" w:themeFillShade="BF"/>
-            <w:tcMar/>
-          </w:tcPr>
-          <w:p>
-            <w:pPr>
-              <w:pStyle w:val="Normal"/>
-              <w:rPr>
-                <w:rFonts w:ascii="Tahoma" w:hAnsi="Tahoma" w:eastAsia="Tahoma" w:cs="Tahoma"/>
-                <w:b w:val="1"/>
-                <w:bCs w:val="1"/>
-                <w:sz w:val="22"/>
-                <w:szCs w:val="22"/>
-              </w:rPr>
-            </w:pPr>
-            <w:r>
-              <w:rPr>
-                <w:rFonts w:ascii="Tahoma" w:hAnsi="Tahoma" w:eastAsia="Tahoma" w:cs="Tahoma"/>
-                <w:b w:val="1"/>
-                <w:bCs w:val="1"/>
-                <w:sz w:val="22"/>
-                <w:szCs w:val="22"/>
+          </w:tcPr>
+          <w:p>
+            <w:pPr>
+              <w:rPr>
+                <w:rFonts w:ascii="Tahoma" w:eastAsia="Tahoma" w:hAnsi="Tahoma" w:cs="Tahoma"/>
+                <w:b/>
+                <w:bCs/>
+              </w:rPr>
+            </w:pPr>
+            <w:r>
+              <w:rPr>
+                <w:rFonts w:ascii="Tahoma" w:eastAsia="Tahoma" w:hAnsi="Tahoma" w:cs="Tahoma"/>
+                <w:b/>
+                <w:bCs/>
               </w:rPr>
               <w:t>Flujo Básico</w:t>
             </w:r>
             <w:r>
               <w:rPr>
-                <w:rFonts w:ascii="Tahoma" w:hAnsi="Tahoma" w:eastAsia="Tahoma" w:cs="Tahoma"/>
-                <w:b w:val="1"/>
-                <w:bCs w:val="1"/>
-                <w:sz w:val="22"/>
-                <w:szCs w:val="22"/>
+                <w:rFonts w:ascii="Tahoma" w:eastAsia="Tahoma" w:hAnsi="Tahoma" w:cs="Tahoma"/>
+                <w:b/>
+                <w:bCs/>
               </w:rPr>
               <w:t>:</w:t>
             </w:r>
@@ -5822,7 +5555,6 @@
           <w:tcPr>
             <w:tcW w:w="10101" w:type="dxa"/>
             <w:gridSpan w:val="5"/>
-            <w:tcMar/>
           </w:tcPr>
           <w:p>
             <w:pPr>
@@ -5857,7 +5589,6 @@
           <w:tcPr>
             <w:tcW w:w="10101" w:type="dxa"/>
             <w:gridSpan w:val="5"/>
-            <w:tcMar/>
           </w:tcPr>
           <w:p>
             <w:pPr>
@@ -5892,7 +5623,6 @@
           <w:tcPr>
             <w:tcW w:w="10101" w:type="dxa"/>
             <w:gridSpan w:val="5"/>
-            <w:tcMar/>
           </w:tcPr>
           <w:p>
             <w:pPr>
@@ -5927,7 +5657,6 @@
           <w:tcPr>
             <w:tcW w:w="10101" w:type="dxa"/>
             <w:gridSpan w:val="5"/>
-            <w:tcMar/>
           </w:tcPr>
           <w:p>
             <w:pPr>
@@ -5962,7 +5691,6 @@
           <w:tcPr>
             <w:tcW w:w="10101" w:type="dxa"/>
             <w:gridSpan w:val="5"/>
-            <w:tcMar/>
           </w:tcPr>
           <w:p>
             <w:pPr>
@@ -5997,7 +5725,6 @@
           <w:tcPr>
             <w:tcW w:w="10101" w:type="dxa"/>
             <w:gridSpan w:val="5"/>
-            <w:tcMar/>
           </w:tcPr>
           <w:p>
             <w:pPr>
@@ -6032,7 +5759,6 @@
           <w:tcPr>
             <w:tcW w:w="10101" w:type="dxa"/>
             <w:gridSpan w:val="5"/>
-            <w:tcMar/>
           </w:tcPr>
           <w:p>
             <w:pPr>
@@ -6075,7 +5801,6 @@
           <w:tcPr>
             <w:tcW w:w="10101" w:type="dxa"/>
             <w:gridSpan w:val="5"/>
-            <w:tcMar/>
           </w:tcPr>
           <w:p>
             <w:pPr>
@@ -6111,26 +5836,20 @@
             <w:tcW w:w="10101" w:type="dxa"/>
             <w:gridSpan w:val="5"/>
             <w:shd w:val="clear" w:color="auto" w:fill="BFBFBF" w:themeFill="background1" w:themeFillShade="BF"/>
-            <w:tcMar/>
-          </w:tcPr>
-          <w:p>
-            <w:pPr>
-              <w:pStyle w:val="Normal"/>
-              <w:rPr>
-                <w:rFonts w:ascii="Tahoma" w:hAnsi="Tahoma" w:eastAsia="Tahoma" w:cs="Tahoma"/>
-                <w:b w:val="1"/>
-                <w:bCs w:val="1"/>
-                <w:sz w:val="22"/>
-                <w:szCs w:val="22"/>
-              </w:rPr>
-            </w:pPr>
-            <w:r>
-              <w:rPr>
-                <w:rFonts w:ascii="Tahoma" w:hAnsi="Tahoma" w:eastAsia="Tahoma" w:cs="Tahoma"/>
-                <w:b w:val="1"/>
-                <w:bCs w:val="1"/>
-                <w:sz w:val="22"/>
-                <w:szCs w:val="22"/>
+          </w:tcPr>
+          <w:p>
+            <w:pPr>
+              <w:rPr>
+                <w:rFonts w:ascii="Tahoma" w:eastAsia="Tahoma" w:hAnsi="Tahoma" w:cs="Tahoma"/>
+                <w:b/>
+                <w:bCs/>
+              </w:rPr>
+            </w:pPr>
+            <w:r>
+              <w:rPr>
+                <w:rFonts w:ascii="Tahoma" w:eastAsia="Tahoma" w:hAnsi="Tahoma" w:cs="Tahoma"/>
+                <w:b/>
+                <w:bCs/>
               </w:rPr>
               <w:t>Flujos  Alternativos:</w:t>
             </w:r>
@@ -6146,7 +5865,6 @@
           <w:tcPr>
             <w:tcW w:w="10101" w:type="dxa"/>
             <w:gridSpan w:val="5"/>
-            <w:tcMar/>
           </w:tcPr>
           <w:p>
             <w:pPr>
@@ -6178,7 +5896,6 @@
           <w:tcPr>
             <w:tcW w:w="10056" w:type="dxa"/>
             <w:gridSpan w:val="4"/>
-            <w:tcMar/>
           </w:tcPr>
           <w:p>
             <w:pPr>
@@ -6262,7 +5979,6 @@
           <w:tcPr>
             <w:tcW w:w="10056" w:type="dxa"/>
             <w:gridSpan w:val="4"/>
-            <w:tcMar/>
           </w:tcPr>
           <w:p>
             <w:pPr>
@@ -6298,7 +6014,6 @@
           <w:tcPr>
             <w:tcW w:w="10056" w:type="dxa"/>
             <w:gridSpan w:val="4"/>
-            <w:tcMar/>
           </w:tcPr>
           <w:p>
             <w:pPr>
@@ -6334,7 +6049,6 @@
           <w:tcPr>
             <w:tcW w:w="10056" w:type="dxa"/>
             <w:gridSpan w:val="4"/>
-            <w:tcMar/>
           </w:tcPr>
           <w:p>
             <w:pPr>
@@ -6370,7 +6084,6 @@
           <w:tcPr>
             <w:tcW w:w="10056" w:type="dxa"/>
             <w:gridSpan w:val="4"/>
-            <w:tcMar/>
           </w:tcPr>
           <w:p>
             <w:pPr>
@@ -6406,11 +6119,9 @@
           <w:tcPr>
             <w:tcW w:w="10056" w:type="dxa"/>
             <w:gridSpan w:val="4"/>
-            <w:tcMar/>
-          </w:tcPr>
-          <w:p>
-            <w:pPr>
-              <w:pStyle w:val="Normal"/>
+          </w:tcPr>
+          <w:p>
+            <w:pPr>
               <w:rPr>
                 <w:rFonts w:cs="Tahoma"/>
                 <w:sz w:val="20"/>
@@ -6419,28 +6130,18 @@
             </w:pPr>
             <w:r>
               <w:rPr>
-                <w:rFonts w:ascii="Tahoma" w:hAnsi="Tahoma" w:eastAsia="Tahoma" w:cs="Tahoma"/>
-                <w:b w:val="1"/>
-                <w:bCs w:val="1"/>
-                <w:sz w:val="20"/>
-                <w:szCs w:val="20"/>
-              </w:rPr>
-              <w:t>Use Case de Generalización:</w:t>
-            </w:r>
-            <w:r>
-              <w:rPr>
-                <w:rFonts w:ascii="Tahoma" w:hAnsi="Tahoma" w:eastAsia="Tahoma" w:cs="Tahoma"/>
-                <w:b w:val="1"/>
-                <w:bCs w:val="1"/>
-                <w:sz w:val="20"/>
-                <w:szCs w:val="20"/>
-              </w:rPr>
-              <w:t xml:space="preserve"> </w:t>
-            </w:r>
-            <w:r>
-              <w:rPr>
-                <w:b w:val="1"/>
-                <w:bCs w:val="1"/>
+                <w:rFonts w:ascii="Tahoma" w:eastAsia="Tahoma" w:hAnsi="Tahoma" w:cs="Tahoma"/>
+                <w:b/>
+                <w:bCs/>
+                <w:sz w:val="20"/>
+                <w:szCs w:val="20"/>
+              </w:rPr>
+              <w:t xml:space="preserve">Use Case de Generalización: </w:t>
+            </w:r>
+            <w:r>
+              <w:rPr>
+                <w:b/>
+                <w:bCs/>
                 <w:sz w:val="20"/>
                 <w:szCs w:val="20"/>
               </w:rPr>
@@ -6461,13 +6162,11 @@
           <w:tcPr>
             <w:tcW w:w="6383" w:type="dxa"/>
             <w:gridSpan w:val="2"/>
-            <w:tcMar/>
-          </w:tcPr>
-          <w:p>
-            <w:pPr>
-              <w:pStyle w:val="Normal"/>
+          </w:tcPr>
+          <w:p>
+            <w:pPr>
               <w:tabs>
-                <w:tab w:val="right" w:leader="none" w:pos="1988"/>
+                <w:tab w:val="right" w:pos="1988"/>
               </w:tabs>
               <w:rPr>
                 <w:rFonts w:cs="Tahoma"/>
@@ -6477,9 +6176,9 @@
             </w:pPr>
             <w:r>
               <w:rPr>
-                <w:rFonts w:ascii="Tahoma" w:hAnsi="Tahoma" w:eastAsia="Tahoma" w:cs="Tahoma"/>
-                <w:b w:val="1"/>
-                <w:bCs w:val="1"/>
+                <w:rFonts w:ascii="Tahoma" w:eastAsia="Tahoma" w:hAnsi="Tahoma" w:cs="Tahoma"/>
+                <w:b/>
+                <w:bCs/>
                 <w:sz w:val="20"/>
                 <w:szCs w:val="20"/>
               </w:rPr>
@@ -6493,7 +6192,6 @@
               <w:t xml:space="preserve"> </w:t>
             </w:r>
             <w:r>
-              <w:rPr/>
               <w:t>Agustín Borgo</w:t>
             </w:r>
           </w:p>
@@ -6502,11 +6200,9 @@
           <w:tcPr>
             <w:tcW w:w="3633" w:type="dxa"/>
             <w:gridSpan w:val="2"/>
-            <w:tcMar/>
-          </w:tcPr>
-          <w:p>
-            <w:pPr>
-              <w:pStyle w:val="Normal"/>
+          </w:tcPr>
+          <w:p>
+            <w:pPr>
               <w:rPr>
                 <w:rFonts w:cs="Tahoma"/>
                 <w:sz w:val="20"/>
@@ -6515,26 +6211,15 @@
             </w:pPr>
             <w:r>
               <w:rPr>
-                <w:rFonts w:ascii="Tahoma" w:hAnsi="Tahoma" w:eastAsia="Tahoma" w:cs="Tahoma"/>
-                <w:b w:val="1"/>
-                <w:bCs w:val="1"/>
-                <w:sz w:val="20"/>
-                <w:szCs w:val="20"/>
-              </w:rPr>
-              <w:t>Fecha Creación</w:t>
-            </w:r>
-            <w:r>
-              <w:rPr>
-                <w:rFonts w:ascii="Tahoma" w:hAnsi="Tahoma" w:eastAsia="Tahoma" w:cs="Tahoma"/>
-                <w:b w:val="1"/>
-                <w:bCs w:val="1"/>
-                <w:sz w:val="20"/>
-                <w:szCs w:val="20"/>
-              </w:rPr>
-              <w:t>:</w:t>
-            </w:r>
-            <w:r>
-              <w:rPr/>
+                <w:rFonts w:ascii="Tahoma" w:eastAsia="Tahoma" w:hAnsi="Tahoma" w:cs="Tahoma"/>
+                <w:b/>
+                <w:bCs/>
+                <w:sz w:val="20"/>
+                <w:szCs w:val="20"/>
+              </w:rPr>
+              <w:t>Fecha Creación:</w:t>
+            </w:r>
+            <w:r>
               <w:t xml:space="preserve"> 6/10/2026</w:t>
             </w:r>
           </w:p>
@@ -6552,11 +6237,9 @@
           <w:tcPr>
             <w:tcW w:w="6383" w:type="dxa"/>
             <w:gridSpan w:val="2"/>
-            <w:tcMar/>
-          </w:tcPr>
-          <w:p>
-            <w:pPr>
-              <w:pStyle w:val="Normal"/>
+          </w:tcPr>
+          <w:p>
+            <w:pPr>
               <w:rPr>
                 <w:rFonts w:cs="Tahoma"/>
                 <w:sz w:val="20"/>
@@ -6565,26 +6248,15 @@
             </w:pPr>
             <w:r>
               <w:rPr>
-                <w:rFonts w:ascii="Tahoma" w:hAnsi="Tahoma" w:eastAsia="Tahoma" w:cs="Tahoma"/>
-                <w:b w:val="1"/>
-                <w:bCs w:val="1"/>
-                <w:sz w:val="20"/>
-                <w:szCs w:val="20"/>
-              </w:rPr>
-              <w:t>Autor Última Modificación:</w:t>
-            </w:r>
-            <w:r>
-              <w:rPr>
-                <w:rFonts w:ascii="Tahoma" w:hAnsi="Tahoma" w:eastAsia="Tahoma" w:cs="Tahoma"/>
-                <w:b w:val="1"/>
-                <w:bCs w:val="1"/>
-                <w:sz w:val="20"/>
-                <w:szCs w:val="20"/>
-              </w:rPr>
-              <w:t xml:space="preserve"> </w:t>
-            </w:r>
-            <w:r>
-              <w:rPr/>
+                <w:rFonts w:ascii="Tahoma" w:eastAsia="Tahoma" w:hAnsi="Tahoma" w:cs="Tahoma"/>
+                <w:b/>
+                <w:bCs/>
+                <w:sz w:val="20"/>
+                <w:szCs w:val="20"/>
+              </w:rPr>
+              <w:t xml:space="preserve">Autor Última Modificación: </w:t>
+            </w:r>
+            <w:r>
               <w:t>Agustín Borgo</w:t>
             </w:r>
           </w:p>
@@ -6593,11 +6265,9 @@
           <w:tcPr>
             <w:tcW w:w="3633" w:type="dxa"/>
             <w:gridSpan w:val="2"/>
-            <w:tcMar/>
-          </w:tcPr>
-          <w:p>
-            <w:pPr>
-              <w:pStyle w:val="Normal"/>
+          </w:tcPr>
+          <w:p>
+            <w:pPr>
               <w:rPr>
                 <w:rFonts w:cs="Tahoma"/>
                 <w:sz w:val="20"/>
@@ -6606,26 +6276,15 @@
             </w:pPr>
             <w:r>
               <w:rPr>
-                <w:rFonts w:ascii="Tahoma" w:hAnsi="Tahoma" w:eastAsia="Tahoma" w:cs="Tahoma"/>
-                <w:b w:val="1"/>
-                <w:bCs w:val="1"/>
-                <w:sz w:val="20"/>
-                <w:szCs w:val="20"/>
-              </w:rPr>
-              <w:t>Fecha Última Modificación</w:t>
-            </w:r>
-            <w:r>
-              <w:rPr>
-                <w:rFonts w:ascii="Tahoma" w:hAnsi="Tahoma" w:eastAsia="Tahoma" w:cs="Tahoma"/>
-                <w:b w:val="1"/>
-                <w:bCs w:val="1"/>
-                <w:sz w:val="20"/>
-                <w:szCs w:val="20"/>
-              </w:rPr>
-              <w:t xml:space="preserve">: </w:t>
-            </w:r>
-            <w:r>
-              <w:rPr/>
+                <w:rFonts w:ascii="Tahoma" w:eastAsia="Tahoma" w:hAnsi="Tahoma" w:cs="Tahoma"/>
+                <w:b/>
+                <w:bCs/>
+                <w:sz w:val="20"/>
+                <w:szCs w:val="20"/>
+              </w:rPr>
+              <w:t xml:space="preserve">Fecha Última Modificación: </w:t>
+            </w:r>
+            <w:r>
               <w:t>6/10/2026</w:t>
             </w:r>
           </w:p>
@@ -6638,7 +6297,6 @@
       </w:pPr>
     </w:p>
     <w:p>
-      <w:pPr/>
       <w:r>
         <w:br w:type="page"/>
       </w:r>
@@ -6647,45 +6305,41 @@
       <w:pPr>
         <w:pStyle w:val="Ttulo2"/>
         <w:rPr>
-          <w:b w:val="1"/>
-          <w:bCs w:val="1"/>
-          <w:u w:val="none"/>
-        </w:rPr>
-      </w:pPr>
-      <w:bookmarkStart w:name="_Toc120165810" w:id="1768569584"/>
-      <w:r>
-        <w:rPr>
-          <w:b w:val="1"/>
-          <w:bCs w:val="1"/>
-          <w:u w:val="none"/>
-        </w:rPr>
+          <w:b/>
+          <w:bCs/>
+        </w:rPr>
+      </w:pPr>
+      <w:bookmarkStart w:id="7" w:name="_Toc120165810"/>
+      <w:r>
+        <w:rPr>
+          <w:b/>
+          <w:bCs/>
+        </w:rPr>
+        <w:lastRenderedPageBreak/>
         <w:t>Prototipo de Modific</w:t>
       </w:r>
       <w:r>
         <w:rPr>
-          <w:b w:val="1"/>
-          <w:bCs w:val="1"/>
-          <w:u w:val="none"/>
+          <w:b/>
+          <w:bCs/>
         </w:rPr>
         <w:t xml:space="preserve">ar </w:t>
       </w:r>
       <w:r>
         <w:rPr>
-          <w:b w:val="1"/>
-          <w:bCs w:val="1"/>
-          <w:u w:val="none"/>
+          <w:b/>
+          <w:bCs/>
         </w:rPr>
         <w:t>retiro</w:t>
       </w:r>
       <w:r>
         <w:rPr>
-          <w:b w:val="1"/>
-          <w:bCs w:val="1"/>
-          <w:u w:val="none"/>
+          <w:b/>
+          <w:bCs/>
         </w:rPr>
         <w:t xml:space="preserve"> agendado</w:t>
       </w:r>
-      <w:bookmarkEnd w:id="1768569584"/>
+      <w:bookmarkEnd w:id="7"/>
     </w:p>
     <w:p>
       <w:pPr>
@@ -6822,25 +6476,24 @@
       <w:pPr>
         <w:pStyle w:val="Ttulo1"/>
         <w:rPr>
-          <w:b w:val="1"/>
-          <w:bCs w:val="1"/>
-          <w:sz w:val="40"/>
-          <w:szCs w:val="40"/>
+          <w:b/>
+          <w:bCs/>
           <w:u w:val="single"/>
           <w:lang w:val="es-AR"/>
         </w:rPr>
       </w:pPr>
-      <w:bookmarkStart w:name="_Toc447222063" w:id="703218160"/>
-      <w:r>
-        <w:rPr>
-          <w:b w:val="1"/>
-          <w:bCs w:val="1"/>
+      <w:bookmarkStart w:id="8" w:name="_Toc447222063"/>
+      <w:r>
+        <w:rPr>
+          <w:b/>
+          <w:bCs/>
           <w:u w:val="single"/>
           <w:lang w:val="es-AR"/>
         </w:rPr>
+        <w:lastRenderedPageBreak/>
         <w:t>Diagrama de transición de estados</w:t>
       </w:r>
-      <w:bookmarkEnd w:id="703218160"/>
+      <w:bookmarkEnd w:id="8"/>
     </w:p>
     <w:p>
       <w:pPr>
@@ -6921,37 +6574,38 @@
       <w:pPr>
         <w:pStyle w:val="Ttulo1"/>
         <w:rPr>
-          <w:b w:val="1"/>
-          <w:bCs w:val="1"/>
+          <w:b/>
+          <w:bCs/>
           <w:u w:val="single"/>
         </w:rPr>
       </w:pPr>
-      <w:bookmarkStart w:name="_Toc72469304" w:id="1893364355"/>
-      <w:r>
-        <w:rPr>
-          <w:b w:val="1"/>
-          <w:bCs w:val="1"/>
+      <w:bookmarkStart w:id="9" w:name="_Toc72469304"/>
+      <w:r>
+        <w:rPr>
+          <w:b/>
+          <w:bCs/>
           <w:u w:val="single"/>
         </w:rPr>
+        <w:lastRenderedPageBreak/>
         <w:t>Git log de la</w:t>
       </w:r>
       <w:r>
         <w:rPr>
-          <w:b w:val="1"/>
-          <w:bCs w:val="1"/>
+          <w:b/>
+          <w:bCs/>
           <w:u w:val="single"/>
         </w:rPr>
         <w:t xml:space="preserve"> tercera</w:t>
       </w:r>
       <w:r>
         <w:rPr>
-          <w:b w:val="1"/>
-          <w:bCs w:val="1"/>
+          <w:b/>
+          <w:bCs/>
           <w:u w:val="single"/>
         </w:rPr>
         <w:t xml:space="preserve"> entrega</w:t>
       </w:r>
-      <w:bookmarkEnd w:id="1893364355"/>
+      <w:bookmarkEnd w:id="9"/>
     </w:p>
     <w:p>
       <w:r>
@@ -7002,6 +6656,7 @@
           <w:noProof/>
           <w:lang w:val="en-US" w:eastAsia="en-US"/>
         </w:rPr>
+        <w:lastRenderedPageBreak/>
         <w:drawing>
           <wp:inline distT="0" distB="0" distL="0" distR="0" wp14:anchorId="1CCFE1C3" wp14:editId="3CADEE00">
             <wp:extent cx="5362575" cy="4757755"/>
@@ -7046,7 +6701,7 @@
       <w:footerReference w:type="default" r:id="rId31"/>
       <w:headerReference w:type="first" r:id="rId32"/>
       <w:footerReference w:type="first" r:id="rId33"/>
-      <w:pgSz w:w="11906" w:h="16838" w:orient="portrait"/>
+      <w:pgSz w:w="11906" w:h="16838"/>
       <w:pgMar w:top="1440" w:right="1440" w:bottom="1440" w:left="1440" w:header="720" w:footer="720" w:gutter="0"/>
       <w:pgNumType w:start="0"/>
       <w:cols w:space="720"/>
@@ -7094,7 +6749,7 @@
 </file>
 
 <file path=word/footer2.xml><?xml version="1.0" encoding="utf-8"?>
-<w:ftr xmlns:wpc="http://schemas.microsoft.com/office/word/2010/wordprocessingCanvas" xmlns:cx="http://schemas.microsoft.com/office/drawing/2014/chartex" xmlns:cx1="http://schemas.microsoft.com/office/drawing/2015/9/8/chartex" xmlns:cx2="http://schemas.microsoft.com/office/drawing/2015/10/21/chartex" xmlns:cx3="http://schemas.microsoft.com/office/drawing/2016/5/9/chartex" xmlns:cx4="http://schemas.microsoft.com/office/drawing/2016/5/10/chartex" xmlns:cx5="http://schemas.microsoft.com/office/drawing/2016/5/11/chartex" xmlns:cx6="http://schemas.microsoft.com/office/drawing/2016/5/12/chartex" xmlns:cx7="http://schemas.microsoft.com/office/drawing/2016/5/13/chartex" xmlns:cx8="http://schemas.microsoft.com/office/drawing/2016/5/14/chartex" xmlns:mc="http://schemas.openxmlformats.org/markup-compatibility/2006" xmlns:aink="http://schemas.microsoft.com/office/drawing/2016/ink" xmlns:am3d="http://schemas.microsoft.com/office/drawing/2017/model3d" xmlns:o="urn:schemas-microsoft-com:office:office" xmlns:oel="http://schemas.microsoft.com/office/2019/extlst" xmlns:r="http://schemas.openxmlformats.org/officeDocument/2006/relationships" xmlns:m="http://schemas.openxmlformats.org/officeDocument/2006/math" xmlns:v="urn:schemas-microsoft-com:vml" xmlns:wp14="http://schemas.microsoft.com/office/word/2010/wordprocessingDrawing" xmlns:wp="http://schemas.openxmlformats.org/drawingml/2006/wordprocessingDrawing" xmlns:w10="urn:schemas-microsoft-com:office:word" xmlns:w="http://schemas.openxmlformats.org/wordprocessingml/2006/main" xmlns:w14="http://schemas.microsoft.com/office/word/2010/wordml" xmlns:w15="http://schemas.microsoft.com/office/word/2012/wordml" xmlns:w16cex="http://schemas.microsoft.com/office/word/2018/wordml/cex" xmlns:w16cid="http://schemas.microsoft.com/office/word/2016/wordml/cid" xmlns:w16="http://schemas.microsoft.com/office/word/2018/wordml" xmlns:w16sdtdh="http://schemas.microsoft.com/office/word/2020/wordml/sdtdatahash" xmlns:w16se="http://schemas.microsoft.com/office/word/2015/wordml/symex" xmlns:wpg="http://schemas.microsoft.com/office/word/2010/wordprocessingGroup" xmlns:wpi="http://schemas.microsoft.com/office/word/2010/wordprocessingInk" xmlns:wne="http://schemas.microsoft.com/office/word/2006/wordml" xmlns:wps="http://schemas.microsoft.com/office/word/2010/wordprocessingShape" xmlns:a="http://schemas.openxmlformats.org/drawingml/2006/main" mc:Ignorable="w14 w15 w16se w16cid w16 w16cex w16sdtdh wp14">
+<w:ftr xmlns:wpc="http://schemas.microsoft.com/office/word/2010/wordprocessingCanvas" xmlns:cx="http://schemas.microsoft.com/office/drawing/2014/chartex" xmlns:cx1="http://schemas.microsoft.com/office/drawing/2015/9/8/chartex" xmlns:cx2="http://schemas.microsoft.com/office/drawing/2015/10/21/chartex" xmlns:cx3="http://schemas.microsoft.com/office/drawing/2016/5/9/chartex" xmlns:cx4="http://schemas.microsoft.com/office/drawing/2016/5/10/chartex" xmlns:cx5="http://schemas.microsoft.com/office/drawing/2016/5/11/chartex" xmlns:cx6="http://schemas.microsoft.com/office/drawing/2016/5/12/chartex" xmlns:cx7="http://schemas.microsoft.com/office/drawing/2016/5/13/chartex" xmlns:cx8="http://schemas.microsoft.com/office/drawing/2016/5/14/chartex" xmlns:mc="http://schemas.openxmlformats.org/markup-compatibility/2006" xmlns:aink="http://schemas.microsoft.com/office/drawing/2016/ink" xmlns:am3d="http://schemas.microsoft.com/office/drawing/2017/model3d" xmlns:o="urn:schemas-microsoft-com:office:office" xmlns:oel="http://schemas.microsoft.com/office/2019/extlst" xmlns:r="http://schemas.openxmlformats.org/officeDocument/2006/relationships" xmlns:m="http://schemas.openxmlformats.org/officeDocument/2006/math" xmlns:v="urn:schemas-microsoft-com:vml" xmlns:wp14="http://schemas.microsoft.com/office/word/2010/wordprocessingDrawing" xmlns:wp="http://schemas.openxmlformats.org/drawingml/2006/wordprocessingDrawing" xmlns:w10="urn:schemas-microsoft-com:office:word" xmlns:w="http://schemas.openxmlformats.org/wordprocessingml/2006/main" xmlns:w14="http://schemas.microsoft.com/office/word/2010/wordml" xmlns:w15="http://schemas.microsoft.com/office/word/2012/wordml" xmlns:w16cex="http://schemas.microsoft.com/office/word/2018/wordml/cex" xmlns:w16cid="http://schemas.microsoft.com/office/word/2016/wordml/cid" xmlns:w16="http://schemas.microsoft.com/office/word/2018/wordml" xmlns:w16sdtdh="http://schemas.microsoft.com/office/word/2020/wordml/sdtdatahash" xmlns:w16se="http://schemas.microsoft.com/office/word/2015/wordml/symex" xmlns:wpg="http://schemas.microsoft.com/office/word/2010/wordprocessingGroup" xmlns:wpi="http://schemas.microsoft.com/office/word/2010/wordprocessingInk" xmlns:wne="http://schemas.microsoft.com/office/word/2006/wordml" xmlns:wps="http://schemas.microsoft.com/office/word/2010/wordprocessingShape" mc:Ignorable="w14 w15 w16se w16cid w16 w16cex w16sdtdh wp14">
   <w:p>
     <w:r>
       <w:rPr>
@@ -7171,19 +6826,19 @@
           </w:drawing>
         </mc:Choice>
         <mc:Fallback>
-          <w:pict w14:anchorId="20D4A900">
-            <v:shapetype id="_x0000_t15" coordsize="21600,21600" o:spt="15" adj="16200" path="m@0,l,,,21600@0,21600,21600,10800xe" w14:anchorId="78A880AB">
+          <w:pict>
+            <v:shapetype w14:anchorId="78A880AB" id="_x0000_t15" coordsize="21600,21600" o:spt="15" adj="16200" path="m@0,l,,,21600@0,21600,21600,10800xe">
               <v:stroke joinstyle="miter"/>
               <v:formulas>
                 <v:f eqn="val #0"/>
                 <v:f eqn="prod #0 1 2"/>
               </v:formulas>
-              <v:path textboxrect="0,0,10800,21600;0,0,16200,21600;0,0,21600,21600" gradientshapeok="t" o:connecttype="custom" o:connectlocs="@1,0;0,10800;@1,21600;21600,10800" o:connectangles="270,180,90,0"/>
+              <v:path gradientshapeok="t" o:connecttype="custom" o:connectlocs="@1,0;0,10800;@1,21600;21600,10800" o:connectangles="270,180,90,0" textboxrect="0,0,10800,21600;0,0,16200,21600;0,0,21600,21600"/>
               <v:handles>
                 <v:h position="#0,topLeft" xrange="0,21600"/>
               </v:handles>
             </v:shapetype>
-            <v:shape id="Flecha: pentágono 3" style="position:absolute;margin-left:410.9pt;margin-top:7.5pt;width:110.65pt;height:26.25pt;rotation:180;z-index:-503316460;visibility:visible;mso-wrap-style:square;mso-wrap-distance-left:0;mso-wrap-distance-top:0;mso-wrap-distance-right:0;mso-wrap-distance-bottom:0;mso-position-horizontal:absolute;mso-position-horizontal-relative:text;mso-position-vertical:absolute;mso-position-vertical-relative:text;v-text-anchor:middle" o:spid="_x0000_s1027" fillcolor="#45818e" stroked="f" strokeweight="0" type="#_x0000_t15" adj="19038" o:gfxdata="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">
+            <v:shape id="Flecha: pentágono 3" o:spid="_x0000_s1027" type="#_x0000_t15" style="position:absolute;margin-left:410.9pt;margin-top:7.5pt;width:110.65pt;height:26.25pt;rotation:180;z-index:-503316460;visibility:visible;mso-wrap-style:square;mso-wrap-distance-left:0;mso-wrap-distance-top:0;mso-wrap-distance-right:0;mso-wrap-distance-bottom:0;mso-position-horizontal:absolute;mso-position-horizontal-relative:text;mso-position-vertical:absolute;mso-position-vertical-relative:text;v-text-anchor:middle" o:gfxdata="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" adj="19038" fillcolor="#45818e" stroked="f" strokeweight="0">
               <v:textbox inset=",7.2pt,,7.2pt">
                 <w:txbxContent>
                   <w:p>
@@ -7288,25 +6943,7 @@
                               <w:sz w:val="24"/>
                               <w:szCs w:val="20"/>
                             </w:rPr>
-                            <w:t xml:space="preserve"> </w:t>
-                          </w:r>
-                          <w:proofErr w:type="spellStart"/>
-                          <w:r>
-                            <w:rPr>
-                              <w:color w:val="666666"/>
-                              <w:sz w:val="24"/>
-                              <w:szCs w:val="20"/>
-                            </w:rPr>
-                            <w:t>Nuñez</w:t>
-                          </w:r>
-                          <w:proofErr w:type="spellEnd"/>
-                          <w:r>
-                            <w:rPr>
-                              <w:color w:val="666666"/>
-                              <w:sz w:val="24"/>
-                              <w:szCs w:val="20"/>
-                            </w:rPr>
-                            <w:t xml:space="preserve"> Juan</w:t>
+                            <w:t xml:space="preserve"> Nuñez Juan</w:t>
                           </w:r>
                         </w:p>
                       </w:txbxContent>
@@ -7321,8 +6958,8 @@
           </w:drawing>
         </mc:Choice>
         <mc:Fallback>
-          <w:pict w14:anchorId="080FB80A">
-            <v:rect id="Cuadro de texto 1" style="position:absolute;margin-left:59.35pt;margin-top:5.05pt;width:305.65pt;height:54.15pt;z-index:-503316445;visibility:visible;mso-wrap-style:square;mso-wrap-distance-left:0;mso-wrap-distance-top:0;mso-wrap-distance-right:0;mso-wrap-distance-bottom:0;mso-position-horizontal:absolute;mso-position-horizontal-relative:margin;mso-position-vertical:absolute;mso-position-vertical-relative:text;v-text-anchor:top" o:spid="_x0000_s1028" o:allowincell="f" filled="f" stroked="f" strokeweight="0" w14:anchorId="55970E85" o:gfxdata="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">
+          <w:pict>
+            <v:rect w14:anchorId="55970E85" id="Cuadro de texto 1" o:spid="_x0000_s1028" style="position:absolute;margin-left:59.35pt;margin-top:5.05pt;width:305.65pt;height:54.15pt;z-index:-503316445;visibility:visible;mso-wrap-style:square;mso-wrap-distance-left:0;mso-wrap-distance-top:0;mso-wrap-distance-right:0;mso-wrap-distance-bottom:0;mso-position-horizontal:absolute;mso-position-horizontal-relative:margin;mso-position-vertical:absolute;mso-position-vertical-relative:text;v-text-anchor:top" o:gfxdata="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" o:allowincell="f" filled="f" stroked="f" strokeweight="0">
               <v:textbox inset=",7.2pt,,7.2pt">
                 <w:txbxContent>
                   <w:p>
@@ -7361,25 +6998,7 @@
                         <w:sz w:val="24"/>
                         <w:szCs w:val="20"/>
                       </w:rPr>
-                      <w:t xml:space="preserve"> </w:t>
-                    </w:r>
-                    <w:proofErr w:type="spellStart"/>
-                    <w:r>
-                      <w:rPr>
-                        <w:color w:val="666666"/>
-                        <w:sz w:val="24"/>
-                        <w:szCs w:val="20"/>
-                      </w:rPr>
-                      <w:t>Nuñez</w:t>
-                    </w:r>
-                    <w:proofErr w:type="spellEnd"/>
-                    <w:r>
-                      <w:rPr>
-                        <w:color w:val="666666"/>
-                        <w:sz w:val="24"/>
-                        <w:szCs w:val="20"/>
-                      </w:rPr>
-                      <w:t xml:space="preserve"> Juan</w:t>
+                      <w:t xml:space="preserve"> Nuñez Juan</w:t>
                     </w:r>
                   </w:p>
                 </w:txbxContent>
@@ -7472,7 +7091,7 @@
 </file>
 
 <file path=word/header2.xml><?xml version="1.0" encoding="utf-8"?>
-<w:hdr xmlns:wpc="http://schemas.microsoft.com/office/word/2010/wordprocessingCanvas" xmlns:cx="http://schemas.microsoft.com/office/drawing/2014/chartex" xmlns:cx1="http://schemas.microsoft.com/office/drawing/2015/9/8/chartex" xmlns:cx2="http://schemas.microsoft.com/office/drawing/2015/10/21/chartex" xmlns:cx3="http://schemas.microsoft.com/office/drawing/2016/5/9/chartex" xmlns:cx4="http://schemas.microsoft.com/office/drawing/2016/5/10/chartex" xmlns:cx5="http://schemas.microsoft.com/office/drawing/2016/5/11/chartex" xmlns:cx6="http://schemas.microsoft.com/office/drawing/2016/5/12/chartex" xmlns:cx7="http://schemas.microsoft.com/office/drawing/2016/5/13/chartex" xmlns:cx8="http://schemas.microsoft.com/office/drawing/2016/5/14/chartex" xmlns:mc="http://schemas.openxmlformats.org/markup-compatibility/2006" xmlns:aink="http://schemas.microsoft.com/office/drawing/2016/ink" xmlns:am3d="http://schemas.microsoft.com/office/drawing/2017/model3d" xmlns:o="urn:schemas-microsoft-com:office:office" xmlns:oel="http://schemas.microsoft.com/office/2019/extlst" xmlns:r="http://schemas.openxmlformats.org/officeDocument/2006/relationships" xmlns:m="http://schemas.openxmlformats.org/officeDocument/2006/math" xmlns:v="urn:schemas-microsoft-com:vml" xmlns:wp14="http://schemas.microsoft.com/office/word/2010/wordprocessingDrawing" xmlns:wp="http://schemas.openxmlformats.org/drawingml/2006/wordprocessingDrawing" xmlns:w10="urn:schemas-microsoft-com:office:word" xmlns:w="http://schemas.openxmlformats.org/wordprocessingml/2006/main" xmlns:w14="http://schemas.microsoft.com/office/word/2010/wordml" xmlns:w15="http://schemas.microsoft.com/office/word/2012/wordml" xmlns:w16cex="http://schemas.microsoft.com/office/word/2018/wordml/cex" xmlns:w16cid="http://schemas.microsoft.com/office/word/2016/wordml/cid" xmlns:w16="http://schemas.microsoft.com/office/word/2018/wordml" xmlns:w16sdtdh="http://schemas.microsoft.com/office/word/2020/wordml/sdtdatahash" xmlns:w16se="http://schemas.microsoft.com/office/word/2015/wordml/symex" xmlns:wpg="http://schemas.microsoft.com/office/word/2010/wordprocessingGroup" xmlns:wpi="http://schemas.microsoft.com/office/word/2010/wordprocessingInk" xmlns:wne="http://schemas.microsoft.com/office/word/2006/wordml" xmlns:wps="http://schemas.microsoft.com/office/word/2010/wordprocessingShape" xmlns:a="http://schemas.openxmlformats.org/drawingml/2006/main" xmlns:pic="http://schemas.openxmlformats.org/drawingml/2006/picture" mc:Ignorable="w14 w15 w16se w16cid w16 w16cex w16sdtdh wp14">
+<w:hdr xmlns:wpc="http://schemas.microsoft.com/office/word/2010/wordprocessingCanvas" xmlns:cx="http://schemas.microsoft.com/office/drawing/2014/chartex" xmlns:cx1="http://schemas.microsoft.com/office/drawing/2015/9/8/chartex" xmlns:cx2="http://schemas.microsoft.com/office/drawing/2015/10/21/chartex" xmlns:cx3="http://schemas.microsoft.com/office/drawing/2016/5/9/chartex" xmlns:cx4="http://schemas.microsoft.com/office/drawing/2016/5/10/chartex" xmlns:cx5="http://schemas.microsoft.com/office/drawing/2016/5/11/chartex" xmlns:cx6="http://schemas.microsoft.com/office/drawing/2016/5/12/chartex" xmlns:cx7="http://schemas.microsoft.com/office/drawing/2016/5/13/chartex" xmlns:cx8="http://schemas.microsoft.com/office/drawing/2016/5/14/chartex" xmlns:mc="http://schemas.openxmlformats.org/markup-compatibility/2006" xmlns:aink="http://schemas.microsoft.com/office/drawing/2016/ink" xmlns:am3d="http://schemas.microsoft.com/office/drawing/2017/model3d" xmlns:o="urn:schemas-microsoft-com:office:office" xmlns:oel="http://schemas.microsoft.com/office/2019/extlst" xmlns:r="http://schemas.openxmlformats.org/officeDocument/2006/relationships" xmlns:m="http://schemas.openxmlformats.org/officeDocument/2006/math" xmlns:v="urn:schemas-microsoft-com:vml" xmlns:wp14="http://schemas.microsoft.com/office/word/2010/wordprocessingDrawing" xmlns:wp="http://schemas.openxmlformats.org/drawingml/2006/wordprocessingDrawing" xmlns:w10="urn:schemas-microsoft-com:office:word" xmlns:w="http://schemas.openxmlformats.org/wordprocessingml/2006/main" xmlns:w14="http://schemas.microsoft.com/office/word/2010/wordml" xmlns:w15="http://schemas.microsoft.com/office/word/2012/wordml" xmlns:w16cex="http://schemas.microsoft.com/office/word/2018/wordml/cex" xmlns:w16cid="http://schemas.microsoft.com/office/word/2016/wordml/cid" xmlns:w16="http://schemas.microsoft.com/office/word/2018/wordml" xmlns:w16sdtdh="http://schemas.microsoft.com/office/word/2020/wordml/sdtdatahash" xmlns:w16se="http://schemas.microsoft.com/office/word/2015/wordml/symex" xmlns:wpg="http://schemas.microsoft.com/office/word/2010/wordprocessingGroup" xmlns:wpi="http://schemas.microsoft.com/office/word/2010/wordprocessingInk" xmlns:wne="http://schemas.microsoft.com/office/word/2006/wordml" xmlns:wps="http://schemas.microsoft.com/office/word/2010/wordprocessingShape" mc:Ignorable="w14 w15 w16se w16cid w16 w16cex w16sdtdh wp14">
   <w:p>
     <w:r>
       <w:rPr>
@@ -7532,7 +7151,7 @@
                           </w:pPr>
                           <w:r>
                             <w:rPr>
-                              <w:rFonts w:ascii="Roboto" w:hAnsi="Roboto" w:eastAsia="Roboto" w:cs="Roboto"/>
+                              <w:rFonts w:ascii="Roboto" w:eastAsia="Roboto" w:hAnsi="Roboto" w:cs="Roboto"/>
                               <w:b/>
                               <w:color w:val="666666"/>
                             </w:rPr>
@@ -7546,7 +7165,7 @@
                           </w:pPr>
                           <w:r>
                             <w:rPr>
-                              <w:rFonts w:ascii="Roboto" w:hAnsi="Roboto" w:eastAsia="Roboto" w:cs="Roboto"/>
+                              <w:rFonts w:ascii="Roboto" w:eastAsia="Roboto" w:hAnsi="Roboto" w:cs="Roboto"/>
                               <w:color w:val="666666"/>
                             </w:rPr>
                             <w:t>Análisis de Sistemas de Información</w:t>
@@ -7564,8 +7183,8 @@
           </w:drawing>
         </mc:Choice>
         <mc:Fallback>
-          <w:pict w14:anchorId="08A8B822">
-            <v:rect id="Cuadro de texto 2" style="position:absolute;margin-left:-54pt;margin-top:-23.25pt;width:258pt;height:40.5pt;z-index:-503316470;visibility:visible;mso-wrap-style:square;mso-wrap-distance-left:0;mso-wrap-distance-top:0;mso-wrap-distance-right:0;mso-wrap-distance-bottom:0;mso-position-horizontal:absolute;mso-position-horizontal-relative:text;mso-position-vertical:absolute;mso-position-vertical-relative:text;v-text-anchor:top" o:spid="_x0000_s1026" filled="f" stroked="f" strokeweight="0" w14:anchorId="6704EB9D" o:gfxdata="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">
+          <w:pict>
+            <v:rect w14:anchorId="6704EB9D" id="Cuadro de texto 2" o:spid="_x0000_s1026" style="position:absolute;margin-left:-54pt;margin-top:-23.25pt;width:258pt;height:40.5pt;z-index:-503316470;visibility:visible;mso-wrap-style:square;mso-wrap-distance-left:0;mso-wrap-distance-top:0;mso-wrap-distance-right:0;mso-wrap-distance-bottom:0;mso-position-horizontal:absolute;mso-position-horizontal-relative:text;mso-position-vertical:absolute;mso-position-vertical-relative:text;v-text-anchor:top" o:gfxdata="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" filled="f" stroked="f" strokeweight="0">
               <v:textbox inset=",7.2pt,,7.2pt">
                 <w:txbxContent>
                   <w:p>
@@ -7574,7 +7193,7 @@
                     </w:pPr>
                     <w:r>
                       <w:rPr>
-                        <w:rFonts w:ascii="Roboto" w:hAnsi="Roboto" w:eastAsia="Roboto" w:cs="Roboto"/>
+                        <w:rFonts w:ascii="Roboto" w:eastAsia="Roboto" w:hAnsi="Roboto" w:cs="Roboto"/>
                         <w:b/>
                         <w:color w:val="666666"/>
                       </w:rPr>
@@ -7588,7 +7207,7 @@
                     </w:pPr>
                     <w:r>
                       <w:rPr>
-                        <w:rFonts w:ascii="Roboto" w:hAnsi="Roboto" w:eastAsia="Roboto" w:cs="Roboto"/>
+                        <w:rFonts w:ascii="Roboto" w:eastAsia="Roboto" w:hAnsi="Roboto" w:cs="Roboto"/>
                         <w:color w:val="666666"/>
                       </w:rPr>
                       <w:t>Análisis de Sistemas de Información</w:t>
@@ -7771,7 +7390,7 @@
         <w:ind w:left="720" w:hanging="360"/>
       </w:pPr>
       <w:rPr>
-        <w:rFonts w:hint="default" w:ascii="Symbol" w:hAnsi="Symbol"/>
+        <w:rFonts w:ascii="Symbol" w:hAnsi="Symbol" w:hint="default"/>
       </w:rPr>
     </w:lvl>
     <w:lvl w:ilvl="1" w:tplc="04090003" w:tentative="1">
@@ -7783,7 +7402,7 @@
         <w:ind w:left="1440" w:hanging="360"/>
       </w:pPr>
       <w:rPr>
-        <w:rFonts w:hint="default" w:ascii="Courier New" w:hAnsi="Courier New" w:cs="Courier New"/>
+        <w:rFonts w:ascii="Courier New" w:hAnsi="Courier New" w:cs="Courier New" w:hint="default"/>
       </w:rPr>
     </w:lvl>
     <w:lvl w:ilvl="2" w:tplc="04090005" w:tentative="1">
@@ -7795,7 +7414,7 @@
         <w:ind w:left="2160" w:hanging="360"/>
       </w:pPr>
       <w:rPr>
-        <w:rFonts w:hint="default" w:ascii="Wingdings" w:hAnsi="Wingdings"/>
+        <w:rFonts w:ascii="Wingdings" w:hAnsi="Wingdings" w:hint="default"/>
       </w:rPr>
     </w:lvl>
     <w:lvl w:ilvl="3" w:tplc="04090001" w:tentative="1">
@@ -7807,7 +7426,7 @@
         <w:ind w:left="2880" w:hanging="360"/>
       </w:pPr>
       <w:rPr>
-        <w:rFonts w:hint="default" w:ascii="Symbol" w:hAnsi="Symbol"/>
+        <w:rFonts w:ascii="Symbol" w:hAnsi="Symbol" w:hint="default"/>
       </w:rPr>
     </w:lvl>
     <w:lvl w:ilvl="4" w:tplc="04090003" w:tentative="1">
@@ -7819,7 +7438,7 @@
         <w:ind w:left="3600" w:hanging="360"/>
       </w:pPr>
       <w:rPr>
-        <w:rFonts w:hint="default" w:ascii="Courier New" w:hAnsi="Courier New" w:cs="Courier New"/>
+        <w:rFonts w:ascii="Courier New" w:hAnsi="Courier New" w:cs="Courier New" w:hint="default"/>
       </w:rPr>
     </w:lvl>
     <w:lvl w:ilvl="5" w:tplc="04090005" w:tentative="1">
@@ -7831,7 +7450,7 @@
         <w:ind w:left="4320" w:hanging="360"/>
       </w:pPr>
       <w:rPr>
-        <w:rFonts w:hint="default" w:ascii="Wingdings" w:hAnsi="Wingdings"/>
+        <w:rFonts w:ascii="Wingdings" w:hAnsi="Wingdings" w:hint="default"/>
       </w:rPr>
     </w:lvl>
     <w:lvl w:ilvl="6" w:tplc="04090001" w:tentative="1">
@@ -7843,7 +7462,7 @@
         <w:ind w:left="5040" w:hanging="360"/>
       </w:pPr>
       <w:rPr>
-        <w:rFonts w:hint="default" w:ascii="Symbol" w:hAnsi="Symbol"/>
+        <w:rFonts w:ascii="Symbol" w:hAnsi="Symbol" w:hint="default"/>
       </w:rPr>
     </w:lvl>
     <w:lvl w:ilvl="7" w:tplc="04090003" w:tentative="1">
@@ -7855,7 +7474,7 @@
         <w:ind w:left="5760" w:hanging="360"/>
       </w:pPr>
       <w:rPr>
-        <w:rFonts w:hint="default" w:ascii="Courier New" w:hAnsi="Courier New" w:cs="Courier New"/>
+        <w:rFonts w:ascii="Courier New" w:hAnsi="Courier New" w:cs="Courier New" w:hint="default"/>
       </w:rPr>
     </w:lvl>
     <w:lvl w:ilvl="8" w:tplc="04090005" w:tentative="1">
@@ -7867,7 +7486,7 @@
         <w:ind w:left="6480" w:hanging="360"/>
       </w:pPr>
       <w:rPr>
-        <w:rFonts w:hint="default" w:ascii="Wingdings" w:hAnsi="Wingdings"/>
+        <w:rFonts w:ascii="Wingdings" w:hAnsi="Wingdings" w:hint="default"/>
       </w:rPr>
     </w:lvl>
   </w:abstractNum>
@@ -8009,7 +7628,7 @@
         <w:ind w:left="720" w:hanging="360"/>
       </w:pPr>
       <w:rPr>
-        <w:rFonts w:hint="default" w:ascii="Symbol" w:hAnsi="Symbol" w:cs="Symbol"/>
+        <w:rFonts w:ascii="Symbol" w:hAnsi="Symbol" w:cs="Symbol" w:hint="default"/>
       </w:rPr>
     </w:lvl>
     <w:lvl w:ilvl="1">
@@ -8024,7 +7643,7 @@
         <w:ind w:left="1440" w:hanging="360"/>
       </w:pPr>
       <w:rPr>
-        <w:rFonts w:hint="default" w:ascii="Courier New" w:hAnsi="Courier New" w:cs="Courier New"/>
+        <w:rFonts w:ascii="Courier New" w:hAnsi="Courier New" w:cs="Courier New" w:hint="default"/>
       </w:rPr>
     </w:lvl>
     <w:lvl w:ilvl="2">
@@ -8039,7 +7658,7 @@
         <w:ind w:left="2160" w:hanging="360"/>
       </w:pPr>
       <w:rPr>
-        <w:rFonts w:hint="default" w:ascii="Wingdings" w:hAnsi="Wingdings" w:cs="Wingdings"/>
+        <w:rFonts w:ascii="Wingdings" w:hAnsi="Wingdings" w:cs="Wingdings" w:hint="default"/>
       </w:rPr>
     </w:lvl>
     <w:lvl w:ilvl="3">
@@ -8054,7 +7673,7 @@
         <w:ind w:left="2880" w:hanging="360"/>
       </w:pPr>
       <w:rPr>
-        <w:rFonts w:hint="default" w:ascii="Symbol" w:hAnsi="Symbol" w:cs="Symbol"/>
+        <w:rFonts w:ascii="Symbol" w:hAnsi="Symbol" w:cs="Symbol" w:hint="default"/>
       </w:rPr>
     </w:lvl>
     <w:lvl w:ilvl="4">
@@ -8069,7 +7688,7 @@
         <w:ind w:left="3600" w:hanging="360"/>
       </w:pPr>
       <w:rPr>
-        <w:rFonts w:hint="default" w:ascii="Courier New" w:hAnsi="Courier New" w:cs="Courier New"/>
+        <w:rFonts w:ascii="Courier New" w:hAnsi="Courier New" w:cs="Courier New" w:hint="default"/>
       </w:rPr>
     </w:lvl>
     <w:lvl w:ilvl="5">
@@ -8084,7 +7703,7 @@
         <w:ind w:left="4320" w:hanging="360"/>
       </w:pPr>
       <w:rPr>
-        <w:rFonts w:hint="default" w:ascii="Wingdings" w:hAnsi="Wingdings" w:cs="Wingdings"/>
+        <w:rFonts w:ascii="Wingdings" w:hAnsi="Wingdings" w:cs="Wingdings" w:hint="default"/>
       </w:rPr>
     </w:lvl>
     <w:lvl w:ilvl="6">
@@ -8099,7 +7718,7 @@
         <w:ind w:left="5040" w:hanging="360"/>
       </w:pPr>
       <w:rPr>
-        <w:rFonts w:hint="default" w:ascii="Symbol" w:hAnsi="Symbol" w:cs="Symbol"/>
+        <w:rFonts w:ascii="Symbol" w:hAnsi="Symbol" w:cs="Symbol" w:hint="default"/>
       </w:rPr>
     </w:lvl>
     <w:lvl w:ilvl="7">
@@ -8114,7 +7733,7 @@
         <w:ind w:left="5760" w:hanging="360"/>
       </w:pPr>
       <w:rPr>
-        <w:rFonts w:hint="default" w:ascii="Courier New" w:hAnsi="Courier New" w:cs="Courier New"/>
+        <w:rFonts w:ascii="Courier New" w:hAnsi="Courier New" w:cs="Courier New" w:hint="default"/>
       </w:rPr>
     </w:lvl>
     <w:lvl w:ilvl="8">
@@ -8129,7 +7748,7 @@
         <w:ind w:left="6480" w:hanging="360"/>
       </w:pPr>
       <w:rPr>
-        <w:rFonts w:hint="default" w:ascii="Wingdings" w:hAnsi="Wingdings" w:cs="Wingdings"/>
+        <w:rFonts w:ascii="Wingdings" w:hAnsi="Wingdings" w:cs="Wingdings" w:hint="default"/>
       </w:rPr>
     </w:lvl>
   </w:abstractNum>
@@ -8327,7 +7946,7 @@
         <w:ind w:left="720" w:hanging="360"/>
       </w:pPr>
       <w:rPr>
-        <w:rFonts w:hint="default" w:ascii="Symbol" w:hAnsi="Symbol" w:cs="Symbol"/>
+        <w:rFonts w:ascii="Symbol" w:hAnsi="Symbol" w:cs="Symbol" w:hint="default"/>
       </w:rPr>
     </w:lvl>
     <w:lvl w:ilvl="1">
@@ -8342,7 +7961,7 @@
         <w:ind w:left="1440" w:hanging="360"/>
       </w:pPr>
       <w:rPr>
-        <w:rFonts w:hint="default" w:ascii="Courier New" w:hAnsi="Courier New" w:cs="Courier New"/>
+        <w:rFonts w:ascii="Courier New" w:hAnsi="Courier New" w:cs="Courier New" w:hint="default"/>
       </w:rPr>
     </w:lvl>
     <w:lvl w:ilvl="2">
@@ -8357,7 +7976,7 @@
         <w:ind w:left="2160" w:hanging="360"/>
       </w:pPr>
       <w:rPr>
-        <w:rFonts w:hint="default" w:ascii="Wingdings" w:hAnsi="Wingdings" w:cs="Wingdings"/>
+        <w:rFonts w:ascii="Wingdings" w:hAnsi="Wingdings" w:cs="Wingdings" w:hint="default"/>
       </w:rPr>
     </w:lvl>
     <w:lvl w:ilvl="3">
@@ -8372,7 +7991,7 @@
         <w:ind w:left="2880" w:hanging="360"/>
       </w:pPr>
       <w:rPr>
-        <w:rFonts w:hint="default" w:ascii="Symbol" w:hAnsi="Symbol" w:cs="Symbol"/>
+        <w:rFonts w:ascii="Symbol" w:hAnsi="Symbol" w:cs="Symbol" w:hint="default"/>
       </w:rPr>
     </w:lvl>
     <w:lvl w:ilvl="4">
@@ -8387,7 +8006,7 @@
         <w:ind w:left="3600" w:hanging="360"/>
       </w:pPr>
       <w:rPr>
-        <w:rFonts w:hint="default" w:ascii="Courier New" w:hAnsi="Courier New" w:cs="Courier New"/>
+        <w:rFonts w:ascii="Courier New" w:hAnsi="Courier New" w:cs="Courier New" w:hint="default"/>
       </w:rPr>
     </w:lvl>
     <w:lvl w:ilvl="5">
@@ -8402,7 +8021,7 @@
         <w:ind w:left="4320" w:hanging="360"/>
       </w:pPr>
       <w:rPr>
-        <w:rFonts w:hint="default" w:ascii="Wingdings" w:hAnsi="Wingdings" w:cs="Wingdings"/>
+        <w:rFonts w:ascii="Wingdings" w:hAnsi="Wingdings" w:cs="Wingdings" w:hint="default"/>
       </w:rPr>
     </w:lvl>
     <w:lvl w:ilvl="6">
@@ -8417,7 +8036,7 @@
         <w:ind w:left="5040" w:hanging="360"/>
       </w:pPr>
       <w:rPr>
-        <w:rFonts w:hint="default" w:ascii="Symbol" w:hAnsi="Symbol" w:cs="Symbol"/>
+        <w:rFonts w:ascii="Symbol" w:hAnsi="Symbol" w:cs="Symbol" w:hint="default"/>
       </w:rPr>
     </w:lvl>
     <w:lvl w:ilvl="7">
@@ -8432,7 +8051,7 @@
         <w:ind w:left="5760" w:hanging="360"/>
       </w:pPr>
       <w:rPr>
-        <w:rFonts w:hint="default" w:ascii="Courier New" w:hAnsi="Courier New" w:cs="Courier New"/>
+        <w:rFonts w:ascii="Courier New" w:hAnsi="Courier New" w:cs="Courier New" w:hint="default"/>
       </w:rPr>
     </w:lvl>
     <w:lvl w:ilvl="8">
@@ -8447,7 +8066,7 @@
         <w:ind w:left="6480" w:hanging="360"/>
       </w:pPr>
       <w:rPr>
-        <w:rFonts w:hint="default" w:ascii="Wingdings" w:hAnsi="Wingdings" w:cs="Wingdings"/>
+        <w:rFonts w:ascii="Wingdings" w:hAnsi="Wingdings" w:cs="Wingdings" w:hint="default"/>
       </w:rPr>
     </w:lvl>
   </w:abstractNum>
@@ -8476,11 +8095,11 @@
 </file>
 
 <file path=word/styles.xml><?xml version="1.0" encoding="utf-8"?>
-<w:styles xmlns:wp14="http://schemas.microsoft.com/office/word/2010/wordprocessingDrawing" xmlns:mc="http://schemas.openxmlformats.org/markup-compatibility/2006" xmlns:r="http://schemas.openxmlformats.org/officeDocument/2006/relationships" xmlns:w="http://schemas.openxmlformats.org/wordprocessingml/2006/main" xmlns:w14="http://schemas.microsoft.com/office/word/2010/wordml" xmlns:w15="http://schemas.microsoft.com/office/word/2012/wordml" xmlns:w16cex="http://schemas.microsoft.com/office/word/2018/wordml/cex" xmlns:w16cid="http://schemas.microsoft.com/office/word/2016/wordml/cid" xmlns:w16="http://schemas.microsoft.com/office/word/2018/wordml" xmlns:w16sdtdh="http://schemas.microsoft.com/office/word/2020/wordml/sdtdatahash" xmlns:w16se="http://schemas.microsoft.com/office/word/2015/wordml/symex" mc:Ignorable="w14 w15 w16se w16cid w16 w16cex w16sdtdh wp14">
+<w:styles xmlns:mc="http://schemas.openxmlformats.org/markup-compatibility/2006" xmlns:r="http://schemas.openxmlformats.org/officeDocument/2006/relationships" xmlns:w="http://schemas.openxmlformats.org/wordprocessingml/2006/main" xmlns:w14="http://schemas.microsoft.com/office/word/2010/wordml" xmlns:w15="http://schemas.microsoft.com/office/word/2012/wordml" xmlns:w16cex="http://schemas.microsoft.com/office/word/2018/wordml/cex" xmlns:w16cid="http://schemas.microsoft.com/office/word/2016/wordml/cid" xmlns:w16="http://schemas.microsoft.com/office/word/2018/wordml" xmlns:w16sdtdh="http://schemas.microsoft.com/office/word/2020/wordml/sdtdatahash" xmlns:w16se="http://schemas.microsoft.com/office/word/2015/wordml/symex" mc:Ignorable="w14 w15 w16se w16cid w16 w16cex w16sdtdh">
   <w:docDefaults>
     <w:rPrDefault>
       <w:rPr>
-        <w:rFonts w:ascii="Arial" w:hAnsi="Arial" w:eastAsia="Arial" w:cs="Arial"/>
+        <w:rFonts w:ascii="Arial" w:eastAsia="Arial" w:hAnsi="Arial" w:cs="Arial"/>
         <w:sz w:val="22"/>
         <w:szCs w:val="22"/>
         <w:lang w:val="es-ES" w:eastAsia="es-AR" w:bidi="ar-SA"/>
@@ -8495,14 +8114,14 @@
   <w:latentStyles w:defLockedState="0" w:defUIPriority="99" w:defSemiHidden="0" w:defUnhideWhenUsed="0" w:defQFormat="0" w:count="376">
     <w:lsdException w:name="Normal" w:uiPriority="0" w:qFormat="1"/>
     <w:lsdException w:name="heading 1" w:uiPriority="9" w:qFormat="1"/>
-    <w:lsdException w:name="heading 2" w:uiPriority="9" w:semiHidden="1" w:unhideWhenUsed="1" w:qFormat="1"/>
-    <w:lsdException w:name="heading 3" w:uiPriority="9" w:semiHidden="1" w:unhideWhenUsed="1" w:qFormat="1"/>
-    <w:lsdException w:name="heading 4" w:uiPriority="9" w:semiHidden="1" w:unhideWhenUsed="1" w:qFormat="1"/>
-    <w:lsdException w:name="heading 5" w:uiPriority="9" w:semiHidden="1" w:unhideWhenUsed="1" w:qFormat="1"/>
-    <w:lsdException w:name="heading 6" w:uiPriority="9" w:semiHidden="1" w:unhideWhenUsed="1" w:qFormat="1"/>
-    <w:lsdException w:name="heading 7" w:uiPriority="9" w:semiHidden="1" w:unhideWhenUsed="1" w:qFormat="1"/>
-    <w:lsdException w:name="heading 8" w:uiPriority="9" w:semiHidden="1" w:unhideWhenUsed="1" w:qFormat="1"/>
-    <w:lsdException w:name="heading 9" w:uiPriority="9" w:semiHidden="1" w:unhideWhenUsed="1" w:qFormat="1"/>
+    <w:lsdException w:name="heading 2" w:semiHidden="1" w:uiPriority="9" w:unhideWhenUsed="1" w:qFormat="1"/>
+    <w:lsdException w:name="heading 3" w:semiHidden="1" w:uiPriority="9" w:unhideWhenUsed="1" w:qFormat="1"/>
+    <w:lsdException w:name="heading 4" w:semiHidden="1" w:uiPriority="9" w:unhideWhenUsed="1" w:qFormat="1"/>
+    <w:lsdException w:name="heading 5" w:semiHidden="1" w:uiPriority="9" w:unhideWhenUsed="1" w:qFormat="1"/>
+    <w:lsdException w:name="heading 6" w:semiHidden="1" w:uiPriority="9" w:unhideWhenUsed="1" w:qFormat="1"/>
+    <w:lsdException w:name="heading 7" w:semiHidden="1" w:uiPriority="9" w:unhideWhenUsed="1" w:qFormat="1"/>
+    <w:lsdException w:name="heading 8" w:semiHidden="1" w:uiPriority="9" w:unhideWhenUsed="1" w:qFormat="1"/>
+    <w:lsdException w:name="heading 9" w:semiHidden="1" w:uiPriority="9" w:unhideWhenUsed="1" w:qFormat="1"/>
     <w:lsdException w:name="index 1" w:semiHidden="1" w:unhideWhenUsed="1"/>
     <w:lsdException w:name="index 2" w:semiHidden="1" w:unhideWhenUsed="1"/>
     <w:lsdException w:name="index 3" w:semiHidden="1" w:unhideWhenUsed="1"/>
@@ -8512,22 +8131,22 @@
     <w:lsdException w:name="index 7" w:semiHidden="1" w:unhideWhenUsed="1"/>
     <w:lsdException w:name="index 8" w:semiHidden="1" w:unhideWhenUsed="1"/>
     <w:lsdException w:name="index 9" w:semiHidden="1" w:unhideWhenUsed="1"/>
-    <w:lsdException w:name="toc 1" w:uiPriority="39" w:semiHidden="1" w:unhideWhenUsed="1"/>
-    <w:lsdException w:name="toc 2" w:uiPriority="39" w:semiHidden="1" w:unhideWhenUsed="1"/>
-    <w:lsdException w:name="toc 3" w:uiPriority="39" w:semiHidden="1" w:unhideWhenUsed="1"/>
-    <w:lsdException w:name="toc 4" w:uiPriority="39" w:semiHidden="1" w:unhideWhenUsed="1"/>
-    <w:lsdException w:name="toc 5" w:uiPriority="39" w:semiHidden="1" w:unhideWhenUsed="1"/>
-    <w:lsdException w:name="toc 6" w:uiPriority="39" w:semiHidden="1" w:unhideWhenUsed="1"/>
-    <w:lsdException w:name="toc 7" w:uiPriority="39" w:semiHidden="1" w:unhideWhenUsed="1"/>
-    <w:lsdException w:name="toc 8" w:uiPriority="39" w:semiHidden="1" w:unhideWhenUsed="1"/>
-    <w:lsdException w:name="toc 9" w:uiPriority="39" w:semiHidden="1" w:unhideWhenUsed="1"/>
+    <w:lsdException w:name="toc 1" w:semiHidden="1" w:uiPriority="39" w:unhideWhenUsed="1"/>
+    <w:lsdException w:name="toc 2" w:semiHidden="1" w:uiPriority="39" w:unhideWhenUsed="1"/>
+    <w:lsdException w:name="toc 3" w:semiHidden="1" w:uiPriority="39" w:unhideWhenUsed="1"/>
+    <w:lsdException w:name="toc 4" w:semiHidden="1" w:uiPriority="39" w:unhideWhenUsed="1"/>
+    <w:lsdException w:name="toc 5" w:semiHidden="1" w:uiPriority="39" w:unhideWhenUsed="1"/>
+    <w:lsdException w:name="toc 6" w:semiHidden="1" w:uiPriority="39" w:unhideWhenUsed="1"/>
+    <w:lsdException w:name="toc 7" w:semiHidden="1" w:uiPriority="39" w:unhideWhenUsed="1"/>
+    <w:lsdException w:name="toc 8" w:semiHidden="1" w:uiPriority="39" w:unhideWhenUsed="1"/>
+    <w:lsdException w:name="toc 9" w:semiHidden="1" w:uiPriority="39" w:unhideWhenUsed="1"/>
     <w:lsdException w:name="Normal Indent" w:semiHidden="1" w:unhideWhenUsed="1"/>
     <w:lsdException w:name="footnote text" w:semiHidden="1" w:unhideWhenUsed="1"/>
     <w:lsdException w:name="annotation text" w:semiHidden="1" w:unhideWhenUsed="1"/>
-    <w:lsdException w:name="header" w:uiPriority="0" w:semiHidden="1" w:unhideWhenUsed="1"/>
+    <w:lsdException w:name="header" w:semiHidden="1" w:uiPriority="0" w:unhideWhenUsed="1"/>
     <w:lsdException w:name="footer" w:semiHidden="1" w:unhideWhenUsed="1"/>
     <w:lsdException w:name="index heading" w:semiHidden="1" w:unhideWhenUsed="1"/>
-    <w:lsdException w:name="caption" w:uiPriority="35" w:semiHidden="1" w:unhideWhenUsed="1" w:qFormat="1"/>
+    <w:lsdException w:name="caption" w:semiHidden="1" w:uiPriority="35" w:unhideWhenUsed="1" w:qFormat="1"/>
     <w:lsdException w:name="table of figures" w:semiHidden="1" w:unhideWhenUsed="1"/>
     <w:lsdException w:name="envelope address" w:semiHidden="1" w:unhideWhenUsed="1"/>
     <w:lsdException w:name="envelope return" w:semiHidden="1" w:unhideWhenUsed="1"/>
@@ -8558,7 +8177,7 @@
     <w:lsdException w:name="Title" w:uiPriority="10" w:qFormat="1"/>
     <w:lsdException w:name="Closing" w:semiHidden="1" w:unhideWhenUsed="1"/>
     <w:lsdException w:name="Signature" w:semiHidden="1" w:unhideWhenUsed="1"/>
-    <w:lsdException w:name="Default Paragraph Font" w:uiPriority="1" w:semiHidden="1" w:unhideWhenUsed="1"/>
+    <w:lsdException w:name="Default Paragraph Font" w:semiHidden="1" w:uiPriority="1" w:unhideWhenUsed="1"/>
     <w:lsdException w:name="Body Text" w:semiHidden="1" w:unhideWhenUsed="1"/>
     <w:lsdException w:name="Body Text Indent" w:semiHidden="1" w:unhideWhenUsed="1"/>
     <w:lsdException w:name="List Continue" w:semiHidden="1" w:unhideWhenUsed="1"/>
@@ -8758,8 +8377,8 @@
     <w:lsdException w:name="Subtle Reference" w:uiPriority="31" w:qFormat="1"/>
     <w:lsdException w:name="Intense Reference" w:uiPriority="32" w:qFormat="1"/>
     <w:lsdException w:name="Book Title" w:uiPriority="33" w:qFormat="1"/>
-    <w:lsdException w:name="Bibliography" w:uiPriority="37" w:semiHidden="1" w:unhideWhenUsed="1"/>
-    <w:lsdException w:name="TOC Heading" w:uiPriority="39" w:semiHidden="1" w:unhideWhenUsed="1" w:qFormat="1"/>
+    <w:lsdException w:name="Bibliography" w:semiHidden="1" w:uiPriority="37" w:unhideWhenUsed="1"/>
+    <w:lsdException w:name="TOC Heading" w:semiHidden="1" w:uiPriority="39" w:unhideWhenUsed="1" w:qFormat="1"/>
     <w:lsdException w:name="Plain Table 1" w:uiPriority="41"/>
     <w:lsdException w:name="Plain Table 2" w:uiPriority="42"/>
     <w:lsdException w:name="Plain Table 3" w:uiPriority="43"/>
@@ -8870,7 +8489,7 @@
     <w:lsdException w:name="Unresolved Mention" w:semiHidden="1" w:unhideWhenUsed="1"/>
     <w:lsdException w:name="Smart Link" w:semiHidden="1" w:unhideWhenUsed="1"/>
   </w:latentStyles>
-  <w:style w:type="paragraph" w:styleId="Normal" w:default="1">
+  <w:style w:type="paragraph" w:default="1" w:styleId="Normal">
     <w:name w:val="Normal"/>
     <w:qFormat/>
     <w:pPr>
@@ -8988,13 +8607,13 @@
       <w:color w:val="666666"/>
     </w:rPr>
   </w:style>
-  <w:style w:type="character" w:styleId="Fuentedeprrafopredeter" w:default="1">
+  <w:style w:type="character" w:default="1" w:styleId="Fuentedeprrafopredeter">
     <w:name w:val="Default Paragraph Font"/>
     <w:uiPriority w:val="1"/>
     <w:semiHidden/>
     <w:unhideWhenUsed/>
   </w:style>
-  <w:style w:type="table" w:styleId="Tablanormal" w:default="1">
+  <w:style w:type="table" w:default="1" w:styleId="Tablanormal">
     <w:name w:val="Normal Table"/>
     <w:uiPriority w:val="99"/>
     <w:semiHidden/>
@@ -9009,7 +8628,7 @@
       </w:tblCellMar>
     </w:tblPr>
   </w:style>
-  <w:style w:type="numbering" w:styleId="Sinlista" w:default="1">
+  <w:style w:type="numbering" w:default="1" w:styleId="Sinlista">
     <w:name w:val="No List"/>
     <w:uiPriority w:val="99"/>
     <w:semiHidden/>
@@ -9026,7 +8645,7 @@
       <w:u w:val="single"/>
     </w:rPr>
   </w:style>
-  <w:style w:type="character" w:styleId="Mencinsinresolver1" w:customStyle="1">
+  <w:style w:type="character" w:customStyle="1" w:styleId="Mencinsinresolver1">
     <w:name w:val="Mención sin resolver1"/>
     <w:basedOn w:val="Fuentedeprrafopredeter"/>
     <w:uiPriority w:val="99"/>
@@ -9050,24 +8669,24 @@
       <w:u w:val="single"/>
     </w:rPr>
   </w:style>
-  <w:style w:type="character" w:styleId="EncabezadoCar" w:customStyle="1">
+  <w:style w:type="character" w:customStyle="1" w:styleId="EncabezadoCar">
     <w:name w:val="Encabezado Car"/>
     <w:basedOn w:val="Fuentedeprrafopredeter"/>
     <w:link w:val="Encabezado"/>
     <w:uiPriority w:val="99"/>
     <w:rsid w:val="004B52D1"/>
   </w:style>
-  <w:style w:type="character" w:styleId="PiedepginaCar" w:customStyle="1">
+  <w:style w:type="character" w:customStyle="1" w:styleId="PiedepginaCar">
     <w:name w:val="Pie de página Car"/>
     <w:basedOn w:val="Fuentedeprrafopredeter"/>
     <w:link w:val="Piedepgina"/>
     <w:uiPriority w:val="99"/>
     <w:rsid w:val="004B52D1"/>
   </w:style>
-  <w:style w:type="character" w:styleId="IndexLink" w:customStyle="1">
+  <w:style w:type="character" w:customStyle="1" w:styleId="IndexLink">
     <w:name w:val="Index Link"/>
   </w:style>
-  <w:style w:type="paragraph" w:styleId="Heading" w:customStyle="1">
+  <w:style w:type="paragraph" w:customStyle="1" w:styleId="Heading">
     <w:name w:val="Heading"/>
     <w:basedOn w:val="Normal"/>
     <w:next w:val="Textoindependiente"/>
@@ -9076,7 +8695,7 @@
       <w:spacing w:before="240" w:after="120"/>
     </w:pPr>
     <w:rPr>
-      <w:rFonts w:ascii="Liberation Sans" w:hAnsi="Liberation Sans" w:eastAsia="Noto Sans" w:cs="Noto Sans Devanagari"/>
+      <w:rFonts w:ascii="Liberation Sans" w:eastAsia="Noto Sans" w:hAnsi="Liberation Sans" w:cs="Noto Sans Devanagari"/>
       <w:sz w:val="28"/>
       <w:szCs w:val="28"/>
     </w:rPr>
@@ -9110,7 +8729,7 @@
       <w:szCs w:val="24"/>
     </w:rPr>
   </w:style>
-  <w:style w:type="paragraph" w:styleId="Index" w:customStyle="1">
+  <w:style w:type="paragraph" w:customStyle="1" w:styleId="Index">
     <w:name w:val="Index"/>
     <w:basedOn w:val="Normal"/>
     <w:pPr>
@@ -9153,7 +8772,7 @@
       <w:szCs w:val="30"/>
     </w:rPr>
   </w:style>
-  <w:style w:type="paragraph" w:styleId="HeaderandFooter" w:customStyle="1">
+  <w:style w:type="paragraph" w:customStyle="1" w:styleId="HeaderandFooter">
     <w:name w:val="Header and Footer"/>
     <w:basedOn w:val="Normal"/>
   </w:style>
@@ -9203,7 +8822,7 @@
       <w:outlineLvl w:val="9"/>
     </w:pPr>
     <w:rPr>
-      <w:rFonts w:asciiTheme="majorHAnsi" w:hAnsiTheme="majorHAnsi" w:eastAsiaTheme="majorEastAsia" w:cstheme="majorBidi"/>
+      <w:rFonts w:asciiTheme="majorHAnsi" w:eastAsiaTheme="majorEastAsia" w:hAnsiTheme="majorHAnsi" w:cstheme="majorBidi"/>
       <w:color w:val="365F91" w:themeColor="accent1" w:themeShade="BF"/>
       <w:sz w:val="32"/>
       <w:szCs w:val="32"/>
@@ -9259,11 +8878,11 @@
       <w:ind w:left="440"/>
     </w:pPr>
   </w:style>
-  <w:style w:type="paragraph" w:styleId="FrameContents" w:customStyle="1">
+  <w:style w:type="paragraph" w:customStyle="1" w:styleId="FrameContents">
     <w:name w:val="Frame Contents"/>
     <w:basedOn w:val="Normal"/>
   </w:style>
-  <w:style w:type="table" w:styleId="TableNormal" w:customStyle="1">
+  <w:style w:type="table" w:customStyle="1" w:styleId="TableNormal">
     <w:name w:val="TableNormal"/>
     <w:tblPr>
       <w:tblCellMar>
@@ -9281,12 +8900,12 @@
     <w:rsid w:val="00C55A72"/>
     <w:tblPr>
       <w:tblBorders>
-        <w:top w:val="single" w:color="auto" w:sz="4" w:space="0"/>
-        <w:left w:val="single" w:color="auto" w:sz="4" w:space="0"/>
-        <w:bottom w:val="single" w:color="auto" w:sz="4" w:space="0"/>
-        <w:right w:val="single" w:color="auto" w:sz="4" w:space="0"/>
-        <w:insideH w:val="single" w:color="auto" w:sz="4" w:space="0"/>
-        <w:insideV w:val="single" w:color="auto" w:sz="4" w:space="0"/>
+        <w:top w:val="single" w:sz="4" w:space="0" w:color="auto"/>
+        <w:left w:val="single" w:sz="4" w:space="0" w:color="auto"/>
+        <w:bottom w:val="single" w:sz="4" w:space="0" w:color="auto"/>
+        <w:right w:val="single" w:sz="4" w:space="0" w:color="auto"/>
+        <w:insideH w:val="single" w:sz="4" w:space="0" w:color="auto"/>
+        <w:insideV w:val="single" w:sz="4" w:space="0" w:color="auto"/>
       </w:tblBorders>
     </w:tblPr>
   </w:style>

</xml_diff>

<commit_message>
Agregué CU dar de baja retiro
</commit_message>
<xml_diff>
--- a/Entrega 3/Entrega 3 - TPI.docx
+++ b/Entrega 3/Entrega 3 - TPI.docx
@@ -1307,6 +1307,66 @@
             <w:r>
               <w:t>Modificar los datos de un retiro agendado y registrar los cambios</w:t>
             </w:r>
+            <w:r>
+              <w:t>.</w:t>
+            </w:r>
+          </w:p>
+        </w:tc>
+        <w:tc>
+          <w:tcPr>
+            <w:tcW w:w="2254" w:type="dxa"/>
+          </w:tcPr>
+          <w:p>
+            <w:pPr>
+              <w:jc w:val="both"/>
+            </w:pPr>
+            <w:r>
+              <w:t>Usuario</w:t>
+            </w:r>
+          </w:p>
+        </w:tc>
+      </w:tr>
+      <w:tr>
+        <w:tc>
+          <w:tcPr>
+            <w:tcW w:w="846" w:type="dxa"/>
+          </w:tcPr>
+          <w:p>
+            <w:pPr>
+              <w:jc w:val="both"/>
+            </w:pPr>
+            <w:r>
+              <w:t>CU4</w:t>
+            </w:r>
+          </w:p>
+        </w:tc>
+        <w:tc>
+          <w:tcPr>
+            <w:tcW w:w="2126" w:type="dxa"/>
+          </w:tcPr>
+          <w:p>
+            <w:pPr>
+              <w:jc w:val="both"/>
+            </w:pPr>
+            <w:r>
+              <w:t>Dar de baja un retiro</w:t>
+            </w:r>
+          </w:p>
+        </w:tc>
+        <w:tc>
+          <w:tcPr>
+            <w:tcW w:w="3790" w:type="dxa"/>
+          </w:tcPr>
+          <w:p>
+            <w:pPr>
+              <w:tabs>
+                <w:tab w:val="left" w:pos="1245"/>
+              </w:tabs>
+              <w:jc w:val="both"/>
+            </w:pPr>
+            <w:r>
+              <w:t>Dar de baja un retiro agendado modificando su estado a cancelado.</w:t>
+            </w:r>
           </w:p>
         </w:tc>
         <w:tc>
@@ -1339,7 +1399,7 @@
               <w:t>CU</w:t>
             </w:r>
             <w:r>
-              <w:t>4</w:t>
+              <w:t>5</w:t>
             </w:r>
           </w:p>
         </w:tc>
@@ -1396,7 +1456,10 @@
               <w:jc w:val="both"/>
             </w:pPr>
             <w:r>
-              <w:t>CU5</w:t>
+              <w:t>CU</w:t>
+            </w:r>
+            <w:r>
+              <w:t>6</w:t>
             </w:r>
           </w:p>
         </w:tc>
@@ -1458,7 +1521,7 @@
               <w:t>CU</w:t>
             </w:r>
             <w:r>
-              <w:t>6</w:t>
+              <w:t>7</w:t>
             </w:r>
           </w:p>
         </w:tc>
@@ -1520,7 +1583,7 @@
               <w:t>CU</w:t>
             </w:r>
             <w:r>
-              <w:t>7</w:t>
+              <w:t>8</w:t>
             </w:r>
           </w:p>
         </w:tc>
@@ -1588,7 +1651,7 @@
               <w:t>CU</w:t>
             </w:r>
             <w:r>
-              <w:t>8</w:t>
+              <w:t>9</w:t>
             </w:r>
           </w:p>
         </w:tc>
@@ -2214,7 +2277,7 @@
                     </wp:inline>
                   </w:drawing>
                 </mc:Choice>
-                <mc:Fallback xmlns:a14="http://schemas.microsoft.com/office/drawing/2010/main" xmlns:pic="http://schemas.openxmlformats.org/drawingml/2006/picture" xmlns:a="http://schemas.openxmlformats.org/drawingml/2006/main"/>
+                <mc:Fallback xmlns:a="http://schemas.openxmlformats.org/drawingml/2006/main" xmlns:pic="http://schemas.openxmlformats.org/drawingml/2006/picture" xmlns:a14="http://schemas.microsoft.com/office/drawing/2010/main"/>
               </mc:AlternateContent>
             </w:r>
             <w:r>
@@ -2707,8 +2770,47 @@
                 <w:sz w:val="20"/>
                 <w:szCs w:val="20"/>
               </w:rPr>
-              <w:t>A3. En caso de que el usuario al presionar no encuentre una actividad en la lista predeterminada de categorías, se llama al caso de uso de registrar categoría.</w:t>
-            </w:r>
+              <w:t xml:space="preserve">A3. En caso de que el usuario al presionar no encuentre una </w:t>
+            </w:r>
+            <w:r>
+              <w:rPr>
+                <w:rFonts w:ascii="Tahoma" w:hAnsi="Tahoma" w:cs="Tahoma"/>
+                <w:sz w:val="20"/>
+                <w:szCs w:val="20"/>
+              </w:rPr>
+              <w:t>categoría</w:t>
+            </w:r>
+            <w:r>
+              <w:rPr>
+                <w:rFonts w:ascii="Tahoma" w:hAnsi="Tahoma" w:cs="Tahoma"/>
+                <w:sz w:val="20"/>
+                <w:szCs w:val="20"/>
+              </w:rPr>
+              <w:t xml:space="preserve"> en la lista predeterminada de categorías, se llama al caso de uso de registrar categoría.</w:t>
+            </w:r>
+          </w:p>
+        </w:tc>
+      </w:tr>
+      <w:tr>
+        <w:trPr>
+          <w:trHeight w:val="285"/>
+          <w:tblCellSpacing w:w="20" w:type="dxa"/>
+          <w:jc w:val="center"/>
+        </w:trPr>
+        <w:tc>
+          <w:tcPr>
+            <w:tcW w:w="9120" w:type="dxa"/>
+            <w:gridSpan w:val="5"/>
+          </w:tcPr>
+          <w:p>
+            <w:pPr>
+              <w:jc w:val="both"/>
+              <w:rPr>
+                <w:rFonts w:ascii="Tahoma" w:hAnsi="Tahoma" w:cs="Tahoma"/>
+                <w:sz w:val="20"/>
+                <w:szCs w:val="20"/>
+              </w:rPr>
+            </w:pPr>
           </w:p>
         </w:tc>
       </w:tr>
@@ -3821,7 +3923,7 @@
                     </wp:anchor>
                   </w:drawing>
                 </mc:Choice>
-                <mc:Fallback xmlns:w16du="http://schemas.microsoft.com/office/word/2023/wordml/word16du" xmlns:w16sdtfl="http://schemas.microsoft.com/office/word/2024/wordml/sdtformatlock" xmlns:a14="http://schemas.microsoft.com/office/drawing/2010/main" xmlns:pic="http://schemas.openxmlformats.org/drawingml/2006/picture" xmlns:a="http://schemas.openxmlformats.org/drawingml/2006/main">
+                <mc:Fallback xmlns:a="http://schemas.openxmlformats.org/drawingml/2006/main" xmlns:pic="http://schemas.openxmlformats.org/drawingml/2006/picture" xmlns:a14="http://schemas.microsoft.com/office/drawing/2010/main" xmlns:w16sdtfl="http://schemas.microsoft.com/office/word/2024/wordml/sdtformatlock" xmlns:w16du="http://schemas.microsoft.com/office/word/2023/wordml/word16du">
                   <w:pict w14:anchorId="6873BC2E">
                     <v:shapetype id="_x0000_t11" coordsize="21600,21600" o:spt="11" adj="5400" path="m@0,l@0@0,0@0,0@2@0@2@0,21600@1,21600@1@2,21600@2,21600@0@1@0@1,xe" w14:anchorId="3CE4F9DD">
                       <v:stroke joinstyle="miter"/>
@@ -5323,7 +5425,7 @@
                     </wp:anchor>
                   </w:drawing>
                 </mc:Choice>
-                <mc:Fallback xmlns:w16du="http://schemas.microsoft.com/office/word/2023/wordml/word16du" xmlns:w16sdtfl="http://schemas.microsoft.com/office/word/2024/wordml/sdtformatlock" xmlns:a14="http://schemas.microsoft.com/office/drawing/2010/main" xmlns:pic="http://schemas.openxmlformats.org/drawingml/2006/picture" xmlns:a="http://schemas.openxmlformats.org/drawingml/2006/main">
+                <mc:Fallback xmlns:a="http://schemas.openxmlformats.org/drawingml/2006/main" xmlns:pic="http://schemas.openxmlformats.org/drawingml/2006/picture" xmlns:a14="http://schemas.microsoft.com/office/drawing/2010/main" xmlns:w16sdtfl="http://schemas.microsoft.com/office/word/2024/wordml/sdtformatlock" xmlns:w16du="http://schemas.microsoft.com/office/word/2023/wordml/word16du">
                   <w:pict w14:anchorId="73905CDF">
                     <v:shape id="Cruz 6" style="position:absolute;margin-left:146.35pt;margin-top:.65pt;width:10.5pt;height:11.25pt;z-index:251663360;visibility:visible;mso-wrap-style:square;mso-width-percent:0;mso-height-percent:0;mso-wrap-distance-left:9pt;mso-wrap-distance-top:0;mso-wrap-distance-right:9pt;mso-wrap-distance-bottom:0;mso-position-horizontal:absolute;mso-position-horizontal-relative:text;mso-position-vertical:absolute;mso-position-vertical-relative:text;mso-width-percent:0;mso-height-percent:0;mso-width-relative:page;mso-height-relative:page;v-text-anchor:top" o:spid="_x0000_s1026" fillcolor="black" strokecolor="#f2f2f2" strokeweight="3pt" type="#_x0000_t11" o:gfxdata="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" w14:anchorId="263415CC">
                       <v:shadow on="t" color="#7f7f7f" opacity=".5" offset="1pt"/>

</xml_diff>

<commit_message>
Se modificaron el diagrama de CU y las plantillas
</commit_message>
<xml_diff>
--- a/Entrega 3/Entrega 3 - TPI.docx
+++ b/Entrega 3/Entrega 3 - TPI.docx
@@ -279,7 +279,15 @@
     </w:p>
     <w:p>
       <w:r>
-        <w:t>Agüero, Maximo.</w:t>
+        <w:t xml:space="preserve">Agüero, </w:t>
+      </w:r>
+      <w:proofErr w:type="spellStart"/>
+      <w:r>
+        <w:t>Maximo</w:t>
+      </w:r>
+      <w:proofErr w:type="spellEnd"/>
+      <w:r>
+        <w:t>.</w:t>
       </w:r>
       <w:r>
         <w:tab/>
@@ -990,9 +998,9 @@
           <w:lang w:val="en-US" w:eastAsia="en-US"/>
         </w:rPr>
         <w:drawing>
-          <wp:inline distT="0" distB="0" distL="0" distR="0" wp14:anchorId="08315925" wp14:editId="171B7E75">
-            <wp:extent cx="5731510" cy="7043420"/>
-            <wp:effectExtent l="0" t="0" r="2540" b="5080"/>
+          <wp:inline distT="0" distB="0" distL="0" distR="0" wp14:anchorId="08315925" wp14:editId="5E050E98">
+            <wp:extent cx="5623081" cy="7043420"/>
+            <wp:effectExtent l="0" t="0" r="0" b="5080"/>
             <wp:docPr id="19" name="Imagen 19"/>
             <wp:cNvGraphicFramePr>
               <a:graphicFrameLocks xmlns:a="http://schemas.openxmlformats.org/drawingml/2006/main" noChangeAspect="1"/>
@@ -1001,11 +1009,17 @@
               <a:graphicData uri="http://schemas.openxmlformats.org/drawingml/2006/picture">
                 <pic:pic xmlns:pic="http://schemas.openxmlformats.org/drawingml/2006/picture">
                   <pic:nvPicPr>
-                    <pic:cNvPr id="1" name=""/>
+                    <pic:cNvPr id="19" name="Imagen 19"/>
                     <pic:cNvPicPr/>
                   </pic:nvPicPr>
                   <pic:blipFill>
-                    <a:blip r:embed="rId14"/>
+                    <a:blip r:embed="rId14">
+                      <a:extLst>
+                        <a:ext uri="{28A0092B-C50C-407E-A947-70E740481C1C}">
+                          <a14:useLocalDpi xmlns:a14="http://schemas.microsoft.com/office/drawing/2010/main" val="0"/>
+                        </a:ext>
+                      </a:extLst>
+                    </a:blip>
                     <a:stretch>
                       <a:fillRect/>
                     </a:stretch>
@@ -1013,7 +1027,7 @@
                   <pic:spPr>
                     <a:xfrm>
                       <a:off x="0" y="0"/>
-                      <a:ext cx="5731510" cy="7043420"/>
+                      <a:ext cx="5623081" cy="7043420"/>
                     </a:xfrm>
                     <a:prstGeom prst="rect">
                       <a:avLst/>
@@ -1935,7 +1949,27 @@
           <w:bCs/>
           <w:color w:val="333399"/>
         </w:rPr>
-        <w:t>Plantilla para Descripción de Use Cases  (Trazo Intermedio)</w:t>
+        <w:t xml:space="preserve">Plantilla para Descripción de Use </w:t>
+      </w:r>
+      <w:proofErr w:type="gramStart"/>
+      <w:r>
+        <w:rPr>
+          <w:rFonts w:ascii="Tahoma" w:hAnsi="Tahoma" w:cs="Tahoma"/>
+          <w:b/>
+          <w:bCs/>
+          <w:color w:val="333399"/>
+        </w:rPr>
+        <w:t>Cases  (</w:t>
+      </w:r>
+      <w:proofErr w:type="gramEnd"/>
+      <w:r>
+        <w:rPr>
+          <w:rFonts w:ascii="Tahoma" w:hAnsi="Tahoma" w:cs="Tahoma"/>
+          <w:b/>
+          <w:bCs/>
+          <w:color w:val="333399"/>
+        </w:rPr>
+        <w:t>Trazo Intermedio)</w:t>
       </w:r>
     </w:p>
     <w:p>
@@ -4418,6 +4452,30 @@
               </w:rPr>
               <w:t>.</w:t>
             </w:r>
+            <w:r>
+              <w:rPr>
+                <w:rFonts w:ascii="Tahoma" w:hAnsi="Tahoma" w:cs="Tahoma"/>
+                <w:sz w:val="20"/>
+                <w:szCs w:val="20"/>
+              </w:rPr>
+              <w:t xml:space="preserve"> E</w:t>
+            </w:r>
+            <w:r>
+              <w:rPr>
+                <w:rFonts w:ascii="Tahoma" w:hAnsi="Tahoma" w:cs="Tahoma"/>
+                <w:sz w:val="20"/>
+                <w:szCs w:val="20"/>
+              </w:rPr>
+              <w:t>l usuario puede optar por modificar o cancelar el retiro</w:t>
+            </w:r>
+            <w:r>
+              <w:rPr>
+                <w:rFonts w:ascii="Tahoma" w:hAnsi="Tahoma" w:cs="Tahoma"/>
+                <w:sz w:val="20"/>
+                <w:szCs w:val="20"/>
+              </w:rPr>
+              <w:t>.</w:t>
+            </w:r>
           </w:p>
         </w:tc>
       </w:tr>
@@ -4589,6 +4647,32 @@
           </w:p>
           <w:p>
             <w:pPr>
+              <w:numPr>
+                <w:ilvl w:val="0"/>
+                <w:numId w:val="6"/>
+              </w:numPr>
+              <w:suppressAutoHyphens w:val="0"/>
+              <w:spacing w:line="240" w:lineRule="auto"/>
+              <w:jc w:val="both"/>
+              <w:rPr>
+                <w:rFonts w:ascii="Tahoma" w:hAnsi="Tahoma" w:cs="Tahoma"/>
+                <w:b/>
+                <w:bCs/>
+                <w:sz w:val="20"/>
+              </w:rPr>
+            </w:pPr>
+            <w:r>
+              <w:rPr>
+                <w:rFonts w:ascii="Tahoma" w:hAnsi="Tahoma" w:cs="Tahoma"/>
+                <w:b/>
+                <w:bCs/>
+                <w:sz w:val="20"/>
+              </w:rPr>
+              <w:t>Dar de baja cambia el estado del retiro a “Cancelado”.</w:t>
+            </w:r>
+          </w:p>
+          <w:p>
+            <w:pPr>
               <w:jc w:val="both"/>
               <w:rPr>
                 <w:rFonts w:ascii="Tahoma" w:hAnsi="Tahoma" w:cs="Tahoma"/>
@@ -4641,7 +4725,14 @@
                 <w:bCs/>
                 <w:sz w:val="20"/>
               </w:rPr>
-              <w:t>Asociaciones de Extensión:  No aplica</w:t>
+              <w:t xml:space="preserve">Asociaciones de Extensión:  </w:t>
+            </w:r>
+            <w:r>
+              <w:rPr>
+                <w:rFonts w:ascii="Tahoma" w:hAnsi="Tahoma" w:cs="Tahoma"/>
+                <w:sz w:val="20"/>
+              </w:rPr>
+              <w:t>Modificar retiro agendado, Dar de baja un retiro.</w:t>
             </w:r>
           </w:p>
         </w:tc>
@@ -4842,6 +4933,13 @@
               </w:rPr>
               <w:t>Agustín Borgo</w:t>
             </w:r>
+            <w:r>
+              <w:rPr>
+                <w:sz w:val="20"/>
+                <w:szCs w:val="20"/>
+              </w:rPr>
+              <w:t>/Juan Nuñez</w:t>
+            </w:r>
           </w:p>
         </w:tc>
         <w:tc>
@@ -4916,7 +5014,7 @@
                 <w:sz w:val="20"/>
                 <w:szCs w:val="20"/>
               </w:rPr>
-              <w:t>Agustín Borgo</w:t>
+              <w:t>Juan Nuñez</w:t>
             </w:r>
           </w:p>
         </w:tc>
@@ -4958,7 +5056,14 @@
                 <w:sz w:val="20"/>
                 <w:szCs w:val="20"/>
               </w:rPr>
-              <w:t>6/10/2026</w:t>
+              <w:t>12</w:t>
+            </w:r>
+            <w:r>
+              <w:rPr>
+                <w:sz w:val="20"/>
+                <w:szCs w:val="20"/>
+              </w:rPr>
+              <w:t>/10/2026</w:t>
             </w:r>
           </w:p>
         </w:tc>
@@ -5313,7 +5418,27 @@
           <w:color w:val="333399"/>
         </w:rPr>
         <w:lastRenderedPageBreak/>
-        <w:t>Plantilla para Descripción de Use Cases  (Trazo Intermedio)</w:t>
+        <w:t xml:space="preserve">Plantilla para Descripción de Use </w:t>
+      </w:r>
+      <w:proofErr w:type="gramStart"/>
+      <w:r>
+        <w:rPr>
+          <w:rFonts w:ascii="Tahoma" w:hAnsi="Tahoma" w:cs="Tahoma"/>
+          <w:b/>
+          <w:bCs/>
+          <w:color w:val="333399"/>
+        </w:rPr>
+        <w:t>Cases  (</w:t>
+      </w:r>
+      <w:proofErr w:type="gramEnd"/>
+      <w:r>
+        <w:rPr>
+          <w:rFonts w:ascii="Tahoma" w:hAnsi="Tahoma" w:cs="Tahoma"/>
+          <w:b/>
+          <w:bCs/>
+          <w:color w:val="333399"/>
+        </w:rPr>
+        <w:t>Trazo Intermedio)</w:t>
       </w:r>
     </w:p>
     <w:p>
@@ -5881,7 +6006,14 @@
                 <w:rFonts w:ascii="Tahoma" w:hAnsi="Tahoma" w:cs="Tahoma"/>
                 <w:sz w:val="20"/>
               </w:rPr>
-              <w:t>El CU comienza cuando el usuario selecciona la opción “Modificar retiro”.</w:t>
+              <w:t>El CU comienza cuando el usuario, desde el detalle de un retiro agendado, selecciona la opción "Modificar"</w:t>
+            </w:r>
+            <w:r>
+              <w:rPr>
+                <w:rFonts w:ascii="Tahoma" w:hAnsi="Tahoma" w:cs="Tahoma"/>
+                <w:sz w:val="20"/>
+              </w:rPr>
+              <w:t>.</w:t>
             </w:r>
           </w:p>
         </w:tc>
@@ -5915,7 +6047,7 @@
                 <w:rFonts w:ascii="Tahoma" w:hAnsi="Tahoma" w:cs="Tahoma"/>
                 <w:sz w:val="20"/>
               </w:rPr>
-              <w:t>El sistema muestra los retiros agendados.</w:t>
+              <w:t>El sistema muestra el formulario de edición con los datos actuales del retiro: nombre, descripción, categoría/temática, ubicación, fecha de inicio y finalización, hora de inicio, costo total, fecha de vencimiento del pago, contacto y actividades.</w:t>
             </w:r>
           </w:p>
         </w:tc>
@@ -5942,14 +6074,16 @@
               <w:rPr>
                 <w:rFonts w:ascii="Tahoma" w:hAnsi="Tahoma" w:cs="Tahoma"/>
                 <w:sz w:val="20"/>
-              </w:rPr>
-            </w:pPr>
-            <w:r>
-              <w:rPr>
-                <w:rFonts w:ascii="Tahoma" w:hAnsi="Tahoma" w:cs="Tahoma"/>
-                <w:sz w:val="20"/>
-              </w:rPr>
-              <w:t>El usuario elige el retiro que quiere modificar.</w:t>
+                <w:lang w:val="es-AR"/>
+              </w:rPr>
+            </w:pPr>
+            <w:r>
+              <w:rPr>
+                <w:rFonts w:ascii="Tahoma" w:hAnsi="Tahoma" w:cs="Tahoma"/>
+                <w:sz w:val="20"/>
+                <w:lang w:val="es-AR"/>
+              </w:rPr>
+              <w:t>El usuario modifica los datos que desea.</w:t>
             </w:r>
           </w:p>
         </w:tc>
@@ -5983,7 +6117,14 @@
                 <w:rFonts w:ascii="Tahoma" w:hAnsi="Tahoma" w:cs="Tahoma"/>
                 <w:sz w:val="20"/>
               </w:rPr>
-              <w:t>El sistema muestra los datos de ese retiro y permite modificarlos.</w:t>
+              <w:t>El usuario selecciona "Guardar cambios"</w:t>
+            </w:r>
+            <w:r>
+              <w:rPr>
+                <w:rFonts w:ascii="Tahoma" w:hAnsi="Tahoma" w:cs="Tahoma"/>
+                <w:sz w:val="20"/>
+              </w:rPr>
+              <w:t>.</w:t>
             </w:r>
           </w:p>
         </w:tc>
@@ -6017,7 +6158,14 @@
                 <w:rFonts w:ascii="Tahoma" w:hAnsi="Tahoma" w:cs="Tahoma"/>
                 <w:sz w:val="20"/>
               </w:rPr>
-              <w:t>El usuario modifica los datos que desea.</w:t>
+              <w:t>El sistema valida los datos ingresados</w:t>
+            </w:r>
+            <w:r>
+              <w:rPr>
+                <w:rFonts w:ascii="Tahoma" w:hAnsi="Tahoma" w:cs="Tahoma"/>
+                <w:sz w:val="20"/>
+              </w:rPr>
+              <w:t>.</w:t>
             </w:r>
           </w:p>
         </w:tc>
@@ -6051,7 +6199,7 @@
                 <w:rFonts w:ascii="Tahoma" w:hAnsi="Tahoma" w:cs="Tahoma"/>
                 <w:sz w:val="20"/>
               </w:rPr>
-              <w:t>El usuario selecciona “Guardar cambios”.</w:t>
+              <w:t>El sistema registra las modificaciones.</w:t>
             </w:r>
           </w:p>
         </w:tc>
@@ -6085,15 +6233,7 @@
                 <w:rFonts w:ascii="Tahoma" w:hAnsi="Tahoma" w:cs="Tahoma"/>
                 <w:sz w:val="20"/>
               </w:rPr>
-              <w:t xml:space="preserve">El sistema registra la modificación con los siguientes datos: </w:t>
-            </w:r>
-            <w:r>
-              <w:rPr>
-                <w:rFonts w:ascii="Tahoma" w:hAnsi="Tahoma" w:cs="Tahoma"/>
-                <w:sz w:val="20"/>
-                <w:szCs w:val="20"/>
-              </w:rPr>
-              <w:t>nombre, descripción, ubicación, fecha de inicio y finalización, hora, costo, categoría/temática, estado, contacto, fecha de vencimiento del pago o seña.</w:t>
+              <w:t>El sistema muestra el detalle actualizado del retiro.</w:t>
             </w:r>
           </w:p>
         </w:tc>
@@ -6151,13 +6291,23 @@
                 <w:bCs/>
               </w:rPr>
             </w:pPr>
+            <w:proofErr w:type="gramStart"/>
             <w:r>
               <w:rPr>
                 <w:rFonts w:ascii="Tahoma" w:eastAsia="Tahoma" w:hAnsi="Tahoma" w:cs="Tahoma"/>
                 <w:b/>
                 <w:bCs/>
               </w:rPr>
-              <w:t>Flujos  Alternativos:</w:t>
+              <w:t>Flujos  Alternativos</w:t>
+            </w:r>
+            <w:proofErr w:type="gramEnd"/>
+            <w:r>
+              <w:rPr>
+                <w:rFonts w:ascii="Tahoma" w:eastAsia="Tahoma" w:hAnsi="Tahoma" w:cs="Tahoma"/>
+                <w:b/>
+                <w:bCs/>
+              </w:rPr>
+              <w:t>:</w:t>
             </w:r>
           </w:p>
         </w:tc>
@@ -6185,7 +6335,116 @@
                 <w:rFonts w:ascii="Tahoma" w:hAnsi="Tahoma" w:cs="Tahoma"/>
                 <w:sz w:val="20"/>
               </w:rPr>
-              <w:t>3A. El retiro que desea modificar el usuario no está registrado, se cancela el caso de uso.</w:t>
+              <w:t>5</w:t>
+            </w:r>
+            <w:r>
+              <w:rPr>
+                <w:rFonts w:ascii="Tahoma" w:hAnsi="Tahoma" w:cs="Tahoma"/>
+                <w:sz w:val="20"/>
+              </w:rPr>
+              <w:t xml:space="preserve">A. </w:t>
+            </w:r>
+            <w:r>
+              <w:rPr>
+                <w:rFonts w:ascii="Tahoma" w:hAnsi="Tahoma" w:cs="Tahoma"/>
+                <w:sz w:val="20"/>
+              </w:rPr>
+              <w:t>E</w:t>
+            </w:r>
+            <w:r>
+              <w:rPr>
+                <w:rFonts w:ascii="Tahoma" w:hAnsi="Tahoma" w:cs="Tahoma"/>
+                <w:sz w:val="20"/>
+              </w:rPr>
+              <w:t>l sistema detecta un campo obligatorio vacío, una fecha de finalización anterior a la de inicio</w:t>
+            </w:r>
+            <w:r>
+              <w:rPr>
+                <w:rFonts w:ascii="Tahoma" w:hAnsi="Tahoma" w:cs="Tahoma"/>
+                <w:sz w:val="20"/>
+              </w:rPr>
+              <w:t xml:space="preserve"> o</w:t>
+            </w:r>
+            <w:r>
+              <w:rPr>
+                <w:rFonts w:ascii="Tahoma" w:hAnsi="Tahoma" w:cs="Tahoma"/>
+                <w:sz w:val="20"/>
+              </w:rPr>
+              <w:t xml:space="preserve"> dos</w:t>
+            </w:r>
+            <w:r>
+              <w:rPr>
+                <w:rFonts w:ascii="Tahoma" w:hAnsi="Tahoma" w:cs="Tahoma"/>
+                <w:sz w:val="20"/>
+              </w:rPr>
+              <w:t xml:space="preserve"> o más</w:t>
+            </w:r>
+            <w:r>
+              <w:rPr>
+                <w:rFonts w:ascii="Tahoma" w:hAnsi="Tahoma" w:cs="Tahoma"/>
+                <w:sz w:val="20"/>
+              </w:rPr>
+              <w:t xml:space="preserve"> actividades superpuestas (mismo día y turno</w:t>
+            </w:r>
+            <w:r>
+              <w:rPr>
+                <w:rFonts w:ascii="Tahoma" w:hAnsi="Tahoma" w:cs="Tahoma"/>
+                <w:sz w:val="20"/>
+              </w:rPr>
+              <w:t>)</w:t>
+            </w:r>
+            <w:r>
+              <w:rPr>
+                <w:rFonts w:ascii="Tahoma" w:hAnsi="Tahoma" w:cs="Tahoma"/>
+                <w:sz w:val="20"/>
+              </w:rPr>
+              <w:t>. El sistema informa el error y el flujo vuelve al paso 3</w:t>
+            </w:r>
+            <w:r>
+              <w:rPr>
+                <w:rFonts w:ascii="Tahoma" w:hAnsi="Tahoma" w:cs="Tahoma"/>
+                <w:sz w:val="20"/>
+              </w:rPr>
+              <w:t>.</w:t>
+            </w:r>
+          </w:p>
+          <w:p>
+            <w:pPr>
+              <w:jc w:val="both"/>
+              <w:rPr>
+                <w:rFonts w:ascii="Tahoma" w:hAnsi="Tahoma" w:cs="Tahoma"/>
+                <w:sz w:val="20"/>
+              </w:rPr>
+            </w:pPr>
+          </w:p>
+          <w:p>
+            <w:pPr>
+              <w:jc w:val="both"/>
+              <w:rPr>
+                <w:rFonts w:ascii="Tahoma" w:hAnsi="Tahoma" w:cs="Tahoma"/>
+                <w:sz w:val="20"/>
+              </w:rPr>
+            </w:pPr>
+            <w:r>
+              <w:rPr>
+                <w:rFonts w:ascii="Tahoma" w:hAnsi="Tahoma" w:cs="Tahoma"/>
+                <w:sz w:val="20"/>
+              </w:rPr>
+              <w:t xml:space="preserve">3A. </w:t>
+            </w:r>
+            <w:r>
+              <w:rPr>
+                <w:rFonts w:ascii="Tahoma" w:hAnsi="Tahoma" w:cs="Tahoma"/>
+                <w:sz w:val="20"/>
+              </w:rPr>
+              <w:t>El usuario selecciona "Descartar edición": el sistema no registra ningún cambio, vuelve al detalle del retiro y termina el CU</w:t>
+            </w:r>
+            <w:r>
+              <w:rPr>
+                <w:rFonts w:ascii="Tahoma" w:hAnsi="Tahoma" w:cs="Tahoma"/>
+                <w:sz w:val="20"/>
+              </w:rPr>
+              <w:t>.</w:t>
             </w:r>
           </w:p>
         </w:tc>
@@ -6408,7 +6667,21 @@
                 <w:bCs/>
                 <w:sz w:val="20"/>
               </w:rPr>
-              <w:t>Use Case al que extiende: No aplica</w:t>
+              <w:t xml:space="preserve">Use Case al que extiende: </w:t>
+            </w:r>
+            <w:r>
+              <w:rPr>
+                <w:rFonts w:ascii="Tahoma" w:hAnsi="Tahoma" w:cs="Tahoma"/>
+                <w:sz w:val="20"/>
+              </w:rPr>
+              <w:t>Consultar retiro agendado</w:t>
+            </w:r>
+            <w:r>
+              <w:rPr>
+                <w:rFonts w:ascii="Tahoma" w:hAnsi="Tahoma" w:cs="Tahoma"/>
+                <w:sz w:val="20"/>
+              </w:rPr>
+              <w:t>.</w:t>
             </w:r>
           </w:p>
         </w:tc>
@@ -6500,6 +6773,9 @@
             <w:r>
               <w:t>Agustín Borgo</w:t>
             </w:r>
+            <w:r>
+              <w:t>/Juan Nuñez</w:t>
+            </w:r>
           </w:p>
         </w:tc>
         <w:tc>
@@ -6563,7 +6839,7 @@
               <w:t xml:space="preserve">Autor Última Modificación: </w:t>
             </w:r>
             <w:r>
-              <w:t>Agustín Borgo</w:t>
+              <w:t>Juan Nuñez</w:t>
             </w:r>
           </w:p>
         </w:tc>
@@ -6591,7 +6867,10 @@
               <w:t xml:space="preserve">Fecha Última Modificación: </w:t>
             </w:r>
             <w:r>
-              <w:t>6/10/2026</w:t>
+              <w:t>12</w:t>
+            </w:r>
+            <w:r>
+              <w:t>/10/2026</w:t>
             </w:r>
           </w:p>
         </w:tc>
@@ -6606,15 +6885,6 @@
       <w:r>
         <w:br w:type="page"/>
       </w:r>
-    </w:p>
-    <w:p>
-      <w:pPr>
-        <w:pStyle w:val="Ttulo2"/>
-        <w:rPr>
-          <w:b/>
-          <w:bCs/>
-        </w:rPr>
-      </w:pPr>
       <w:bookmarkStart w:id="7" w:name="_Toc120165810"/>
       <w:r>
         <w:rPr>
@@ -7277,6 +7547,9 @@
     </w:p>
     <w:p>
       <w:r>
+        <w:rPr>
+          <w:noProof/>
+        </w:rPr>
         <w:lastRenderedPageBreak/>
         <w:drawing>
           <wp:inline distT="0" distB="0" distL="0" distR="0" wp14:anchorId="738B8089" wp14:editId="1E8AD246">
@@ -8463,6 +8736,119 @@
     </w:lvl>
   </w:abstractNum>
   <w:abstractNum w:abstractNumId="5" w15:restartNumberingAfterBreak="0">
+    <w:nsid w:val="38E02962"/>
+    <w:multiLevelType w:val="multilevel"/>
+    <w:tmpl w:val="BB2AB5C2"/>
+    <w:lvl w:ilvl="0">
+      <w:start w:val="1"/>
+      <w:numFmt w:val="decimal"/>
+      <w:lvlText w:val="%1."/>
+      <w:lvlJc w:val="left"/>
+      <w:pPr>
+        <w:tabs>
+          <w:tab w:val="num" w:pos="720"/>
+        </w:tabs>
+        <w:ind w:left="720" w:hanging="360"/>
+      </w:pPr>
+    </w:lvl>
+    <w:lvl w:ilvl="1" w:tentative="1">
+      <w:start w:val="1"/>
+      <w:numFmt w:val="decimal"/>
+      <w:lvlText w:val="%2."/>
+      <w:lvlJc w:val="left"/>
+      <w:pPr>
+        <w:tabs>
+          <w:tab w:val="num" w:pos="1440"/>
+        </w:tabs>
+        <w:ind w:left="1440" w:hanging="360"/>
+      </w:pPr>
+    </w:lvl>
+    <w:lvl w:ilvl="2" w:tentative="1">
+      <w:start w:val="1"/>
+      <w:numFmt w:val="decimal"/>
+      <w:lvlText w:val="%3."/>
+      <w:lvlJc w:val="left"/>
+      <w:pPr>
+        <w:tabs>
+          <w:tab w:val="num" w:pos="2160"/>
+        </w:tabs>
+        <w:ind w:left="2160" w:hanging="360"/>
+      </w:pPr>
+    </w:lvl>
+    <w:lvl w:ilvl="3" w:tentative="1">
+      <w:start w:val="1"/>
+      <w:numFmt w:val="decimal"/>
+      <w:lvlText w:val="%4."/>
+      <w:lvlJc w:val="left"/>
+      <w:pPr>
+        <w:tabs>
+          <w:tab w:val="num" w:pos="2880"/>
+        </w:tabs>
+        <w:ind w:left="2880" w:hanging="360"/>
+      </w:pPr>
+    </w:lvl>
+    <w:lvl w:ilvl="4" w:tentative="1">
+      <w:start w:val="1"/>
+      <w:numFmt w:val="decimal"/>
+      <w:lvlText w:val="%5."/>
+      <w:lvlJc w:val="left"/>
+      <w:pPr>
+        <w:tabs>
+          <w:tab w:val="num" w:pos="3600"/>
+        </w:tabs>
+        <w:ind w:left="3600" w:hanging="360"/>
+      </w:pPr>
+    </w:lvl>
+    <w:lvl w:ilvl="5" w:tentative="1">
+      <w:start w:val="1"/>
+      <w:numFmt w:val="decimal"/>
+      <w:lvlText w:val="%6."/>
+      <w:lvlJc w:val="left"/>
+      <w:pPr>
+        <w:tabs>
+          <w:tab w:val="num" w:pos="4320"/>
+        </w:tabs>
+        <w:ind w:left="4320" w:hanging="360"/>
+      </w:pPr>
+    </w:lvl>
+    <w:lvl w:ilvl="6" w:tentative="1">
+      <w:start w:val="1"/>
+      <w:numFmt w:val="decimal"/>
+      <w:lvlText w:val="%7."/>
+      <w:lvlJc w:val="left"/>
+      <w:pPr>
+        <w:tabs>
+          <w:tab w:val="num" w:pos="5040"/>
+        </w:tabs>
+        <w:ind w:left="5040" w:hanging="360"/>
+      </w:pPr>
+    </w:lvl>
+    <w:lvl w:ilvl="7" w:tentative="1">
+      <w:start w:val="1"/>
+      <w:numFmt w:val="decimal"/>
+      <w:lvlText w:val="%8."/>
+      <w:lvlJc w:val="left"/>
+      <w:pPr>
+        <w:tabs>
+          <w:tab w:val="num" w:pos="5760"/>
+        </w:tabs>
+        <w:ind w:left="5760" w:hanging="360"/>
+      </w:pPr>
+    </w:lvl>
+    <w:lvl w:ilvl="8" w:tentative="1">
+      <w:start w:val="1"/>
+      <w:numFmt w:val="decimal"/>
+      <w:lvlText w:val="%9."/>
+      <w:lvlJc w:val="left"/>
+      <w:pPr>
+        <w:tabs>
+          <w:tab w:val="num" w:pos="6480"/>
+        </w:tabs>
+        <w:ind w:left="6480" w:hanging="360"/>
+      </w:pPr>
+    </w:lvl>
+  </w:abstractNum>
+  <w:abstractNum w:abstractNumId="6" w15:restartNumberingAfterBreak="0">
     <w:nsid w:val="45DB3215"/>
     <w:multiLevelType w:val="hybridMultilevel"/>
     <w:tmpl w:val="F76EBEB6"/>
@@ -8551,7 +8937,7 @@
       </w:pPr>
     </w:lvl>
   </w:abstractNum>
-  <w:abstractNum w:abstractNumId="6" w15:restartNumberingAfterBreak="0">
+  <w:abstractNum w:abstractNumId="7" w15:restartNumberingAfterBreak="0">
     <w:nsid w:val="55CC2D77"/>
     <w:multiLevelType w:val="multilevel"/>
     <w:tmpl w:val="B3A8E9AA"/>
@@ -8692,7 +9078,7 @@
     </w:lvl>
   </w:abstractNum>
   <w:num w:numId="1" w16cid:durableId="1946958931">
-    <w:abstractNumId w:val="6"/>
+    <w:abstractNumId w:val="7"/>
   </w:num>
   <w:num w:numId="2" w16cid:durableId="540435574">
     <w:abstractNumId w:val="3"/>
@@ -8710,6 +9096,9 @@
     <w:abstractNumId w:val="1"/>
   </w:num>
   <w:num w:numId="7" w16cid:durableId="1536845712">
+    <w:abstractNumId w:val="6"/>
+  </w:num>
+  <w:num w:numId="8" w16cid:durableId="996570425">
     <w:abstractNumId w:val="5"/>
   </w:num>
 </w:numbering>

</xml_diff>

<commit_message>
Elimine extends (vemos que dice la profe)
</commit_message>
<xml_diff>
--- a/Entrega 3/Entrega 3 - TPI.docx
+++ b/Entrega 3/Entrega 3 - TPI.docx
@@ -1,6 +1,6 @@
 
 <file path=word/document.xml><?xml version="1.0" encoding="utf-8"?>
-<w:document xmlns:wpc="http://schemas.microsoft.com/office/word/2010/wordprocessingCanvas" xmlns:cx="http://schemas.microsoft.com/office/drawing/2014/chartex" xmlns:cx1="http://schemas.microsoft.com/office/drawing/2015/9/8/chartex" xmlns:cx2="http://schemas.microsoft.com/office/drawing/2015/10/21/chartex" xmlns:cx3="http://schemas.microsoft.com/office/drawing/2016/5/9/chartex" xmlns:cx4="http://schemas.microsoft.com/office/drawing/2016/5/10/chartex" xmlns:cx5="http://schemas.microsoft.com/office/drawing/2016/5/11/chartex" xmlns:cx6="http://schemas.microsoft.com/office/drawing/2016/5/12/chartex" xmlns:cx7="http://schemas.microsoft.com/office/drawing/2016/5/13/chartex" xmlns:cx8="http://schemas.microsoft.com/office/drawing/2016/5/14/chartex" xmlns:mc="http://schemas.openxmlformats.org/markup-compatibility/2006" xmlns:aink="http://schemas.microsoft.com/office/drawing/2016/ink" xmlns:am3d="http://schemas.microsoft.com/office/drawing/2017/model3d" xmlns:o="urn:schemas-microsoft-com:office:office" xmlns:oel="http://schemas.microsoft.com/office/2019/extlst" xmlns:r="http://schemas.openxmlformats.org/officeDocument/2006/relationships" xmlns:m="http://schemas.openxmlformats.org/officeDocument/2006/math" xmlns:v="urn:schemas-microsoft-com:vml" xmlns:wp14="http://schemas.microsoft.com/office/word/2010/wordprocessingDrawing" xmlns:wp="http://schemas.openxmlformats.org/drawingml/2006/wordprocessingDrawing" xmlns:w10="urn:schemas-microsoft-com:office:word" xmlns:w="http://schemas.openxmlformats.org/wordprocessingml/2006/main" xmlns:w14="http://schemas.microsoft.com/office/word/2010/wordml" xmlns:w15="http://schemas.microsoft.com/office/word/2012/wordml" xmlns:w16cex="http://schemas.microsoft.com/office/word/2018/wordml/cex" xmlns:w16cid="http://schemas.microsoft.com/office/word/2016/wordml/cid" xmlns:w16="http://schemas.microsoft.com/office/word/2018/wordml" xmlns:w16du="http://schemas.microsoft.com/office/word/2023/wordml/word16du" xmlns:w16sdtdh="http://schemas.microsoft.com/office/word/2020/wordml/sdtdatahash" xmlns:w16sdtfl="http://schemas.microsoft.com/office/word/2024/wordml/sdtformatlock" xmlns:w16se="http://schemas.microsoft.com/office/word/2015/wordml/symex" xmlns:wpg="http://schemas.microsoft.com/office/word/2010/wordprocessingGroup" xmlns:wpi="http://schemas.microsoft.com/office/word/2010/wordprocessingInk" xmlns:wne="http://schemas.microsoft.com/office/word/2006/wordml" xmlns:wps="http://schemas.microsoft.com/office/word/2010/wordprocessingShape" mc:Ignorable="w14 w15 w16se w16cid w16 w16cex w16sdtdh w16sdtfl w16du wp14">
+<w:document xmlns:wpc="http://schemas.microsoft.com/office/word/2010/wordprocessingCanvas" xmlns:cx="http://schemas.microsoft.com/office/drawing/2014/chartex" xmlns:cx1="http://schemas.microsoft.com/office/drawing/2015/9/8/chartex" xmlns:cx2="http://schemas.microsoft.com/office/drawing/2015/10/21/chartex" xmlns:cx3="http://schemas.microsoft.com/office/drawing/2016/5/9/chartex" xmlns:cx4="http://schemas.microsoft.com/office/drawing/2016/5/10/chartex" xmlns:cx5="http://schemas.microsoft.com/office/drawing/2016/5/11/chartex" xmlns:cx6="http://schemas.microsoft.com/office/drawing/2016/5/12/chartex" xmlns:cx7="http://schemas.microsoft.com/office/drawing/2016/5/13/chartex" xmlns:cx8="http://schemas.microsoft.com/office/drawing/2016/5/14/chartex" xmlns:mc="http://schemas.openxmlformats.org/markup-compatibility/2006" xmlns:aink="http://schemas.microsoft.com/office/drawing/2016/ink" xmlns:am3d="http://schemas.microsoft.com/office/drawing/2017/model3d" xmlns:o="urn:schemas-microsoft-com:office:office" xmlns:oel="http://schemas.microsoft.com/office/2019/extlst" xmlns:r="http://schemas.openxmlformats.org/officeDocument/2006/relationships" xmlns:m="http://schemas.openxmlformats.org/officeDocument/2006/math" xmlns:v="urn:schemas-microsoft-com:vml" xmlns:wp14="http://schemas.microsoft.com/office/word/2010/wordprocessingDrawing" xmlns:wp="http://schemas.openxmlformats.org/drawingml/2006/wordprocessingDrawing" xmlns:w10="urn:schemas-microsoft-com:office:word" xmlns:w="http://schemas.openxmlformats.org/wordprocessingml/2006/main" xmlns:w14="http://schemas.microsoft.com/office/word/2010/wordml" xmlns:w15="http://schemas.microsoft.com/office/word/2012/wordml" xmlns:w16cex="http://schemas.microsoft.com/office/word/2018/wordml/cex" xmlns:w16cid="http://schemas.microsoft.com/office/word/2016/wordml/cid" xmlns:w16="http://schemas.microsoft.com/office/word/2018/wordml" xmlns:w16sdtdh="http://schemas.microsoft.com/office/word/2020/wordml/sdtdatahash" xmlns:w16se="http://schemas.microsoft.com/office/word/2015/wordml/symex" xmlns:wpg="http://schemas.microsoft.com/office/word/2010/wordprocessingGroup" xmlns:wpi="http://schemas.microsoft.com/office/word/2010/wordprocessingInk" xmlns:wne="http://schemas.microsoft.com/office/word/2006/wordml" xmlns:wps="http://schemas.microsoft.com/office/word/2010/wordprocessingShape" mc:Ignorable="w14 w15 w16se w16cid w16 w16cex w16sdtdh wp14">
   <w:body>
     <w:p>
       <w:pPr>
@@ -184,8 +184,13 @@
       </w:r>
     </w:p>
     <w:p>
-      <w:r>
-        <w:t>Simieli, Mariana Paola.</w:t>
+      <w:proofErr w:type="spellStart"/>
+      <w:r>
+        <w:t>Simieli</w:t>
+      </w:r>
+      <w:proofErr w:type="spellEnd"/>
+      <w:r>
+        <w:t>, Mariana Paola.</w:t>
       </w:r>
     </w:p>
     <w:p>
@@ -194,8 +199,13 @@
       </w:r>
     </w:p>
     <w:p>
-      <w:r>
-        <w:t>Achetta, María Laura.</w:t>
+      <w:proofErr w:type="spellStart"/>
+      <w:r>
+        <w:t>Achetta</w:t>
+      </w:r>
+      <w:proofErr w:type="spellEnd"/>
+      <w:r>
+        <w:t>, María Laura.</w:t>
       </w:r>
     </w:p>
     <w:p>
@@ -350,8 +360,13 @@
       </w:r>
     </w:p>
     <w:p>
-      <w:r>
-        <w:t>Didzius, Luana Micaela.</w:t>
+      <w:proofErr w:type="spellStart"/>
+      <w:r>
+        <w:t>Didzius</w:t>
+      </w:r>
+      <w:proofErr w:type="spellEnd"/>
+      <w:r>
+        <w:t>, Luana Micaela.</w:t>
       </w:r>
       <w:r>
         <w:tab/>
@@ -405,8 +420,13 @@
       </w:hyperlink>
     </w:p>
     <w:p>
-      <w:r>
-        <w:t>Tise, Maximiliano</w:t>
+      <w:proofErr w:type="spellStart"/>
+      <w:r>
+        <w:t>Tise</w:t>
+      </w:r>
+      <w:proofErr w:type="spellEnd"/>
+      <w:r>
+        <w:t>, Maximiliano</w:t>
       </w:r>
       <w:r>
         <w:tab/>
@@ -434,8 +454,13 @@
       </w:hyperlink>
     </w:p>
     <w:p>
-      <w:r>
-        <w:t>Nuñez Loza, Juan Manuel</w:t>
+      <w:proofErr w:type="spellStart"/>
+      <w:r>
+        <w:t>Nuñez</w:t>
+      </w:r>
+      <w:proofErr w:type="spellEnd"/>
+      <w:r>
+        <w:t xml:space="preserve"> Loza, Juan Manuel</w:t>
       </w:r>
       <w:r>
         <w:tab/>
@@ -1104,8 +1129,13 @@
             <w:pPr>
               <w:jc w:val="both"/>
             </w:pPr>
-            <w:r>
-              <w:t>N° CU</w:t>
+            <w:proofErr w:type="spellStart"/>
+            <w:r>
+              <w:t>N°</w:t>
+            </w:r>
+            <w:proofErr w:type="spellEnd"/>
+            <w:r>
+              <w:t xml:space="preserve"> CU</w:t>
             </w:r>
           </w:p>
         </w:tc>
@@ -1379,7 +1409,15 @@
               <w:jc w:val="both"/>
             </w:pPr>
             <w:r>
-              <w:t>Dar de baja un retiro agendado modificando su estado a cancelado.</w:t>
+              <w:t xml:space="preserve">Dar de baja un retiro agendado modificando su estado </w:t>
+            </w:r>
+            <w:proofErr w:type="spellStart"/>
+            <w:r>
+              <w:t>a</w:t>
+            </w:r>
+            <w:proofErr w:type="spellEnd"/>
+            <w:r>
+              <w:t xml:space="preserve"> cancelado.</w:t>
             </w:r>
           </w:p>
         </w:tc>
@@ -2311,7 +2349,7 @@
                     </wp:inline>
                   </w:drawing>
                 </mc:Choice>
-                <mc:Fallback xmlns:a="http://schemas.openxmlformats.org/drawingml/2006/main" xmlns:pic="http://schemas.openxmlformats.org/drawingml/2006/picture" xmlns:a14="http://schemas.microsoft.com/office/drawing/2010/main"/>
+                <mc:Fallback xmlns:w16du="http://schemas.microsoft.com/office/word/2023/wordml/word16du" xmlns:w16sdtfl="http://schemas.microsoft.com/office/word/2024/wordml/sdtformatlock" xmlns:a="http://schemas.openxmlformats.org/drawingml/2006/main" xmlns:pic="http://schemas.openxmlformats.org/drawingml/2006/picture" xmlns:a14="http://schemas.microsoft.com/office/drawing/2010/main"/>
               </mc:AlternateContent>
             </w:r>
             <w:r>
@@ -2588,6 +2626,14 @@
               </w:rPr>
               <w:t>El usuario carga los datos correspondientes</w:t>
             </w:r>
+            <w:r>
+              <w:rPr>
+                <w:rFonts w:ascii="Tahoma" w:hAnsi="Tahoma" w:cs="Tahoma"/>
+                <w:sz w:val="20"/>
+                <w:szCs w:val="20"/>
+              </w:rPr>
+              <w:t>.</w:t>
+            </w:r>
           </w:p>
         </w:tc>
       </w:tr>
@@ -2624,39 +2670,7 @@
                 <w:sz w:val="20"/>
                 <w:szCs w:val="20"/>
               </w:rPr>
-              <w:t>El sistema registra un nuevo retiro con los siguientes datos (</w:t>
-            </w:r>
-            <w:r>
-              <w:rPr>
-                <w:rFonts w:ascii="Tahoma" w:hAnsi="Tahoma" w:cs="Tahoma"/>
-                <w:sz w:val="20"/>
-                <w:szCs w:val="20"/>
-              </w:rPr>
-              <w:t>nombre, descripción, ubicación, fecha de inicio</w:t>
-            </w:r>
-            <w:r>
-              <w:rPr>
-                <w:rFonts w:ascii="Tahoma" w:hAnsi="Tahoma" w:cs="Tahoma"/>
-                <w:sz w:val="20"/>
-                <w:szCs w:val="20"/>
-              </w:rPr>
-              <w:t xml:space="preserve"> </w:t>
-            </w:r>
-            <w:r>
-              <w:rPr>
-                <w:rFonts w:ascii="Tahoma" w:hAnsi="Tahoma" w:cs="Tahoma"/>
-                <w:sz w:val="20"/>
-                <w:szCs w:val="20"/>
-              </w:rPr>
-              <w:t>y finalización, hora, costo, categoría/temática, estado, contacto, método de pago, fecha de vencimiento de pago o seña)</w:t>
-            </w:r>
-            <w:r>
-              <w:rPr>
-                <w:rFonts w:ascii="Tahoma" w:hAnsi="Tahoma" w:cs="Tahoma"/>
-                <w:sz w:val="20"/>
-                <w:szCs w:val="20"/>
-              </w:rPr>
-              <w:t>.</w:t>
+              <w:t>El sistema valida los datos ingresados.</w:t>
             </w:r>
           </w:p>
         </w:tc>
@@ -2694,6 +2708,76 @@
                 <w:sz w:val="20"/>
                 <w:szCs w:val="20"/>
               </w:rPr>
+              <w:t>El sistema registra un nuevo retiro con los siguientes datos (</w:t>
+            </w:r>
+            <w:r>
+              <w:rPr>
+                <w:rFonts w:ascii="Tahoma" w:hAnsi="Tahoma" w:cs="Tahoma"/>
+                <w:sz w:val="20"/>
+                <w:szCs w:val="20"/>
+              </w:rPr>
+              <w:t>nombre, descripción, ubicación, fecha de inicio</w:t>
+            </w:r>
+            <w:r>
+              <w:rPr>
+                <w:rFonts w:ascii="Tahoma" w:hAnsi="Tahoma" w:cs="Tahoma"/>
+                <w:sz w:val="20"/>
+                <w:szCs w:val="20"/>
+              </w:rPr>
+              <w:t xml:space="preserve"> </w:t>
+            </w:r>
+            <w:r>
+              <w:rPr>
+                <w:rFonts w:ascii="Tahoma" w:hAnsi="Tahoma" w:cs="Tahoma"/>
+                <w:sz w:val="20"/>
+                <w:szCs w:val="20"/>
+              </w:rPr>
+              <w:t>y finalización, hora, costo, categoría/temática, estado, contacto, método de pago, fecha de vencimiento de pago o seña)</w:t>
+            </w:r>
+            <w:r>
+              <w:rPr>
+                <w:rFonts w:ascii="Tahoma" w:hAnsi="Tahoma" w:cs="Tahoma"/>
+                <w:sz w:val="20"/>
+                <w:szCs w:val="20"/>
+              </w:rPr>
+              <w:t>.</w:t>
+            </w:r>
+          </w:p>
+        </w:tc>
+      </w:tr>
+      <w:tr>
+        <w:trPr>
+          <w:trHeight w:val="188"/>
+          <w:tblCellSpacing w:w="20" w:type="dxa"/>
+          <w:jc w:val="center"/>
+        </w:trPr>
+        <w:tc>
+          <w:tcPr>
+            <w:tcW w:w="9120" w:type="dxa"/>
+            <w:gridSpan w:val="5"/>
+          </w:tcPr>
+          <w:p>
+            <w:pPr>
+              <w:pStyle w:val="Prrafodelista"/>
+              <w:numPr>
+                <w:ilvl w:val="0"/>
+                <w:numId w:val="4"/>
+              </w:numPr>
+              <w:suppressAutoHyphens w:val="0"/>
+              <w:spacing w:line="240" w:lineRule="auto"/>
+              <w:jc w:val="both"/>
+              <w:rPr>
+                <w:rFonts w:ascii="Tahoma" w:hAnsi="Tahoma" w:cs="Tahoma"/>
+                <w:sz w:val="20"/>
+                <w:szCs w:val="20"/>
+              </w:rPr>
+            </w:pPr>
+            <w:r>
+              <w:rPr>
+                <w:rFonts w:ascii="Tahoma" w:hAnsi="Tahoma" w:cs="Tahoma"/>
+                <w:sz w:val="20"/>
+                <w:szCs w:val="20"/>
+              </w:rPr>
               <w:t>Fin del caso de uso.</w:t>
             </w:r>
           </w:p>
@@ -2773,7 +2857,23 @@
                 <w:sz w:val="20"/>
                 <w:szCs w:val="20"/>
               </w:rPr>
-              <w:t>A2. En caso de que el usuario al presionar no encuentre una actividad en la lista predeterminada de actividades, se llama al caso de uso registrar actividades.</w:t>
+              <w:t>2</w:t>
+            </w:r>
+            <w:r>
+              <w:rPr>
+                <w:rFonts w:ascii="Tahoma" w:hAnsi="Tahoma" w:cs="Tahoma"/>
+                <w:sz w:val="20"/>
+                <w:szCs w:val="20"/>
+              </w:rPr>
+              <w:t>A</w:t>
+            </w:r>
+            <w:r>
+              <w:rPr>
+                <w:rFonts w:ascii="Tahoma" w:hAnsi="Tahoma" w:cs="Tahoma"/>
+                <w:sz w:val="20"/>
+                <w:szCs w:val="20"/>
+              </w:rPr>
+              <w:t>. En caso de que el usuario al presionar no encuentre una actividad en la lista predeterminada de actividades, se llama al caso de uso registrar actividades.</w:t>
             </w:r>
           </w:p>
         </w:tc>
@@ -2804,7 +2904,23 @@
                 <w:sz w:val="20"/>
                 <w:szCs w:val="20"/>
               </w:rPr>
-              <w:t xml:space="preserve">A3. En caso de que el usuario al presionar no encuentre una </w:t>
+              <w:t>3</w:t>
+            </w:r>
+            <w:r>
+              <w:rPr>
+                <w:rFonts w:ascii="Tahoma" w:hAnsi="Tahoma" w:cs="Tahoma"/>
+                <w:sz w:val="20"/>
+                <w:szCs w:val="20"/>
+              </w:rPr>
+              <w:t>A</w:t>
+            </w:r>
+            <w:r>
+              <w:rPr>
+                <w:rFonts w:ascii="Tahoma" w:hAnsi="Tahoma" w:cs="Tahoma"/>
+                <w:sz w:val="20"/>
+                <w:szCs w:val="20"/>
+              </w:rPr>
+              <w:t xml:space="preserve">. En caso de que el usuario al presionar no encuentre una </w:t>
             </w:r>
             <w:r>
               <w:rPr>
@@ -2845,6 +2961,77 @@
                 <w:szCs w:val="20"/>
               </w:rPr>
             </w:pPr>
+            <w:r>
+              <w:rPr>
+                <w:rFonts w:ascii="Tahoma" w:hAnsi="Tahoma" w:cs="Tahoma"/>
+                <w:sz w:val="20"/>
+                <w:szCs w:val="20"/>
+              </w:rPr>
+              <w:t xml:space="preserve">4A. </w:t>
+            </w:r>
+            <w:r>
+              <w:rPr>
+                <w:rFonts w:ascii="Tahoma" w:hAnsi="Tahoma" w:cs="Tahoma"/>
+                <w:sz w:val="20"/>
+              </w:rPr>
+              <w:t>E</w:t>
+            </w:r>
+            <w:r>
+              <w:rPr>
+                <w:rFonts w:ascii="Tahoma" w:hAnsi="Tahoma" w:cs="Tahoma"/>
+                <w:sz w:val="20"/>
+              </w:rPr>
+              <w:t>l sistema detecta un campo obligatorio vacío, una fecha de finalización anterior a la de inicio</w:t>
+            </w:r>
+            <w:r>
+              <w:rPr>
+                <w:rFonts w:ascii="Tahoma" w:hAnsi="Tahoma" w:cs="Tahoma"/>
+                <w:sz w:val="20"/>
+              </w:rPr>
+              <w:t xml:space="preserve"> o</w:t>
+            </w:r>
+            <w:r>
+              <w:rPr>
+                <w:rFonts w:ascii="Tahoma" w:hAnsi="Tahoma" w:cs="Tahoma"/>
+                <w:sz w:val="20"/>
+              </w:rPr>
+              <w:t xml:space="preserve"> dos</w:t>
+            </w:r>
+            <w:r>
+              <w:rPr>
+                <w:rFonts w:ascii="Tahoma" w:hAnsi="Tahoma" w:cs="Tahoma"/>
+                <w:sz w:val="20"/>
+              </w:rPr>
+              <w:t xml:space="preserve"> o más</w:t>
+            </w:r>
+            <w:r>
+              <w:rPr>
+                <w:rFonts w:ascii="Tahoma" w:hAnsi="Tahoma" w:cs="Tahoma"/>
+                <w:sz w:val="20"/>
+              </w:rPr>
+              <w:t xml:space="preserve"> actividades superpuestas (mismo día y turno</w:t>
+            </w:r>
+            <w:r>
+              <w:rPr>
+                <w:rFonts w:ascii="Tahoma" w:hAnsi="Tahoma" w:cs="Tahoma"/>
+                <w:sz w:val="20"/>
+              </w:rPr>
+              <w:t>)</w:t>
+            </w:r>
+            <w:r>
+              <w:rPr>
+                <w:rFonts w:ascii="Tahoma" w:hAnsi="Tahoma" w:cs="Tahoma"/>
+                <w:sz w:val="20"/>
+              </w:rPr>
+              <w:t>. El sistema informa el error y el flujo vuelve al paso 3</w:t>
+            </w:r>
+            <w:r>
+              <w:rPr>
+                <w:rFonts w:ascii="Tahoma" w:hAnsi="Tahoma" w:cs="Tahoma"/>
+                <w:sz w:val="20"/>
+              </w:rPr>
+              <w:t>.</w:t>
+            </w:r>
           </w:p>
         </w:tc>
       </w:tr>
@@ -2892,6 +3079,15 @@
                 <w:sz w:val="20"/>
               </w:rPr>
             </w:pPr>
+            <w:r>
+              <w:rPr>
+                <w:rFonts w:ascii="Tahoma" w:hAnsi="Tahoma" w:cs="Tahoma"/>
+                <w:b/>
+                <w:bCs/>
+                <w:sz w:val="20"/>
+              </w:rPr>
+              <w:t>El CU se puede cancelar en cualquier momento.</w:t>
+            </w:r>
           </w:p>
           <w:p>
             <w:pPr>
@@ -4055,7 +4251,7 @@
                     </wp:anchor>
                   </w:drawing>
                 </mc:Choice>
-                <mc:Fallback>
+                <mc:Fallback xmlns:w16du="http://schemas.microsoft.com/office/word/2023/wordml/word16du" xmlns:w16sdtfl="http://schemas.microsoft.com/office/word/2024/wordml/sdtformatlock">
                   <w:pict>
                     <v:shapetype w14:anchorId="17AF70A4" id="_x0000_t11" coordsize="21600,21600" o:spt="11" adj="5400" path="m@0,l@0@0,0@0,0@2@0@2@0,21600@1,21600@1@2,21600@2,21600@0@1@0@1,xe">
                       <v:stroke joinstyle="miter"/>
@@ -4730,9 +4926,11 @@
             <w:r>
               <w:rPr>
                 <w:rFonts w:ascii="Tahoma" w:hAnsi="Tahoma" w:cs="Tahoma"/>
-                <w:sz w:val="20"/>
-              </w:rPr>
-              <w:t>Modificar retiro agendado, Dar de baja un retiro.</w:t>
+                <w:b/>
+                <w:bCs/>
+                <w:sz w:val="20"/>
+              </w:rPr>
+              <w:t>No aplica</w:t>
             </w:r>
           </w:p>
         </w:tc>
@@ -4938,8 +5136,17 @@
                 <w:sz w:val="20"/>
                 <w:szCs w:val="20"/>
               </w:rPr>
-              <w:t>/Juan Nuñez</w:t>
-            </w:r>
+              <w:t xml:space="preserve">/Juan </w:t>
+            </w:r>
+            <w:proofErr w:type="spellStart"/>
+            <w:r>
+              <w:rPr>
+                <w:sz w:val="20"/>
+                <w:szCs w:val="20"/>
+              </w:rPr>
+              <w:t>Nuñez</w:t>
+            </w:r>
+            <w:proofErr w:type="spellEnd"/>
           </w:p>
         </w:tc>
         <w:tc>
@@ -5014,8 +5221,17 @@
                 <w:sz w:val="20"/>
                 <w:szCs w:val="20"/>
               </w:rPr>
-              <w:t>Juan Nuñez</w:t>
-            </w:r>
+              <w:t xml:space="preserve">Juan </w:t>
+            </w:r>
+            <w:proofErr w:type="spellStart"/>
+            <w:r>
+              <w:rPr>
+                <w:sz w:val="20"/>
+                <w:szCs w:val="20"/>
+              </w:rPr>
+              <w:t>Nuñez</w:t>
+            </w:r>
+            <w:proofErr w:type="spellEnd"/>
           </w:p>
         </w:tc>
         <w:tc>
@@ -5754,7 +5970,7 @@
                     </wp:anchor>
                   </w:drawing>
                 </mc:Choice>
-                <mc:Fallback>
+                <mc:Fallback xmlns:w16du="http://schemas.microsoft.com/office/word/2023/wordml/word16du" xmlns:w16sdtfl="http://schemas.microsoft.com/office/word/2024/wordml/sdtformatlock">
                   <w:pict>
                     <v:shape w14:anchorId="77088128" id="Cruz 6" o:spid="_x0000_s1026" type="#_x0000_t11" style="position:absolute;margin-left:146.35pt;margin-top:.65pt;width:10.5pt;height:11.25pt;z-index:251659264;visibility:visible;mso-wrap-style:square;mso-width-percent:0;mso-height-percent:0;mso-wrap-distance-left:9pt;mso-wrap-distance-top:0;mso-wrap-distance-right:9pt;mso-wrap-distance-bottom:0;mso-position-horizontal:absolute;mso-position-horizontal-relative:text;mso-position-vertical:absolute;mso-position-vertical-relative:text;mso-width-percent:0;mso-height-percent:0;mso-width-relative:page;mso-height-relative:page;v-text-anchor:top" o:gfxdata="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" fillcolor="black" strokecolor="#f2f2f2" strokeweight="3pt">
                       <v:shadow on="t" color="#7f7f7f" opacity=".5" offset="1pt"/>
@@ -6408,15 +6624,18 @@
               <w:t>.</w:t>
             </w:r>
           </w:p>
-          <w:p>
-            <w:pPr>
-              <w:jc w:val="both"/>
-              <w:rPr>
-                <w:rFonts w:ascii="Tahoma" w:hAnsi="Tahoma" w:cs="Tahoma"/>
-                <w:sz w:val="20"/>
-              </w:rPr>
-            </w:pPr>
-          </w:p>
+        </w:tc>
+      </w:tr>
+      <w:tr>
+        <w:trPr>
+          <w:tblCellSpacing w:w="20" w:type="dxa"/>
+          <w:jc w:val="center"/>
+        </w:trPr>
+        <w:tc>
+          <w:tcPr>
+            <w:tcW w:w="10101" w:type="dxa"/>
+            <w:gridSpan w:val="5"/>
+          </w:tcPr>
           <w:p>
             <w:pPr>
               <w:jc w:val="both"/>
@@ -6672,16 +6891,11 @@
             <w:r>
               <w:rPr>
                 <w:rFonts w:ascii="Tahoma" w:hAnsi="Tahoma" w:cs="Tahoma"/>
-                <w:sz w:val="20"/>
-              </w:rPr>
-              <w:t>Consultar retiro agendado</w:t>
-            </w:r>
-            <w:r>
-              <w:rPr>
-                <w:rFonts w:ascii="Tahoma" w:hAnsi="Tahoma" w:cs="Tahoma"/>
-                <w:sz w:val="20"/>
-              </w:rPr>
-              <w:t>.</w:t>
+                <w:b/>
+                <w:bCs/>
+                <w:sz w:val="20"/>
+              </w:rPr>
+              <w:t>No aplica</w:t>
             </w:r>
           </w:p>
         </w:tc>
@@ -6774,8 +6988,13 @@
               <w:t>Agustín Borgo</w:t>
             </w:r>
             <w:r>
-              <w:t>/Juan Nuñez</w:t>
-            </w:r>
+              <w:t xml:space="preserve">/Juan </w:t>
+            </w:r>
+            <w:proofErr w:type="spellStart"/>
+            <w:r>
+              <w:t>Nuñez</w:t>
+            </w:r>
+            <w:proofErr w:type="spellEnd"/>
           </w:p>
         </w:tc>
         <w:tc>
@@ -6839,8 +7058,13 @@
               <w:t xml:space="preserve">Autor Última Modificación: </w:t>
             </w:r>
             <w:r>
-              <w:t>Juan Nuñez</w:t>
-            </w:r>
+              <w:t xml:space="preserve">Juan </w:t>
+            </w:r>
+            <w:proofErr w:type="spellStart"/>
+            <w:r>
+              <w:t>Nuñez</w:t>
+            </w:r>
+            <w:proofErr w:type="spellEnd"/>
           </w:p>
         </w:tc>
         <w:tc>
@@ -7282,7 +7506,7 @@
               </wp:anchor>
             </w:drawing>
           </mc:Choice>
-          <mc:Fallback>
+          <mc:Fallback xmlns:w16du="http://schemas.microsoft.com/office/word/2023/wordml/word16du" xmlns:w16sdtfl="http://schemas.microsoft.com/office/word/2024/wordml/sdtformatlock">
             <w:pict>
               <v:group w14:anchorId="43439F23" id="Grupo 11" o:spid="_x0000_s1026" style="position:absolute;margin-left:167.75pt;margin-top:.65pt;width:173.35pt;height:451.6pt;z-index:251671552" coordsize="22015,57351" o:gfxdata="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">
                 <v:shapetype id="_x0000_t75" coordsize="21600,21600" o:spt="75" o:preferrelative="t" path="m@4@5l@4@11@9@11@9@5xe" filled="f" stroked="f">
@@ -7608,7 +7832,7 @@
 </file>
 
 <file path=word/endnotes.xml><?xml version="1.0" encoding="utf-8"?>
-<w:endnotes xmlns:wpc="http://schemas.microsoft.com/office/word/2010/wordprocessingCanvas" xmlns:cx="http://schemas.microsoft.com/office/drawing/2014/chartex" xmlns:cx1="http://schemas.microsoft.com/office/drawing/2015/9/8/chartex" xmlns:cx2="http://schemas.microsoft.com/office/drawing/2015/10/21/chartex" xmlns:cx3="http://schemas.microsoft.com/office/drawing/2016/5/9/chartex" xmlns:cx4="http://schemas.microsoft.com/office/drawing/2016/5/10/chartex" xmlns:cx5="http://schemas.microsoft.com/office/drawing/2016/5/11/chartex" xmlns:cx6="http://schemas.microsoft.com/office/drawing/2016/5/12/chartex" xmlns:cx7="http://schemas.microsoft.com/office/drawing/2016/5/13/chartex" xmlns:cx8="http://schemas.microsoft.com/office/drawing/2016/5/14/chartex" xmlns:mc="http://schemas.openxmlformats.org/markup-compatibility/2006" xmlns:aink="http://schemas.microsoft.com/office/drawing/2016/ink" xmlns:am3d="http://schemas.microsoft.com/office/drawing/2017/model3d" xmlns:o="urn:schemas-microsoft-com:office:office" xmlns:oel="http://schemas.microsoft.com/office/2019/extlst" xmlns:r="http://schemas.openxmlformats.org/officeDocument/2006/relationships" xmlns:m="http://schemas.openxmlformats.org/officeDocument/2006/math" xmlns:v="urn:schemas-microsoft-com:vml" xmlns:wp14="http://schemas.microsoft.com/office/word/2010/wordprocessingDrawing" xmlns:wp="http://schemas.openxmlformats.org/drawingml/2006/wordprocessingDrawing" xmlns:w10="urn:schemas-microsoft-com:office:word" xmlns:w="http://schemas.openxmlformats.org/wordprocessingml/2006/main" xmlns:w14="http://schemas.microsoft.com/office/word/2010/wordml" xmlns:w15="http://schemas.microsoft.com/office/word/2012/wordml" xmlns:w16cex="http://schemas.microsoft.com/office/word/2018/wordml/cex" xmlns:w16cid="http://schemas.microsoft.com/office/word/2016/wordml/cid" xmlns:w16="http://schemas.microsoft.com/office/word/2018/wordml" xmlns:w16du="http://schemas.microsoft.com/office/word/2023/wordml/word16du" xmlns:w16sdtdh="http://schemas.microsoft.com/office/word/2020/wordml/sdtdatahash" xmlns:w16sdtfl="http://schemas.microsoft.com/office/word/2024/wordml/sdtformatlock" xmlns:w16se="http://schemas.microsoft.com/office/word/2015/wordml/symex" xmlns:wpg="http://schemas.microsoft.com/office/word/2010/wordprocessingGroup" xmlns:wpi="http://schemas.microsoft.com/office/word/2010/wordprocessingInk" xmlns:wne="http://schemas.microsoft.com/office/word/2006/wordml" xmlns:wps="http://schemas.microsoft.com/office/word/2010/wordprocessingShape" mc:Ignorable="w14 w15 w16se w16cid w16 w16cex w16sdtdh w16sdtfl w16du wp14">
+<w:endnotes xmlns:wpc="http://schemas.microsoft.com/office/word/2010/wordprocessingCanvas" xmlns:cx="http://schemas.microsoft.com/office/drawing/2014/chartex" xmlns:cx1="http://schemas.microsoft.com/office/drawing/2015/9/8/chartex" xmlns:cx2="http://schemas.microsoft.com/office/drawing/2015/10/21/chartex" xmlns:cx3="http://schemas.microsoft.com/office/drawing/2016/5/9/chartex" xmlns:cx4="http://schemas.microsoft.com/office/drawing/2016/5/10/chartex" xmlns:cx5="http://schemas.microsoft.com/office/drawing/2016/5/11/chartex" xmlns:cx6="http://schemas.microsoft.com/office/drawing/2016/5/12/chartex" xmlns:cx7="http://schemas.microsoft.com/office/drawing/2016/5/13/chartex" xmlns:cx8="http://schemas.microsoft.com/office/drawing/2016/5/14/chartex" xmlns:mc="http://schemas.openxmlformats.org/markup-compatibility/2006" xmlns:aink="http://schemas.microsoft.com/office/drawing/2016/ink" xmlns:am3d="http://schemas.microsoft.com/office/drawing/2017/model3d" xmlns:o="urn:schemas-microsoft-com:office:office" xmlns:oel="http://schemas.microsoft.com/office/2019/extlst" xmlns:r="http://schemas.openxmlformats.org/officeDocument/2006/relationships" xmlns:m="http://schemas.openxmlformats.org/officeDocument/2006/math" xmlns:v="urn:schemas-microsoft-com:vml" xmlns:wp14="http://schemas.microsoft.com/office/word/2010/wordprocessingDrawing" xmlns:wp="http://schemas.openxmlformats.org/drawingml/2006/wordprocessingDrawing" xmlns:w10="urn:schemas-microsoft-com:office:word" xmlns:w="http://schemas.openxmlformats.org/wordprocessingml/2006/main" xmlns:w14="http://schemas.microsoft.com/office/word/2010/wordml" xmlns:w15="http://schemas.microsoft.com/office/word/2012/wordml" xmlns:w16cex="http://schemas.microsoft.com/office/word/2018/wordml/cex" xmlns:w16cid="http://schemas.microsoft.com/office/word/2016/wordml/cid" xmlns:w16="http://schemas.microsoft.com/office/word/2018/wordml" xmlns:w16sdtdh="http://schemas.microsoft.com/office/word/2020/wordml/sdtdatahash" xmlns:w16se="http://schemas.microsoft.com/office/word/2015/wordml/symex" xmlns:wpg="http://schemas.microsoft.com/office/word/2010/wordprocessingGroup" xmlns:wpi="http://schemas.microsoft.com/office/word/2010/wordprocessingInk" xmlns:wne="http://schemas.microsoft.com/office/word/2006/wordml" xmlns:wps="http://schemas.microsoft.com/office/word/2010/wordprocessingShape" mc:Ignorable="w14 w15 w16se w16cid w16 w16cex w16sdtdh wp14">
   <w:endnote w:type="separator" w:id="-1">
     <w:p>
       <w:pPr>
@@ -7633,7 +7857,7 @@
 </file>
 
 <file path=word/footer1.xml><?xml version="1.0" encoding="utf-8"?>
-<w:ftr xmlns:wpc="http://schemas.microsoft.com/office/word/2010/wordprocessingCanvas" xmlns:cx="http://schemas.microsoft.com/office/drawing/2014/chartex" xmlns:cx1="http://schemas.microsoft.com/office/drawing/2015/9/8/chartex" xmlns:cx2="http://schemas.microsoft.com/office/drawing/2015/10/21/chartex" xmlns:cx3="http://schemas.microsoft.com/office/drawing/2016/5/9/chartex" xmlns:cx4="http://schemas.microsoft.com/office/drawing/2016/5/10/chartex" xmlns:cx5="http://schemas.microsoft.com/office/drawing/2016/5/11/chartex" xmlns:cx6="http://schemas.microsoft.com/office/drawing/2016/5/12/chartex" xmlns:cx7="http://schemas.microsoft.com/office/drawing/2016/5/13/chartex" xmlns:cx8="http://schemas.microsoft.com/office/drawing/2016/5/14/chartex" xmlns:mc="http://schemas.openxmlformats.org/markup-compatibility/2006" xmlns:aink="http://schemas.microsoft.com/office/drawing/2016/ink" xmlns:am3d="http://schemas.microsoft.com/office/drawing/2017/model3d" xmlns:o="urn:schemas-microsoft-com:office:office" xmlns:oel="http://schemas.microsoft.com/office/2019/extlst" xmlns:r="http://schemas.openxmlformats.org/officeDocument/2006/relationships" xmlns:m="http://schemas.openxmlformats.org/officeDocument/2006/math" xmlns:v="urn:schemas-microsoft-com:vml" xmlns:wp14="http://schemas.microsoft.com/office/word/2010/wordprocessingDrawing" xmlns:wp="http://schemas.openxmlformats.org/drawingml/2006/wordprocessingDrawing" xmlns:w10="urn:schemas-microsoft-com:office:word" xmlns:w="http://schemas.openxmlformats.org/wordprocessingml/2006/main" xmlns:w14="http://schemas.microsoft.com/office/word/2010/wordml" xmlns:w15="http://schemas.microsoft.com/office/word/2012/wordml" xmlns:w16cex="http://schemas.microsoft.com/office/word/2018/wordml/cex" xmlns:w16cid="http://schemas.microsoft.com/office/word/2016/wordml/cid" xmlns:w16="http://schemas.microsoft.com/office/word/2018/wordml" xmlns:w16du="http://schemas.microsoft.com/office/word/2023/wordml/word16du" xmlns:w16sdtdh="http://schemas.microsoft.com/office/word/2020/wordml/sdtdatahash" xmlns:w16sdtfl="http://schemas.microsoft.com/office/word/2024/wordml/sdtformatlock" xmlns:w16se="http://schemas.microsoft.com/office/word/2015/wordml/symex" xmlns:wpg="http://schemas.microsoft.com/office/word/2010/wordprocessingGroup" xmlns:wpi="http://schemas.microsoft.com/office/word/2010/wordprocessingInk" xmlns:wne="http://schemas.microsoft.com/office/word/2006/wordml" xmlns:wps="http://schemas.microsoft.com/office/word/2010/wordprocessingShape" mc:Ignorable="w14 w15 w16se w16cid w16 w16cex w16sdtdh w16sdtfl w16du wp14">
+<w:ftr xmlns:wpc="http://schemas.microsoft.com/office/word/2010/wordprocessingCanvas" xmlns:cx="http://schemas.microsoft.com/office/drawing/2014/chartex" xmlns:cx1="http://schemas.microsoft.com/office/drawing/2015/9/8/chartex" xmlns:cx2="http://schemas.microsoft.com/office/drawing/2015/10/21/chartex" xmlns:cx3="http://schemas.microsoft.com/office/drawing/2016/5/9/chartex" xmlns:cx4="http://schemas.microsoft.com/office/drawing/2016/5/10/chartex" xmlns:cx5="http://schemas.microsoft.com/office/drawing/2016/5/11/chartex" xmlns:cx6="http://schemas.microsoft.com/office/drawing/2016/5/12/chartex" xmlns:cx7="http://schemas.microsoft.com/office/drawing/2016/5/13/chartex" xmlns:cx8="http://schemas.microsoft.com/office/drawing/2016/5/14/chartex" xmlns:mc="http://schemas.openxmlformats.org/markup-compatibility/2006" xmlns:aink="http://schemas.microsoft.com/office/drawing/2016/ink" xmlns:am3d="http://schemas.microsoft.com/office/drawing/2017/model3d" xmlns:o="urn:schemas-microsoft-com:office:office" xmlns:oel="http://schemas.microsoft.com/office/2019/extlst" xmlns:r="http://schemas.openxmlformats.org/officeDocument/2006/relationships" xmlns:m="http://schemas.openxmlformats.org/officeDocument/2006/math" xmlns:v="urn:schemas-microsoft-com:vml" xmlns:wp14="http://schemas.microsoft.com/office/word/2010/wordprocessingDrawing" xmlns:wp="http://schemas.openxmlformats.org/drawingml/2006/wordprocessingDrawing" xmlns:w10="urn:schemas-microsoft-com:office:word" xmlns:w="http://schemas.openxmlformats.org/wordprocessingml/2006/main" xmlns:w14="http://schemas.microsoft.com/office/word/2010/wordml" xmlns:w15="http://schemas.microsoft.com/office/word/2012/wordml" xmlns:w16cex="http://schemas.microsoft.com/office/word/2018/wordml/cex" xmlns:w16cid="http://schemas.microsoft.com/office/word/2016/wordml/cid" xmlns:w16="http://schemas.microsoft.com/office/word/2018/wordml" xmlns:w16sdtdh="http://schemas.microsoft.com/office/word/2020/wordml/sdtdatahash" xmlns:w16se="http://schemas.microsoft.com/office/word/2015/wordml/symex" xmlns:wpg="http://schemas.microsoft.com/office/word/2010/wordprocessingGroup" xmlns:wpi="http://schemas.microsoft.com/office/word/2010/wordprocessingInk" xmlns:wne="http://schemas.microsoft.com/office/word/2006/wordml" xmlns:wps="http://schemas.microsoft.com/office/word/2010/wordprocessingShape" mc:Ignorable="w14 w15 w16se w16cid w16 w16cex w16sdtdh wp14">
   <w:p>
     <w:pPr>
       <w:pStyle w:val="Piedepgina"/>
@@ -7643,7 +7867,7 @@
 </file>
 
 <file path=word/footer2.xml><?xml version="1.0" encoding="utf-8"?>
-<w:ftr xmlns:wpc="http://schemas.microsoft.com/office/word/2010/wordprocessingCanvas" xmlns:cx="http://schemas.microsoft.com/office/drawing/2014/chartex" xmlns:cx1="http://schemas.microsoft.com/office/drawing/2015/9/8/chartex" xmlns:cx2="http://schemas.microsoft.com/office/drawing/2015/10/21/chartex" xmlns:cx3="http://schemas.microsoft.com/office/drawing/2016/5/9/chartex" xmlns:cx4="http://schemas.microsoft.com/office/drawing/2016/5/10/chartex" xmlns:cx5="http://schemas.microsoft.com/office/drawing/2016/5/11/chartex" xmlns:cx6="http://schemas.microsoft.com/office/drawing/2016/5/12/chartex" xmlns:cx7="http://schemas.microsoft.com/office/drawing/2016/5/13/chartex" xmlns:cx8="http://schemas.microsoft.com/office/drawing/2016/5/14/chartex" xmlns:mc="http://schemas.openxmlformats.org/markup-compatibility/2006" xmlns:aink="http://schemas.microsoft.com/office/drawing/2016/ink" xmlns:am3d="http://schemas.microsoft.com/office/drawing/2017/model3d" xmlns:o="urn:schemas-microsoft-com:office:office" xmlns:oel="http://schemas.microsoft.com/office/2019/extlst" xmlns:r="http://schemas.openxmlformats.org/officeDocument/2006/relationships" xmlns:m="http://schemas.openxmlformats.org/officeDocument/2006/math" xmlns:v="urn:schemas-microsoft-com:vml" xmlns:wp14="http://schemas.microsoft.com/office/word/2010/wordprocessingDrawing" xmlns:wp="http://schemas.openxmlformats.org/drawingml/2006/wordprocessingDrawing" xmlns:w10="urn:schemas-microsoft-com:office:word" xmlns:w="http://schemas.openxmlformats.org/wordprocessingml/2006/main" xmlns:w14="http://schemas.microsoft.com/office/word/2010/wordml" xmlns:w15="http://schemas.microsoft.com/office/word/2012/wordml" xmlns:w16cex="http://schemas.microsoft.com/office/word/2018/wordml/cex" xmlns:w16cid="http://schemas.microsoft.com/office/word/2016/wordml/cid" xmlns:w16="http://schemas.microsoft.com/office/word/2018/wordml" xmlns:w16du="http://schemas.microsoft.com/office/word/2023/wordml/word16du" xmlns:w16sdtdh="http://schemas.microsoft.com/office/word/2020/wordml/sdtdatahash" xmlns:w16sdtfl="http://schemas.microsoft.com/office/word/2024/wordml/sdtformatlock" xmlns:w16se="http://schemas.microsoft.com/office/word/2015/wordml/symex" xmlns:wpg="http://schemas.microsoft.com/office/word/2010/wordprocessingGroup" xmlns:wpi="http://schemas.microsoft.com/office/word/2010/wordprocessingInk" xmlns:wne="http://schemas.microsoft.com/office/word/2006/wordml" xmlns:wps="http://schemas.microsoft.com/office/word/2010/wordprocessingShape" mc:Ignorable="w14 w15 w16se w16cid w16 w16cex w16sdtdh w16sdtfl w16du wp14">
+<w:ftr xmlns:wpc="http://schemas.microsoft.com/office/word/2010/wordprocessingCanvas" xmlns:cx="http://schemas.microsoft.com/office/drawing/2014/chartex" xmlns:cx1="http://schemas.microsoft.com/office/drawing/2015/9/8/chartex" xmlns:cx2="http://schemas.microsoft.com/office/drawing/2015/10/21/chartex" xmlns:cx3="http://schemas.microsoft.com/office/drawing/2016/5/9/chartex" xmlns:cx4="http://schemas.microsoft.com/office/drawing/2016/5/10/chartex" xmlns:cx5="http://schemas.microsoft.com/office/drawing/2016/5/11/chartex" xmlns:cx6="http://schemas.microsoft.com/office/drawing/2016/5/12/chartex" xmlns:cx7="http://schemas.microsoft.com/office/drawing/2016/5/13/chartex" xmlns:cx8="http://schemas.microsoft.com/office/drawing/2016/5/14/chartex" xmlns:mc="http://schemas.openxmlformats.org/markup-compatibility/2006" xmlns:aink="http://schemas.microsoft.com/office/drawing/2016/ink" xmlns:am3d="http://schemas.microsoft.com/office/drawing/2017/model3d" xmlns:o="urn:schemas-microsoft-com:office:office" xmlns:oel="http://schemas.microsoft.com/office/2019/extlst" xmlns:r="http://schemas.openxmlformats.org/officeDocument/2006/relationships" xmlns:m="http://schemas.openxmlformats.org/officeDocument/2006/math" xmlns:v="urn:schemas-microsoft-com:vml" xmlns:wp14="http://schemas.microsoft.com/office/word/2010/wordprocessingDrawing" xmlns:wp="http://schemas.openxmlformats.org/drawingml/2006/wordprocessingDrawing" xmlns:w10="urn:schemas-microsoft-com:office:word" xmlns:w="http://schemas.openxmlformats.org/wordprocessingml/2006/main" xmlns:w14="http://schemas.microsoft.com/office/word/2010/wordml" xmlns:w15="http://schemas.microsoft.com/office/word/2012/wordml" xmlns:w16cex="http://schemas.microsoft.com/office/word/2018/wordml/cex" xmlns:w16cid="http://schemas.microsoft.com/office/word/2016/wordml/cid" xmlns:w16="http://schemas.microsoft.com/office/word/2018/wordml" xmlns:w16sdtdh="http://schemas.microsoft.com/office/word/2020/wordml/sdtdatahash" xmlns:w16se="http://schemas.microsoft.com/office/word/2015/wordml/symex" xmlns:wpg="http://schemas.microsoft.com/office/word/2010/wordprocessingGroup" xmlns:wpi="http://schemas.microsoft.com/office/word/2010/wordprocessingInk" xmlns:wne="http://schemas.microsoft.com/office/word/2006/wordml" xmlns:wps="http://schemas.microsoft.com/office/word/2010/wordprocessingShape" mc:Ignorable="w14 w15 w16se w16cid w16 w16cex w16sdtdh wp14">
   <w:p>
     <w:r>
       <w:rPr>
@@ -7818,7 +8042,43 @@
                               <w:sz w:val="24"/>
                               <w:szCs w:val="20"/>
                             </w:rPr>
-                            <w:t>Agüero Máximo - Borgo Agustín - Didzius Luana - Medina Manuel – Tise Maximiliano –</w:t>
+                            <w:t xml:space="preserve">Agüero Máximo - Borgo Agustín - </w:t>
+                          </w:r>
+                          <w:proofErr w:type="spellStart"/>
+                          <w:r>
+                            <w:rPr>
+                              <w:color w:val="666666"/>
+                              <w:sz w:val="24"/>
+                              <w:szCs w:val="20"/>
+                            </w:rPr>
+                            <w:t>Didzius</w:t>
+                          </w:r>
+                          <w:proofErr w:type="spellEnd"/>
+                          <w:r>
+                            <w:rPr>
+                              <w:color w:val="666666"/>
+                              <w:sz w:val="24"/>
+                              <w:szCs w:val="20"/>
+                            </w:rPr>
+                            <w:t xml:space="preserve"> Luana - Medina Manuel – </w:t>
+                          </w:r>
+                          <w:proofErr w:type="spellStart"/>
+                          <w:r>
+                            <w:rPr>
+                              <w:color w:val="666666"/>
+                              <w:sz w:val="24"/>
+                              <w:szCs w:val="20"/>
+                            </w:rPr>
+                            <w:t>Tise</w:t>
+                          </w:r>
+                          <w:proofErr w:type="spellEnd"/>
+                          <w:r>
+                            <w:rPr>
+                              <w:color w:val="666666"/>
+                              <w:sz w:val="24"/>
+                              <w:szCs w:val="20"/>
+                            </w:rPr>
+                            <w:t xml:space="preserve"> Maximiliano –</w:t>
                           </w:r>
                         </w:p>
                         <w:p>
@@ -7837,7 +8097,25 @@
                               <w:sz w:val="24"/>
                               <w:szCs w:val="20"/>
                             </w:rPr>
-                            <w:t xml:space="preserve"> Nuñez Juan</w:t>
+                            <w:t xml:space="preserve"> </w:t>
+                          </w:r>
+                          <w:proofErr w:type="spellStart"/>
+                          <w:r>
+                            <w:rPr>
+                              <w:color w:val="666666"/>
+                              <w:sz w:val="24"/>
+                              <w:szCs w:val="20"/>
+                            </w:rPr>
+                            <w:t>Nuñez</w:t>
+                          </w:r>
+                          <w:proofErr w:type="spellEnd"/>
+                          <w:r>
+                            <w:rPr>
+                              <w:color w:val="666666"/>
+                              <w:sz w:val="24"/>
+                              <w:szCs w:val="20"/>
+                            </w:rPr>
+                            <w:t xml:space="preserve"> Juan</w:t>
                           </w:r>
                         </w:p>
                       </w:txbxContent>
@@ -7873,7 +8151,43 @@
                         <w:sz w:val="24"/>
                         <w:szCs w:val="20"/>
                       </w:rPr>
-                      <w:t>Agüero Máximo - Borgo Agustín - Didzius Luana - Medina Manuel – Tise Maximiliano –</w:t>
+                      <w:t xml:space="preserve">Agüero Máximo - Borgo Agustín - </w:t>
+                    </w:r>
+                    <w:proofErr w:type="spellStart"/>
+                    <w:r>
+                      <w:rPr>
+                        <w:color w:val="666666"/>
+                        <w:sz w:val="24"/>
+                        <w:szCs w:val="20"/>
+                      </w:rPr>
+                      <w:t>Didzius</w:t>
+                    </w:r>
+                    <w:proofErr w:type="spellEnd"/>
+                    <w:r>
+                      <w:rPr>
+                        <w:color w:val="666666"/>
+                        <w:sz w:val="24"/>
+                        <w:szCs w:val="20"/>
+                      </w:rPr>
+                      <w:t xml:space="preserve"> Luana - Medina Manuel – </w:t>
+                    </w:r>
+                    <w:proofErr w:type="spellStart"/>
+                    <w:r>
+                      <w:rPr>
+                        <w:color w:val="666666"/>
+                        <w:sz w:val="24"/>
+                        <w:szCs w:val="20"/>
+                      </w:rPr>
+                      <w:t>Tise</w:t>
+                    </w:r>
+                    <w:proofErr w:type="spellEnd"/>
+                    <w:r>
+                      <w:rPr>
+                        <w:color w:val="666666"/>
+                        <w:sz w:val="24"/>
+                        <w:szCs w:val="20"/>
+                      </w:rPr>
+                      <w:t xml:space="preserve"> Maximiliano –</w:t>
                     </w:r>
                   </w:p>
                   <w:p>
@@ -7892,7 +8206,25 @@
                         <w:sz w:val="24"/>
                         <w:szCs w:val="20"/>
                       </w:rPr>
-                      <w:t xml:space="preserve"> Nuñez Juan</w:t>
+                      <w:t xml:space="preserve"> </w:t>
+                    </w:r>
+                    <w:proofErr w:type="spellStart"/>
+                    <w:r>
+                      <w:rPr>
+                        <w:color w:val="666666"/>
+                        <w:sz w:val="24"/>
+                        <w:szCs w:val="20"/>
+                      </w:rPr>
+                      <w:t>Nuñez</w:t>
+                    </w:r>
+                    <w:proofErr w:type="spellEnd"/>
+                    <w:r>
+                      <w:rPr>
+                        <w:color w:val="666666"/>
+                        <w:sz w:val="24"/>
+                        <w:szCs w:val="20"/>
+                      </w:rPr>
+                      <w:t xml:space="preserve"> Juan</w:t>
                     </w:r>
                   </w:p>
                 </w:txbxContent>
@@ -7940,7 +8272,7 @@
 </file>
 
 <file path=word/footer3.xml><?xml version="1.0" encoding="utf-8"?>
-<w:ftr xmlns:wpc="http://schemas.microsoft.com/office/word/2010/wordprocessingCanvas" xmlns:cx="http://schemas.microsoft.com/office/drawing/2014/chartex" xmlns:cx1="http://schemas.microsoft.com/office/drawing/2015/9/8/chartex" xmlns:cx2="http://schemas.microsoft.com/office/drawing/2015/10/21/chartex" xmlns:cx3="http://schemas.microsoft.com/office/drawing/2016/5/9/chartex" xmlns:cx4="http://schemas.microsoft.com/office/drawing/2016/5/10/chartex" xmlns:cx5="http://schemas.microsoft.com/office/drawing/2016/5/11/chartex" xmlns:cx6="http://schemas.microsoft.com/office/drawing/2016/5/12/chartex" xmlns:cx7="http://schemas.microsoft.com/office/drawing/2016/5/13/chartex" xmlns:cx8="http://schemas.microsoft.com/office/drawing/2016/5/14/chartex" xmlns:mc="http://schemas.openxmlformats.org/markup-compatibility/2006" xmlns:aink="http://schemas.microsoft.com/office/drawing/2016/ink" xmlns:am3d="http://schemas.microsoft.com/office/drawing/2017/model3d" xmlns:o="urn:schemas-microsoft-com:office:office" xmlns:oel="http://schemas.microsoft.com/office/2019/extlst" xmlns:r="http://schemas.openxmlformats.org/officeDocument/2006/relationships" xmlns:m="http://schemas.openxmlformats.org/officeDocument/2006/math" xmlns:v="urn:schemas-microsoft-com:vml" xmlns:wp14="http://schemas.microsoft.com/office/word/2010/wordprocessingDrawing" xmlns:wp="http://schemas.openxmlformats.org/drawingml/2006/wordprocessingDrawing" xmlns:w10="urn:schemas-microsoft-com:office:word" xmlns:w="http://schemas.openxmlformats.org/wordprocessingml/2006/main" xmlns:w14="http://schemas.microsoft.com/office/word/2010/wordml" xmlns:w15="http://schemas.microsoft.com/office/word/2012/wordml" xmlns:w16cex="http://schemas.microsoft.com/office/word/2018/wordml/cex" xmlns:w16cid="http://schemas.microsoft.com/office/word/2016/wordml/cid" xmlns:w16="http://schemas.microsoft.com/office/word/2018/wordml" xmlns:w16du="http://schemas.microsoft.com/office/word/2023/wordml/word16du" xmlns:w16sdtdh="http://schemas.microsoft.com/office/word/2020/wordml/sdtdatahash" xmlns:w16sdtfl="http://schemas.microsoft.com/office/word/2024/wordml/sdtformatlock" xmlns:w16se="http://schemas.microsoft.com/office/word/2015/wordml/symex" xmlns:wpg="http://schemas.microsoft.com/office/word/2010/wordprocessingGroup" xmlns:wpi="http://schemas.microsoft.com/office/word/2010/wordprocessingInk" xmlns:wne="http://schemas.microsoft.com/office/word/2006/wordml" xmlns:wps="http://schemas.microsoft.com/office/word/2010/wordprocessingShape" mc:Ignorable="w14 w15 w16se w16cid w16 w16cex w16sdtdh w16sdtfl w16du wp14">
+<w:ftr xmlns:wpc="http://schemas.microsoft.com/office/word/2010/wordprocessingCanvas" xmlns:cx="http://schemas.microsoft.com/office/drawing/2014/chartex" xmlns:cx1="http://schemas.microsoft.com/office/drawing/2015/9/8/chartex" xmlns:cx2="http://schemas.microsoft.com/office/drawing/2015/10/21/chartex" xmlns:cx3="http://schemas.microsoft.com/office/drawing/2016/5/9/chartex" xmlns:cx4="http://schemas.microsoft.com/office/drawing/2016/5/10/chartex" xmlns:cx5="http://schemas.microsoft.com/office/drawing/2016/5/11/chartex" xmlns:cx6="http://schemas.microsoft.com/office/drawing/2016/5/12/chartex" xmlns:cx7="http://schemas.microsoft.com/office/drawing/2016/5/13/chartex" xmlns:cx8="http://schemas.microsoft.com/office/drawing/2016/5/14/chartex" xmlns:mc="http://schemas.openxmlformats.org/markup-compatibility/2006" xmlns:aink="http://schemas.microsoft.com/office/drawing/2016/ink" xmlns:am3d="http://schemas.microsoft.com/office/drawing/2017/model3d" xmlns:o="urn:schemas-microsoft-com:office:office" xmlns:oel="http://schemas.microsoft.com/office/2019/extlst" xmlns:r="http://schemas.openxmlformats.org/officeDocument/2006/relationships" xmlns:m="http://schemas.openxmlformats.org/officeDocument/2006/math" xmlns:v="urn:schemas-microsoft-com:vml" xmlns:wp14="http://schemas.microsoft.com/office/word/2010/wordprocessingDrawing" xmlns:wp="http://schemas.openxmlformats.org/drawingml/2006/wordprocessingDrawing" xmlns:w10="urn:schemas-microsoft-com:office:word" xmlns:w="http://schemas.openxmlformats.org/wordprocessingml/2006/main" xmlns:w14="http://schemas.microsoft.com/office/word/2010/wordml" xmlns:w15="http://schemas.microsoft.com/office/word/2012/wordml" xmlns:w16cex="http://schemas.microsoft.com/office/word/2018/wordml/cex" xmlns:w16cid="http://schemas.microsoft.com/office/word/2016/wordml/cid" xmlns:w16="http://schemas.microsoft.com/office/word/2018/wordml" xmlns:w16sdtdh="http://schemas.microsoft.com/office/word/2020/wordml/sdtdatahash" xmlns:w16se="http://schemas.microsoft.com/office/word/2015/wordml/symex" xmlns:wpg="http://schemas.microsoft.com/office/word/2010/wordprocessingGroup" xmlns:wpi="http://schemas.microsoft.com/office/word/2010/wordprocessingInk" xmlns:wne="http://schemas.microsoft.com/office/word/2006/wordml" xmlns:wps="http://schemas.microsoft.com/office/word/2010/wordprocessingShape" mc:Ignorable="w14 w15 w16se w16cid w16 w16cex w16sdtdh wp14">
   <w:p>
     <w:pPr>
       <w:pStyle w:val="Piedepgina"/>
@@ -7950,7 +8282,7 @@
 </file>
 
 <file path=word/footnotes.xml><?xml version="1.0" encoding="utf-8"?>
-<w:footnotes xmlns:wpc="http://schemas.microsoft.com/office/word/2010/wordprocessingCanvas" xmlns:cx="http://schemas.microsoft.com/office/drawing/2014/chartex" xmlns:cx1="http://schemas.microsoft.com/office/drawing/2015/9/8/chartex" xmlns:cx2="http://schemas.microsoft.com/office/drawing/2015/10/21/chartex" xmlns:cx3="http://schemas.microsoft.com/office/drawing/2016/5/9/chartex" xmlns:cx4="http://schemas.microsoft.com/office/drawing/2016/5/10/chartex" xmlns:cx5="http://schemas.microsoft.com/office/drawing/2016/5/11/chartex" xmlns:cx6="http://schemas.microsoft.com/office/drawing/2016/5/12/chartex" xmlns:cx7="http://schemas.microsoft.com/office/drawing/2016/5/13/chartex" xmlns:cx8="http://schemas.microsoft.com/office/drawing/2016/5/14/chartex" xmlns:mc="http://schemas.openxmlformats.org/markup-compatibility/2006" xmlns:aink="http://schemas.microsoft.com/office/drawing/2016/ink" xmlns:am3d="http://schemas.microsoft.com/office/drawing/2017/model3d" xmlns:o="urn:schemas-microsoft-com:office:office" xmlns:oel="http://schemas.microsoft.com/office/2019/extlst" xmlns:r="http://schemas.openxmlformats.org/officeDocument/2006/relationships" xmlns:m="http://schemas.openxmlformats.org/officeDocument/2006/math" xmlns:v="urn:schemas-microsoft-com:vml" xmlns:wp14="http://schemas.microsoft.com/office/word/2010/wordprocessingDrawing" xmlns:wp="http://schemas.openxmlformats.org/drawingml/2006/wordprocessingDrawing" xmlns:w10="urn:schemas-microsoft-com:office:word" xmlns:w="http://schemas.openxmlformats.org/wordprocessingml/2006/main" xmlns:w14="http://schemas.microsoft.com/office/word/2010/wordml" xmlns:w15="http://schemas.microsoft.com/office/word/2012/wordml" xmlns:w16cex="http://schemas.microsoft.com/office/word/2018/wordml/cex" xmlns:w16cid="http://schemas.microsoft.com/office/word/2016/wordml/cid" xmlns:w16="http://schemas.microsoft.com/office/word/2018/wordml" xmlns:w16du="http://schemas.microsoft.com/office/word/2023/wordml/word16du" xmlns:w16sdtdh="http://schemas.microsoft.com/office/word/2020/wordml/sdtdatahash" xmlns:w16sdtfl="http://schemas.microsoft.com/office/word/2024/wordml/sdtformatlock" xmlns:w16se="http://schemas.microsoft.com/office/word/2015/wordml/symex" xmlns:wpg="http://schemas.microsoft.com/office/word/2010/wordprocessingGroup" xmlns:wpi="http://schemas.microsoft.com/office/word/2010/wordprocessingInk" xmlns:wne="http://schemas.microsoft.com/office/word/2006/wordml" xmlns:wps="http://schemas.microsoft.com/office/word/2010/wordprocessingShape" mc:Ignorable="w14 w15 w16se w16cid w16 w16cex w16sdtdh w16sdtfl w16du wp14">
+<w:footnotes xmlns:wpc="http://schemas.microsoft.com/office/word/2010/wordprocessingCanvas" xmlns:cx="http://schemas.microsoft.com/office/drawing/2014/chartex" xmlns:cx1="http://schemas.microsoft.com/office/drawing/2015/9/8/chartex" xmlns:cx2="http://schemas.microsoft.com/office/drawing/2015/10/21/chartex" xmlns:cx3="http://schemas.microsoft.com/office/drawing/2016/5/9/chartex" xmlns:cx4="http://schemas.microsoft.com/office/drawing/2016/5/10/chartex" xmlns:cx5="http://schemas.microsoft.com/office/drawing/2016/5/11/chartex" xmlns:cx6="http://schemas.microsoft.com/office/drawing/2016/5/12/chartex" xmlns:cx7="http://schemas.microsoft.com/office/drawing/2016/5/13/chartex" xmlns:cx8="http://schemas.microsoft.com/office/drawing/2016/5/14/chartex" xmlns:mc="http://schemas.openxmlformats.org/markup-compatibility/2006" xmlns:aink="http://schemas.microsoft.com/office/drawing/2016/ink" xmlns:am3d="http://schemas.microsoft.com/office/drawing/2017/model3d" xmlns:o="urn:schemas-microsoft-com:office:office" xmlns:oel="http://schemas.microsoft.com/office/2019/extlst" xmlns:r="http://schemas.openxmlformats.org/officeDocument/2006/relationships" xmlns:m="http://schemas.openxmlformats.org/officeDocument/2006/math" xmlns:v="urn:schemas-microsoft-com:vml" xmlns:wp14="http://schemas.microsoft.com/office/word/2010/wordprocessingDrawing" xmlns:wp="http://schemas.openxmlformats.org/drawingml/2006/wordprocessingDrawing" xmlns:w10="urn:schemas-microsoft-com:office:word" xmlns:w="http://schemas.openxmlformats.org/wordprocessingml/2006/main" xmlns:w14="http://schemas.microsoft.com/office/word/2010/wordml" xmlns:w15="http://schemas.microsoft.com/office/word/2012/wordml" xmlns:w16cex="http://schemas.microsoft.com/office/word/2018/wordml/cex" xmlns:w16cid="http://schemas.microsoft.com/office/word/2016/wordml/cid" xmlns:w16="http://schemas.microsoft.com/office/word/2018/wordml" xmlns:w16sdtdh="http://schemas.microsoft.com/office/word/2020/wordml/sdtdatahash" xmlns:w16se="http://schemas.microsoft.com/office/word/2015/wordml/symex" xmlns:wpg="http://schemas.microsoft.com/office/word/2010/wordprocessingGroup" xmlns:wpi="http://schemas.microsoft.com/office/word/2010/wordprocessingInk" xmlns:wne="http://schemas.microsoft.com/office/word/2006/wordml" xmlns:wps="http://schemas.microsoft.com/office/word/2010/wordprocessingShape" mc:Ignorable="w14 w15 w16se w16cid w16 w16cex w16sdtdh wp14">
   <w:footnote w:type="separator" w:id="-1">
     <w:p>
       <w:pPr>
@@ -7975,7 +8307,7 @@
 </file>
 
 <file path=word/header1.xml><?xml version="1.0" encoding="utf-8"?>
-<w:hdr xmlns:wpc="http://schemas.microsoft.com/office/word/2010/wordprocessingCanvas" xmlns:cx="http://schemas.microsoft.com/office/drawing/2014/chartex" xmlns:cx1="http://schemas.microsoft.com/office/drawing/2015/9/8/chartex" xmlns:cx2="http://schemas.microsoft.com/office/drawing/2015/10/21/chartex" xmlns:cx3="http://schemas.microsoft.com/office/drawing/2016/5/9/chartex" xmlns:cx4="http://schemas.microsoft.com/office/drawing/2016/5/10/chartex" xmlns:cx5="http://schemas.microsoft.com/office/drawing/2016/5/11/chartex" xmlns:cx6="http://schemas.microsoft.com/office/drawing/2016/5/12/chartex" xmlns:cx7="http://schemas.microsoft.com/office/drawing/2016/5/13/chartex" xmlns:cx8="http://schemas.microsoft.com/office/drawing/2016/5/14/chartex" xmlns:mc="http://schemas.openxmlformats.org/markup-compatibility/2006" xmlns:aink="http://schemas.microsoft.com/office/drawing/2016/ink" xmlns:am3d="http://schemas.microsoft.com/office/drawing/2017/model3d" xmlns:o="urn:schemas-microsoft-com:office:office" xmlns:oel="http://schemas.microsoft.com/office/2019/extlst" xmlns:r="http://schemas.openxmlformats.org/officeDocument/2006/relationships" xmlns:m="http://schemas.openxmlformats.org/officeDocument/2006/math" xmlns:v="urn:schemas-microsoft-com:vml" xmlns:wp14="http://schemas.microsoft.com/office/word/2010/wordprocessingDrawing" xmlns:wp="http://schemas.openxmlformats.org/drawingml/2006/wordprocessingDrawing" xmlns:w10="urn:schemas-microsoft-com:office:word" xmlns:w="http://schemas.openxmlformats.org/wordprocessingml/2006/main" xmlns:w14="http://schemas.microsoft.com/office/word/2010/wordml" xmlns:w15="http://schemas.microsoft.com/office/word/2012/wordml" xmlns:w16cex="http://schemas.microsoft.com/office/word/2018/wordml/cex" xmlns:w16cid="http://schemas.microsoft.com/office/word/2016/wordml/cid" xmlns:w16="http://schemas.microsoft.com/office/word/2018/wordml" xmlns:w16du="http://schemas.microsoft.com/office/word/2023/wordml/word16du" xmlns:w16sdtdh="http://schemas.microsoft.com/office/word/2020/wordml/sdtdatahash" xmlns:w16sdtfl="http://schemas.microsoft.com/office/word/2024/wordml/sdtformatlock" xmlns:w16se="http://schemas.microsoft.com/office/word/2015/wordml/symex" xmlns:wpg="http://schemas.microsoft.com/office/word/2010/wordprocessingGroup" xmlns:wpi="http://schemas.microsoft.com/office/word/2010/wordprocessingInk" xmlns:wne="http://schemas.microsoft.com/office/word/2006/wordml" xmlns:wps="http://schemas.microsoft.com/office/word/2010/wordprocessingShape" mc:Ignorable="w14 w15 w16se w16cid w16 w16cex w16sdtdh w16sdtfl w16du wp14">
+<w:hdr xmlns:wpc="http://schemas.microsoft.com/office/word/2010/wordprocessingCanvas" xmlns:cx="http://schemas.microsoft.com/office/drawing/2014/chartex" xmlns:cx1="http://schemas.microsoft.com/office/drawing/2015/9/8/chartex" xmlns:cx2="http://schemas.microsoft.com/office/drawing/2015/10/21/chartex" xmlns:cx3="http://schemas.microsoft.com/office/drawing/2016/5/9/chartex" xmlns:cx4="http://schemas.microsoft.com/office/drawing/2016/5/10/chartex" xmlns:cx5="http://schemas.microsoft.com/office/drawing/2016/5/11/chartex" xmlns:cx6="http://schemas.microsoft.com/office/drawing/2016/5/12/chartex" xmlns:cx7="http://schemas.microsoft.com/office/drawing/2016/5/13/chartex" xmlns:cx8="http://schemas.microsoft.com/office/drawing/2016/5/14/chartex" xmlns:mc="http://schemas.openxmlformats.org/markup-compatibility/2006" xmlns:aink="http://schemas.microsoft.com/office/drawing/2016/ink" xmlns:am3d="http://schemas.microsoft.com/office/drawing/2017/model3d" xmlns:o="urn:schemas-microsoft-com:office:office" xmlns:oel="http://schemas.microsoft.com/office/2019/extlst" xmlns:r="http://schemas.openxmlformats.org/officeDocument/2006/relationships" xmlns:m="http://schemas.openxmlformats.org/officeDocument/2006/math" xmlns:v="urn:schemas-microsoft-com:vml" xmlns:wp14="http://schemas.microsoft.com/office/word/2010/wordprocessingDrawing" xmlns:wp="http://schemas.openxmlformats.org/drawingml/2006/wordprocessingDrawing" xmlns:w10="urn:schemas-microsoft-com:office:word" xmlns:w="http://schemas.openxmlformats.org/wordprocessingml/2006/main" xmlns:w14="http://schemas.microsoft.com/office/word/2010/wordml" xmlns:w15="http://schemas.microsoft.com/office/word/2012/wordml" xmlns:w16cex="http://schemas.microsoft.com/office/word/2018/wordml/cex" xmlns:w16cid="http://schemas.microsoft.com/office/word/2016/wordml/cid" xmlns:w16="http://schemas.microsoft.com/office/word/2018/wordml" xmlns:w16sdtdh="http://schemas.microsoft.com/office/word/2020/wordml/sdtdatahash" xmlns:w16se="http://schemas.microsoft.com/office/word/2015/wordml/symex" xmlns:wpg="http://schemas.microsoft.com/office/word/2010/wordprocessingGroup" xmlns:wpi="http://schemas.microsoft.com/office/word/2010/wordprocessingInk" xmlns:wne="http://schemas.microsoft.com/office/word/2006/wordml" xmlns:wps="http://schemas.microsoft.com/office/word/2010/wordprocessingShape" mc:Ignorable="w14 w15 w16se w16cid w16 w16cex w16sdtdh wp14">
   <w:p>
     <w:pPr>
       <w:pStyle w:val="Encabezado"/>
@@ -7985,7 +8317,7 @@
 </file>
 
 <file path=word/header2.xml><?xml version="1.0" encoding="utf-8"?>
-<w:hdr xmlns:wpc="http://schemas.microsoft.com/office/word/2010/wordprocessingCanvas" xmlns:cx="http://schemas.microsoft.com/office/drawing/2014/chartex" xmlns:cx1="http://schemas.microsoft.com/office/drawing/2015/9/8/chartex" xmlns:cx2="http://schemas.microsoft.com/office/drawing/2015/10/21/chartex" xmlns:cx3="http://schemas.microsoft.com/office/drawing/2016/5/9/chartex" xmlns:cx4="http://schemas.microsoft.com/office/drawing/2016/5/10/chartex" xmlns:cx5="http://schemas.microsoft.com/office/drawing/2016/5/11/chartex" xmlns:cx6="http://schemas.microsoft.com/office/drawing/2016/5/12/chartex" xmlns:cx7="http://schemas.microsoft.com/office/drawing/2016/5/13/chartex" xmlns:cx8="http://schemas.microsoft.com/office/drawing/2016/5/14/chartex" xmlns:mc="http://schemas.openxmlformats.org/markup-compatibility/2006" xmlns:aink="http://schemas.microsoft.com/office/drawing/2016/ink" xmlns:am3d="http://schemas.microsoft.com/office/drawing/2017/model3d" xmlns:o="urn:schemas-microsoft-com:office:office" xmlns:oel="http://schemas.microsoft.com/office/2019/extlst" xmlns:r="http://schemas.openxmlformats.org/officeDocument/2006/relationships" xmlns:m="http://schemas.openxmlformats.org/officeDocument/2006/math" xmlns:v="urn:schemas-microsoft-com:vml" xmlns:wp14="http://schemas.microsoft.com/office/word/2010/wordprocessingDrawing" xmlns:wp="http://schemas.openxmlformats.org/drawingml/2006/wordprocessingDrawing" xmlns:w10="urn:schemas-microsoft-com:office:word" xmlns:w="http://schemas.openxmlformats.org/wordprocessingml/2006/main" xmlns:w14="http://schemas.microsoft.com/office/word/2010/wordml" xmlns:w15="http://schemas.microsoft.com/office/word/2012/wordml" xmlns:w16cex="http://schemas.microsoft.com/office/word/2018/wordml/cex" xmlns:w16cid="http://schemas.microsoft.com/office/word/2016/wordml/cid" xmlns:w16="http://schemas.microsoft.com/office/word/2018/wordml" xmlns:w16du="http://schemas.microsoft.com/office/word/2023/wordml/word16du" xmlns:w16sdtdh="http://schemas.microsoft.com/office/word/2020/wordml/sdtdatahash" xmlns:w16sdtfl="http://schemas.microsoft.com/office/word/2024/wordml/sdtformatlock" xmlns:w16se="http://schemas.microsoft.com/office/word/2015/wordml/symex" xmlns:wpg="http://schemas.microsoft.com/office/word/2010/wordprocessingGroup" xmlns:wpi="http://schemas.microsoft.com/office/word/2010/wordprocessingInk" xmlns:wne="http://schemas.microsoft.com/office/word/2006/wordml" xmlns:wps="http://schemas.microsoft.com/office/word/2010/wordprocessingShape" mc:Ignorable="w14 w15 w16se w16cid w16 w16cex w16sdtdh w16sdtfl w16du wp14">
+<w:hdr xmlns:wpc="http://schemas.microsoft.com/office/word/2010/wordprocessingCanvas" xmlns:cx="http://schemas.microsoft.com/office/drawing/2014/chartex" xmlns:cx1="http://schemas.microsoft.com/office/drawing/2015/9/8/chartex" xmlns:cx2="http://schemas.microsoft.com/office/drawing/2015/10/21/chartex" xmlns:cx3="http://schemas.microsoft.com/office/drawing/2016/5/9/chartex" xmlns:cx4="http://schemas.microsoft.com/office/drawing/2016/5/10/chartex" xmlns:cx5="http://schemas.microsoft.com/office/drawing/2016/5/11/chartex" xmlns:cx6="http://schemas.microsoft.com/office/drawing/2016/5/12/chartex" xmlns:cx7="http://schemas.microsoft.com/office/drawing/2016/5/13/chartex" xmlns:cx8="http://schemas.microsoft.com/office/drawing/2016/5/14/chartex" xmlns:mc="http://schemas.openxmlformats.org/markup-compatibility/2006" xmlns:aink="http://schemas.microsoft.com/office/drawing/2016/ink" xmlns:am3d="http://schemas.microsoft.com/office/drawing/2017/model3d" xmlns:o="urn:schemas-microsoft-com:office:office" xmlns:oel="http://schemas.microsoft.com/office/2019/extlst" xmlns:r="http://schemas.openxmlformats.org/officeDocument/2006/relationships" xmlns:m="http://schemas.openxmlformats.org/officeDocument/2006/math" xmlns:v="urn:schemas-microsoft-com:vml" xmlns:wp14="http://schemas.microsoft.com/office/word/2010/wordprocessingDrawing" xmlns:wp="http://schemas.openxmlformats.org/drawingml/2006/wordprocessingDrawing" xmlns:w10="urn:schemas-microsoft-com:office:word" xmlns:w="http://schemas.openxmlformats.org/wordprocessingml/2006/main" xmlns:w14="http://schemas.microsoft.com/office/word/2010/wordml" xmlns:w15="http://schemas.microsoft.com/office/word/2012/wordml" xmlns:w16cex="http://schemas.microsoft.com/office/word/2018/wordml/cex" xmlns:w16cid="http://schemas.microsoft.com/office/word/2016/wordml/cid" xmlns:w16="http://schemas.microsoft.com/office/word/2018/wordml" xmlns:w16sdtdh="http://schemas.microsoft.com/office/word/2020/wordml/sdtdatahash" xmlns:w16se="http://schemas.microsoft.com/office/word/2015/wordml/symex" xmlns:wpg="http://schemas.microsoft.com/office/word/2010/wordprocessingGroup" xmlns:wpi="http://schemas.microsoft.com/office/word/2010/wordprocessingInk" xmlns:wne="http://schemas.microsoft.com/office/word/2006/wordml" xmlns:wps="http://schemas.microsoft.com/office/word/2010/wordprocessingShape" mc:Ignorable="w14 w15 w16se w16cid w16 w16cex w16sdtdh wp14">
   <w:p>
     <w:r>
       <w:rPr>
@@ -8171,7 +8503,7 @@
 </file>
 
 <file path=word/header3.xml><?xml version="1.0" encoding="utf-8"?>
-<w:hdr xmlns:wpc="http://schemas.microsoft.com/office/word/2010/wordprocessingCanvas" xmlns:cx="http://schemas.microsoft.com/office/drawing/2014/chartex" xmlns:cx1="http://schemas.microsoft.com/office/drawing/2015/9/8/chartex" xmlns:cx2="http://schemas.microsoft.com/office/drawing/2015/10/21/chartex" xmlns:cx3="http://schemas.microsoft.com/office/drawing/2016/5/9/chartex" xmlns:cx4="http://schemas.microsoft.com/office/drawing/2016/5/10/chartex" xmlns:cx5="http://schemas.microsoft.com/office/drawing/2016/5/11/chartex" xmlns:cx6="http://schemas.microsoft.com/office/drawing/2016/5/12/chartex" xmlns:cx7="http://schemas.microsoft.com/office/drawing/2016/5/13/chartex" xmlns:cx8="http://schemas.microsoft.com/office/drawing/2016/5/14/chartex" xmlns:mc="http://schemas.openxmlformats.org/markup-compatibility/2006" xmlns:aink="http://schemas.microsoft.com/office/drawing/2016/ink" xmlns:am3d="http://schemas.microsoft.com/office/drawing/2017/model3d" xmlns:o="urn:schemas-microsoft-com:office:office" xmlns:oel="http://schemas.microsoft.com/office/2019/extlst" xmlns:r="http://schemas.openxmlformats.org/officeDocument/2006/relationships" xmlns:m="http://schemas.openxmlformats.org/officeDocument/2006/math" xmlns:v="urn:schemas-microsoft-com:vml" xmlns:wp14="http://schemas.microsoft.com/office/word/2010/wordprocessingDrawing" xmlns:wp="http://schemas.openxmlformats.org/drawingml/2006/wordprocessingDrawing" xmlns:w10="urn:schemas-microsoft-com:office:word" xmlns:w="http://schemas.openxmlformats.org/wordprocessingml/2006/main" xmlns:w14="http://schemas.microsoft.com/office/word/2010/wordml" xmlns:w15="http://schemas.microsoft.com/office/word/2012/wordml" xmlns:w16cex="http://schemas.microsoft.com/office/word/2018/wordml/cex" xmlns:w16cid="http://schemas.microsoft.com/office/word/2016/wordml/cid" xmlns:w16="http://schemas.microsoft.com/office/word/2018/wordml" xmlns:w16du="http://schemas.microsoft.com/office/word/2023/wordml/word16du" xmlns:w16sdtdh="http://schemas.microsoft.com/office/word/2020/wordml/sdtdatahash" xmlns:w16sdtfl="http://schemas.microsoft.com/office/word/2024/wordml/sdtformatlock" xmlns:w16se="http://schemas.microsoft.com/office/word/2015/wordml/symex" xmlns:wpg="http://schemas.microsoft.com/office/word/2010/wordprocessingGroup" xmlns:wpi="http://schemas.microsoft.com/office/word/2010/wordprocessingInk" xmlns:wne="http://schemas.microsoft.com/office/word/2006/wordml" xmlns:wps="http://schemas.microsoft.com/office/word/2010/wordprocessingShape" mc:Ignorable="w14 w15 w16se w16cid w16 w16cex w16sdtdh w16sdtfl w16du wp14">
+<w:hdr xmlns:wpc="http://schemas.microsoft.com/office/word/2010/wordprocessingCanvas" xmlns:cx="http://schemas.microsoft.com/office/drawing/2014/chartex" xmlns:cx1="http://schemas.microsoft.com/office/drawing/2015/9/8/chartex" xmlns:cx2="http://schemas.microsoft.com/office/drawing/2015/10/21/chartex" xmlns:cx3="http://schemas.microsoft.com/office/drawing/2016/5/9/chartex" xmlns:cx4="http://schemas.microsoft.com/office/drawing/2016/5/10/chartex" xmlns:cx5="http://schemas.microsoft.com/office/drawing/2016/5/11/chartex" xmlns:cx6="http://schemas.microsoft.com/office/drawing/2016/5/12/chartex" xmlns:cx7="http://schemas.microsoft.com/office/drawing/2016/5/13/chartex" xmlns:cx8="http://schemas.microsoft.com/office/drawing/2016/5/14/chartex" xmlns:mc="http://schemas.openxmlformats.org/markup-compatibility/2006" xmlns:aink="http://schemas.microsoft.com/office/drawing/2016/ink" xmlns:am3d="http://schemas.microsoft.com/office/drawing/2017/model3d" xmlns:o="urn:schemas-microsoft-com:office:office" xmlns:oel="http://schemas.microsoft.com/office/2019/extlst" xmlns:r="http://schemas.openxmlformats.org/officeDocument/2006/relationships" xmlns:m="http://schemas.openxmlformats.org/officeDocument/2006/math" xmlns:v="urn:schemas-microsoft-com:vml" xmlns:wp14="http://schemas.microsoft.com/office/word/2010/wordprocessingDrawing" xmlns:wp="http://schemas.openxmlformats.org/drawingml/2006/wordprocessingDrawing" xmlns:w10="urn:schemas-microsoft-com:office:word" xmlns:w="http://schemas.openxmlformats.org/wordprocessingml/2006/main" xmlns:w14="http://schemas.microsoft.com/office/word/2010/wordml" xmlns:w15="http://schemas.microsoft.com/office/word/2012/wordml" xmlns:w16cex="http://schemas.microsoft.com/office/word/2018/wordml/cex" xmlns:w16cid="http://schemas.microsoft.com/office/word/2016/wordml/cid" xmlns:w16="http://schemas.microsoft.com/office/word/2018/wordml" xmlns:w16sdtdh="http://schemas.microsoft.com/office/word/2020/wordml/sdtdatahash" xmlns:w16se="http://schemas.microsoft.com/office/word/2015/wordml/symex" xmlns:wpg="http://schemas.microsoft.com/office/word/2010/wordprocessingGroup" xmlns:wpi="http://schemas.microsoft.com/office/word/2010/wordprocessingInk" xmlns:wne="http://schemas.microsoft.com/office/word/2006/wordml" xmlns:wps="http://schemas.microsoft.com/office/word/2010/wordprocessingShape" mc:Ignorable="w14 w15 w16se w16cid w16 w16cex w16sdtdh wp14">
   <w:p>
     <w:pPr>
       <w:pStyle w:val="Encabezado"/>
@@ -8181,7 +8513,7 @@
 </file>
 
 <file path=word/numbering.xml><?xml version="1.0" encoding="utf-8"?>
-<w:numbering xmlns:wpc="http://schemas.microsoft.com/office/word/2010/wordprocessingCanvas" xmlns:cx="http://schemas.microsoft.com/office/drawing/2014/chartex" xmlns:cx1="http://schemas.microsoft.com/office/drawing/2015/9/8/chartex" xmlns:cx2="http://schemas.microsoft.com/office/drawing/2015/10/21/chartex" xmlns:cx3="http://schemas.microsoft.com/office/drawing/2016/5/9/chartex" xmlns:cx4="http://schemas.microsoft.com/office/drawing/2016/5/10/chartex" xmlns:cx5="http://schemas.microsoft.com/office/drawing/2016/5/11/chartex" xmlns:cx6="http://schemas.microsoft.com/office/drawing/2016/5/12/chartex" xmlns:cx7="http://schemas.microsoft.com/office/drawing/2016/5/13/chartex" xmlns:cx8="http://schemas.microsoft.com/office/drawing/2016/5/14/chartex" xmlns:mc="http://schemas.openxmlformats.org/markup-compatibility/2006" xmlns:aink="http://schemas.microsoft.com/office/drawing/2016/ink" xmlns:am3d="http://schemas.microsoft.com/office/drawing/2017/model3d" xmlns:o="urn:schemas-microsoft-com:office:office" xmlns:oel="http://schemas.microsoft.com/office/2019/extlst" xmlns:r="http://schemas.openxmlformats.org/officeDocument/2006/relationships" xmlns:m="http://schemas.openxmlformats.org/officeDocument/2006/math" xmlns:v="urn:schemas-microsoft-com:vml" xmlns:wp14="http://schemas.microsoft.com/office/word/2010/wordprocessingDrawing" xmlns:wp="http://schemas.openxmlformats.org/drawingml/2006/wordprocessingDrawing" xmlns:w10="urn:schemas-microsoft-com:office:word" xmlns:w="http://schemas.openxmlformats.org/wordprocessingml/2006/main" xmlns:w14="http://schemas.microsoft.com/office/word/2010/wordml" xmlns:w15="http://schemas.microsoft.com/office/word/2012/wordml" xmlns:w16cex="http://schemas.microsoft.com/office/word/2018/wordml/cex" xmlns:w16cid="http://schemas.microsoft.com/office/word/2016/wordml/cid" xmlns:w16="http://schemas.microsoft.com/office/word/2018/wordml" xmlns:w16du="http://schemas.microsoft.com/office/word/2023/wordml/word16du" xmlns:w16sdtdh="http://schemas.microsoft.com/office/word/2020/wordml/sdtdatahash" xmlns:w16sdtfl="http://schemas.microsoft.com/office/word/2024/wordml/sdtformatlock" xmlns:w16se="http://schemas.microsoft.com/office/word/2015/wordml/symex" xmlns:wpg="http://schemas.microsoft.com/office/word/2010/wordprocessingGroup" xmlns:wpi="http://schemas.microsoft.com/office/word/2010/wordprocessingInk" xmlns:wne="http://schemas.microsoft.com/office/word/2006/wordml" xmlns:wps="http://schemas.microsoft.com/office/word/2010/wordprocessingShape" mc:Ignorable="w14 w15 w16se w16cid w16 w16cex w16sdtdh w16sdtfl w16du wp14">
+<w:numbering xmlns:wpc="http://schemas.microsoft.com/office/word/2010/wordprocessingCanvas" xmlns:cx="http://schemas.microsoft.com/office/drawing/2014/chartex" xmlns:cx1="http://schemas.microsoft.com/office/drawing/2015/9/8/chartex" xmlns:cx2="http://schemas.microsoft.com/office/drawing/2015/10/21/chartex" xmlns:cx3="http://schemas.microsoft.com/office/drawing/2016/5/9/chartex" xmlns:cx4="http://schemas.microsoft.com/office/drawing/2016/5/10/chartex" xmlns:cx5="http://schemas.microsoft.com/office/drawing/2016/5/11/chartex" xmlns:cx6="http://schemas.microsoft.com/office/drawing/2016/5/12/chartex" xmlns:cx7="http://schemas.microsoft.com/office/drawing/2016/5/13/chartex" xmlns:cx8="http://schemas.microsoft.com/office/drawing/2016/5/14/chartex" xmlns:mc="http://schemas.openxmlformats.org/markup-compatibility/2006" xmlns:aink="http://schemas.microsoft.com/office/drawing/2016/ink" xmlns:am3d="http://schemas.microsoft.com/office/drawing/2017/model3d" xmlns:o="urn:schemas-microsoft-com:office:office" xmlns:oel="http://schemas.microsoft.com/office/2019/extlst" xmlns:r="http://schemas.openxmlformats.org/officeDocument/2006/relationships" xmlns:m="http://schemas.openxmlformats.org/officeDocument/2006/math" xmlns:v="urn:schemas-microsoft-com:vml" xmlns:wp14="http://schemas.microsoft.com/office/word/2010/wordprocessingDrawing" xmlns:wp="http://schemas.openxmlformats.org/drawingml/2006/wordprocessingDrawing" xmlns:w10="urn:schemas-microsoft-com:office:word" xmlns:w="http://schemas.openxmlformats.org/wordprocessingml/2006/main" xmlns:w14="http://schemas.microsoft.com/office/word/2010/wordml" xmlns:w15="http://schemas.microsoft.com/office/word/2012/wordml" xmlns:w16cex="http://schemas.microsoft.com/office/word/2018/wordml/cex" xmlns:w16cid="http://schemas.microsoft.com/office/word/2016/wordml/cid" xmlns:w16="http://schemas.microsoft.com/office/word/2018/wordml" xmlns:w16sdtdh="http://schemas.microsoft.com/office/word/2020/wordml/sdtdatahash" xmlns:w16se="http://schemas.microsoft.com/office/word/2015/wordml/symex" xmlns:wpg="http://schemas.microsoft.com/office/word/2010/wordprocessingGroup" xmlns:wpi="http://schemas.microsoft.com/office/word/2010/wordprocessingInk" xmlns:wne="http://schemas.microsoft.com/office/word/2006/wordml" xmlns:wps="http://schemas.microsoft.com/office/word/2010/wordprocessingShape" mc:Ignorable="w14 w15 w16se w16cid w16 w16cex w16sdtdh wp14">
   <w:abstractNum w:abstractNumId="0" w15:restartNumberingAfterBreak="0">
     <w:nsid w:val="034D47F8"/>
     <w:multiLevelType w:val="hybridMultilevel"/>
@@ -9105,7 +9437,7 @@
 </file>
 
 <file path=word/styles.xml><?xml version="1.0" encoding="utf-8"?>
-<w:styles xmlns:mc="http://schemas.openxmlformats.org/markup-compatibility/2006" xmlns:r="http://schemas.openxmlformats.org/officeDocument/2006/relationships" xmlns:w="http://schemas.openxmlformats.org/wordprocessingml/2006/main" xmlns:w14="http://schemas.microsoft.com/office/word/2010/wordml" xmlns:w15="http://schemas.microsoft.com/office/word/2012/wordml" xmlns:w16cex="http://schemas.microsoft.com/office/word/2018/wordml/cex" xmlns:w16cid="http://schemas.microsoft.com/office/word/2016/wordml/cid" xmlns:w16="http://schemas.microsoft.com/office/word/2018/wordml" xmlns:w16du="http://schemas.microsoft.com/office/word/2023/wordml/word16du" xmlns:w16sdtdh="http://schemas.microsoft.com/office/word/2020/wordml/sdtdatahash" xmlns:w16sdtfl="http://schemas.microsoft.com/office/word/2024/wordml/sdtformatlock" xmlns:w16se="http://schemas.microsoft.com/office/word/2015/wordml/symex" mc:Ignorable="w14 w15 w16se w16cid w16 w16cex w16sdtdh w16sdtfl w16du">
+<w:styles xmlns:mc="http://schemas.openxmlformats.org/markup-compatibility/2006" xmlns:r="http://schemas.openxmlformats.org/officeDocument/2006/relationships" xmlns:w="http://schemas.openxmlformats.org/wordprocessingml/2006/main" xmlns:w14="http://schemas.microsoft.com/office/word/2010/wordml" xmlns:w15="http://schemas.microsoft.com/office/word/2012/wordml" xmlns:w16cex="http://schemas.microsoft.com/office/word/2018/wordml/cex" xmlns:w16cid="http://schemas.microsoft.com/office/word/2016/wordml/cid" xmlns:w16="http://schemas.microsoft.com/office/word/2018/wordml" xmlns:w16sdtdh="http://schemas.microsoft.com/office/word/2020/wordml/sdtdatahash" xmlns:w16se="http://schemas.microsoft.com/office/word/2015/wordml/symex" mc:Ignorable="w14 w15 w16se w16cid w16 w16cex w16sdtdh">
   <w:docDefaults>
     <w:rPrDefault>
       <w:rPr>

</xml_diff>